<commit_message>
Libro: corrige la fila de transformadas óptimas en la Tabla 1 (notación)
La Tabla 1 aún decía "WTH_M, WTHS_M — Transformadas óptimas: máx(líneas,
disco)"; se actualiza a "I_opt^top, I_opt^bot — suma de ramas (líneas +
disco)", coherente con la ec. (9) y el pseudocódigo del Apéndice D.
</commit_message>
<xml_diff>
--- a/docs/Tesis_Borrador_V3.docx
+++ b/docs/Tesis_Borrador_V3.docx
@@ -6412,7 +6412,7 @@
                 <w:rFonts w:eastAsia="Times New Roman" w:cs="Times New Roman"/>
                 <w:sz w:val="19"/>
               </w:rPr>
-              <w:t>WTH_M, WTHS_M</w:t>
+              <w:t>I_opt^top, I_opt^bot</w:t>
             </w:r>
           </w:p>
         </w:tc>
@@ -6438,7 +6438,7 @@
                 <w:rFonts w:eastAsia="Times New Roman" w:cs="Times New Roman"/>
                 <w:sz w:val="19"/>
               </w:rPr>
-              <w:t>Transformadas óptimas: máx(líneas, disco) por fuente</w:t>
+              <w:t>Transformadas óptimas: suma de ramas (líneas + disco) por fuente</w:t>
             </w:r>
           </w:p>
         </w:tc>

</xml_diff>

<commit_message>
Integra la ablación de la función de aptitud en toda la documentación
- Libro (59 págs): nuevo cierre de la sección 5.6 con la Figura 11 (curva
  aptitud vs m, sin restricciones de rango) y la Tabla 12 (óptimos de F_apt
  y Fo sobre los 20 pares), con actualización de las listas de figuras y
  tablas; el texto explica el piso m*=0,30 en las 50 corridas, el óptimo
  trivial r=1 de Fo sobre la propuesta y la coincidencia del máximo real de
  Fo con nuestro óptimo (m~0,07), reforzando H2.
- Informe de avances (28 págs): nueva sección 12 con la curva y la Tabla 9;
  conclusiones renumeradas a 13; próximos pasos incluyen el experimento M3FD.
- Excel (11 hojas): hoja nueva Ablacion_Fo con los barridos y la comparativa.
- Presentación (18 láminas): lámina nueva tras la de PSO con la curva y la
  lectura del experimento, con notas del orador para la pregunta del tribunal.
</commit_message>
<xml_diff>
--- a/docs/Tesis_Borrador_V3.docx
+++ b/docs/Tesis_Borrador_V3.docx
@@ -4920,6 +4920,21 @@
     </w:p>
     <w:p>
       <w:pPr>
+        <w:pStyle w:val="Normal"/>
+        <w:spacing w:lineRule="auto" w:line="276" w:before="0" w:after="40"/>
+        <w:jc w:val="both"/>
+        <w:rPr/>
+      </w:pPr>
+      <w:r>
+        <w:rPr>
+          <w:rFonts w:eastAsia="Times New Roman" w:cs="Times New Roman"/>
+          <w:sz w:val="21"/>
+        </w:rPr>
+        <w:t xml:space="preserve">Figura 11. Aptitud en función del peso de contraste m (r = 25): F_apt de la tesis y Fo del trabajo de referencia.</w:t>
+      </w:r>
+    </w:p>
+    <w:p>
+      <w:pPr>
         <w:pStyle w:val="Heading1"/>
         <w:jc w:val="start"/>
         <w:rPr/>
@@ -5094,6 +5109,21 @@
       </w:r>
       <w:r>
         <w:br w:type="page"/>
+      </w:r>
+    </w:p>
+    <w:p>
+      <w:pPr>
+        <w:pStyle w:val="Normal"/>
+        <w:spacing w:lineRule="auto" w:line="276" w:before="0" w:after="40"/>
+        <w:jc w:val="both"/>
+        <w:rPr/>
+      </w:pPr>
+      <w:r>
+        <w:rPr>
+          <w:rFonts w:eastAsia="Times New Roman" w:cs="Times New Roman"/>
+          <w:sz w:val="21"/>
+        </w:rPr>
+        <w:t xml:space="preserve">Tabla 12. Ablación de la función de aptitud: óptimos de F_apt y de Fo sobre los 20 pares.</w:t>
       </w:r>
     </w:p>
     <w:p>
@@ -31732,6 +31762,847 @@
       </w:pPr>
       <w:r>
         <w:rPr/>
+      </w:r>
+    </w:p>
+    <w:p>
+      <w:pPr>
+        <w:pStyle w:val="Normal"/>
+        <w:spacing w:lineRule="auto" w:line="360"/>
+        <w:ind w:firstLine="709"/>
+        <w:jc w:val="both"/>
+        <w:rPr/>
+      </w:pPr>
+      <w:r>
+        <w:rPr>
+          <w:i/>
+          <w:iCs/>
+          <w:rFonts w:eastAsia="Times New Roman" w:cs="Times New Roman"/>
+        </w:rPr>
+        <w:t xml:space="preserve">Ablación de la función de aptitud. </w:t>
+      </w:r>
+      <w:r>
+        <w:rPr>
+          <w:iCs/>
+          <w:rFonts w:eastAsia="Times New Roman" w:cs="Times New Roman"/>
+        </w:rPr>
+        <w:t xml:space="preserve">A pedido de la revisión de avances, el barrido de 25 configuraciones se repitió con la función objetivo del trabajo de referencia, Fo = SSIMavg + En + PSNRn (Ortega y Espinoza, 2025), con su rango original m ∈ [0,3; 2,0], tanto sobre la propuesta como sobre el operador clásico. En las 50 corridas el peso óptimo se ubicó en el límite inferior del rango (m* = 0,30): los dos términos de fidelidad de Fo dominan a la entropía y empujan el realce al mínimo permitido. Sobre la propuesta, Fo seleccionó además r* = 1, un óptimo trivial que desactiva en la práctica el banco de elementos estructurantes.</w:t>
+      </w:r>
+    </w:p>
+    <w:p>
+      <w:pPr>
+        <w:pStyle w:val="Normal"/>
+        <w:spacing w:lineRule="auto" w:line="360"/>
+        <w:ind w:firstLine="709"/>
+        <w:jc w:val="both"/>
+        <w:rPr/>
+      </w:pPr>
+      <w:r>
+        <w:rPr>
+          <w:iCs/>
+          <w:rFonts w:eastAsia="Times New Roman" w:cs="Times New Roman"/>
+        </w:rPr>
+        <w:t xml:space="preserve">La Figura 11 muestra el paisaje de aptitud en función de m (con r = 25) sin restricciones de rango: ambas funciones decrecen monótonamente para m ≥ 0,2, de modo que ningún tamaño de enjambre ni número de iteraciones puede converger dentro de [0,5; 2,0]; y el máximo real de Fo sobre la propuesta se ubica en m ≈ 0,07, coincidente con el óptimo de la aptitud orientada a la fusión (m = 0,0703): ambas formulaciones acuerdan el peso adecuado para el operador con suma de ramas.</w:t>
+      </w:r>
+    </w:p>
+    <w:p>
+      <w:pPr>
+        <w:pStyle w:val="Normal"/>
+        <w:spacing w:lineRule="auto" w:line="276"/>
+        <w:jc w:val="center"/>
+        <w:rPr/>
+      </w:pPr>
+      <w:r>
+        <w:rPr/>
+        <w:drawing>
+          <wp:inline distT="0" distB="0" distL="0" distR="0">
+            <wp:extent cx="5760720" cy="3023475"/>
+            <wp:effectExtent l="0" t="0" r="0" b="0"/>
+            <wp:docPr id="9911" name="fig_aptitud_vs_m.png"/>
+            <wp:cNvGraphicFramePr>
+              <a:graphicFrameLocks xmlns:a="http://schemas.openxmlformats.org/drawingml/2006/main" noChangeAspect="1"/>
+            </wp:cNvGraphicFramePr>
+            <a:graphic xmlns:a="http://schemas.openxmlformats.org/drawingml/2006/main">
+              <a:graphicData uri="http://schemas.openxmlformats.org/drawingml/2006/picture">
+                <pic:pic xmlns:pic="http://schemas.openxmlformats.org/drawingml/2006/picture">
+                  <pic:nvPicPr>
+                    <pic:cNvPr id="14" name="Picture 13"/>
+                    <pic:cNvPicPr>
+                      <a:picLocks noChangeAspect="1" noChangeArrowheads="1"/>
+                    </pic:cNvPicPr>
+                  </pic:nvPicPr>
+                  <pic:blipFill>
+                    <a:blip r:embed="rId11"/>
+                    <a:stretch>
+                      <a:fillRect/>
+                    </a:stretch>
+                  </pic:blipFill>
+                  <pic:spPr bwMode="auto">
+                    <a:xfrm>
+                      <a:off x="0" y="0"/>
+                      <a:ext cx="5760720" cy="3023475"/>
+                    </a:xfrm>
+                    <a:prstGeom prst="rect">
+                      <a:avLst/>
+                    </a:prstGeom>
+                    <a:noFill/>
+                  </pic:spPr>
+                </pic:pic>
+              </a:graphicData>
+            </a:graphic>
+          </wp:inline>
+        </w:drawing>
+      </w:r>
+    </w:p>
+    <w:p>
+      <w:pPr>
+        <w:pStyle w:val="Normal"/>
+        <w:spacing w:lineRule="auto" w:line="276"/>
+        <w:jc w:val="both"/>
+        <w:rPr/>
+      </w:pPr>
+      <w:r>
+        <w:rPr>
+          <w:rFonts w:eastAsia="Times New Roman" w:cs="Times New Roman"/>
+          <w:i/>
+          <w:sz w:val="18"/>
+        </w:rPr>
+        <w:t xml:space="preserve">Figura 11. Aptitud en función del peso de contraste m (r = 25), sin restricciones de rango: F_apt de la tesis y Fo del trabajo de referencia sobre ambos operadores.</w:t>
+      </w:r>
+    </w:p>
+    <w:p>
+      <w:pPr>
+        <w:pStyle w:val="Normal"/>
+        <w:spacing w:lineRule="auto" w:line="276"/>
+        <w:jc w:val="both"/>
+        <w:rPr/>
+      </w:pPr>
+      <w:r>
+        <w:rPr>
+          <w:rFonts w:eastAsia="Times New Roman" w:cs="Times New Roman"/>
+          <w:i/>
+          <w:sz w:val="18"/>
+        </w:rPr>
+        <w:t xml:space="preserve">Tabla 12. Ablación de la función de aptitud: óptimos de F_apt y de Fo evaluados sobre los 20 pares (medias).</w:t>
+      </w:r>
+    </w:p>
+    <w:tbl>
+      <w:tblPr>
+        <w:tblW w:w="9102" w:type="dxa"/>
+        <w:jc w:val="start"/>
+        <w:tblInd w:w="0" w:type="dxa"/>
+        <w:tblLayout w:type="fixed"/>
+        <w:tblCellMar>
+          <w:top w:w="0" w:type="dxa"/>
+          <w:start w:w="108" w:type="dxa"/>
+          <w:bottom w:w="0" w:type="dxa"/>
+          <w:end w:w="108" w:type="dxa"/>
+        </w:tblCellMar>
+        <w:tblLook w:noHBand="0" w:noVBand="1" w:firstColumn="1" w:lastRow="0" w:lastColumn="0" w:firstRow="1" w:val="04a0"/>
+      </w:tblPr>
+      <w:tblGrid>
+        <w:gridCol w:w="3120"/>
+        <w:gridCol w:w="1248"/>
+        <w:gridCol w:w="1248"/>
+        <w:gridCol w:w="1248"/>
+        <w:gridCol w:w="1248"/>
+        <w:gridCol w:w="1248"/>
+      </w:tblGrid>
+      <w:tr>
+        <w:trPr/>
+        <w:tc>
+          <w:tcPr>
+            <w:tcW w:w="3120" w:type="dxa"/>
+            <w:tcBorders/>
+            <w:shd w:val="clear" w:fill="F2F2F2"/>
+          </w:tcPr>
+          <w:p>
+            <w:pPr>
+              <w:pStyle w:val="Normal"/>
+              <w:widowControl w:val="false"/>
+              <w:spacing w:lineRule="auto" w:line="276" w:before="0" w:after="120"/>
+              <w:rPr/>
+            </w:pPr>
+            <w:r>
+              <w:rPr>
+                <w:rFonts w:eastAsia="Times New Roman" w:cs="Times New Roman"/>
+                <w:b/>
+                <w:sz w:val="19"/>
+              </w:rPr>
+              <w:t>Variante</w:t>
+            </w:r>
+          </w:p>
+        </w:tc>
+        <w:tc>
+          <w:tcPr>
+            <w:tcW w:w="1248" w:type="dxa"/>
+            <w:tcBorders/>
+            <w:shd w:val="clear" w:fill="F2F2F2"/>
+          </w:tcPr>
+          <w:p>
+            <w:pPr>
+              <w:pStyle w:val="Normal"/>
+              <w:widowControl w:val="false"/>
+              <w:spacing w:lineRule="auto" w:line="276" w:before="0" w:after="120"/>
+              <w:rPr/>
+            </w:pPr>
+            <w:r>
+              <w:rPr>
+                <w:rFonts w:eastAsia="Times New Roman" w:cs="Times New Roman"/>
+                <w:b/>
+                <w:sz w:val="19"/>
+              </w:rPr>
+              <w:t>Qabf ↑</w:t>
+            </w:r>
+          </w:p>
+        </w:tc>
+        <w:tc>
+          <w:tcPr>
+            <w:tcW w:w="1248" w:type="dxa"/>
+            <w:tcBorders/>
+            <w:shd w:val="clear" w:fill="F2F2F2"/>
+          </w:tcPr>
+          <w:p>
+            <w:pPr>
+              <w:pStyle w:val="Normal"/>
+              <w:widowControl w:val="false"/>
+              <w:spacing w:lineRule="auto" w:line="276" w:before="0" w:after="120"/>
+              <w:rPr/>
+            </w:pPr>
+            <w:r>
+              <w:rPr>
+                <w:rFonts w:eastAsia="Times New Roman" w:cs="Times New Roman"/>
+                <w:b/>
+                <w:sz w:val="19"/>
+              </w:rPr>
+              <w:t>Nabf ↓</w:t>
+            </w:r>
+          </w:p>
+        </w:tc>
+        <w:tc>
+          <w:tcPr>
+            <w:tcW w:w="1248" w:type="dxa"/>
+            <w:tcBorders/>
+            <w:shd w:val="clear" w:fill="F2F2F2"/>
+          </w:tcPr>
+          <w:p>
+            <w:pPr>
+              <w:pStyle w:val="Normal"/>
+              <w:widowControl w:val="false"/>
+              <w:spacing w:lineRule="auto" w:line="276" w:before="0" w:after="120"/>
+              <w:rPr/>
+            </w:pPr>
+            <w:r>
+              <w:rPr>
+                <w:rFonts w:eastAsia="Times New Roman" w:cs="Times New Roman"/>
+                <w:b/>
+                <w:sz w:val="19"/>
+              </w:rPr>
+              <w:t>SSIM ↑</w:t>
+            </w:r>
+          </w:p>
+        </w:tc>
+        <w:tc>
+          <w:tcPr>
+            <w:tcW w:w="1248" w:type="dxa"/>
+            <w:tcBorders/>
+            <w:shd w:val="clear" w:fill="F2F2F2"/>
+          </w:tcPr>
+          <w:p>
+            <w:pPr>
+              <w:pStyle w:val="Normal"/>
+              <w:widowControl w:val="false"/>
+              <w:spacing w:lineRule="auto" w:line="276" w:before="0" w:after="120"/>
+              <w:rPr/>
+            </w:pPr>
+            <w:r>
+              <w:rPr>
+                <w:rFonts w:eastAsia="Times New Roman" w:cs="Times New Roman"/>
+                <w:b/>
+                <w:sz w:val="19"/>
+              </w:rPr>
+              <w:t>SCD ↑</w:t>
+            </w:r>
+          </w:p>
+        </w:tc>
+        <w:tc>
+          <w:tcPr>
+            <w:tcW w:w="1248" w:type="dxa"/>
+            <w:tcBorders/>
+            <w:shd w:val="clear" w:fill="F2F2F2"/>
+          </w:tcPr>
+          <w:p>
+            <w:pPr>
+              <w:pStyle w:val="Normal"/>
+              <w:widowControl w:val="false"/>
+              <w:spacing w:lineRule="auto" w:line="276" w:before="0" w:after="120"/>
+              <w:rPr/>
+            </w:pPr>
+            <w:r>
+              <w:rPr>
+                <w:rFonts w:eastAsia="Times New Roman" w:cs="Times New Roman"/>
+                <w:b/>
+                <w:sz w:val="19"/>
+              </w:rPr>
+              <w:t>VIF ↑</w:t>
+            </w:r>
+          </w:p>
+        </w:tc>
+      </w:tr>
+      <w:tr>
+        <w:trPr/>
+        <w:tc>
+          <w:tcPr>
+            <w:tcW w:w="3120" w:type="dxa"/>
+            <w:tcBorders/>
+          </w:tcPr>
+          <w:p>
+            <w:pPr>
+              <w:pStyle w:val="Normal"/>
+              <w:widowControl w:val="false"/>
+              <w:spacing w:lineRule="auto" w:line="276" w:before="0" w:after="120"/>
+              <w:rPr/>
+            </w:pPr>
+            <w:r>
+              <w:rPr>
+                <w:rFonts w:eastAsia="Times New Roman" w:cs="Times New Roman"/>
+                <w:b/>
+                <w:sz w:val="19"/>
+              </w:rPr>
+              <w:t>Propuesta + F_apt (r = 25; m = 0,070)</w:t>
+            </w:r>
+          </w:p>
+        </w:tc>
+        <w:tc>
+          <w:tcPr>
+            <w:tcW w:w="1248" w:type="dxa"/>
+            <w:tcBorders/>
+          </w:tcPr>
+          <w:p>
+            <w:pPr>
+              <w:pStyle w:val="Normal"/>
+              <w:widowControl w:val="false"/>
+              <w:spacing w:lineRule="auto" w:line="276" w:before="0" w:after="120"/>
+              <w:rPr/>
+            </w:pPr>
+            <w:r>
+              <w:rPr>
+                <w:rFonts w:eastAsia="Times New Roman" w:cs="Times New Roman"/>
+                <w:b/>
+                <w:sz w:val="19"/>
+              </w:rPr>
+              <w:t>0,500</w:t>
+            </w:r>
+          </w:p>
+        </w:tc>
+        <w:tc>
+          <w:tcPr>
+            <w:tcW w:w="1248" w:type="dxa"/>
+            <w:tcBorders/>
+          </w:tcPr>
+          <w:p>
+            <w:pPr>
+              <w:pStyle w:val="Normal"/>
+              <w:widowControl w:val="false"/>
+              <w:spacing w:lineRule="auto" w:line="276" w:before="0" w:after="120"/>
+              <w:rPr/>
+            </w:pPr>
+            <w:r>
+              <w:rPr>
+                <w:rFonts w:eastAsia="Times New Roman" w:cs="Times New Roman"/>
+                <w:b/>
+                <w:sz w:val="19"/>
+              </w:rPr>
+              <w:t>0,041</w:t>
+            </w:r>
+          </w:p>
+        </w:tc>
+        <w:tc>
+          <w:tcPr>
+            <w:tcW w:w="1248" w:type="dxa"/>
+            <w:tcBorders/>
+          </w:tcPr>
+          <w:p>
+            <w:pPr>
+              <w:pStyle w:val="Normal"/>
+              <w:widowControl w:val="false"/>
+              <w:spacing w:lineRule="auto" w:line="276" w:before="0" w:after="120"/>
+              <w:rPr/>
+            </w:pPr>
+            <w:r>
+              <w:rPr>
+                <w:rFonts w:eastAsia="Times New Roman" w:cs="Times New Roman"/>
+                <w:b/>
+                <w:sz w:val="19"/>
+              </w:rPr>
+              <w:t>0,782</w:t>
+            </w:r>
+          </w:p>
+        </w:tc>
+        <w:tc>
+          <w:tcPr>
+            <w:tcW w:w="1248" w:type="dxa"/>
+            <w:tcBorders/>
+          </w:tcPr>
+          <w:p>
+            <w:pPr>
+              <w:pStyle w:val="Normal"/>
+              <w:widowControl w:val="false"/>
+              <w:spacing w:lineRule="auto" w:line="276" w:before="0" w:after="120"/>
+              <w:rPr/>
+            </w:pPr>
+            <w:r>
+              <w:rPr>
+                <w:rFonts w:eastAsia="Times New Roman" w:cs="Times New Roman"/>
+                <w:b/>
+                <w:sz w:val="19"/>
+              </w:rPr>
+              <w:t>1,450</w:t>
+            </w:r>
+          </w:p>
+        </w:tc>
+        <w:tc>
+          <w:tcPr>
+            <w:tcW w:w="1248" w:type="dxa"/>
+            <w:tcBorders/>
+          </w:tcPr>
+          <w:p>
+            <w:pPr>
+              <w:pStyle w:val="Normal"/>
+              <w:widowControl w:val="false"/>
+              <w:spacing w:lineRule="auto" w:line="276" w:before="0" w:after="120"/>
+              <w:rPr/>
+            </w:pPr>
+            <w:r>
+              <w:rPr>
+                <w:rFonts w:eastAsia="Times New Roman" w:cs="Times New Roman"/>
+                <w:b/>
+                <w:sz w:val="19"/>
+              </w:rPr>
+              <w:t>0,368</w:t>
+            </w:r>
+          </w:p>
+        </w:tc>
+      </w:tr>
+      <w:tr>
+        <w:trPr/>
+        <w:tc>
+          <w:tcPr>
+            <w:tcW w:w="3120" w:type="dxa"/>
+            <w:tcBorders/>
+          </w:tcPr>
+          <w:p>
+            <w:pPr>
+              <w:pStyle w:val="Normal"/>
+              <w:widowControl w:val="false"/>
+              <w:spacing w:lineRule="auto" w:line="276" w:before="0" w:after="120"/>
+              <w:rPr/>
+            </w:pPr>
+            <w:r>
+              <w:rPr>
+                <w:rFonts w:eastAsia="Times New Roman" w:cs="Times New Roman"/>
+                <w:b/>
+                <w:sz w:val="19"/>
+              </w:rPr>
+              <w:t>Top-Hat clásico + Fo (r = 25; m = 0,30)</w:t>
+            </w:r>
+          </w:p>
+        </w:tc>
+        <w:tc>
+          <w:tcPr>
+            <w:tcW w:w="1248" w:type="dxa"/>
+            <w:tcBorders/>
+          </w:tcPr>
+          <w:p>
+            <w:pPr>
+              <w:pStyle w:val="Normal"/>
+              <w:widowControl w:val="false"/>
+              <w:spacing w:lineRule="auto" w:line="276" w:before="0" w:after="120"/>
+              <w:rPr/>
+            </w:pPr>
+            <w:r>
+              <w:rPr>
+                <w:rFonts w:eastAsia="Times New Roman" w:cs="Times New Roman"/>
+                <w:b/>
+                <w:sz w:val="19"/>
+              </w:rPr>
+              <w:t>0,534</w:t>
+            </w:r>
+          </w:p>
+        </w:tc>
+        <w:tc>
+          <w:tcPr>
+            <w:tcW w:w="1248" w:type="dxa"/>
+            <w:tcBorders/>
+          </w:tcPr>
+          <w:p>
+            <w:pPr>
+              <w:pStyle w:val="Normal"/>
+              <w:widowControl w:val="false"/>
+              <w:spacing w:lineRule="auto" w:line="276" w:before="0" w:after="120"/>
+              <w:rPr/>
+            </w:pPr>
+            <w:r>
+              <w:rPr>
+                <w:rFonts w:eastAsia="Times New Roman" w:cs="Times New Roman"/>
+                <w:b/>
+                <w:sz w:val="19"/>
+              </w:rPr>
+              <w:t>0,184</w:t>
+            </w:r>
+          </w:p>
+        </w:tc>
+        <w:tc>
+          <w:tcPr>
+            <w:tcW w:w="1248" w:type="dxa"/>
+            <w:tcBorders/>
+          </w:tcPr>
+          <w:p>
+            <w:pPr>
+              <w:pStyle w:val="Normal"/>
+              <w:widowControl w:val="false"/>
+              <w:spacing w:lineRule="auto" w:line="276" w:before="0" w:after="120"/>
+              <w:rPr/>
+            </w:pPr>
+            <w:r>
+              <w:rPr>
+                <w:rFonts w:eastAsia="Times New Roman" w:cs="Times New Roman"/>
+                <w:b/>
+                <w:sz w:val="19"/>
+              </w:rPr>
+              <w:t>0,745</w:t>
+            </w:r>
+          </w:p>
+        </w:tc>
+        <w:tc>
+          <w:tcPr>
+            <w:tcW w:w="1248" w:type="dxa"/>
+            <w:tcBorders/>
+          </w:tcPr>
+          <w:p>
+            <w:pPr>
+              <w:pStyle w:val="Normal"/>
+              <w:widowControl w:val="false"/>
+              <w:spacing w:lineRule="auto" w:line="276" w:before="0" w:after="120"/>
+              <w:rPr/>
+            </w:pPr>
+            <w:r>
+              <w:rPr>
+                <w:rFonts w:eastAsia="Times New Roman" w:cs="Times New Roman"/>
+                <w:b/>
+                <w:sz w:val="19"/>
+              </w:rPr>
+              <w:t>1,504</w:t>
+            </w:r>
+          </w:p>
+        </w:tc>
+        <w:tc>
+          <w:tcPr>
+            <w:tcW w:w="1248" w:type="dxa"/>
+            <w:tcBorders/>
+          </w:tcPr>
+          <w:p>
+            <w:pPr>
+              <w:pStyle w:val="Normal"/>
+              <w:widowControl w:val="false"/>
+              <w:spacing w:lineRule="auto" w:line="276" w:before="0" w:after="120"/>
+              <w:rPr/>
+            </w:pPr>
+            <w:r>
+              <w:rPr>
+                <w:rFonts w:eastAsia="Times New Roman" w:cs="Times New Roman"/>
+                <w:b/>
+                <w:sz w:val="19"/>
+              </w:rPr>
+              <w:t>0,395</w:t>
+            </w:r>
+          </w:p>
+        </w:tc>
+      </w:tr>
+      <w:tr>
+        <w:trPr/>
+        <w:tc>
+          <w:tcPr>
+            <w:tcW w:w="3120" w:type="dxa"/>
+            <w:tcBorders/>
+          </w:tcPr>
+          <w:p>
+            <w:pPr>
+              <w:pStyle w:val="Normal"/>
+              <w:widowControl w:val="false"/>
+              <w:spacing w:lineRule="auto" w:line="276" w:before="0" w:after="120"/>
+              <w:rPr/>
+            </w:pPr>
+            <w:r>
+              <w:rPr>
+                <w:rFonts w:eastAsia="Times New Roman" w:cs="Times New Roman"/>
+                <w:b/>
+                <w:sz w:val="19"/>
+              </w:rPr>
+              <w:t>Propuesta + Fo (r = 1; m = 0,30)</w:t>
+            </w:r>
+          </w:p>
+        </w:tc>
+        <w:tc>
+          <w:tcPr>
+            <w:tcW w:w="1248" w:type="dxa"/>
+            <w:tcBorders/>
+          </w:tcPr>
+          <w:p>
+            <w:pPr>
+              <w:pStyle w:val="Normal"/>
+              <w:widowControl w:val="false"/>
+              <w:spacing w:lineRule="auto" w:line="276" w:before="0" w:after="120"/>
+              <w:rPr/>
+            </w:pPr>
+            <w:r>
+              <w:rPr>
+                <w:rFonts w:eastAsia="Times New Roman" w:cs="Times New Roman"/>
+                <w:b/>
+                <w:sz w:val="19"/>
+              </w:rPr>
+              <w:t>0,448</w:t>
+            </w:r>
+          </w:p>
+        </w:tc>
+        <w:tc>
+          <w:tcPr>
+            <w:tcW w:w="1248" w:type="dxa"/>
+            <w:tcBorders/>
+          </w:tcPr>
+          <w:p>
+            <w:pPr>
+              <w:pStyle w:val="Normal"/>
+              <w:widowControl w:val="false"/>
+              <w:spacing w:lineRule="auto" w:line="276" w:before="0" w:after="120"/>
+              <w:rPr/>
+            </w:pPr>
+            <w:r>
+              <w:rPr>
+                <w:rFonts w:eastAsia="Times New Roman" w:cs="Times New Roman"/>
+                <w:b/>
+                <w:sz w:val="19"/>
+              </w:rPr>
+              <w:t>0,121</w:t>
+            </w:r>
+          </w:p>
+        </w:tc>
+        <w:tc>
+          <w:tcPr>
+            <w:tcW w:w="1248" w:type="dxa"/>
+            <w:tcBorders/>
+          </w:tcPr>
+          <w:p>
+            <w:pPr>
+              <w:pStyle w:val="Normal"/>
+              <w:widowControl w:val="false"/>
+              <w:spacing w:lineRule="auto" w:line="276" w:before="0" w:after="120"/>
+              <w:rPr/>
+            </w:pPr>
+            <w:r>
+              <w:rPr>
+                <w:rFonts w:eastAsia="Times New Roman" w:cs="Times New Roman"/>
+                <w:b/>
+                <w:sz w:val="19"/>
+              </w:rPr>
+              <w:t>0,761</w:t>
+            </w:r>
+          </w:p>
+        </w:tc>
+        <w:tc>
+          <w:tcPr>
+            <w:tcW w:w="1248" w:type="dxa"/>
+            <w:tcBorders/>
+          </w:tcPr>
+          <w:p>
+            <w:pPr>
+              <w:pStyle w:val="Normal"/>
+              <w:widowControl w:val="false"/>
+              <w:spacing w:lineRule="auto" w:line="276" w:before="0" w:after="120"/>
+              <w:rPr/>
+            </w:pPr>
+            <w:r>
+              <w:rPr>
+                <w:rFonts w:eastAsia="Times New Roman" w:cs="Times New Roman"/>
+                <w:b/>
+                <w:sz w:val="19"/>
+              </w:rPr>
+              <w:t>1,353</w:t>
+            </w:r>
+          </w:p>
+        </w:tc>
+        <w:tc>
+          <w:tcPr>
+            <w:tcW w:w="1248" w:type="dxa"/>
+            <w:tcBorders/>
+          </w:tcPr>
+          <w:p>
+            <w:pPr>
+              <w:pStyle w:val="Normal"/>
+              <w:widowControl w:val="false"/>
+              <w:spacing w:lineRule="auto" w:line="276" w:before="0" w:after="120"/>
+              <w:rPr/>
+            </w:pPr>
+            <w:r>
+              <w:rPr>
+                <w:rFonts w:eastAsia="Times New Roman" w:cs="Times New Roman"/>
+                <w:b/>
+                <w:sz w:val="19"/>
+              </w:rPr>
+              <w:t>0,322</w:t>
+            </w:r>
+          </w:p>
+        </w:tc>
+      </w:tr>
+      <w:tr>
+        <w:trPr/>
+        <w:tc>
+          <w:tcPr>
+            <w:tcW w:w="3120" w:type="dxa"/>
+            <w:tcBorders/>
+          </w:tcPr>
+          <w:p>
+            <w:pPr>
+              <w:pStyle w:val="Normal"/>
+              <w:widowControl w:val="false"/>
+              <w:spacing w:lineRule="auto" w:line="276" w:before="0" w:after="120"/>
+              <w:rPr/>
+            </w:pPr>
+            <w:r>
+              <w:rPr>
+                <w:rFonts w:eastAsia="Times New Roman" w:cs="Times New Roman"/>
+                <w:b/>
+                <w:sz w:val="19"/>
+              </w:rPr>
+              <w:t>Top-Hat clásico manual (r = 5; m = 1)</w:t>
+            </w:r>
+          </w:p>
+        </w:tc>
+        <w:tc>
+          <w:tcPr>
+            <w:tcW w:w="1248" w:type="dxa"/>
+            <w:tcBorders/>
+          </w:tcPr>
+          <w:p>
+            <w:pPr>
+              <w:pStyle w:val="Normal"/>
+              <w:widowControl w:val="false"/>
+              <w:spacing w:lineRule="auto" w:line="276" w:before="0" w:after="120"/>
+              <w:rPr/>
+            </w:pPr>
+            <w:r>
+              <w:rPr>
+                <w:rFonts w:eastAsia="Times New Roman" w:cs="Times New Roman"/>
+                <w:b/>
+                <w:sz w:val="19"/>
+              </w:rPr>
+              <w:t>0,305</w:t>
+            </w:r>
+          </w:p>
+        </w:tc>
+        <w:tc>
+          <w:tcPr>
+            <w:tcW w:w="1248" w:type="dxa"/>
+            <w:tcBorders/>
+          </w:tcPr>
+          <w:p>
+            <w:pPr>
+              <w:pStyle w:val="Normal"/>
+              <w:widowControl w:val="false"/>
+              <w:spacing w:lineRule="auto" w:line="276" w:before="0" w:after="120"/>
+              <w:rPr/>
+            </w:pPr>
+            <w:r>
+              <w:rPr>
+                <w:rFonts w:eastAsia="Times New Roman" w:cs="Times New Roman"/>
+                <w:b/>
+                <w:sz w:val="19"/>
+              </w:rPr>
+              <w:t>0,585</w:t>
+            </w:r>
+          </w:p>
+        </w:tc>
+        <w:tc>
+          <w:tcPr>
+            <w:tcW w:w="1248" w:type="dxa"/>
+            <w:tcBorders/>
+          </w:tcPr>
+          <w:p>
+            <w:pPr>
+              <w:pStyle w:val="Normal"/>
+              <w:widowControl w:val="false"/>
+              <w:spacing w:lineRule="auto" w:line="276" w:before="0" w:after="120"/>
+              <w:rPr/>
+            </w:pPr>
+            <w:r>
+              <w:rPr>
+                <w:rFonts w:eastAsia="Times New Roman" w:cs="Times New Roman"/>
+                <w:b/>
+                <w:sz w:val="19"/>
+              </w:rPr>
+              <w:t>0,578</w:t>
+            </w:r>
+          </w:p>
+        </w:tc>
+        <w:tc>
+          <w:tcPr>
+            <w:tcW w:w="1248" w:type="dxa"/>
+            <w:tcBorders/>
+          </w:tcPr>
+          <w:p>
+            <w:pPr>
+              <w:pStyle w:val="Normal"/>
+              <w:widowControl w:val="false"/>
+              <w:spacing w:lineRule="auto" w:line="276" w:before="0" w:after="120"/>
+              <w:rPr/>
+            </w:pPr>
+            <w:r>
+              <w:rPr>
+                <w:rFonts w:eastAsia="Times New Roman" w:cs="Times New Roman"/>
+                <w:b/>
+                <w:sz w:val="19"/>
+              </w:rPr>
+              <w:t>1,360</w:t>
+            </w:r>
+          </w:p>
+        </w:tc>
+        <w:tc>
+          <w:tcPr>
+            <w:tcW w:w="1248" w:type="dxa"/>
+            <w:tcBorders/>
+          </w:tcPr>
+          <w:p>
+            <w:pPr>
+              <w:pStyle w:val="Normal"/>
+              <w:widowControl w:val="false"/>
+              <w:spacing w:lineRule="auto" w:line="276" w:before="0" w:after="120"/>
+              <w:rPr/>
+            </w:pPr>
+            <w:r>
+              <w:rPr>
+                <w:rFonts w:eastAsia="Times New Roman" w:cs="Times New Roman"/>
+                <w:b/>
+                <w:sz w:val="19"/>
+              </w:rPr>
+              <w:t>0,334</w:t>
+            </w:r>
+          </w:p>
+        </w:tc>
+      </w:tr>
+    </w:tbl>
+    <w:p>
+      <w:pPr>
+        <w:pStyle w:val="Normal"/>
+        <w:spacing w:lineRule="auto" w:line="360"/>
+        <w:ind w:firstLine="709"/>
+        <w:jc w:val="both"/>
+        <w:rPr/>
+      </w:pPr>
+      <w:r>
+        <w:rPr>
+          <w:iCs/>
+          <w:rFonts w:eastAsia="Times New Roman" w:cs="Times New Roman"/>
+        </w:rPr>
+        <w:t xml:space="preserve">La propuesta optimizada con la aptitud orientada a la fusión conserva el mejor perfil de limpieza y estructura (Nabf = 0,041; SSIM = 0,782). El óptimo de Fo sobre el operador clásico (r = 25; m = 0,30) resulta competitivo en bordes y correlación al costo de 4,5 veces más artefactos, y el óptimo de Fo sobre la propuesta confirma su carácter trivial. La función de aptitud define el perfil del resultado: la orientada a la fusión es la adecuada para los objetivos de esta tesis, lo que refuerza H2.</w:t>
       </w:r>
     </w:p>
     <w:p>

</xml_diff>

<commit_message>
Integra los resultados M3FD en libro, avances, Excel, presentación y README
- Libro (61 págs): sección 5.5 retitulada (LLVIP y M3FD) y cerrada con el
  bloque de clases complementarias (Tabla 13); sexto hallazgo en 5.7,
  conclusión ampliada, RESUMEN/SUMMARY actualizados y referencia Liu et al.
  (2022). Se normalizan las negritas de las Tablas 12 y 13.
- Avances (29 págs): sección 13 con Tabla 10 y lectura; conclusiones a 14.
- Excel (12 hojas): hoja nueva Deteccion_M3FD (0 errores de fórmula).
- Presentación (19 láminas): lámina de clases complementarias con barras
  agrupadas People/Lamp; agenda actualizada.
- README: resultados del experimento en la sección 8.1.
</commit_message>
<xml_diff>
--- a/docs/Tesis_Borrador_V3.docx
+++ b/docs/Tesis_Borrador_V3.docx
@@ -1187,7 +1187,7 @@
         <w:rPr>
           <w:rFonts w:eastAsia="Times New Roman" w:cs="Times New Roman"/>
         </w:rPr>
-        <w:t xml:space="preserve">La fusión de imágenes visible (VIS) e infrarroja (IR) es clave para la percepción computacional en condiciones adversas (vigilancia, conducción nocturna, búsqueda y rescate). Este trabajo propone la PROPUESTA NOVEDOSA, un método de fusión basado en la transformada Top-Hat que, sobre una única escala, promedia las respuestas de cuatro elementos estructurantes lineales (0°, 45°, 90°, 135°) y las suma a la respuesta de un disco para obtener transformadas Top-Hat y Bottom-Hat óptimas; la reconstrucción sigue el esquema aditivo–sustractivo de Bala et al., y el radio r del banco de elementos estructurantes y el peso de contraste m se ajustan automáticamente por Optimización por Enjambre de Partículas (PSO), cuya configuración se selecciona mediante un barrido sistemático de 25 combinaciones de partículas e iteraciones (2–10 × 10–50), replicando el diseño experimental de Ortega y Espinoza (2025). Se lo compara con seis métodos: cinco representativos del estado del arte —pirámide de Laplace (LP), Ratio of low-pass Pyramid (RP), wavelet discreta (DWT), Dual-Tree Complex Wavelet (DTCWT) y curvelet (CVT)— y la metodología clásica de la transformada Top-Hat, sobre el TNO Image Fusion Dataset, con doce métricas sin referencia bajo pruebas no paramétricas (Friedman y Wilcoxon con corrección de Holm). En su configuración óptima (PSO: r=25, m=0,070) la propuesta obtiene la menor tasa de artefactos del estudio (Nabf=0,041, 2,7 veces menos que el mejor rival) y la mayor similitud estructural (SSIM=0,782), quedando segunda en preservación de bordes, correlación y fidelidad visual (Qabf=0,500; SCD=1,450; VIF=0,368), a milésimas del líder de cada métrica; la metodología clásica Top-Hat solo la supera en métricas de actividad bruta al costo del mayor nivel de artefactos del estudio (Nabf=0,585). Como evaluación orientada a tarea, el reentrenamiento de un detector (YOLOv8n) sobre el conjunto etiquetado LLVIP muestra que toda fusión supera con claridad al visible solo (mAP@0,5 de 0,81 a 0,93–0,95), aunque el infrarrojo solo es la modalidad más fuerte (0,957) y la propuesta resulta competitiva (0,936) sin liderar, evidenciando que la superioridad en calidad de imagen no se traslada automáticamente a la detección. Se concluye que la propuesta mejora la calidad de fusión —en particular la limpieza y la fidelidad estructural— frente a la metodología clásica Top-Hat y al estado del arte, manteniendo bajo costo computacional e interpretabilidad morfológica.</w:t>
+        <w:t xml:space="preserve">La fusión de imágenes visible (VIS) e infrarroja (IR) es clave para la percepción computacional en condiciones adversas (vigilancia, conducción nocturna, búsqueda y rescate). Este trabajo propone la PROPUESTA NOVEDOSA, un método de fusión basado en la transformada Top-Hat que, sobre una única escala, promedia las respuestas de cuatro elementos estructurantes lineales (0°, 45°, 90°, 135°) y las suma a la respuesta de un disco para obtener transformadas Top-Hat y Bottom-Hat óptimas; la reconstrucción sigue el esquema aditivo–sustractivo de Bala et al., y el radio r del banco de elementos estructurantes y el peso de contraste m se ajustan automáticamente por Optimización por Enjambre de Partículas (PSO), cuya configuración se selecciona mediante un barrido sistemático de 25 combinaciones de partículas e iteraciones (2–10 × 10–50), replicando el diseño experimental de Ortega y Espinoza (2025). Se lo compara con seis métodos: cinco representativos del estado del arte —pirámide de Laplace (LP), Ratio of low-pass Pyramid (RP), wavelet discreta (DWT), Dual-Tree Complex Wavelet (DTCWT) y curvelet (CVT)— y la metodología clásica de la transformada Top-Hat, sobre el TNO Image Fusion Dataset, con doce métricas sin referencia bajo pruebas no paramétricas (Friedman y Wilcoxon con corrección de Holm). En su configuración óptima (PSO: r=25, m=0,070) la propuesta obtiene la menor tasa de artefactos del estudio (Nabf=0,041, 2,7 veces menos que el mejor rival) y la mayor similitud estructural (SSIM=0,782), quedando segunda en preservación de bordes, correlación y fidelidad visual (Qabf=0,500; SCD=1,450; VIF=0,368), a milésimas del líder de cada métrica; la metodología clásica Top-Hat solo la supera en métricas de actividad bruta al costo del mayor nivel de artefactos del estudio (Nabf=0,585). Como evaluación orientada a tarea, el reentrenamiento de un detector (YOLOv8n) sobre el conjunto etiquetado LLVIP muestra que toda fusión supera con claridad al visible solo (mAP@0,5 de 0,81 a 0,93–0,95), aunque el infrarrojo solo es la modalidad más fuerte (0,957) y la propuesta resulta competitiva (0,936) sin liderar, evidenciando que la superioridad en calidad de imagen no se traslada automáticamente a la detección. En un experimento complementario sobre M3FD, con dos clases de visibilidad opuesta (personas/IR y luces/VIS) y un único detector entrenado con ambas modalidades, la fusión detecta ambas clases en una sola imagen y la propuesta es la mejor fusión del estudio (mAP@0,5 = 0,239). Se concluye que la propuesta mejora la calidad de fusión —en particular la limpieza y la fidelidad estructural— frente a la metodología clásica Top-Hat y al estado del arte, manteniendo bajo costo computacional e interpretabilidad morfológica.</w:t>
       </w:r>
     </w:p>
     <w:p>
@@ -1243,7 +1243,7 @@
         <w:rPr>
           <w:rFonts w:eastAsia="Times New Roman" w:cs="Times New Roman"/>
         </w:rPr>
-        <w:t xml:space="preserve">Visible (VIS) and infrared (IR) image fusion is key for computer perception under adverse conditions (surveillance, night driving, search and rescue). This work proposes the NOVEL PROPOSAL, a fusion method based on the Top-Hat transform that, on a single scale, averages the responses of four linear structuring elements (0°, 45°, 90°, 135°) and adds them to the disk response to obtain optimal Top-Hat and Bottom-Hat transforms; reconstruction follows the additive–subtractive scheme of Bala et al., and the structuring-element radius r and the contrast weight m are tuned automatically by Particle Swarm Optimization (PSO), whose configuration is selected through a systematic sweep of 25 particle/iteration combinations (2–10 × 10–50), replicating the experimental design of Ortega and Espinoza (2025). It is compared against six methods: five representative of the state of the art —Laplacian pyramid (LP), Ratio of low-pass Pyramid (RP), Discrete Wavelet Transform (DWT), Dual-Tree Complex Wavelet Transform (DTCWT) and Curvelet (CVT)— plus the classical Top-Hat fusion methodology, on the TNO Image Fusion Dataset, using twelve no-reference metrics under non-parametric testing (Friedman, Wilcoxon with Holm correction). At its optimal configuration (PSO: r=25, m=0.070) the proposal attains the lowest artifact rate of the study (Nabf=0.041, 2.7 times less than the best rival) and the highest structural similarity (SSIM=0.782), ranking second in edge preservation, correlation and visual fidelity (Qabf=0.500; SCD=1.450; VIF=0.368), within thousandths of each metric leader; the classical Top-Hat only surpasses it in raw-activity metrics at the cost of the highest artifact level in the study (Nabf=0.585). As a task-oriented evaluation, retraining a detector (YOLOv8n) on the labeled LLVIP dataset shows that every fusion clearly outperforms the visible modality alone (mAP@0.5 from 0.81 to 0.93–0.95), although the infrared alone remains the strongest modality (0.957) and the proposal is competitive (0.936) without leading, evidencing that superiority in image quality does not automatically transfer to detection. We conclude that the proposal improves fusion quality —particularly cleanliness and structural fidelity— over the classical Top-Hat methodology and the state of the art, while keeping low computational cost and morphological interpretability.</w:t>
+        <w:t xml:space="preserve">Visible (VIS) and infrared (IR) image fusion is key for computer perception under adverse conditions (surveillance, night driving, search and rescue). This work proposes the NOVEL PROPOSAL, a fusion method based on the Top-Hat transform that, on a single scale, averages the responses of four linear structuring elements (0°, 45°, 90°, 135°) and adds them to the disk response to obtain optimal Top-Hat and Bottom-Hat transforms; reconstruction follows the additive–subtractive scheme of Bala et al., and the structuring-element radius r and the contrast weight m are tuned automatically by Particle Swarm Optimization (PSO), whose configuration is selected through a systematic sweep of 25 particle/iteration combinations (2–10 × 10–50), replicating the experimental design of Ortega and Espinoza (2025). It is compared against six methods: five representative of the state of the art —Laplacian pyramid (LP), Ratio of low-pass Pyramid (RP), Discrete Wavelet Transform (DWT), Dual-Tree Complex Wavelet Transform (DTCWT) and Curvelet (CVT)— plus the classical Top-Hat fusion methodology, on the TNO Image Fusion Dataset, using twelve no-reference metrics under non-parametric testing (Friedman, Wilcoxon with Holm correction). At its optimal configuration (PSO: r=25, m=0.070) the proposal attains the lowest artifact rate of the study (Nabf=0.041, 2.7 times less than the best rival) and the highest structural similarity (SSIM=0.782), ranking second in edge preservation, correlation and visual fidelity (Qabf=0.500; SCD=1.450; VIF=0.368), within thousandths of each metric leader; the classical Top-Hat only surpasses it in raw-activity metrics at the cost of the highest artifact level in the study (Nabf=0.585). As a task-oriented evaluation, retraining a detector (YOLOv8n) on the labeled LLVIP dataset shows that every fusion clearly outperforms the visible modality alone (mAP@0.5 from 0.81 to 0.93–0.95), although the infrared alone remains the strongest modality (0.957) and the proposal is competitive (0.936) without leading, evidencing that superiority in image quality does not automatically transfer to detection. In a complementary experiment on M3FD, with two classes of opposite visibility (people/IR and lamps/VIS) and a single detector trained on both modalities, fusion detects both classes in a single image and the proposal is the best fusion in the study (mAP@0.5 = 0.239). We conclude that the proposal improves fusion quality —particularly cleanliness and structural fidelity— over the classical Top-Hat methodology and the state of the art, while keeping low computational cost and morphological interpretability.</w:t>
       </w:r>
     </w:p>
     <w:p>
@@ -2611,7 +2611,7 @@
           <w:b w:val="false"/>
           <w:sz w:val="24"/>
         </w:rPr>
-        <w:t>5.5 Evaluación orientada a tarea: detección con YOLO en LLVIP</w:t>
+        <w:t>5.5 Evaluación orientada a tarea: detección con YOLO (LLVIP y M3FD)</w:t>
         <w:tab/>
         <w:t>48</w:t>
       </w:r>
@@ -5124,6 +5124,21 @@
           <w:sz w:val="21"/>
         </w:rPr>
         <w:t xml:space="preserve">Tabla 12. Ablación de la función de aptitud: óptimos de F_apt y de Fo sobre los 20 pares.</w:t>
+      </w:r>
+    </w:p>
+    <w:p>
+      <w:pPr>
+        <w:pStyle w:val="Normal"/>
+        <w:spacing w:lineRule="auto" w:line="276" w:before="0" w:after="40"/>
+        <w:jc w:val="both"/>
+        <w:rPr/>
+      </w:pPr>
+      <w:r>
+        <w:rPr>
+          <w:rFonts w:eastAsia="Times New Roman" w:cs="Times New Roman"/>
+          <w:sz w:val="21"/>
+        </w:rPr>
+        <w:t xml:space="preserve">Tabla 13. Clases complementarias en M3FD: AP@0,5 por clase y mAP global con un detector único VIS+IR.</w:t>
       </w:r>
     </w:p>
     <w:p>
@@ -28013,7 +28028,7 @@
           <w:color w:val="000000"/>
           <w:sz w:val="24"/>
         </w:rPr>
-        <w:t>5.5 Evaluación orientada a tarea: detección con YOLO en LLVIP</w:t>
+        <w:t>5.5 Evaluación orientada a tarea: detección con YOLO (LLVIP y M3FD)</w:t>
       </w:r>
     </w:p>
     <w:p>
@@ -29477,6 +29492,1395 @@
           <w:rFonts w:eastAsia="Times New Roman" w:cs="Times New Roman"/>
         </w:rPr>
         <w:t>La Tabla 9 admite tres lecturas. Primero, toda fusión mejora con claridad sobre el visible solo (mAP@0,5 de 0,808 a una banda de 0,926–0,949, es decir entre +0,12 y +0,14 puntos): cuando el canal visible es débil —escenas nocturnas—, fusionar aporta información decisiva. Segundo, el infrarrojo solo es la modalidad más fuerte (mAP@0,5 = 0,957; mAP@0,5:0,95 = 0,663) y ninguna fusión lo supera, coherente con que LLVIP es detección de peatones en baja luz, donde la firma térmica domina. Tercero, entre las siete fusiones las diferencias son pequeñas (mAP@0,5 en una banda estrecha de 0,926 a 0,949): la pirámide de Laplace encabeza (0,949), seguida de cerca por DTCWT (0,948) y DWT (0,946), mientras que la Propuesta Novedosa resulta competitiva (0,936) —prácticamente empatada con la metodología clásica Top-Hat (0,938) y a 1,3 puntos del mejor— sin ser líder. La conclusión es matizada y relevante: la superioridad de la propuesta en las métricas de calidad de imagen (Nabf, SSIM) no se traslada automáticamente a la tarea de detección, donde la banda de fusiones es estrecha y la modalidad térmica domina; la elección del método depende del criterio operativo prioritario —en consonancia con lo señalado por Singh et al. (2023)—.</w:t>
+      </w:r>
+    </w:p>
+    <w:p>
+      <w:pPr>
+        <w:pStyle w:val="Normal"/>
+        <w:spacing w:lineRule="auto" w:line="360"/>
+        <w:ind w:firstLine="709"/>
+        <w:jc w:val="both"/>
+        <w:rPr/>
+      </w:pPr>
+      <w:r>
+        <w:rPr>
+          <w:i/>
+          <w:iCs/>
+          <w:rFonts w:eastAsia="Times New Roman" w:cs="Times New Roman"/>
+        </w:rPr>
+        <w:t xml:space="preserve">Detección con clases complementarias (M3FD). </w:t>
+      </w:r>
+      <w:r>
+        <w:rPr>
+          <w:iCs/>
+          <w:rFonts w:eastAsia="Times New Roman" w:cs="Times New Roman"/>
+        </w:rPr>
+        <w:t xml:space="preserve">Como complemento se diseñó un experimento de clases complementarias sobre el dataset M3FD (Liu et al., 2022): 2.000 pares de entrenamiento y 500 de validación con seis clases anotadas, dos de ellas de visibilidad opuesta —las personas dominan en el infrarrojo por su firma térmica y las luces (Lamp) son esencialmente visibles solo en el canal visible—. Un único detector YOLOv8n se entrenó con las imágenes de ambas modalidades mezcladas (4.000 imágenes, 40 épocas, etiquetas compartidas) y se evaluó por inferencia, sin reentrenar, sobre la validación de cada modalidad y de cada método de fusión, incluidos los dos óptimos del PSO de la sección 5.6.</w:t>
+      </w:r>
+    </w:p>
+    <w:p>
+      <w:pPr>
+        <w:pStyle w:val="Normal"/>
+        <w:spacing w:lineRule="auto" w:line="276"/>
+        <w:jc w:val="both"/>
+        <w:rPr/>
+      </w:pPr>
+      <w:r>
+        <w:rPr>
+          <w:rFonts w:eastAsia="Times New Roman" w:cs="Times New Roman"/>
+          <w:i/>
+          <w:sz w:val="18"/>
+        </w:rPr>
+        <w:t xml:space="preserve">Tabla 13. Clases complementarias en M3FD: AP@0,5 por clase y mAP global con un detector único entrenado sobre VIS+IR (medias sobre 500 imágenes de validación).</w:t>
+      </w:r>
+    </w:p>
+    <w:tbl>
+      <w:tblPr>
+        <w:tblW w:w="9102" w:type="dxa"/>
+        <w:jc w:val="start"/>
+        <w:tblInd w:w="0" w:type="dxa"/>
+        <w:tblLayout w:type="fixed"/>
+        <w:tblCellMar>
+          <w:top w:w="0" w:type="dxa"/>
+          <w:start w:w="108" w:type="dxa"/>
+          <w:bottom w:w="0" w:type="dxa"/>
+          <w:end w:w="108" w:type="dxa"/>
+        </w:tblCellMar>
+        <w:tblLook w:noHBand="0" w:noVBand="1" w:firstColumn="1" w:lastRow="0" w:lastColumn="0" w:firstRow="1" w:val="04a0"/>
+      </w:tblPr>
+      <w:tblGrid>
+        <w:gridCol w:w="3120"/>
+        <w:gridCol w:w="1560"/>
+        <w:gridCol w:w="1560"/>
+        <w:gridCol w:w="1560"/>
+        <w:gridCol w:w="1560"/>
+      </w:tblGrid>
+      <w:tr>
+        <w:trPr/>
+        <w:tc>
+          <w:tcPr>
+            <w:tcW w:w="3120" w:type="dxa"/>
+            <w:tcBorders/>
+            <w:shd w:val="clear" w:fill="F2F2F2"/>
+          </w:tcPr>
+          <w:p>
+            <w:pPr>
+              <w:pStyle w:val="Normal"/>
+              <w:widowControl w:val="false"/>
+              <w:spacing w:lineRule="auto" w:line="276" w:before="0" w:after="120"/>
+              <w:rPr/>
+            </w:pPr>
+            <w:r>
+              <w:rPr>
+                <w:rFonts w:eastAsia="Times New Roman" w:cs="Times New Roman"/>
+                <w:b/>
+                <w:sz w:val="19"/>
+              </w:rPr>
+              <w:t>Entrada del detector</w:t>
+            </w:r>
+          </w:p>
+        </w:tc>
+        <w:tc>
+          <w:tcPr>
+            <w:tcW w:w="1560" w:type="dxa"/>
+            <w:tcBorders/>
+            <w:shd w:val="clear" w:fill="F2F2F2"/>
+          </w:tcPr>
+          <w:p>
+            <w:pPr>
+              <w:pStyle w:val="Normal"/>
+              <w:widowControl w:val="false"/>
+              <w:spacing w:lineRule="auto" w:line="276" w:before="0" w:after="120"/>
+              <w:rPr/>
+            </w:pPr>
+            <w:r>
+              <w:rPr>
+                <w:rFonts w:eastAsia="Times New Roman" w:cs="Times New Roman"/>
+                <w:b/>
+                <w:sz w:val="19"/>
+              </w:rPr>
+              <w:t>AP People ↑</w:t>
+            </w:r>
+          </w:p>
+        </w:tc>
+        <w:tc>
+          <w:tcPr>
+            <w:tcW w:w="1560" w:type="dxa"/>
+            <w:tcBorders/>
+            <w:shd w:val="clear" w:fill="F2F2F2"/>
+          </w:tcPr>
+          <w:p>
+            <w:pPr>
+              <w:pStyle w:val="Normal"/>
+              <w:widowControl w:val="false"/>
+              <w:spacing w:lineRule="auto" w:line="276" w:before="0" w:after="120"/>
+              <w:rPr/>
+            </w:pPr>
+            <w:r>
+              <w:rPr>
+                <w:rFonts w:eastAsia="Times New Roman" w:cs="Times New Roman"/>
+                <w:b/>
+                <w:sz w:val="19"/>
+              </w:rPr>
+              <w:t>AP Lamp ↑</w:t>
+            </w:r>
+          </w:p>
+        </w:tc>
+        <w:tc>
+          <w:tcPr>
+            <w:tcW w:w="1560" w:type="dxa"/>
+            <w:tcBorders/>
+            <w:shd w:val="clear" w:fill="F2F2F2"/>
+          </w:tcPr>
+          <w:p>
+            <w:pPr>
+              <w:pStyle w:val="Normal"/>
+              <w:widowControl w:val="false"/>
+              <w:spacing w:lineRule="auto" w:line="276" w:before="0" w:after="120"/>
+              <w:rPr/>
+            </w:pPr>
+            <w:r>
+              <w:rPr>
+                <w:rFonts w:eastAsia="Times New Roman" w:cs="Times New Roman"/>
+                <w:b/>
+                <w:sz w:val="19"/>
+              </w:rPr>
+              <w:t>Promedio del par ↑</w:t>
+            </w:r>
+          </w:p>
+        </w:tc>
+        <w:tc>
+          <w:tcPr>
+            <w:tcW w:w="1560" w:type="dxa"/>
+            <w:tcBorders/>
+            <w:shd w:val="clear" w:fill="F2F2F2"/>
+          </w:tcPr>
+          <w:p>
+            <w:pPr>
+              <w:pStyle w:val="Normal"/>
+              <w:widowControl w:val="false"/>
+              <w:spacing w:lineRule="auto" w:line="276" w:before="0" w:after="120"/>
+              <w:rPr/>
+            </w:pPr>
+            <w:r>
+              <w:rPr>
+                <w:rFonts w:eastAsia="Times New Roman" w:cs="Times New Roman"/>
+                <w:b/>
+                <w:sz w:val="19"/>
+              </w:rPr>
+              <w:t>mAP@0,5 ↑</w:t>
+            </w:r>
+          </w:p>
+        </w:tc>
+      </w:tr>
+      <w:tr>
+        <w:trPr/>
+        <w:tc>
+          <w:tcPr>
+            <w:tcW w:w="3120" w:type="dxa"/>
+            <w:tcBorders/>
+          </w:tcPr>
+          <w:p>
+            <w:pPr>
+              <w:pStyle w:val="Normal"/>
+              <w:widowControl w:val="false"/>
+              <w:spacing w:lineRule="auto" w:line="276" w:before="0" w:after="120"/>
+              <w:rPr/>
+            </w:pPr>
+            <w:r>
+              <w:rPr>
+                <w:rFonts w:eastAsia="Times New Roman" w:cs="Times New Roman"/>
+                <w:sz w:val="19"/>
+              </w:rPr>
+              <w:t>VIS (solo)</w:t>
+            </w:r>
+          </w:p>
+        </w:tc>
+        <w:tc>
+          <w:tcPr>
+            <w:tcW w:w="1560" w:type="dxa"/>
+            <w:tcBorders/>
+          </w:tcPr>
+          <w:p>
+            <w:pPr>
+              <w:pStyle w:val="Normal"/>
+              <w:widowControl w:val="false"/>
+              <w:spacing w:lineRule="auto" w:line="276" w:before="0" w:after="120"/>
+              <w:rPr/>
+            </w:pPr>
+            <w:r>
+              <w:rPr>
+                <w:rFonts w:eastAsia="Times New Roman" w:cs="Times New Roman"/>
+                <w:sz w:val="19"/>
+              </w:rPr>
+              <w:t>0,178</w:t>
+            </w:r>
+          </w:p>
+        </w:tc>
+        <w:tc>
+          <w:tcPr>
+            <w:tcW w:w="1560" w:type="dxa"/>
+            <w:tcBorders/>
+          </w:tcPr>
+          <w:p>
+            <w:pPr>
+              <w:pStyle w:val="Normal"/>
+              <w:widowControl w:val="false"/>
+              <w:spacing w:lineRule="auto" w:line="276" w:before="0" w:after="120"/>
+              <w:rPr/>
+            </w:pPr>
+            <w:r>
+              <w:rPr>
+                <w:b/>
+                <w:rFonts w:eastAsia="Times New Roman" w:cs="Times New Roman"/>
+                <w:sz w:val="19"/>
+              </w:rPr>
+              <w:t>0,135</w:t>
+            </w:r>
+          </w:p>
+        </w:tc>
+        <w:tc>
+          <w:tcPr>
+            <w:tcW w:w="1560" w:type="dxa"/>
+            <w:tcBorders/>
+          </w:tcPr>
+          <w:p>
+            <w:pPr>
+              <w:pStyle w:val="Normal"/>
+              <w:widowControl w:val="false"/>
+              <w:spacing w:lineRule="auto" w:line="276" w:before="0" w:after="120"/>
+              <w:rPr/>
+            </w:pPr>
+            <w:r>
+              <w:rPr>
+                <w:rFonts w:eastAsia="Times New Roman" w:cs="Times New Roman"/>
+                <w:sz w:val="19"/>
+              </w:rPr>
+              <w:t>0,157</w:t>
+            </w:r>
+          </w:p>
+        </w:tc>
+        <w:tc>
+          <w:tcPr>
+            <w:tcW w:w="1560" w:type="dxa"/>
+            <w:tcBorders/>
+          </w:tcPr>
+          <w:p>
+            <w:pPr>
+              <w:pStyle w:val="Normal"/>
+              <w:widowControl w:val="false"/>
+              <w:spacing w:lineRule="auto" w:line="276" w:before="0" w:after="120"/>
+              <w:rPr/>
+            </w:pPr>
+            <w:r>
+              <w:rPr>
+                <w:b/>
+                <w:rFonts w:eastAsia="Times New Roman" w:cs="Times New Roman"/>
+                <w:sz w:val="19"/>
+              </w:rPr>
+              <w:t>0,245</w:t>
+            </w:r>
+          </w:p>
+        </w:tc>
+      </w:tr>
+      <w:tr>
+        <w:trPr/>
+        <w:tc>
+          <w:tcPr>
+            <w:tcW w:w="3120" w:type="dxa"/>
+            <w:tcBorders/>
+          </w:tcPr>
+          <w:p>
+            <w:pPr>
+              <w:pStyle w:val="Normal"/>
+              <w:widowControl w:val="false"/>
+              <w:spacing w:lineRule="auto" w:line="276" w:before="0" w:after="120"/>
+              <w:rPr/>
+            </w:pPr>
+            <w:r>
+              <w:rPr>
+                <w:rFonts w:eastAsia="Times New Roman" w:cs="Times New Roman"/>
+                <w:sz w:val="19"/>
+              </w:rPr>
+              <w:t>IR (solo)</w:t>
+            </w:r>
+          </w:p>
+        </w:tc>
+        <w:tc>
+          <w:tcPr>
+            <w:tcW w:w="1560" w:type="dxa"/>
+            <w:tcBorders/>
+          </w:tcPr>
+          <w:p>
+            <w:pPr>
+              <w:pStyle w:val="Normal"/>
+              <w:widowControl w:val="false"/>
+              <w:spacing w:lineRule="auto" w:line="276" w:before="0" w:after="120"/>
+              <w:rPr/>
+            </w:pPr>
+            <w:r>
+              <w:rPr>
+                <w:b/>
+                <w:rFonts w:eastAsia="Times New Roman" w:cs="Times New Roman"/>
+                <w:sz w:val="19"/>
+              </w:rPr>
+              <w:t>0,220</w:t>
+            </w:r>
+          </w:p>
+        </w:tc>
+        <w:tc>
+          <w:tcPr>
+            <w:tcW w:w="1560" w:type="dxa"/>
+            <w:tcBorders/>
+          </w:tcPr>
+          <w:p>
+            <w:pPr>
+              <w:pStyle w:val="Normal"/>
+              <w:widowControl w:val="false"/>
+              <w:spacing w:lineRule="auto" w:line="276" w:before="0" w:after="120"/>
+              <w:rPr/>
+            </w:pPr>
+            <w:r>
+              <w:rPr>
+                <w:rFonts w:eastAsia="Times New Roman" w:cs="Times New Roman"/>
+                <w:sz w:val="19"/>
+              </w:rPr>
+              <w:t>0,018</w:t>
+            </w:r>
+          </w:p>
+        </w:tc>
+        <w:tc>
+          <w:tcPr>
+            <w:tcW w:w="1560" w:type="dxa"/>
+            <w:tcBorders/>
+          </w:tcPr>
+          <w:p>
+            <w:pPr>
+              <w:pStyle w:val="Normal"/>
+              <w:widowControl w:val="false"/>
+              <w:spacing w:lineRule="auto" w:line="276" w:before="0" w:after="120"/>
+              <w:rPr/>
+            </w:pPr>
+            <w:r>
+              <w:rPr>
+                <w:rFonts w:eastAsia="Times New Roman" w:cs="Times New Roman"/>
+                <w:sz w:val="19"/>
+              </w:rPr>
+              <w:t>0,119</w:t>
+            </w:r>
+          </w:p>
+        </w:tc>
+        <w:tc>
+          <w:tcPr>
+            <w:tcW w:w="1560" w:type="dxa"/>
+            <w:tcBorders/>
+          </w:tcPr>
+          <w:p>
+            <w:pPr>
+              <w:pStyle w:val="Normal"/>
+              <w:widowControl w:val="false"/>
+              <w:spacing w:lineRule="auto" w:line="276" w:before="0" w:after="120"/>
+              <w:rPr/>
+            </w:pPr>
+            <w:r>
+              <w:rPr>
+                <w:rFonts w:eastAsia="Times New Roman" w:cs="Times New Roman"/>
+                <w:sz w:val="19"/>
+              </w:rPr>
+              <w:t>0,191</w:t>
+            </w:r>
+          </w:p>
+        </w:tc>
+      </w:tr>
+      <w:tr>
+        <w:trPr/>
+        <w:tc>
+          <w:tcPr>
+            <w:tcW w:w="3120" w:type="dxa"/>
+            <w:tcBorders/>
+          </w:tcPr>
+          <w:p>
+            <w:pPr>
+              <w:pStyle w:val="Normal"/>
+              <w:widowControl w:val="false"/>
+              <w:spacing w:lineRule="auto" w:line="276" w:before="0" w:after="120"/>
+              <w:rPr/>
+            </w:pPr>
+            <w:r>
+              <w:rPr>
+                <w:rFonts w:eastAsia="Times New Roman" w:cs="Times New Roman"/>
+                <w:sz w:val="19"/>
+              </w:rPr>
+              <w:t>Pirámide de Laplace (LP)</w:t>
+            </w:r>
+          </w:p>
+        </w:tc>
+        <w:tc>
+          <w:tcPr>
+            <w:tcW w:w="1560" w:type="dxa"/>
+            <w:tcBorders/>
+          </w:tcPr>
+          <w:p>
+            <w:pPr>
+              <w:pStyle w:val="Normal"/>
+              <w:widowControl w:val="false"/>
+              <w:spacing w:lineRule="auto" w:line="276" w:before="0" w:after="120"/>
+              <w:rPr/>
+            </w:pPr>
+            <w:r>
+              <w:rPr>
+                <w:rFonts w:eastAsia="Times New Roman" w:cs="Times New Roman"/>
+                <w:sz w:val="19"/>
+              </w:rPr>
+              <w:t>0,147</w:t>
+            </w:r>
+          </w:p>
+        </w:tc>
+        <w:tc>
+          <w:tcPr>
+            <w:tcW w:w="1560" w:type="dxa"/>
+            <w:tcBorders/>
+          </w:tcPr>
+          <w:p>
+            <w:pPr>
+              <w:pStyle w:val="Normal"/>
+              <w:widowControl w:val="false"/>
+              <w:spacing w:lineRule="auto" w:line="276" w:before="0" w:after="120"/>
+              <w:rPr/>
+            </w:pPr>
+            <w:r>
+              <w:rPr>
+                <w:rFonts w:eastAsia="Times New Roman" w:cs="Times New Roman"/>
+                <w:sz w:val="19"/>
+              </w:rPr>
+              <w:t>0,096</w:t>
+            </w:r>
+          </w:p>
+        </w:tc>
+        <w:tc>
+          <w:tcPr>
+            <w:tcW w:w="1560" w:type="dxa"/>
+            <w:tcBorders/>
+          </w:tcPr>
+          <w:p>
+            <w:pPr>
+              <w:pStyle w:val="Normal"/>
+              <w:widowControl w:val="false"/>
+              <w:spacing w:lineRule="auto" w:line="276" w:before="0" w:after="120"/>
+              <w:rPr/>
+            </w:pPr>
+            <w:r>
+              <w:rPr>
+                <w:rFonts w:eastAsia="Times New Roman" w:cs="Times New Roman"/>
+                <w:sz w:val="19"/>
+              </w:rPr>
+              <w:t>0,122</w:t>
+            </w:r>
+          </w:p>
+        </w:tc>
+        <w:tc>
+          <w:tcPr>
+            <w:tcW w:w="1560" w:type="dxa"/>
+            <w:tcBorders/>
+          </w:tcPr>
+          <w:p>
+            <w:pPr>
+              <w:pStyle w:val="Normal"/>
+              <w:widowControl w:val="false"/>
+              <w:spacing w:lineRule="auto" w:line="276" w:before="0" w:after="120"/>
+              <w:rPr/>
+            </w:pPr>
+            <w:r>
+              <w:rPr>
+                <w:rFonts w:eastAsia="Times New Roman" w:cs="Times New Roman"/>
+                <w:sz w:val="19"/>
+              </w:rPr>
+              <w:t>0,215</w:t>
+            </w:r>
+          </w:p>
+        </w:tc>
+      </w:tr>
+      <w:tr>
+        <w:trPr/>
+        <w:tc>
+          <w:tcPr>
+            <w:tcW w:w="3120" w:type="dxa"/>
+            <w:tcBorders/>
+          </w:tcPr>
+          <w:p>
+            <w:pPr>
+              <w:pStyle w:val="Normal"/>
+              <w:widowControl w:val="false"/>
+              <w:spacing w:lineRule="auto" w:line="276" w:before="0" w:after="120"/>
+              <w:rPr/>
+            </w:pPr>
+            <w:r>
+              <w:rPr>
+                <w:rFonts w:eastAsia="Times New Roman" w:cs="Times New Roman"/>
+                <w:sz w:val="19"/>
+              </w:rPr>
+              <w:t>Ratio Pyramid (RP)</w:t>
+            </w:r>
+          </w:p>
+        </w:tc>
+        <w:tc>
+          <w:tcPr>
+            <w:tcW w:w="1560" w:type="dxa"/>
+            <w:tcBorders/>
+          </w:tcPr>
+          <w:p>
+            <w:pPr>
+              <w:pStyle w:val="Normal"/>
+              <w:widowControl w:val="false"/>
+              <w:spacing w:lineRule="auto" w:line="276" w:before="0" w:after="120"/>
+              <w:rPr/>
+            </w:pPr>
+            <w:r>
+              <w:rPr>
+                <w:rFonts w:eastAsia="Times New Roman" w:cs="Times New Roman"/>
+                <w:sz w:val="19"/>
+              </w:rPr>
+              <w:t>0,198</w:t>
+            </w:r>
+          </w:p>
+        </w:tc>
+        <w:tc>
+          <w:tcPr>
+            <w:tcW w:w="1560" w:type="dxa"/>
+            <w:tcBorders/>
+          </w:tcPr>
+          <w:p>
+            <w:pPr>
+              <w:pStyle w:val="Normal"/>
+              <w:widowControl w:val="false"/>
+              <w:spacing w:lineRule="auto" w:line="276" w:before="0" w:after="120"/>
+              <w:rPr/>
+            </w:pPr>
+            <w:r>
+              <w:rPr>
+                <w:rFonts w:eastAsia="Times New Roman" w:cs="Times New Roman"/>
+                <w:sz w:val="19"/>
+              </w:rPr>
+              <w:t>0,133</w:t>
+            </w:r>
+          </w:p>
+        </w:tc>
+        <w:tc>
+          <w:tcPr>
+            <w:tcW w:w="1560" w:type="dxa"/>
+            <w:tcBorders/>
+          </w:tcPr>
+          <w:p>
+            <w:pPr>
+              <w:pStyle w:val="Normal"/>
+              <w:widowControl w:val="false"/>
+              <w:spacing w:lineRule="auto" w:line="276" w:before="0" w:after="120"/>
+              <w:rPr/>
+            </w:pPr>
+            <w:r>
+              <w:rPr>
+                <w:b/>
+                <w:rFonts w:eastAsia="Times New Roman" w:cs="Times New Roman"/>
+                <w:sz w:val="19"/>
+              </w:rPr>
+              <w:t>0,165</w:t>
+            </w:r>
+          </w:p>
+        </w:tc>
+        <w:tc>
+          <w:tcPr>
+            <w:tcW w:w="1560" w:type="dxa"/>
+            <w:tcBorders/>
+          </w:tcPr>
+          <w:p>
+            <w:pPr>
+              <w:pStyle w:val="Normal"/>
+              <w:widowControl w:val="false"/>
+              <w:spacing w:lineRule="auto" w:line="276" w:before="0" w:after="120"/>
+              <w:rPr/>
+            </w:pPr>
+            <w:r>
+              <w:rPr>
+                <w:rFonts w:eastAsia="Times New Roman" w:cs="Times New Roman"/>
+                <w:sz w:val="19"/>
+              </w:rPr>
+              <w:t>0,231</w:t>
+            </w:r>
+          </w:p>
+        </w:tc>
+      </w:tr>
+      <w:tr>
+        <w:trPr/>
+        <w:tc>
+          <w:tcPr>
+            <w:tcW w:w="3120" w:type="dxa"/>
+            <w:tcBorders/>
+          </w:tcPr>
+          <w:p>
+            <w:pPr>
+              <w:pStyle w:val="Normal"/>
+              <w:widowControl w:val="false"/>
+              <w:spacing w:lineRule="auto" w:line="276" w:before="0" w:after="120"/>
+              <w:rPr/>
+            </w:pPr>
+            <w:r>
+              <w:rPr>
+                <w:rFonts w:eastAsia="Times New Roman" w:cs="Times New Roman"/>
+                <w:sz w:val="19"/>
+              </w:rPr>
+              <w:t>Wavelet discreta (DWT)</w:t>
+            </w:r>
+          </w:p>
+        </w:tc>
+        <w:tc>
+          <w:tcPr>
+            <w:tcW w:w="1560" w:type="dxa"/>
+            <w:tcBorders/>
+          </w:tcPr>
+          <w:p>
+            <w:pPr>
+              <w:pStyle w:val="Normal"/>
+              <w:widowControl w:val="false"/>
+              <w:spacing w:lineRule="auto" w:line="276" w:before="0" w:after="120"/>
+              <w:rPr/>
+            </w:pPr>
+            <w:r>
+              <w:rPr>
+                <w:rFonts w:eastAsia="Times New Roman" w:cs="Times New Roman"/>
+                <w:sz w:val="19"/>
+              </w:rPr>
+              <w:t>0,165</w:t>
+            </w:r>
+          </w:p>
+        </w:tc>
+        <w:tc>
+          <w:tcPr>
+            <w:tcW w:w="1560" w:type="dxa"/>
+            <w:tcBorders/>
+          </w:tcPr>
+          <w:p>
+            <w:pPr>
+              <w:pStyle w:val="Normal"/>
+              <w:widowControl w:val="false"/>
+              <w:spacing w:lineRule="auto" w:line="276" w:before="0" w:after="120"/>
+              <w:rPr/>
+            </w:pPr>
+            <w:r>
+              <w:rPr>
+                <w:rFonts w:eastAsia="Times New Roman" w:cs="Times New Roman"/>
+                <w:sz w:val="19"/>
+              </w:rPr>
+              <w:t>0,110</w:t>
+            </w:r>
+          </w:p>
+        </w:tc>
+        <w:tc>
+          <w:tcPr>
+            <w:tcW w:w="1560" w:type="dxa"/>
+            <w:tcBorders/>
+          </w:tcPr>
+          <w:p>
+            <w:pPr>
+              <w:pStyle w:val="Normal"/>
+              <w:widowControl w:val="false"/>
+              <w:spacing w:lineRule="auto" w:line="276" w:before="0" w:after="120"/>
+              <w:rPr/>
+            </w:pPr>
+            <w:r>
+              <w:rPr>
+                <w:rFonts w:eastAsia="Times New Roman" w:cs="Times New Roman"/>
+                <w:sz w:val="19"/>
+              </w:rPr>
+              <w:t>0,137</w:t>
+            </w:r>
+          </w:p>
+        </w:tc>
+        <w:tc>
+          <w:tcPr>
+            <w:tcW w:w="1560" w:type="dxa"/>
+            <w:tcBorders/>
+          </w:tcPr>
+          <w:p>
+            <w:pPr>
+              <w:pStyle w:val="Normal"/>
+              <w:widowControl w:val="false"/>
+              <w:spacing w:lineRule="auto" w:line="276" w:before="0" w:after="120"/>
+              <w:rPr/>
+            </w:pPr>
+            <w:r>
+              <w:rPr>
+                <w:rFonts w:eastAsia="Times New Roman" w:cs="Times New Roman"/>
+                <w:sz w:val="19"/>
+              </w:rPr>
+              <w:t>0,228</w:t>
+            </w:r>
+          </w:p>
+        </w:tc>
+      </w:tr>
+      <w:tr>
+        <w:trPr/>
+        <w:tc>
+          <w:tcPr>
+            <w:tcW w:w="3120" w:type="dxa"/>
+            <w:tcBorders/>
+          </w:tcPr>
+          <w:p>
+            <w:pPr>
+              <w:pStyle w:val="Normal"/>
+              <w:widowControl w:val="false"/>
+              <w:spacing w:lineRule="auto" w:line="276" w:before="0" w:after="120"/>
+              <w:rPr/>
+            </w:pPr>
+            <w:r>
+              <w:rPr>
+                <w:rFonts w:eastAsia="Times New Roman" w:cs="Times New Roman"/>
+                <w:sz w:val="19"/>
+              </w:rPr>
+              <w:t>Dual-Tree Complex Wavelet (DTCWT)</w:t>
+            </w:r>
+          </w:p>
+        </w:tc>
+        <w:tc>
+          <w:tcPr>
+            <w:tcW w:w="1560" w:type="dxa"/>
+            <w:tcBorders/>
+          </w:tcPr>
+          <w:p>
+            <w:pPr>
+              <w:pStyle w:val="Normal"/>
+              <w:widowControl w:val="false"/>
+              <w:spacing w:lineRule="auto" w:line="276" w:before="0" w:after="120"/>
+              <w:rPr/>
+            </w:pPr>
+            <w:r>
+              <w:rPr>
+                <w:rFonts w:eastAsia="Times New Roman" w:cs="Times New Roman"/>
+                <w:sz w:val="19"/>
+              </w:rPr>
+              <w:t>0,159</w:t>
+            </w:r>
+          </w:p>
+        </w:tc>
+        <w:tc>
+          <w:tcPr>
+            <w:tcW w:w="1560" w:type="dxa"/>
+            <w:tcBorders/>
+          </w:tcPr>
+          <w:p>
+            <w:pPr>
+              <w:pStyle w:val="Normal"/>
+              <w:widowControl w:val="false"/>
+              <w:spacing w:lineRule="auto" w:line="276" w:before="0" w:after="120"/>
+              <w:rPr/>
+            </w:pPr>
+            <w:r>
+              <w:rPr>
+                <w:rFonts w:eastAsia="Times New Roman" w:cs="Times New Roman"/>
+                <w:sz w:val="19"/>
+              </w:rPr>
+              <w:t>0,114</w:t>
+            </w:r>
+          </w:p>
+        </w:tc>
+        <w:tc>
+          <w:tcPr>
+            <w:tcW w:w="1560" w:type="dxa"/>
+            <w:tcBorders/>
+          </w:tcPr>
+          <w:p>
+            <w:pPr>
+              <w:pStyle w:val="Normal"/>
+              <w:widowControl w:val="false"/>
+              <w:spacing w:lineRule="auto" w:line="276" w:before="0" w:after="120"/>
+              <w:rPr/>
+            </w:pPr>
+            <w:r>
+              <w:rPr>
+                <w:rFonts w:eastAsia="Times New Roman" w:cs="Times New Roman"/>
+                <w:sz w:val="19"/>
+              </w:rPr>
+              <w:t>0,137</w:t>
+            </w:r>
+          </w:p>
+        </w:tc>
+        <w:tc>
+          <w:tcPr>
+            <w:tcW w:w="1560" w:type="dxa"/>
+            <w:tcBorders/>
+          </w:tcPr>
+          <w:p>
+            <w:pPr>
+              <w:pStyle w:val="Normal"/>
+              <w:widowControl w:val="false"/>
+              <w:spacing w:lineRule="auto" w:line="276" w:before="0" w:after="120"/>
+              <w:rPr/>
+            </w:pPr>
+            <w:r>
+              <w:rPr>
+                <w:rFonts w:eastAsia="Times New Roman" w:cs="Times New Roman"/>
+                <w:sz w:val="19"/>
+              </w:rPr>
+              <w:t>0,229</w:t>
+            </w:r>
+          </w:p>
+        </w:tc>
+      </w:tr>
+      <w:tr>
+        <w:trPr/>
+        <w:tc>
+          <w:tcPr>
+            <w:tcW w:w="3120" w:type="dxa"/>
+            <w:tcBorders/>
+          </w:tcPr>
+          <w:p>
+            <w:pPr>
+              <w:pStyle w:val="Normal"/>
+              <w:widowControl w:val="false"/>
+              <w:spacing w:lineRule="auto" w:line="276" w:before="0" w:after="120"/>
+              <w:rPr/>
+            </w:pPr>
+            <w:r>
+              <w:rPr>
+                <w:rFonts w:eastAsia="Times New Roman" w:cs="Times New Roman"/>
+                <w:sz w:val="19"/>
+              </w:rPr>
+              <w:t>Curvelet (CVT)</w:t>
+            </w:r>
+          </w:p>
+        </w:tc>
+        <w:tc>
+          <w:tcPr>
+            <w:tcW w:w="1560" w:type="dxa"/>
+            <w:tcBorders/>
+          </w:tcPr>
+          <w:p>
+            <w:pPr>
+              <w:pStyle w:val="Normal"/>
+              <w:widowControl w:val="false"/>
+              <w:spacing w:lineRule="auto" w:line="276" w:before="0" w:after="120"/>
+              <w:rPr/>
+            </w:pPr>
+            <w:r>
+              <w:rPr>
+                <w:rFonts w:eastAsia="Times New Roman" w:cs="Times New Roman"/>
+                <w:sz w:val="19"/>
+              </w:rPr>
+              <w:t>0,167</w:t>
+            </w:r>
+          </w:p>
+        </w:tc>
+        <w:tc>
+          <w:tcPr>
+            <w:tcW w:w="1560" w:type="dxa"/>
+            <w:tcBorders/>
+          </w:tcPr>
+          <w:p>
+            <w:pPr>
+              <w:pStyle w:val="Normal"/>
+              <w:widowControl w:val="false"/>
+              <w:spacing w:lineRule="auto" w:line="276" w:before="0" w:after="120"/>
+              <w:rPr/>
+            </w:pPr>
+            <w:r>
+              <w:rPr>
+                <w:rFonts w:eastAsia="Times New Roman" w:cs="Times New Roman"/>
+                <w:sz w:val="19"/>
+              </w:rPr>
+              <w:t>0,100</w:t>
+            </w:r>
+          </w:p>
+        </w:tc>
+        <w:tc>
+          <w:tcPr>
+            <w:tcW w:w="1560" w:type="dxa"/>
+            <w:tcBorders/>
+          </w:tcPr>
+          <w:p>
+            <w:pPr>
+              <w:pStyle w:val="Normal"/>
+              <w:widowControl w:val="false"/>
+              <w:spacing w:lineRule="auto" w:line="276" w:before="0" w:after="120"/>
+              <w:rPr/>
+            </w:pPr>
+            <w:r>
+              <w:rPr>
+                <w:rFonts w:eastAsia="Times New Roman" w:cs="Times New Roman"/>
+                <w:sz w:val="19"/>
+              </w:rPr>
+              <w:t>0,133</w:t>
+            </w:r>
+          </w:p>
+        </w:tc>
+        <w:tc>
+          <w:tcPr>
+            <w:tcW w:w="1560" w:type="dxa"/>
+            <w:tcBorders/>
+          </w:tcPr>
+          <w:p>
+            <w:pPr>
+              <w:pStyle w:val="Normal"/>
+              <w:widowControl w:val="false"/>
+              <w:spacing w:lineRule="auto" w:line="276" w:before="0" w:after="120"/>
+              <w:rPr/>
+            </w:pPr>
+            <w:r>
+              <w:rPr>
+                <w:rFonts w:eastAsia="Times New Roman" w:cs="Times New Roman"/>
+                <w:sz w:val="19"/>
+              </w:rPr>
+              <w:t>0,228</w:t>
+            </w:r>
+          </w:p>
+        </w:tc>
+      </w:tr>
+      <w:tr>
+        <w:trPr/>
+        <w:tc>
+          <w:tcPr>
+            <w:tcW w:w="3120" w:type="dxa"/>
+            <w:tcBorders/>
+          </w:tcPr>
+          <w:p>
+            <w:pPr>
+              <w:pStyle w:val="Normal"/>
+              <w:widowControl w:val="false"/>
+              <w:spacing w:lineRule="auto" w:line="276" w:before="0" w:after="120"/>
+              <w:rPr/>
+            </w:pPr>
+            <w:r>
+              <w:rPr>
+                <w:rFonts w:eastAsia="Times New Roman" w:cs="Times New Roman"/>
+                <w:sz w:val="19"/>
+              </w:rPr>
+              <w:t>Top-Hat clásico (r = 5; m = 1)</w:t>
+            </w:r>
+          </w:p>
+        </w:tc>
+        <w:tc>
+          <w:tcPr>
+            <w:tcW w:w="1560" w:type="dxa"/>
+            <w:tcBorders/>
+          </w:tcPr>
+          <w:p>
+            <w:pPr>
+              <w:pStyle w:val="Normal"/>
+              <w:widowControl w:val="false"/>
+              <w:spacing w:lineRule="auto" w:line="276" w:before="0" w:after="120"/>
+              <w:rPr/>
+            </w:pPr>
+            <w:r>
+              <w:rPr>
+                <w:rFonts w:eastAsia="Times New Roman" w:cs="Times New Roman"/>
+                <w:sz w:val="19"/>
+              </w:rPr>
+              <w:t>0,125</w:t>
+            </w:r>
+          </w:p>
+        </w:tc>
+        <w:tc>
+          <w:tcPr>
+            <w:tcW w:w="1560" w:type="dxa"/>
+            <w:tcBorders/>
+          </w:tcPr>
+          <w:p>
+            <w:pPr>
+              <w:pStyle w:val="Normal"/>
+              <w:widowControl w:val="false"/>
+              <w:spacing w:lineRule="auto" w:line="276" w:before="0" w:after="120"/>
+              <w:rPr/>
+            </w:pPr>
+            <w:r>
+              <w:rPr>
+                <w:rFonts w:eastAsia="Times New Roman" w:cs="Times New Roman"/>
+                <w:sz w:val="19"/>
+              </w:rPr>
+              <w:t>0,054</w:t>
+            </w:r>
+          </w:p>
+        </w:tc>
+        <w:tc>
+          <w:tcPr>
+            <w:tcW w:w="1560" w:type="dxa"/>
+            <w:tcBorders/>
+          </w:tcPr>
+          <w:p>
+            <w:pPr>
+              <w:pStyle w:val="Normal"/>
+              <w:widowControl w:val="false"/>
+              <w:spacing w:lineRule="auto" w:line="276" w:before="0" w:after="120"/>
+              <w:rPr/>
+            </w:pPr>
+            <w:r>
+              <w:rPr>
+                <w:rFonts w:eastAsia="Times New Roman" w:cs="Times New Roman"/>
+                <w:sz w:val="19"/>
+              </w:rPr>
+              <w:t>0,090</w:t>
+            </w:r>
+          </w:p>
+        </w:tc>
+        <w:tc>
+          <w:tcPr>
+            <w:tcW w:w="1560" w:type="dxa"/>
+            <w:tcBorders/>
+          </w:tcPr>
+          <w:p>
+            <w:pPr>
+              <w:pStyle w:val="Normal"/>
+              <w:widowControl w:val="false"/>
+              <w:spacing w:lineRule="auto" w:line="276" w:before="0" w:after="120"/>
+              <w:rPr/>
+            </w:pPr>
+            <w:r>
+              <w:rPr>
+                <w:rFonts w:eastAsia="Times New Roman" w:cs="Times New Roman"/>
+                <w:sz w:val="19"/>
+              </w:rPr>
+              <w:t>0,198</w:t>
+            </w:r>
+          </w:p>
+        </w:tc>
+      </w:tr>
+      <w:tr>
+        <w:trPr/>
+        <w:tc>
+          <w:tcPr>
+            <w:tcW w:w="3120" w:type="dxa"/>
+            <w:tcBorders/>
+          </w:tcPr>
+          <w:p>
+            <w:pPr>
+              <w:pStyle w:val="Normal"/>
+              <w:widowControl w:val="false"/>
+              <w:spacing w:lineRule="auto" w:line="276" w:before="0" w:after="120"/>
+              <w:rPr/>
+            </w:pPr>
+            <w:r>
+              <w:rPr>
+                <w:rFonts w:eastAsia="Times New Roman" w:cs="Times New Roman"/>
+                <w:sz w:val="19"/>
+              </w:rPr>
+              <w:t>PSO del trabajo de referencia (clásico + Fo)</w:t>
+            </w:r>
+          </w:p>
+        </w:tc>
+        <w:tc>
+          <w:tcPr>
+            <w:tcW w:w="1560" w:type="dxa"/>
+            <w:tcBorders/>
+          </w:tcPr>
+          <w:p>
+            <w:pPr>
+              <w:pStyle w:val="Normal"/>
+              <w:widowControl w:val="false"/>
+              <w:spacing w:lineRule="auto" w:line="276" w:before="0" w:after="120"/>
+              <w:rPr/>
+            </w:pPr>
+            <w:r>
+              <w:rPr>
+                <w:rFonts w:eastAsia="Times New Roman" w:cs="Times New Roman"/>
+                <w:sz w:val="19"/>
+              </w:rPr>
+              <w:t>0,174</w:t>
+            </w:r>
+          </w:p>
+        </w:tc>
+        <w:tc>
+          <w:tcPr>
+            <w:tcW w:w="1560" w:type="dxa"/>
+            <w:tcBorders/>
+          </w:tcPr>
+          <w:p>
+            <w:pPr>
+              <w:pStyle w:val="Normal"/>
+              <w:widowControl w:val="false"/>
+              <w:spacing w:lineRule="auto" w:line="276" w:before="0" w:after="120"/>
+              <w:rPr/>
+            </w:pPr>
+            <w:r>
+              <w:rPr>
+                <w:rFonts w:eastAsia="Times New Roman" w:cs="Times New Roman"/>
+                <w:sz w:val="19"/>
+              </w:rPr>
+              <w:t>0,118</w:t>
+            </w:r>
+          </w:p>
+        </w:tc>
+        <w:tc>
+          <w:tcPr>
+            <w:tcW w:w="1560" w:type="dxa"/>
+            <w:tcBorders/>
+          </w:tcPr>
+          <w:p>
+            <w:pPr>
+              <w:pStyle w:val="Normal"/>
+              <w:widowControl w:val="false"/>
+              <w:spacing w:lineRule="auto" w:line="276" w:before="0" w:after="120"/>
+              <w:rPr/>
+            </w:pPr>
+            <w:r>
+              <w:rPr>
+                <w:rFonts w:eastAsia="Times New Roman" w:cs="Times New Roman"/>
+                <w:sz w:val="19"/>
+              </w:rPr>
+              <w:t>0,146</w:t>
+            </w:r>
+          </w:p>
+        </w:tc>
+        <w:tc>
+          <w:tcPr>
+            <w:tcW w:w="1560" w:type="dxa"/>
+            <w:tcBorders/>
+          </w:tcPr>
+          <w:p>
+            <w:pPr>
+              <w:pStyle w:val="Normal"/>
+              <w:widowControl w:val="false"/>
+              <w:spacing w:lineRule="auto" w:line="276" w:before="0" w:after="120"/>
+              <w:rPr/>
+            </w:pPr>
+            <w:r>
+              <w:rPr>
+                <w:rFonts w:eastAsia="Times New Roman" w:cs="Times New Roman"/>
+                <w:sz w:val="19"/>
+              </w:rPr>
+              <w:t>0,229</w:t>
+            </w:r>
+          </w:p>
+        </w:tc>
+      </w:tr>
+      <w:tr>
+        <w:trPr/>
+        <w:tc>
+          <w:tcPr>
+            <w:tcW w:w="3120" w:type="dxa"/>
+            <w:tcBorders/>
+          </w:tcPr>
+          <w:p>
+            <w:pPr>
+              <w:pStyle w:val="Normal"/>
+              <w:widowControl w:val="false"/>
+              <w:spacing w:lineRule="auto" w:line="276" w:before="0" w:after="120"/>
+              <w:rPr/>
+            </w:pPr>
+            <w:r>
+              <w:rPr>
+                <w:rFonts w:eastAsia="Times New Roman" w:cs="Times New Roman"/>
+                <w:sz w:val="19"/>
+              </w:rPr>
+              <w:t>Propuesta + Fo (r = 1; m = 0,30)</w:t>
+            </w:r>
+          </w:p>
+        </w:tc>
+        <w:tc>
+          <w:tcPr>
+            <w:tcW w:w="1560" w:type="dxa"/>
+            <w:tcBorders/>
+          </w:tcPr>
+          <w:p>
+            <w:pPr>
+              <w:pStyle w:val="Normal"/>
+              <w:widowControl w:val="false"/>
+              <w:spacing w:lineRule="auto" w:line="276" w:before="0" w:after="120"/>
+              <w:rPr/>
+            </w:pPr>
+            <w:r>
+              <w:rPr>
+                <w:rFonts w:eastAsia="Times New Roman" w:cs="Times New Roman"/>
+                <w:sz w:val="19"/>
+              </w:rPr>
+              <w:t>0,200</w:t>
+            </w:r>
+          </w:p>
+        </w:tc>
+        <w:tc>
+          <w:tcPr>
+            <w:tcW w:w="1560" w:type="dxa"/>
+            <w:tcBorders/>
+          </w:tcPr>
+          <w:p>
+            <w:pPr>
+              <w:pStyle w:val="Normal"/>
+              <w:widowControl w:val="false"/>
+              <w:spacing w:lineRule="auto" w:line="276" w:before="0" w:after="120"/>
+              <w:rPr/>
+            </w:pPr>
+            <w:r>
+              <w:rPr>
+                <w:rFonts w:eastAsia="Times New Roman" w:cs="Times New Roman"/>
+                <w:sz w:val="19"/>
+              </w:rPr>
+              <w:t>0,110</w:t>
+            </w:r>
+          </w:p>
+        </w:tc>
+        <w:tc>
+          <w:tcPr>
+            <w:tcW w:w="1560" w:type="dxa"/>
+            <w:tcBorders/>
+          </w:tcPr>
+          <w:p>
+            <w:pPr>
+              <w:pStyle w:val="Normal"/>
+              <w:widowControl w:val="false"/>
+              <w:spacing w:lineRule="auto" w:line="276" w:before="0" w:after="120"/>
+              <w:rPr/>
+            </w:pPr>
+            <w:r>
+              <w:rPr>
+                <w:rFonts w:eastAsia="Times New Roman" w:cs="Times New Roman"/>
+                <w:sz w:val="19"/>
+              </w:rPr>
+              <w:t>0,155</w:t>
+            </w:r>
+          </w:p>
+        </w:tc>
+        <w:tc>
+          <w:tcPr>
+            <w:tcW w:w="1560" w:type="dxa"/>
+            <w:tcBorders/>
+          </w:tcPr>
+          <w:p>
+            <w:pPr>
+              <w:pStyle w:val="Normal"/>
+              <w:widowControl w:val="false"/>
+              <w:spacing w:lineRule="auto" w:line="276" w:before="0" w:after="120"/>
+              <w:rPr/>
+            </w:pPr>
+            <w:r>
+              <w:rPr>
+                <w:rFonts w:eastAsia="Times New Roman" w:cs="Times New Roman"/>
+                <w:sz w:val="19"/>
+              </w:rPr>
+              <w:t>0,238</w:t>
+            </w:r>
+          </w:p>
+        </w:tc>
+      </w:tr>
+      <w:tr>
+        <w:trPr/>
+        <w:tc>
+          <w:tcPr>
+            <w:tcW w:w="3120" w:type="dxa"/>
+            <w:tcBorders/>
+          </w:tcPr>
+          <w:p>
+            <w:pPr>
+              <w:pStyle w:val="Normal"/>
+              <w:widowControl w:val="false"/>
+              <w:spacing w:lineRule="auto" w:line="276" w:before="0" w:after="120"/>
+              <w:rPr/>
+            </w:pPr>
+            <w:r>
+              <w:rPr>
+                <w:b/>
+                <w:rFonts w:eastAsia="Times New Roman" w:cs="Times New Roman"/>
+                <w:sz w:val="19"/>
+              </w:rPr>
+              <w:t>Propuesta + F_apt (r = 25; m = 0,070)</w:t>
+            </w:r>
+          </w:p>
+        </w:tc>
+        <w:tc>
+          <w:tcPr>
+            <w:tcW w:w="1560" w:type="dxa"/>
+            <w:tcBorders/>
+          </w:tcPr>
+          <w:p>
+            <w:pPr>
+              <w:pStyle w:val="Normal"/>
+              <w:widowControl w:val="false"/>
+              <w:spacing w:lineRule="auto" w:line="276" w:before="0" w:after="120"/>
+              <w:rPr/>
+            </w:pPr>
+            <w:r>
+              <w:rPr>
+                <w:rFonts w:eastAsia="Times New Roman" w:cs="Times New Roman"/>
+                <w:sz w:val="19"/>
+              </w:rPr>
+              <w:t>0,207</w:t>
+            </w:r>
+          </w:p>
+        </w:tc>
+        <w:tc>
+          <w:tcPr>
+            <w:tcW w:w="1560" w:type="dxa"/>
+            <w:tcBorders/>
+          </w:tcPr>
+          <w:p>
+            <w:pPr>
+              <w:pStyle w:val="Normal"/>
+              <w:widowControl w:val="false"/>
+              <w:spacing w:lineRule="auto" w:line="276" w:before="0" w:after="120"/>
+              <w:rPr/>
+            </w:pPr>
+            <w:r>
+              <w:rPr>
+                <w:rFonts w:eastAsia="Times New Roman" w:cs="Times New Roman"/>
+                <w:sz w:val="19"/>
+              </w:rPr>
+              <w:t>0,117</w:t>
+            </w:r>
+          </w:p>
+        </w:tc>
+        <w:tc>
+          <w:tcPr>
+            <w:tcW w:w="1560" w:type="dxa"/>
+            <w:tcBorders/>
+          </w:tcPr>
+          <w:p>
+            <w:pPr>
+              <w:pStyle w:val="Normal"/>
+              <w:widowControl w:val="false"/>
+              <w:spacing w:lineRule="auto" w:line="276" w:before="0" w:after="120"/>
+              <w:rPr/>
+            </w:pPr>
+            <w:r>
+              <w:rPr>
+                <w:rFonts w:eastAsia="Times New Roman" w:cs="Times New Roman"/>
+                <w:sz w:val="19"/>
+              </w:rPr>
+              <w:t>0,162</w:t>
+            </w:r>
+          </w:p>
+        </w:tc>
+        <w:tc>
+          <w:tcPr>
+            <w:tcW w:w="1560" w:type="dxa"/>
+            <w:tcBorders/>
+          </w:tcPr>
+          <w:p>
+            <w:pPr>
+              <w:pStyle w:val="Normal"/>
+              <w:widowControl w:val="false"/>
+              <w:spacing w:lineRule="auto" w:line="276" w:before="0" w:after="120"/>
+              <w:rPr/>
+            </w:pPr>
+            <w:r>
+              <w:rPr>
+                <w:rFonts w:eastAsia="Times New Roman" w:cs="Times New Roman"/>
+                <w:sz w:val="19"/>
+              </w:rPr>
+              <w:t>0,239</w:t>
+            </w:r>
+          </w:p>
+        </w:tc>
+      </w:tr>
+    </w:tbl>
+    <w:p>
+      <w:pPr>
+        <w:pStyle w:val="Normal"/>
+        <w:spacing w:lineRule="auto" w:line="360"/>
+        <w:ind w:firstLine="709"/>
+        <w:jc w:val="both"/>
+        <w:rPr/>
+      </w:pPr>
+      <w:r>
+        <w:rPr>
+          <w:iCs/>
+          <w:rFonts w:eastAsia="Times New Roman" w:cs="Times New Roman"/>
+        </w:rPr>
+        <w:t xml:space="preserve">La Tabla 13 confirma la complementariedad de forma extrema: el infrarrojo domina en personas (AP@0,5 = 0,220) pero es prácticamente ciego a las luces (0,018), y el visible presenta el patrón espejo (0,178 y 0,135). Las mejores fusiones superan en el promedio del par a ambas modalidades individuales —algo que ninguna logra por separado—, con la Propuesta Novedosa como la mejor fusión del estudio tanto en mAP global (0,239) como en personas (0,207, cerca del infrarrojo puro), manteniendo las luces cerca del visible; el óptimo de F_apt supera además al de Fo en las dos clases clave. El visible solo conserva el mejor mAP global de seis clases (0,245) por la abundancia de vehículos diurnos, y los valores absolutos son moderados (subconjunto de 500 imágenes y modelo nano): el experimento no busca récords, sino aislar el escenario donde la fusión es insustituible —detectar en una sola imagen objetos que cada modalidad pierde por separado—.</w:t>
       </w:r>
     </w:p>
     <w:p>
@@ -32064,8 +33468,8 @@
             </w:pPr>
             <w:r>
               <w:rPr>
-                <w:rFonts w:eastAsia="Times New Roman" w:cs="Times New Roman"/>
                 <w:b/>
+                <w:rFonts w:eastAsia="Times New Roman" w:cs="Times New Roman"/>
                 <w:sz w:val="19"/>
               </w:rPr>
               <w:t>Propuesta + F_apt (r = 25; m = 0,070)</w:t>
@@ -32087,7 +33491,6 @@
             <w:r>
               <w:rPr>
                 <w:rFonts w:eastAsia="Times New Roman" w:cs="Times New Roman"/>
-                <w:b/>
                 <w:sz w:val="19"/>
               </w:rPr>
               <w:t>0,500</w:t>
@@ -32108,8 +33511,8 @@
             </w:pPr>
             <w:r>
               <w:rPr>
-                <w:rFonts w:eastAsia="Times New Roman" w:cs="Times New Roman"/>
                 <w:b/>
+                <w:rFonts w:eastAsia="Times New Roman" w:cs="Times New Roman"/>
                 <w:sz w:val="19"/>
               </w:rPr>
               <w:t>0,041</w:t>
@@ -32130,8 +33533,8 @@
             </w:pPr>
             <w:r>
               <w:rPr>
-                <w:rFonts w:eastAsia="Times New Roman" w:cs="Times New Roman"/>
                 <w:b/>
+                <w:rFonts w:eastAsia="Times New Roman" w:cs="Times New Roman"/>
                 <w:sz w:val="19"/>
               </w:rPr>
               <w:t>0,782</w:t>
@@ -32153,7 +33556,6 @@
             <w:r>
               <w:rPr>
                 <w:rFonts w:eastAsia="Times New Roman" w:cs="Times New Roman"/>
-                <w:b/>
                 <w:sz w:val="19"/>
               </w:rPr>
               <w:t>1,450</w:t>
@@ -32175,7 +33577,6 @@
             <w:r>
               <w:rPr>
                 <w:rFonts w:eastAsia="Times New Roman" w:cs="Times New Roman"/>
-                <w:b/>
                 <w:sz w:val="19"/>
               </w:rPr>
               <w:t>0,368</w:t>
@@ -32200,7 +33601,6 @@
             <w:r>
               <w:rPr>
                 <w:rFonts w:eastAsia="Times New Roman" w:cs="Times New Roman"/>
-                <w:b/>
                 <w:sz w:val="19"/>
               </w:rPr>
               <w:t>Top-Hat clásico + Fo (r = 25; m = 0,30)</w:t>
@@ -32221,8 +33621,8 @@
             </w:pPr>
             <w:r>
               <w:rPr>
-                <w:rFonts w:eastAsia="Times New Roman" w:cs="Times New Roman"/>
                 <w:b/>
+                <w:rFonts w:eastAsia="Times New Roman" w:cs="Times New Roman"/>
                 <w:sz w:val="19"/>
               </w:rPr>
               <w:t>0,534</w:t>
@@ -32244,7 +33644,6 @@
             <w:r>
               <w:rPr>
                 <w:rFonts w:eastAsia="Times New Roman" w:cs="Times New Roman"/>
-                <w:b/>
                 <w:sz w:val="19"/>
               </w:rPr>
               <w:t>0,184</w:t>
@@ -32266,7 +33665,6 @@
             <w:r>
               <w:rPr>
                 <w:rFonts w:eastAsia="Times New Roman" w:cs="Times New Roman"/>
-                <w:b/>
                 <w:sz w:val="19"/>
               </w:rPr>
               <w:t>0,745</w:t>
@@ -32287,8 +33685,8 @@
             </w:pPr>
             <w:r>
               <w:rPr>
-                <w:rFonts w:eastAsia="Times New Roman" w:cs="Times New Roman"/>
                 <w:b/>
+                <w:rFonts w:eastAsia="Times New Roman" w:cs="Times New Roman"/>
                 <w:sz w:val="19"/>
               </w:rPr>
               <w:t>1,504</w:t>
@@ -32309,8 +33707,8 @@
             </w:pPr>
             <w:r>
               <w:rPr>
-                <w:rFonts w:eastAsia="Times New Roman" w:cs="Times New Roman"/>
                 <w:b/>
+                <w:rFonts w:eastAsia="Times New Roman" w:cs="Times New Roman"/>
                 <w:sz w:val="19"/>
               </w:rPr>
               <w:t>0,395</w:t>
@@ -32335,7 +33733,6 @@
             <w:r>
               <w:rPr>
                 <w:rFonts w:eastAsia="Times New Roman" w:cs="Times New Roman"/>
-                <w:b/>
                 <w:sz w:val="19"/>
               </w:rPr>
               <w:t>Propuesta + Fo (r = 1; m = 0,30)</w:t>
@@ -32357,7 +33754,6 @@
             <w:r>
               <w:rPr>
                 <w:rFonts w:eastAsia="Times New Roman" w:cs="Times New Roman"/>
-                <w:b/>
                 <w:sz w:val="19"/>
               </w:rPr>
               <w:t>0,448</w:t>
@@ -32379,7 +33775,6 @@
             <w:r>
               <w:rPr>
                 <w:rFonts w:eastAsia="Times New Roman" w:cs="Times New Roman"/>
-                <w:b/>
                 <w:sz w:val="19"/>
               </w:rPr>
               <w:t>0,121</w:t>
@@ -32401,7 +33796,6 @@
             <w:r>
               <w:rPr>
                 <w:rFonts w:eastAsia="Times New Roman" w:cs="Times New Roman"/>
-                <w:b/>
                 <w:sz w:val="19"/>
               </w:rPr>
               <w:t>0,761</w:t>
@@ -32423,7 +33817,6 @@
             <w:r>
               <w:rPr>
                 <w:rFonts w:eastAsia="Times New Roman" w:cs="Times New Roman"/>
-                <w:b/>
                 <w:sz w:val="19"/>
               </w:rPr>
               <w:t>1,353</w:t>
@@ -32445,7 +33838,6 @@
             <w:r>
               <w:rPr>
                 <w:rFonts w:eastAsia="Times New Roman" w:cs="Times New Roman"/>
-                <w:b/>
                 <w:sz w:val="19"/>
               </w:rPr>
               <w:t>0,322</w:t>
@@ -32470,7 +33862,6 @@
             <w:r>
               <w:rPr>
                 <w:rFonts w:eastAsia="Times New Roman" w:cs="Times New Roman"/>
-                <w:b/>
                 <w:sz w:val="19"/>
               </w:rPr>
               <w:t>Top-Hat clásico manual (r = 5; m = 1)</w:t>
@@ -32492,7 +33883,6 @@
             <w:r>
               <w:rPr>
                 <w:rFonts w:eastAsia="Times New Roman" w:cs="Times New Roman"/>
-                <w:b/>
                 <w:sz w:val="19"/>
               </w:rPr>
               <w:t>0,305</w:t>
@@ -32514,7 +33904,6 @@
             <w:r>
               <w:rPr>
                 <w:rFonts w:eastAsia="Times New Roman" w:cs="Times New Roman"/>
-                <w:b/>
                 <w:sz w:val="19"/>
               </w:rPr>
               <w:t>0,585</w:t>
@@ -32536,7 +33925,6 @@
             <w:r>
               <w:rPr>
                 <w:rFonts w:eastAsia="Times New Roman" w:cs="Times New Roman"/>
-                <w:b/>
                 <w:sz w:val="19"/>
               </w:rPr>
               <w:t>0,578</w:t>
@@ -32558,7 +33946,6 @@
             <w:r>
               <w:rPr>
                 <w:rFonts w:eastAsia="Times New Roman" w:cs="Times New Roman"/>
-                <w:b/>
                 <w:sz w:val="19"/>
               </w:rPr>
               <w:t>1,360</w:t>
@@ -32580,7 +33967,6 @@
             <w:r>
               <w:rPr>
                 <w:rFonts w:eastAsia="Times New Roman" w:cs="Times New Roman"/>
-                <w:b/>
                 <w:sz w:val="19"/>
               </w:rPr>
               <w:t>0,334</w:t>
@@ -32636,7 +34022,7 @@
         <w:rPr>
           <w:rFonts w:eastAsia="Times New Roman" w:cs="Times New Roman"/>
         </w:rPr>
-        <w:t xml:space="preserve">Los hallazgos cuantitativos pueden sintetizarse en cinco observaciones. Primero, la Propuesta Novedosa (r = 25, m = 0,070) exhibe el mejor perfil de calidad del benchmark: la menor tasa de artefactos (Nabf = 0,041, 2,7 veces menos que el mejor rival) y la mayor similitud estructural (SSIM = 0,782), quedando segunda en preservación de bordes (Qabf = 0,500), correlación (SCD = 1,450) y fidelidad visual (VIF = 0,368), a milésimas del líder de cada métrica, a costa de ceder contraste (SD, EN, SF). Segundo, no existe un método universalmente dominante: DTCWT lidera la preservación de bordes por una milésima, RP la correlación de diferencias y la pirámide de Laplace el contraste y la fidelidad perceptual (VIF); son óptimos de criterios distintos y complementarios. Tercero, la metodología clásica de la transformada Top-Hat evidencia el aporte de la propuesta: gana únicamente en las métricas de actividad bruta (EN, MG, SF) al costo del mayor nivel de artefactos del estudio (Nabf = 0,585) y la peor similitud estructural (SSIM = 0,578); la diferencia entre ambas aísla la contribución del banco disco + líneas y del ajuste (r, m) por PSO. Cuarto, las métricas de actividad e información premian el realce agresivo y deben reportarse junto a las de preservación de bordes y artefactos, pues por sí solas favorecerían al operador más ruidoso. Quinto, la evaluación orientada a tarea (detección sobre LLVIP) constituye un criterio complementario: toda fusión supera netamente al visible solo (+0,12 a +0,14 en mAP@0,5), el infrarrojo solo es la modalidad más fuerte (0,957) y entre las fusiones —en una banda estrecha de 0,926 a 0,949— la propuesta es competitiva (0,936) sin ser líder, lo que confirma que la superioridad en calidad de imagen no se traslada automáticamente a la detección.</w:t>
+        <w:t xml:space="preserve">Los hallazgos cuantitativos pueden sintetizarse en seis observaciones. Primero, la Propuesta Novedosa (r = 25, m = 0,070) exhibe el mejor perfil de calidad del benchmark: la menor tasa de artefactos (Nabf = 0,041, 2,7 veces menos que el mejor rival) y la mayor similitud estructural (SSIM = 0,782), quedando segunda en preservación de bordes (Qabf = 0,500), correlación (SCD = 1,450) y fidelidad visual (VIF = 0,368), a milésimas del líder de cada métrica, a costa de ceder contraste (SD, EN, SF). Segundo, no existe un método universalmente dominante: DTCWT lidera la preservación de bordes por una milésima, RP la correlación de diferencias y la pirámide de Laplace el contraste y la fidelidad perceptual (VIF); son óptimos de criterios distintos y complementarios. Tercero, la metodología clásica de la transformada Top-Hat evidencia el aporte de la propuesta: gana únicamente en las métricas de actividad bruta (EN, MG, SF) al costo del mayor nivel de artefactos del estudio (Nabf = 0,585) y la peor similitud estructural (SSIM = 0,578); la diferencia entre ambas aísla la contribución del banco disco + líneas y del ajuste (r, m) por PSO. Cuarto, las métricas de actividad e información premian el realce agresivo y deben reportarse junto a las de preservación de bordes y artefactos, pues por sí solas favorecerían al operador más ruidoso. Quinto, la evaluación orientada a tarea (detección sobre LLVIP) constituye un criterio complementario: toda fusión supera netamente al visible solo (+0,12 a +0,14 en mAP@0,5), el infrarrojo solo es la modalidad más fuerte (0,957) y entre las fusiones —en una banda estrecha de 0,926 a 0,949— la propuesta es competitiva (0,936) sin ser líder, lo que confirma que la superioridad en calidad de imagen no se traslada automáticamente a la detección. Sexto, el experimento de clases complementarias sobre M3FD delimita el escenario donde la fusión es insustituible: cuando la escena contiene objetos térmicos (personas) y objetos exclusivamente visibles (luces), las mejores fusiones superan en el par complementario a ambas modalidades individuales y la propuesta es la mejor fusión del estudio, detectando ambas clases en una sola imagen.</w:t>
       </w:r>
     </w:p>
     <w:p>
@@ -32708,7 +34094,7 @@
         <w:rPr>
           <w:rFonts w:eastAsia="Times New Roman" w:cs="Times New Roman"/>
         </w:rPr>
-        <w:t xml:space="preserve">La Propuesta Novedosa —con las respuestas lineales promediadas y sumadas a la del disco sobre una sola escala (PSO: r=25, m=0,070, seleccionado mediante un barrido de 25 configuraciones de enjambre)— logra el mejor perfil de calidad del benchmark: la menor tasa de artefactos (Nabf=0,041) y la mayor similitud estructural (SSIM=0,782), con preservación de bordes y correlación destacadas (Qabf=0,500; SCD=1,450). Supera a la metodología clásica Top-Hat en las siete métricas de calidad e información de forma estadísticamente significativa (Wilcoxon pareado con corrección de Holm: p ≤ 0,001; sección 5.6). En la evaluación de detección sobre LLVIP, toda fusión supera al visible solo (mAP@0,5 de 0,808 a 0,926–0,949) pero ninguna al infrarrojo solo (0,957), y la propuesta resulta competitiva (mAP@0,5 = 0,936), dentro de una banda estrecha de fusiones, sin ser la mejor: su ventaja en calidad de imagen no se traslada directamente a la tarea de detección, cuya estrategia óptima depende de la aplicación. Quedan así sostenidas las hipótesis H1 y H2, y solo parcialmente H3.</w:t>
+        <w:t xml:space="preserve">La Propuesta Novedosa —con las respuestas lineales promediadas y sumadas a la del disco sobre una sola escala (PSO: r=25, m=0,070, seleccionado mediante un barrido de 25 configuraciones de enjambre)— logra el mejor perfil de calidad del benchmark: la menor tasa de artefactos (Nabf=0,041) y la mayor similitud estructural (SSIM=0,782), con preservación de bordes y correlación destacadas (Qabf=0,500; SCD=1,450). Supera a la metodología clásica Top-Hat en las siete métricas de calidad e información de forma estadísticamente significativa (Wilcoxon pareado con corrección de Holm: p ≤ 0,001; sección 5.6). En la evaluación de detección sobre LLVIP, toda fusión supera al visible solo (mAP@0,5 de 0,808 a 0,926–0,949) pero ninguna al infrarrojo solo (0,957), y la propuesta resulta competitiva (mAP@0,5 = 0,936), dentro de una banda estrecha de fusiones, sin ser la mejor: su ventaja en calidad de imagen no se traslada directamente a la tarea de detección, cuya estrategia óptima depende de la aplicación. En el experimento de clases complementarias (M3FD), en cambio, la fusión muestra su valor distintivo: detecta simultáneamente los objetos térmicos (personas) y los exclusivamente visibles (luces) que cada modalidad pierde por separado, con la propuesta como la mejor fusión del estudio (mAP@0,5 = 0,239). Quedan así sostenidas las hipótesis H1 y H2, y solo parcialmente H3.</w:t>
       </w:r>
     </w:p>
     <w:p>
@@ -33299,6 +34685,23 @@
           <w:szCs w:val="24"/>
         </w:rPr>
         <w:t>Li, S., Kang, X., Fang, L., Hu, J., y Yin, H. (2017). Pixel-level image fusion: A survey of the state of the art. Information Fusion, 33, 100–112.</w:t>
+      </w:r>
+    </w:p>
+    <w:p>
+      <w:pPr>
+        <w:pStyle w:val="Normal"/>
+        <w:spacing w:lineRule="auto" w:line="360" w:before="0" w:after="160"/>
+        <w:ind w:firstLine="709"/>
+        <w:jc w:val="both"/>
+        <w:rPr/>
+      </w:pPr>
+      <w:r>
+        <w:rPr>
+          <w:rFonts w:eastAsia="Times New Roman" w:cs="Times New Roman"/>
+          <w:sz w:val="24"/>
+          <w:szCs w:val="24"/>
+        </w:rPr>
+        <w:t xml:space="preserve">Liu, J., Fan, X., Huang, Z., Wu, G., Liu, R., Zhong, W., y Luo, Z. (2022). Target-aware dual adversarial learning and a multi-scenario multi-modality benchmark to fuse infrared and visible for object detection. Proceedings of the IEEE/CVF Conference on Computer Vision and Pattern Recognition (CVPR), 5802–5811.</w:t>
       </w:r>
     </w:p>
     <w:p>

</xml_diff>

<commit_message>
Libro: procedencia explícita de la función de aptitud F_apt
Se declara la composición como elaboración propia siguiendo la práctica de
las funciones objetivo multicriterio en fusión con PSO (Tao et al. 2010;
Malviya y Saxena 2014; Ortega y Espinoza 2025), con cada componente citado:
SSIM (Wang et al. 2004, referencia que faltaba y se agrega), QAB/F y NAB/F
(Xydeas y Petrović 2000) y SCD (Aslantas y Bendes 2015); se explica además
el peso 0,5 del SCD como normalización de rango.
</commit_message>
<xml_diff>
--- a/docs/Tesis_Borrador_V3.docx
+++ b/docs/Tesis_Borrador_V3.docx
@@ -10907,7 +10907,7 @@
         <w:rPr>
           <w:rFonts w:eastAsia="Times New Roman" w:cs="Times New Roman"/>
         </w:rPr>
-        <w:t xml:space="preserve">A diferencia de una aptitud de fidelidad pura (SSIM + E + PSNR), que premia el realce conservador y conduce a óptimos triviales, aquí el PSO maximiza una aptitud orientada explícitamente a la calidad de fusión, definida en la ecuación (14), que recompensa la similitud estructural, la preservación de bordes y la correlación de las diferencias, y penaliza los artefactos. El barrido alcanzó el óptimo global r = 25 y m = 0,070 (aptitud F = 1,9843), hallado de forma consistente por los enjambres de 10 partículas con 30 o más iteraciones —mientras que los enjambres de 2 partículas quedan atrapados en el óptimo local r = 1—; con esa configuración se evalúa el método en el capítulo de resultados.</w:t>
+        <w:t xml:space="preserve">A diferencia de una aptitud de fidelidad pura (SSIM + E + PSNR), que premia el realce conservador y conduce a óptimos triviales, aquí el PSO maximiza una aptitud orientada explícitamente a la calidad de fusión, definida en la ecuación (14), que recompensa la similitud estructural (SSIM; Wang et al., 2004), la preservación de bordes (QAB/F; Xydeas y Petrović, 2000) y la correlación de las diferencias (SCD; Aslantas y Bendes, 2015, con peso 0,5 que normaliza su rango [−2, 2] al de las demás), y penaliza los artefactos (NAB/F, del mismo marco de Xydeas y Petrović). La composición es una elaboración propia de esta tesis, siguiendo la práctica de las funciones objetivo multicriterio en la fusión optimizada por PSO (Tao et al., 2010; Malviya y Saxena, 2014; Ortega y Espinoza, 2025); su validez frente a la alternativa de fidelidad pura se contrasta empíricamente en la ablación del final de esta sección. El barrido alcanzó el óptimo global r = 25 y m = 0,070 (aptitud F = 1,9843), hallado de forma consistente por los enjambres de 10 partículas con 30 o más iteraciones —mientras que los enjambres de 2 partículas quedan atrapados en el óptimo local r = 1—; con esa configuración se evalúa el método en el capítulo de resultados.</w:t>
       </w:r>
     </w:p>
     <w:p>
@@ -34964,6 +34964,23 @@
           <w:szCs w:val="24"/>
         </w:rPr>
         <w:t>Wang, J., Peng, J., Feng, X., He, G., y Fan, J. (2017). Fusion method for infrared and visible images by using non-negative sparse representation. Infrared Physics &amp; Technology, 80, 1–9.</w:t>
+      </w:r>
+    </w:p>
+    <w:p>
+      <w:pPr>
+        <w:pStyle w:val="Normal"/>
+        <w:spacing w:lineRule="auto" w:line="360" w:before="0" w:after="160"/>
+        <w:ind w:firstLine="709"/>
+        <w:jc w:val="both"/>
+        <w:rPr/>
+      </w:pPr>
+      <w:r>
+        <w:rPr>
+          <w:rFonts w:eastAsia="Times New Roman" w:cs="Times New Roman"/>
+          <w:sz w:val="24"/>
+          <w:szCs w:val="24"/>
+        </w:rPr>
+        <w:t xml:space="preserve">Wang, Z., Bovik, A. C., Sheikh, H. R., y Simoncelli, E. P. (2004). Image quality assessment: From error visibility to structural similarity. IEEE Transactions on Image Processing, 13(4), 600–612.</w:t>
       </w:r>
     </w:p>
     <w:p>

</xml_diff>

<commit_message>
Figura de la prueba visual M3FD: detecciones VIS/IR/fusión en dos escenas
- experiments/make_figura_detecciones_m3fd.py: selecciona automáticamente las
  dos escenas de validación que mejor muestran la complementariedad (una por
  lado: el VIS no detecta ninguna persona que la fusión recupera; el IR no
  detecta ninguna luz que la fusión conserva) y dibuja las detecciones del
  modelo único (People granate, Lamp azul, conf>=0.25).
- Libro (62 págs): nueva Figura 9 al cierre de 5.5 con renumeración en
  cascada (9-11 -> 10-12), referencia en el texto y lista actualizada.
- Avances (30 págs): página de continuación de la sección 13 con la figura.
- Presentación (20 láminas): lámina nueva tras las barras M3FD con la
  evidencia visual y notas del orador.
</commit_message>
<xml_diff>
--- a/docs/Tesis_Borrador_V3.docx
+++ b/docs/Tesis_Borrador_V3.docx
@@ -4897,10 +4897,9 @@
       <w:r>
         <w:rPr>
           <w:rFonts w:eastAsia="Times New Roman" w:cs="Times New Roman"/>
-          <w:i/>
           <w:sz w:val="18"/>
         </w:rPr>
-        <w:t>Figura 9. Propuesta Novedosa (PSO: r = 25, m = 0,070) frente a la metodología clásica Top-Hat y al estado del arte.</w:t>
+        <w:t xml:space="preserve">Figura 9. Detecciones del modelo único VIS+IR en dos escenas de M3FD: la fusión recupera las personas que el visible pierde y las luces que el infrarrojo pierde.</w:t>
       </w:r>
     </w:p>
     <w:p>
@@ -4913,9 +4912,10 @@
       <w:r>
         <w:rPr>
           <w:rFonts w:eastAsia="Times New Roman" w:cs="Times New Roman"/>
-          <w:sz w:val="21"/>
-        </w:rPr>
-        <w:t>Figura 10. Convergencia del PSO según el número de partículas (izq.) y aptitud del barrido de configuraciones (der.), sobre tres escenas representativas.</w:t>
+          <w:i/>
+          <w:sz w:val="18"/>
+        </w:rPr>
+        <w:t>Figura 10. Propuesta Novedosa (PSO: r = 25, m = 0,070) frente a la metodología clásica Top-Hat y al estado del arte.</w:t>
       </w:r>
     </w:p>
     <w:p>
@@ -4930,7 +4930,22 @@
           <w:rFonts w:eastAsia="Times New Roman" w:cs="Times New Roman"/>
           <w:sz w:val="21"/>
         </w:rPr>
-        <w:t xml:space="preserve">Figura 11. Aptitud en función del peso de contraste m (r = 25): F_apt de la tesis y Fo del trabajo de referencia.</w:t>
+        <w:t>Figura 11. Convergencia del PSO según el número de partículas (izq.) y aptitud del barrido de configuraciones (der.), sobre tres escenas representativas.</w:t>
+      </w:r>
+    </w:p>
+    <w:p>
+      <w:pPr>
+        <w:pStyle w:val="Normal"/>
+        <w:spacing w:lineRule="auto" w:line="276" w:before="0" w:after="40"/>
+        <w:jc w:val="both"/>
+        <w:rPr/>
+      </w:pPr>
+      <w:r>
+        <w:rPr>
+          <w:rFonts w:eastAsia="Times New Roman" w:cs="Times New Roman"/>
+          <w:sz w:val="21"/>
+        </w:rPr>
+        <w:t xml:space="preserve">Figura 12. Aptitud en función del peso de contraste m (r = 25): F_apt de la tesis y Fo del trabajo de referencia.</w:t>
       </w:r>
     </w:p>
     <w:p>
@@ -30880,7 +30895,71 @@
           <w:iCs/>
           <w:rFonts w:eastAsia="Times New Roman" w:cs="Times New Roman"/>
         </w:rPr>
-        <w:t xml:space="preserve">La Tabla 13 confirma la complementariedad de forma extrema: el infrarrojo domina en personas (AP@0,5 = 0,220) pero es prácticamente ciego a las luces (0,018), y el visible presenta el patrón espejo (0,178 y 0,135). Las mejores fusiones superan en el promedio del par a ambas modalidades individuales —algo que ninguna logra por separado—, con la Propuesta Novedosa como la mejor fusión del estudio tanto en mAP global (0,239) como en personas (0,207, cerca del infrarrojo puro), manteniendo las luces cerca del visible; el óptimo de F_apt supera además al de Fo en las dos clases clave. El visible solo conserva el mejor mAP global de seis clases (0,245) por la abundancia de vehículos diurnos, y los valores absolutos son moderados (subconjunto de 500 imágenes y modelo nano): el experimento no busca récords, sino aislar el escenario donde la fusión es insustituible —detectar en una sola imagen objetos que cada modalidad pierde por separado—.</w:t>
+        <w:t xml:space="preserve">La Tabla 13 confirma la complementariedad de forma extrema: el infrarrojo domina en personas (AP@0,5 = 0,220) pero es prácticamente ciego a las luces (0,018), y el visible presenta el patrón espejo (0,178 y 0,135). Las mejores fusiones superan en el promedio del par a ambas modalidades individuales —algo que ninguna logra por separado—, con la Propuesta Novedosa como la mejor fusión del estudio tanto en mAP global (0,239) como en personas (0,207, cerca del infrarrojo puro), manteniendo las luces cerca del visible; el óptimo de F_apt supera además al de Fo en las dos clases clave. El visible solo conserva el mejor mAP global de seis clases (0,245) por la abundancia de vehículos diurnos, y los valores absolutos son moderados (subconjunto de 500 imágenes y modelo nano): el experimento no busca récords, sino aislar el escenario donde la fusión es insustituible —detectar en una sola imagen objetos que cada modalidad pierde por separado—. La Figura 9 ilustra el fenómeno sobre dos escenas de la validación: el visible no ve a las personas que la fusión recupera y el infrarrojo no ve las luces que la fusión conserva.</w:t>
+      </w:r>
+    </w:p>
+    <w:p>
+      <w:pPr>
+        <w:pStyle w:val="Normal"/>
+        <w:spacing w:lineRule="auto" w:line="276"/>
+        <w:jc w:val="center"/>
+        <w:rPr/>
+      </w:pPr>
+      <w:r>
+        <w:rPr/>
+        <w:drawing>
+          <wp:inline distT="0" distB="0" distL="0" distR="0">
+            <wp:extent cx="5760720" cy="3714197"/>
+            <wp:effectExtent l="0" t="0" r="0" b="0"/>
+            <wp:docPr id="9912" name="fig_m3fd_detecciones.png"/>
+            <wp:cNvGraphicFramePr>
+              <a:graphicFrameLocks xmlns:a="http://schemas.openxmlformats.org/drawingml/2006/main" noChangeAspect="1"/>
+            </wp:cNvGraphicFramePr>
+            <a:graphic xmlns:a="http://schemas.openxmlformats.org/drawingml/2006/main">
+              <a:graphicData uri="http://schemas.openxmlformats.org/drawingml/2006/picture">
+                <pic:pic xmlns:pic="http://schemas.openxmlformats.org/drawingml/2006/picture">
+                  <pic:nvPicPr>
+                    <pic:cNvPr id="14" name="Picture 13"/>
+                    <pic:cNvPicPr>
+                      <a:picLocks noChangeAspect="1" noChangeArrowheads="1"/>
+                    </pic:cNvPicPr>
+                  </pic:nvPicPr>
+                  <pic:blipFill>
+                    <a:blip r:embed="rId12"/>
+                    <a:stretch>
+                      <a:fillRect/>
+                    </a:stretch>
+                  </pic:blipFill>
+                  <pic:spPr bwMode="auto">
+                    <a:xfrm>
+                      <a:off x="0" y="0"/>
+                      <a:ext cx="5760720" cy="3714197"/>
+                    </a:xfrm>
+                    <a:prstGeom prst="rect">
+                      <a:avLst/>
+                    </a:prstGeom>
+                    <a:noFill/>
+                  </pic:spPr>
+                </pic:pic>
+              </a:graphicData>
+            </a:graphic>
+          </wp:inline>
+        </w:drawing>
+      </w:r>
+    </w:p>
+    <w:p>
+      <w:pPr>
+        <w:pStyle w:val="Normal"/>
+        <w:spacing w:lineRule="auto" w:line="276"/>
+        <w:jc w:val="both"/>
+        <w:rPr/>
+      </w:pPr>
+      <w:r>
+        <w:rPr>
+          <w:rFonts w:eastAsia="Times New Roman" w:cs="Times New Roman"/>
+          <w:sz w:val="18"/>
+        </w:rPr>
+        <w:t xml:space="preserve">Figura 9. Detecciones del modelo único VIS+IR en dos escenas de la validación de M3FD (personas en recuadro granate, luces en azul): en la escena superior el visible no detecta ninguna persona y la fusión las recupera; en la inferior el infrarrojo no detecta ninguna luz y la fusión las recupera.</w:t>
       </w:r>
     </w:p>
     <w:p>
@@ -31993,7 +32072,7 @@
           <w:i/>
           <w:sz w:val="18"/>
         </w:rPr>
-        <w:t>Figura 9. Propuesta Novedosa (PSO: r = 25, m = 0,070) frente a la metodología clásica Top-Hat y al estado del arte en las métricas estándar de calidad.</w:t>
+        <w:t>Figura 10. Propuesta Novedosa (PSO: r = 25, m = 0,070) frente a la metodología clásica Top-Hat y al estado del arte en las métricas estándar de calidad.</w:t>
       </w:r>
     </w:p>
     <w:p>
@@ -32008,7 +32087,7 @@
         <w:rPr>
           <w:rFonts w:eastAsia="Times New Roman" w:cs="Times New Roman"/>
         </w:rPr>
-        <w:t xml:space="preserve">La Figura 10 resume la optimización del método. El panel izquierdo muestra la convergencia del mejor global según el número de partículas (Tmax = 50): los enjambres grandes escapan del óptimo local r = 1 y alcanzan la aptitud máxima F = 1,9843. El panel derecho y la Tabla 11 sintetizan el barrido de 25 configuraciones: el óptimo global (r = 25, m = 0,070) es alcanzado por seis configuraciones y de forma consistente por los enjambres de 10 partículas con 30 o más iteraciones; la contribución de los elementos estructurantes lineales sobre el disco reside en la cobertura de orientaciones.</w:t>
+        <w:t xml:space="preserve">La Figura 11 resume la optimización del método. El panel izquierdo muestra la convergencia del mejor global según el número de partículas (Tmax = 50): los enjambres grandes escapan del óptimo local r = 1 y alcanzan la aptitud máxima F = 1,9843. El panel derecho y la Tabla 11 sintetizan el barrido de 25 configuraciones: el óptimo global (r = 25, m = 0,070) es alcanzado por seis configuraciones y de forma consistente por los enjambres de 10 partículas con 30 o más iteraciones; la contribución de los elementos estructurantes lineales sobre el disco reside en la cobertura de orientaciones.</w:t>
       </w:r>
     </w:p>
     <w:p>
@@ -32073,7 +32152,7 @@
           <w:i/>
           <w:sz w:val="18"/>
         </w:rPr>
-        <w:t>Figura 10. Convergencia del PSO según el número de partículas (izq.) y aptitud del barrido de configuraciones (der.), sobre tres escenas representativas.</w:t>
+        <w:t>Figura 11. Convergencia del PSO según el número de partículas (izq.) y aptitud del barrido de configuraciones (der.), sobre tres escenas representativas.</w:t>
       </w:r>
     </w:p>
     <w:p>
@@ -33205,7 +33284,7 @@
           <w:iCs/>
           <w:rFonts w:eastAsia="Times New Roman" w:cs="Times New Roman"/>
         </w:rPr>
-        <w:t xml:space="preserve">La Figura 11 muestra el paisaje de aptitud en función de m (con r = 25) sin restricciones de rango: ambas funciones decrecen monótonamente para m ≥ 0,2, de modo que ningún tamaño de enjambre ni número de iteraciones puede converger dentro de [0,5; 2,0]; y el máximo real de Fo sobre la propuesta se ubica en m ≈ 0,07, coincidente con el óptimo de la aptitud orientada a la fusión (m = 0,0703): ambas formulaciones acuerdan el peso adecuado para el operador con suma de ramas.</w:t>
+        <w:t xml:space="preserve">La Figura 12 muestra el paisaje de aptitud en función de m (con r = 25) sin restricciones de rango: ambas funciones decrecen monótonamente para m ≥ 0,2, de modo que ningún tamaño de enjambre ni número de iteraciones puede converger dentro de [0,5; 2,0]; y el máximo real de Fo sobre la propuesta se ubica en m ≈ 0,07, coincidente con el óptimo de la aptitud orientada a la fusión (m = 0,0703): ambas formulaciones acuerdan el peso adecuado para el operador con suma de ramas.</w:t>
       </w:r>
     </w:p>
     <w:p>
@@ -33270,7 +33349,7 @@
           <w:i/>
           <w:sz w:val="18"/>
         </w:rPr>
-        <w:t xml:space="preserve">Figura 11. Aptitud en función del peso de contraste m (r = 25), sin restricciones de rango: F_apt de la tesis y Fo del trabajo de referencia sobre ambos operadores.</w:t>
+        <w:t xml:space="preserve">Figura 12. Aptitud en función del peso de contraste m (r = 25), sin restricciones de rango: F_apt de la tesis y Fo del trabajo de referencia sobre ambos operadores.</w:t>
       </w:r>
     </w:p>
     <w:p>

</xml_diff>

<commit_message>
Libro: completa el paralelo F_o vs F_apt (LLVIP + figura cualitativa)
- Tabla 9 (LLVIP): la Propuesta aparece con sus dos tunings — F_apt (r=25,
  m=0,070; mAP50 0,936) y Fo (r=1, m=0,30; mAP50 0,922) — ambas en la banda
  de las fusiones; lectura actualizada.
- Sección de ablación: contraste de Wilcoxon pareado entre los dos óptimos
  (F_apt mejor y significativo en 8/12 métricas) + nueva Figura 13 cualitativa
  (comparacion_aptitudes.png, 3 escenas VIS/IR/Fo/F_apt).
- 63 páginas, figuras 1-13 consecutivas.
</commit_message>
<xml_diff>
--- a/docs/Tesis_Borrador_V3.docx
+++ b/docs/Tesis_Borrador_V3.docx
@@ -4946,6 +4946,21 @@
           <w:sz w:val="21"/>
         </w:rPr>
         <w:t xml:space="preserve">Figura 12. Aptitud en función del peso de contraste m (r = 25): F_apt de la tesis y Fo del trabajo de referencia.</w:t>
+      </w:r>
+    </w:p>
+    <w:p>
+      <w:pPr>
+        <w:pStyle w:val="Normal"/>
+        <w:spacing w:lineRule="auto" w:line="276" w:before="0" w:after="40"/>
+        <w:jc w:val="both"/>
+        <w:rPr/>
+      </w:pPr>
+      <w:r>
+        <w:rPr>
+          <w:rFonts w:eastAsia="Times New Roman" w:cs="Times New Roman"/>
+          <w:sz w:val="21"/>
+        </w:rPr>
+        <w:t xml:space="preserve">Figura 13. Efecto de la función de aptitud sobre el mismo operador: Fo (más textura) frente a F_apt (más limpia y estructural).</w:t>
       </w:r>
     </w:p>
     <w:p>
@@ -29380,7 +29395,7 @@
                 <w:rFonts w:eastAsia="Times New Roman" w:cs="Times New Roman"/>
                 <w:sz w:val="19"/>
               </w:rPr>
-              <w:t>Propuesta Novedosa (r=25, m=0,070)</w:t>
+              <w:t>Propuesta · F_apt (r=25, m=0,070)</w:t>
             </w:r>
           </w:p>
         </w:tc>
@@ -29489,6 +29504,145 @@
                 <w:sz w:val="19"/>
               </w:rPr>
               <w:t>0,859</w:t>
+            </w:r>
+          </w:p>
+        </w:tc>
+      </w:tr>
+      <w:tr>
+        <w:trPr/>
+        <w:tc>
+          <w:tcPr>
+            <w:tcW w:w="1872" w:type="dxa"/>
+            <w:tcBorders>
+              <w:top w:val="single" w:sz="4" w:space="0" w:color="B0B8C0"/>
+              <w:start w:val="single" w:sz="4" w:space="0" w:color="B0B8C0"/>
+              <w:bottom w:val="single" w:sz="4" w:space="0" w:color="B0B8C0"/>
+              <w:end w:val="single" w:sz="4" w:space="0" w:color="B0B8C0"/>
+            </w:tcBorders>
+          </w:tcPr>
+          <w:p>
+            <w:pPr>
+              <w:pStyle w:val="Normal"/>
+              <w:widowControl w:val="false"/>
+              <w:spacing w:lineRule="auto" w:line="276" w:before="0" w:after="120"/>
+              <w:jc w:val="center"/>
+              <w:rPr/>
+            </w:pPr>
+            <w:r>
+              <w:rPr>
+                <w:b/>
+                <w:rFonts w:eastAsia="Times New Roman" w:cs="Times New Roman"/>
+                <w:sz w:val="19"/>
+              </w:rPr>
+              <w:t>Propuesta · Fo (r=1, m=0,30)</w:t>
+            </w:r>
+          </w:p>
+        </w:tc>
+        <w:tc>
+          <w:tcPr>
+            <w:tcW w:w="1872" w:type="dxa"/>
+            <w:tcBorders>
+              <w:top w:val="single" w:sz="4" w:space="0" w:color="B0B8C0"/>
+              <w:start w:val="single" w:sz="4" w:space="0" w:color="B0B8C0"/>
+              <w:bottom w:val="single" w:sz="4" w:space="0" w:color="B0B8C0"/>
+              <w:end w:val="single" w:sz="4" w:space="0" w:color="B0B8C0"/>
+            </w:tcBorders>
+          </w:tcPr>
+          <w:p>
+            <w:pPr>
+              <w:pStyle w:val="Normal"/>
+              <w:widowControl w:val="false"/>
+              <w:spacing w:lineRule="auto" w:line="276" w:before="0" w:after="120"/>
+              <w:jc w:val="center"/>
+              <w:rPr/>
+            </w:pPr>
+            <w:r>
+              <w:rPr>
+                <w:rFonts w:eastAsia="Times New Roman" w:cs="Times New Roman"/>
+                <w:sz w:val="19"/>
+              </w:rPr>
+              <w:t>0,922</w:t>
+            </w:r>
+          </w:p>
+        </w:tc>
+        <w:tc>
+          <w:tcPr>
+            <w:tcW w:w="1872" w:type="dxa"/>
+            <w:tcBorders>
+              <w:top w:val="single" w:sz="4" w:space="0" w:color="B0B8C0"/>
+              <w:start w:val="single" w:sz="4" w:space="0" w:color="B0B8C0"/>
+              <w:bottom w:val="single" w:sz="4" w:space="0" w:color="B0B8C0"/>
+              <w:end w:val="single" w:sz="4" w:space="0" w:color="B0B8C0"/>
+            </w:tcBorders>
+          </w:tcPr>
+          <w:p>
+            <w:pPr>
+              <w:pStyle w:val="Normal"/>
+              <w:widowControl w:val="false"/>
+              <w:spacing w:lineRule="auto" w:line="276" w:before="0" w:after="120"/>
+              <w:jc w:val="center"/>
+              <w:rPr/>
+            </w:pPr>
+            <w:r>
+              <w:rPr>
+                <w:rFonts w:eastAsia="Times New Roman" w:cs="Times New Roman"/>
+                <w:sz w:val="19"/>
+              </w:rPr>
+              <w:t>0,619</w:t>
+            </w:r>
+          </w:p>
+        </w:tc>
+        <w:tc>
+          <w:tcPr>
+            <w:tcW w:w="1872" w:type="dxa"/>
+            <w:tcBorders>
+              <w:top w:val="single" w:sz="4" w:space="0" w:color="B0B8C0"/>
+              <w:start w:val="single" w:sz="4" w:space="0" w:color="B0B8C0"/>
+              <w:bottom w:val="single" w:sz="4" w:space="0" w:color="B0B8C0"/>
+              <w:end w:val="single" w:sz="4" w:space="0" w:color="B0B8C0"/>
+            </w:tcBorders>
+          </w:tcPr>
+          <w:p>
+            <w:pPr>
+              <w:pStyle w:val="Normal"/>
+              <w:widowControl w:val="false"/>
+              <w:spacing w:lineRule="auto" w:line="276" w:before="0" w:after="120"/>
+              <w:jc w:val="center"/>
+              <w:rPr/>
+            </w:pPr>
+            <w:r>
+              <w:rPr>
+                <w:rFonts w:eastAsia="Times New Roman" w:cs="Times New Roman"/>
+                <w:sz w:val="19"/>
+              </w:rPr>
+              <w:t>0,934</w:t>
+            </w:r>
+          </w:p>
+        </w:tc>
+        <w:tc>
+          <w:tcPr>
+            <w:tcW w:w="1872" w:type="dxa"/>
+            <w:tcBorders>
+              <w:top w:val="single" w:sz="4" w:space="0" w:color="B0B8C0"/>
+              <w:start w:val="single" w:sz="4" w:space="0" w:color="B0B8C0"/>
+              <w:bottom w:val="single" w:sz="4" w:space="0" w:color="B0B8C0"/>
+              <w:end w:val="single" w:sz="4" w:space="0" w:color="B0B8C0"/>
+            </w:tcBorders>
+          </w:tcPr>
+          <w:p>
+            <w:pPr>
+              <w:pStyle w:val="Normal"/>
+              <w:widowControl w:val="false"/>
+              <w:spacing w:lineRule="auto" w:line="276" w:before="0" w:after="120"/>
+              <w:jc w:val="center"/>
+              <w:rPr/>
+            </w:pPr>
+            <w:r>
+              <w:rPr>
+                <w:rFonts w:eastAsia="Times New Roman" w:cs="Times New Roman"/>
+                <w:sz w:val="19"/>
+              </w:rPr>
+              <w:t>0,801</w:t>
             </w:r>
           </w:p>
         </w:tc>
@@ -29506,7 +29660,7 @@
         <w:rPr>
           <w:rFonts w:eastAsia="Times New Roman" w:cs="Times New Roman"/>
         </w:rPr>
-        <w:t>La Tabla 9 admite tres lecturas. Primero, toda fusión mejora con claridad sobre el visible solo (mAP@0,5 de 0,808 a una banda de 0,926–0,949, es decir entre +0,12 y +0,14 puntos): cuando el canal visible es débil —escenas nocturnas—, fusionar aporta información decisiva. Segundo, el infrarrojo solo es la modalidad más fuerte (mAP@0,5 = 0,957; mAP@0,5:0,95 = 0,663) y ninguna fusión lo supera, coherente con que LLVIP es detección de peatones en baja luz, donde la firma térmica domina. Tercero, entre las siete fusiones las diferencias son pequeñas (mAP@0,5 en una banda estrecha de 0,926 a 0,949): la pirámide de Laplace encabeza (0,949), seguida de cerca por DTCWT (0,948) y DWT (0,946), mientras que la Propuesta Novedosa resulta competitiva (0,936) —prácticamente empatada con la metodología clásica Top-Hat (0,938) y a 1,3 puntos del mejor— sin ser líder. La conclusión es matizada y relevante: la superioridad de la propuesta en las métricas de calidad de imagen (Nabf, SSIM) no se traslada automáticamente a la tarea de detección, donde la banda de fusiones es estrecha y la modalidad térmica domina; la elección del método depende del criterio operativo prioritario —en consonancia con lo señalado por Singh et al. (2023)—.</w:t>
+        <w:t>La Tabla 9 admite tres lecturas. Primero, toda fusión mejora con claridad sobre el visible solo (mAP@0,5 de 0,808 a una banda de 0,926–0,949, es decir entre +0,12 y +0,14 puntos): cuando el canal visible es débil —escenas nocturnas—, fusionar aporta información decisiva. Segundo, el infrarrojo solo es la modalidad más fuerte (mAP@0,5 = 0,957; mAP@0,5:0,95 = 0,663) y ninguna fusión lo supera, coherente con que LLVIP es detección de peatones en baja luz, donde la firma térmica domina. Tercero, entre las siete fusiones las diferencias son pequeñas (mAP@0,5 en una banda estrecha de 0,926 a 0,949): la pirámide de Laplace encabeza (0,949), seguida de cerca por DTCWT (0,948) y DWT (0,946), mientras que las dos configuraciones de la Propuesta Novedosa resultan competitivas y prácticamente empatadas entre sí —la tunada con F_apt (0,936) y la tunada con la aptitud publicada Fo (0,922)—, ambas en la banda de las fusiones y a pocos puntos del mejor, sin ser líderes. La conclusión es matizada y relevante: la superioridad de la propuesta en las métricas de calidad de imagen (Nabf, SSIM) no se traslada automáticamente a la tarea de detección, donde la banda de fusiones es estrecha y la modalidad térmica domina; la elección del método depende del criterio operativo prioritario —en consonancia con lo señalado por Singh et al. (2023)—.</w:t>
       </w:r>
     </w:p>
     <w:p>
@@ -34067,7 +34221,71 @@
           <w:iCs/>
           <w:rFonts w:eastAsia="Times New Roman" w:cs="Times New Roman"/>
         </w:rPr>
-        <w:t xml:space="preserve">La propuesta optimizada con la aptitud orientada a la fusión conserva el mejor perfil de limpieza y estructura (Nabf = 0,041; SSIM = 0,782). El óptimo de Fo sobre el operador clásico (r = 25; m = 0,30) resulta competitivo en bordes y correlación al costo de 4,5 veces más artefactos, y el óptimo de Fo sobre la propuesta confirma su carácter trivial. La función de aptitud define el perfil del resultado: la orientada a la fusión es la adecuada para los objetivos de esta tesis, lo que refuerza H2.</w:t>
+        <w:t xml:space="preserve">La propuesta optimizada con la aptitud orientada a la fusión conserva el mejor perfil de limpieza y estructura (Nabf = 0,041; SSIM = 0,782). El óptimo de Fo sobre el operador clásico (r = 25; m = 0,30) resulta competitivo en bordes y correlación al costo de 4,5 veces más artefactos, y el óptimo de Fo sobre la propuesta confirma su carácter trivial. Sobre los 20 pares, un contraste de Wilcoxon pareado entre ambos óptimos de la propuesta favorece a F_apt de forma significativa en 8 de las 12 métricas —las de fidelidad estructural y artefactos (Nabf, SSIM, Qabf, SCD, VIF)—, mientras que Fo solo supera en las de actividad de alta frecuencia (SF, MG, MI). La función de aptitud define el perfil del resultado: la orientada a la fusión es la adecuada para los objetivos de esta tesis, lo que refuerza H2.</w:t>
+      </w:r>
+    </w:p>
+    <w:p>
+      <w:pPr>
+        <w:pStyle w:val="Normal"/>
+        <w:spacing w:lineRule="auto" w:line="276"/>
+        <w:jc w:val="center"/>
+        <w:rPr/>
+      </w:pPr>
+      <w:r>
+        <w:rPr/>
+        <w:drawing>
+          <wp:inline distT="0" distB="0" distL="0" distR="0">
+            <wp:extent cx="5760720" cy="4536000"/>
+            <wp:effectExtent l="0" t="0" r="0" b="0"/>
+            <wp:docPr id="9913" name="comparacion_aptitudes.png"/>
+            <wp:cNvGraphicFramePr>
+              <a:graphicFrameLocks xmlns:a="http://schemas.openxmlformats.org/drawingml/2006/main" noChangeAspect="1"/>
+            </wp:cNvGraphicFramePr>
+            <a:graphic xmlns:a="http://schemas.openxmlformats.org/drawingml/2006/main">
+              <a:graphicData uri="http://schemas.openxmlformats.org/drawingml/2006/picture">
+                <pic:pic xmlns:pic="http://schemas.openxmlformats.org/drawingml/2006/picture">
+                  <pic:nvPicPr>
+                    <pic:cNvPr id="14" name="Picture 13"/>
+                    <pic:cNvPicPr>
+                      <a:picLocks noChangeAspect="1" noChangeArrowheads="1"/>
+                    </pic:cNvPicPr>
+                  </pic:nvPicPr>
+                  <pic:blipFill>
+                    <a:blip r:embed="rId13"/>
+                    <a:stretch>
+                      <a:fillRect/>
+                    </a:stretch>
+                  </pic:blipFill>
+                  <pic:spPr bwMode="auto">
+                    <a:xfrm>
+                      <a:off x="0" y="0"/>
+                      <a:ext cx="5760720" cy="4536000"/>
+                    </a:xfrm>
+                    <a:prstGeom prst="rect">
+                      <a:avLst/>
+                    </a:prstGeom>
+                    <a:noFill/>
+                  </pic:spPr>
+                </pic:pic>
+              </a:graphicData>
+            </a:graphic>
+          </wp:inline>
+        </w:drawing>
+      </w:r>
+    </w:p>
+    <w:p>
+      <w:pPr>
+        <w:pStyle w:val="Normal"/>
+        <w:spacing w:lineRule="auto" w:line="276"/>
+        <w:jc w:val="both"/>
+        <w:rPr/>
+      </w:pPr>
+      <w:r>
+        <w:rPr>
+          <w:rFonts w:eastAsia="Times New Roman" w:cs="Times New Roman"/>
+          <w:sz w:val="18"/>
+        </w:rPr>
+        <w:t xml:space="preserve">Figura 13. Efecto de la función de aptitud sobre el mismo operador (tres escenas): la tunada con Fo (r=1, m=0,30) inyecta más textura de alta frecuencia; la tunada con F_apt (r=25, m=0,070) es más limpia y estructuralmente fiel.</w:t>
       </w:r>
     </w:p>
     <w:p>

</xml_diff>

<commit_message>
WIP reframe F_o (rama, NO usar): cirugía estructural del libro
Estructura hecha (falta narrativa+Figura7+2a tabla resultados+regenerar PDF):
aptitud->F_o, Tablas 4/5/7/8 a 9 métricas, ablación eliminada, detección
limpiada, tablas renumeradas 1-11. El libro AÚN es incoherente (prosa con
Nabf/Qabf y ranking desactualizado). main mantiene el libro coherente previo.
</commit_message>
<xml_diff>
--- a/docs/Tesis_Borrador_V3.docx
+++ b/docs/Tesis_Borrador_V3.docx
@@ -1187,7 +1187,7 @@
         <w:rPr>
           <w:rFonts w:eastAsia="Times New Roman" w:cs="Times New Roman"/>
         </w:rPr>
-        <w:t xml:space="preserve">La fusión de imágenes visible (VIS) e infrarroja (IR) es clave para la percepción computacional en condiciones adversas (vigilancia, conducción nocturna, búsqueda y rescate). Este trabajo propone la PROPUESTA NOVEDOSA, un método de fusión basado en la transformada Top-Hat que, sobre una única escala, promedia las respuestas de cuatro elementos estructurantes lineales (0°, 45°, 90°, 135°) y las suma a la respuesta de un disco para obtener transformadas Top-Hat y Bottom-Hat óptimas; la reconstrucción sigue el esquema aditivo–sustractivo de Bala et al., y el radio r del banco de elementos estructurantes y el peso de contraste m se ajustan automáticamente por Optimización por Enjambre de Partículas (PSO), cuya configuración se selecciona mediante un barrido sistemático de 25 combinaciones de partículas e iteraciones (2–10 × 10–50), replicando el diseño experimental de Ortega y Espinoza (2025). Se lo compara con seis métodos: cinco representativos del estado del arte —pirámide de Laplace (LP), Ratio of low-pass Pyramid (RP), wavelet discreta (DWT), Dual-Tree Complex Wavelet (DTCWT) y curvelet (CVT)— y la metodología clásica de la transformada Top-Hat, sobre el TNO Image Fusion Dataset, con doce métricas sin referencia bajo pruebas no paramétricas (Friedman y Wilcoxon con corrección de Holm). En su configuración óptima (PSO: r=25, m=0,070) la propuesta obtiene la menor tasa de artefactos del estudio (Nabf=0,041, 2,7 veces menos que el mejor rival) y la mayor similitud estructural (SSIM=0,782), quedando segunda en preservación de bordes, correlación y fidelidad visual (Qabf=0,500; SCD=1,450; VIF=0,368), a milésimas del líder de cada métrica; la metodología clásica Top-Hat solo la supera en métricas de actividad bruta al costo del mayor nivel de artefactos del estudio (Nabf=0,585). Como evaluación orientada a tarea, el reentrenamiento de un detector (YOLOv8n) sobre el conjunto etiquetado LLVIP muestra que toda fusión supera con claridad al visible solo (mAP@0,5 de 0,81 a 0,93–0,95), aunque el infrarrojo solo es la modalidad más fuerte (0,957) y la propuesta resulta competitiva (0,936) sin liderar, evidenciando que la superioridad en calidad de imagen no se traslada automáticamente a la detección. En un experimento complementario sobre M3FD, con dos clases de visibilidad opuesta (personas/IR y luces/VIS) y un único detector entrenado con ambas modalidades, la fusión detecta ambas clases en una sola imagen y la propuesta es la mejor fusión del estudio (mAP@0,5 = 0,239). Se concluye que la propuesta mejora la calidad de fusión —en particular la limpieza y la fidelidad estructural— frente a la metodología clásica Top-Hat y al estado del arte, manteniendo bajo costo computacional e interpretabilidad morfológica.</w:t>
+        <w:t xml:space="preserve">La fusión de imágenes visible (VIS) e infrarroja (IR) es clave para la percepción computacional en condiciones adversas (vigilancia, conducción nocturna, búsqueda y rescate). Este trabajo propone la PROPUESTA NOVEDOSA, un método de fusión basado en la transformada Top-Hat que, sobre una única escala, promedia las respuestas de cuatro elementos estructurantes lineales (0°, 45°, 90°, 135°) y las suma a la respuesta de un disco para obtener transformadas Top-Hat y Bottom-Hat óptimas; la reconstrucción sigue el esquema aditivo–sustractivo de Bala et al., y el radio r del banco de elementos estructurantes y el peso de contraste m se ajustan automáticamente por Optimización por Enjambre de Partículas (PSO), cuya configuración se selecciona mediante un barrido sistemático de 25 combinaciones de partículas e iteraciones (2–10 × 10–50), replicando el diseño experimental de Ortega y Espinoza (2025). Se lo compara con seis métodos: cinco representativos del estado del arte —pirámide de Laplace (LP), Ratio of low-pass Pyramid (RP), wavelet discreta (DWT), Dual-Tree Complex Wavelet (DTCWT) y curvelet (CVT)— y la metodología clásica de la transformada Top-Hat, sobre el TNO Image Fusion Dataset, con nueve métricas sin referencia bajo pruebas no paramétricas (Friedman y Wilcoxon con corrección de Holm). En su configuración óptima (PSO: r=25, m=0,070) la propuesta obtiene la menor tasa de artefactos del estudio (Nabf=0,041, 2,7 veces menos que el mejor rival) y la mayor similitud estructural (SSIM=0,782), quedando segunda en preservación de bordes, correlación y fidelidad visual (Qabf=0,500; SCD=1,450; VIF=0,368), a milésimas del líder de cada métrica; la metodología clásica Top-Hat solo la supera en métricas de actividad bruta al costo del mayor nivel de artefactos del estudio (Nabf=0,585). Como evaluación orientada a tarea, el reentrenamiento de un detector (YOLOv8n) sobre el conjunto etiquetado LLVIP muestra que toda fusión supera con claridad al visible solo (mAP@0,5 de 0,81 a 0,93–0,95), aunque el infrarrojo solo es la modalidad más fuerte (0,957) y la propuesta resulta competitiva (0,936) sin liderar, evidenciando que la superioridad en calidad de imagen no se traslada automáticamente a la detección. En un experimento complementario sobre M3FD, con dos clases de visibilidad opuesta (personas/IR y luces/VIS) y un único detector entrenado con ambas modalidades, la fusión detecta ambas clases en una sola imagen y la propuesta es la mejor fusión del estudio (mAP@0,5 = 0,239). Se concluye que la propuesta mejora la calidad de fusión —en particular la limpieza y la fidelidad estructural— frente a la metodología clásica Top-Hat y al estado del arte, manteniendo bajo costo computacional e interpretabilidad morfológica.</w:t>
       </w:r>
     </w:p>
     <w:p>
@@ -4884,7 +4884,7 @@
           <w:rFonts w:eastAsia="Times New Roman" w:cs="Times New Roman"/>
           <w:sz w:val="21"/>
         </w:rPr>
-        <w:t>Figura 8. Ranking global por método (promedio de rangos sobre las doce métricas, con la dirección de cada una corregida).</w:t>
+        <w:t>Figura 8. Ranking global por método (promedio de rangos sobre las nueve métricas, con la dirección de cada una corregida).</w:t>
       </w:r>
     </w:p>
     <w:p>
@@ -4931,36 +4931,6 @@
           <w:sz w:val="21"/>
         </w:rPr>
         <w:t>Figura 11. Convergencia del PSO según el número de partículas (izq.) y aptitud del barrido de configuraciones (der.), sobre tres escenas representativas.</w:t>
-      </w:r>
-    </w:p>
-    <w:p>
-      <w:pPr>
-        <w:pStyle w:val="Normal"/>
-        <w:spacing w:lineRule="auto" w:line="276" w:before="0" w:after="40"/>
-        <w:jc w:val="both"/>
-        <w:rPr/>
-      </w:pPr>
-      <w:r>
-        <w:rPr>
-          <w:rFonts w:eastAsia="Times New Roman" w:cs="Times New Roman"/>
-          <w:sz w:val="21"/>
-        </w:rPr>
-        <w:t xml:space="preserve">Figura 12. Aptitud en función del peso de contraste m (r = 25): F_apt de la tesis y Fo del trabajo de referencia.</w:t>
-      </w:r>
-    </w:p>
-    <w:p>
-      <w:pPr>
-        <w:pStyle w:val="Normal"/>
-        <w:spacing w:lineRule="auto" w:line="276" w:before="0" w:after="40"/>
-        <w:jc w:val="both"/>
-        <w:rPr/>
-      </w:pPr>
-      <w:r>
-        <w:rPr>
-          <w:rFonts w:eastAsia="Times New Roman" w:cs="Times New Roman"/>
-          <w:sz w:val="21"/>
-        </w:rPr>
-        <w:t xml:space="preserve">Figura 13. Efecto de la función de aptitud sobre el mismo operador: Fo (más textura) frente a F_apt (más limpia y estructural).</w:t>
       </w:r>
     </w:p>
     <w:p>
@@ -5047,7 +5017,35 @@
           <w:rFonts w:eastAsia="Times New Roman" w:cs="Times New Roman"/>
           <w:sz w:val="21"/>
         </w:rPr>
-        <w:t>Tabla 5. Promedios de las seis métricas estándar de calidad de fusión por método (n = 20 pares).</w:t>
+        <w:t>Tabla 5. Promedios de frecuencia espacial (SF), similitud estructural (SSIM) y PSNR por método (n = 20 pares).</w:t>
+      </w:r>
+    </w:p>
+    <w:p>
+      <w:pPr>
+        <w:pStyle w:val="Normal"/>
+        <w:spacing w:lineRule="auto" w:line="276" w:before="0" w:after="40"/>
+        <w:rPr/>
+      </w:pPr>
+      <w:r>
+        <w:rPr>
+          <w:rFonts w:eastAsia="Times New Roman" w:cs="Times New Roman"/>
+          <w:sz w:val="21"/>
+        </w:rPr>
+        <w:t>Tabla 6. Prueba de Friedman por métrica (χ², p-valor; α = 0,05).</w:t>
+      </w:r>
+    </w:p>
+    <w:p>
+      <w:pPr>
+        <w:pStyle w:val="Normal"/>
+        <w:spacing w:lineRule="auto" w:line="276" w:before="0" w:after="40"/>
+        <w:rPr/>
+      </w:pPr>
+      <w:r>
+        <w:rPr>
+          <w:rFonts w:eastAsia="Times New Roman" w:cs="Times New Roman"/>
+          <w:sz w:val="21"/>
+        </w:rPr>
+        <w:t>Tabla 7. Ranking promedio por método y métrica (1 = mejor).</w:t>
       </w:r>
     </w:p>
     <w:p>
@@ -5062,35 +5060,7 @@
           <w:rFonts w:eastAsia="Times New Roman" w:cs="Times New Roman"/>
           <w:sz w:val="21"/>
         </w:rPr>
-        <w:t>Tabla 6. Métricas adicionales del review (FMI y Piella Q0/QW/QE) por método — medias sobre 20 pares.</w:t>
-      </w:r>
-    </w:p>
-    <w:p>
-      <w:pPr>
-        <w:pStyle w:val="Normal"/>
-        <w:spacing w:lineRule="auto" w:line="276" w:before="0" w:after="40"/>
-        <w:rPr/>
-      </w:pPr>
-      <w:r>
-        <w:rPr>
-          <w:rFonts w:eastAsia="Times New Roman" w:cs="Times New Roman"/>
-          <w:sz w:val="21"/>
-        </w:rPr>
-        <w:t>Tabla 7. Prueba de Friedman por métrica (χ², p-valor; α = 0,05).</w:t>
-      </w:r>
-    </w:p>
-    <w:p>
-      <w:pPr>
-        <w:pStyle w:val="Normal"/>
-        <w:spacing w:lineRule="auto" w:line="276" w:before="0" w:after="40"/>
-        <w:rPr/>
-      </w:pPr>
-      <w:r>
-        <w:rPr>
-          <w:rFonts w:eastAsia="Times New Roman" w:cs="Times New Roman"/>
-          <w:sz w:val="21"/>
-        </w:rPr>
-        <w:t>Tabla 8. Ranking promedio por método y métrica (1 = mejor).</w:t>
+        <w:t>Tabla 8. Detección de peatones en LLVIP — mAP por modalidad (YOLOv8n; subconjunto 2000 train / 500 val, 40 épocas).</w:t>
       </w:r>
     </w:p>
     <w:p>
@@ -5105,7 +5075,7 @@
           <w:rFonts w:eastAsia="Times New Roman" w:cs="Times New Roman"/>
           <w:sz w:val="21"/>
         </w:rPr>
-        <w:t>Tabla 9. Detección de peatones en LLVIP — mAP por modalidad (YOLOv8n; subconjunto 2000 train / 500 val, 40 épocas).</w:t>
+        <w:t>Tabla 9. Propuesta Novedosa frente a la metodología clásica Top-Hat y al estado del arte — medias sobre 20 pares (n = 20).</w:t>
       </w:r>
     </w:p>
     <w:p>
@@ -5120,7 +5090,10 @@
           <w:rFonts w:eastAsia="Times New Roman" w:cs="Times New Roman"/>
           <w:sz w:val="21"/>
         </w:rPr>
-        <w:t>Tabla 10. Propuesta Novedosa frente a la metodología clásica Top-Hat y al estado del arte — medias sobre 20 pares (n = 20).</w:t>
+        <w:t>Tabla 10. Barrido de configuraciones del PSO: mejor aptitud F por combinación de partículas (n) e iteraciones (T).</w:t>
+      </w:r>
+      <w:r>
+        <w:br w:type="page"/>
       </w:r>
     </w:p>
     <w:p>
@@ -5135,40 +5108,7 @@
           <w:rFonts w:eastAsia="Times New Roman" w:cs="Times New Roman"/>
           <w:sz w:val="21"/>
         </w:rPr>
-        <w:t>Tabla 11. Barrido de configuraciones del PSO: mejor aptitud F por combinación de partículas (n) e iteraciones (T).</w:t>
-      </w:r>
-      <w:r>
-        <w:br w:type="page"/>
-      </w:r>
-    </w:p>
-    <w:p>
-      <w:pPr>
-        <w:pStyle w:val="Normal"/>
-        <w:spacing w:lineRule="auto" w:line="276" w:before="0" w:after="40"/>
-        <w:jc w:val="both"/>
-        <w:rPr/>
-      </w:pPr>
-      <w:r>
-        <w:rPr>
-          <w:rFonts w:eastAsia="Times New Roman" w:cs="Times New Roman"/>
-          <w:sz w:val="21"/>
-        </w:rPr>
-        <w:t xml:space="preserve">Tabla 12. Ablación de la función de aptitud: óptimos de F_apt y de Fo sobre los 20 pares.</w:t>
-      </w:r>
-    </w:p>
-    <w:p>
-      <w:pPr>
-        <w:pStyle w:val="Normal"/>
-        <w:spacing w:lineRule="auto" w:line="276" w:before="0" w:after="40"/>
-        <w:jc w:val="both"/>
-        <w:rPr/>
-      </w:pPr>
-      <w:r>
-        <w:rPr>
-          <w:rFonts w:eastAsia="Times New Roman" w:cs="Times New Roman"/>
-          <w:sz w:val="21"/>
-        </w:rPr>
-        <w:t xml:space="preserve">Tabla 13. Clases complementarias en M3FD: AP@0,5 por clase y mAP global con un detector único VIS+IR.</w:t>
+        <w:t xml:space="preserve">Tabla 11. Clases complementarias en M3FD: AP@0,5 por clase y mAP global con un detector único VIS+IR.</w:t>
       </w:r>
     </w:p>
     <w:p>
@@ -5516,7 +5456,7 @@
         <w:rPr>
           <w:rFonts w:eastAsia="Times New Roman" w:cs="Times New Roman"/>
         </w:rPr>
-        <w:t>Comparar el método óptimo con la metodología clásica de fusión Top-Hat y con cinco métodos representativos del estado del arte (LP, RP, DWT, DTCWT y CVT) sobre doce métricas sin referencia, con pruebas no paramétricas (Friedman y Wilcoxon con corrección de Holm).</w:t>
+        <w:t>Comparar el método óptimo con la metodología clásica de fusión Top-Hat y con cinco métodos representativos del estado del arte (LP, RP, DWT, DTCWT y CVT) sobre nueve métricas sin referencia, con pruebas no paramétricas (Friedman y Wilcoxon con corrección de Holm).</w:t>
       </w:r>
     </w:p>
     <w:p>
@@ -10931,13 +10871,14 @@
           <w:iCs/>
           <w:rFonts w:eastAsia="Times New Roman" w:cs="Times New Roman"/>
         </w:rPr>
-        <w:t xml:space="preserve">Función de aptitud orientada a la fusión. </w:t>
-      </w:r>
-      <w:r>
-        <w:rPr>
-          <w:rFonts w:eastAsia="Times New Roman" w:cs="Times New Roman"/>
-        </w:rPr>
-        <w:t xml:space="preserve">A diferencia de una aptitud de fidelidad pura (SSIM + E + PSNR), que premia el realce conservador y conduce a óptimos triviales, aquí el PSO maximiza una aptitud orientada explícitamente a la calidad de fusión, definida en la ecuación (14), que recompensa la similitud estructural (SSIM; Wang et al., 2004), la preservación de bordes (QAB/F; Xydeas y Petrović, 2000) y la correlación de las diferencias (SCD; Aslantas y Bendes, 2015, con peso 0,5 que normaliza su rango [−2, 2] al de las demás), y penaliza los artefactos (NAB/F, del mismo marco de Xydeas y Petrović). La composición es una elaboración propia de esta tesis, siguiendo la práctica de las funciones objetivo multicriterio en la fusión optimizada por PSO (Tao et al., 2010; Malviya y Saxena, 2014; Ortega y Espinoza, 2025); su validez frente a la alternativa de fidelidad pura se contrasta empíricamente en la ablación del final de esta sección. El barrido alcanzó el óptimo global r = 25 y m = 0,070 (aptitud F = 1,9843), hallado de forma consistente por los enjambres de 10 partículas con 30 o más iteraciones —mientras que los enjambres de 2 partículas quedan atrapados en el óptimo local r = 1—; con esa configuración se evalúa el método en el capítulo de resultados.</w:t>
+        <w:t xml:space="preserve">Función de aptitud (Ortega y Espinoza). </w:t>
+      </w:r>
+      <w:r>
+        <w:rPr>
+          <w:iCs/>
+          <w:rFonts w:eastAsia="Times New Roman" w:cs="Times New Roman"/>
+        </w:rPr>
+        <w:t xml:space="preserve">Los hiperparámetros (r, m) se ajustan maximizando la función objetivo del trabajo de referencia, Fo = SSIMavg + En + PSNRn (ecuación 14): la similitud estructural promedio con las fuentes (SSIMavg; Wang et al., 2004), la entropía normalizada (En = E/8) y la relación señal-ruido de pico normalizada (PSNRn = PSNR/100), sin pesos arbitrarios, equilibrando preservación estructural, contenido informativo y reducción de la distorsión (Ortega y Espinoza, 2025). El barrido de 25 configuraciones (partículas 2–10 × iteraciones 10–50, Cuadro 1 de dicho trabajo) sobre tres escenas representativas, con r ∈ [1, 25] y m ∈ [0,05; 1,20] —el rango de m se amplía respecto del original [0,3; 2,0] porque el operador con suma de ramas inyecta del orden de cuatro veces más energía de detalle que el disco único para el que se calibró—, alcanza el óptimo global r = 25, m = 0,0703 (Fo = 1,7654), de forma consistente con los enjambres de 10 partículas y 30 o más iteraciones; con esa configuración se evalúa el método en el capítulo de resultados.</w:t>
       </w:r>
     </w:p>
     <w:p>
@@ -11305,7 +11246,7 @@
                 <w:rFonts w:eastAsia="Times New Roman" w:cs="Times New Roman"/>
                 <w:sz w:val="19"/>
               </w:rPr>
-              <w:t>F = SSIM + Qabf + 0,5·SCD − Nabf</w:t>
+              <w:t>Fo = SSIMavg + En + PSNRn</w:t>
             </w:r>
           </w:p>
         </w:tc>
@@ -12521,7 +12462,7 @@
         <w:rPr>
           <w:rFonts w:eastAsia="Times New Roman" w:cs="Times New Roman"/>
         </w:rPr>
-        <w:t>Dado que en la fusión VIS/IR no existe una imagen de referencia (ground truth) —como subraya la revisión de Singh et al. (2023)—, la evaluación se realiza con dieciséis métricas sin referencia, que computan el puntaje a partir de la imagen fusionada y de sus fuentes. Seis son clásicas de actividad e información (EN, SD, FE, MG, MI_vis, MI_ir); seis son estándar de calidad de fusión (SF, Qabf, Nabf, SSIM, SCD, VIF); y cuatro se incorporan siguiendo dicha revisión: la información mutua de la fusión sobre mapas de gradiente (FMI; Haghighat et al., 2011) y los índices de Piella y Heijmans (2003) —Q0 (índice universal por ventana), QW (ponderado por saliencia local) y QE (dependiente de bordes)—. Estas métricas evalúan la fidelidad a las fuentes, la preservación de bordes y la generación de artefactos, dimensiones que las clásicas —todas de tipo «mayor es mejor»— no capturan. Las métricas con referencia (PSNR, RMSE, UQI, ERGAS) no se emplean por carecer de imagen de referencia en este problema.</w:t>
+        <w:t>Dado que en la fusión VIS/IR no existe una imagen de referencia (ground truth) —como subraya la revisión de Singh et al. (2023)—, la evaluación se realiza con nueve métricas sin referencia, que computan el puntaje a partir de la imagen fusionada y de sus fuentes. Seis son clásicas de actividad e información (EN, SD, FE, MG, MI_vis, MI_ir); seis son estándar de calidad de fusión (SF, Qabf, Nabf, SSIM, SCD, VIF); y cuatro se incorporan siguiendo dicha revisión: la información mutua de la fusión sobre mapas de gradiente (FMI; Haghighat et al., 2011) y los índices de Piella y Heijmans (2003) —Q0 (índice universal por ventana), QW (ponderado por saliencia local) y QE (dependiente de bordes)—. Estas métricas evalúan la fidelidad a las fuentes, la preservación de bordes y la generación de artefactos, dimensiones que las clásicas —todas de tipo «mayor es mejor»— no capturan. Las métricas con referencia (PSNR, RMSE, UQI, ERGAS) no se emplean por carecer de imagen de referencia en este problema.</w:t>
       </w:r>
     </w:p>
     <w:p>
@@ -17960,7 +17901,7 @@
         <w:rPr>
           <w:rFonts w:eastAsia="Times New Roman" w:cs="Times New Roman"/>
         </w:rPr>
-        <w:t>Criterio escalar que el PSO maximiza para evaluar cada solución candidata. Aquí es una combinación orientada a la fusión, F = SSIM + Qabf + 0,5·SCD − Nabf, que premia la fidelidad estructural, la preservación de bordes y la correlación, y penaliza los artefactos.</w:t>
+        <w:t>Criterio escalar que el PSO maximiza para evaluar cada solución candidata. Aquí es una combinación orientada a la fusión, Fo = SSIMavg + En + PSNRn, que premia la fidelidad estructural, la preservación de bordes y la correlación, y penaliza los artefactos.</w:t>
       </w:r>
       <w:r>
         <w:br w:type="page"/>
@@ -18088,7 +18029,7 @@
         <w:rPr>
           <w:rFonts w:eastAsia="Times New Roman" w:cs="Times New Roman"/>
         </w:rPr>
-        <w:t xml:space="preserve">El diseño es comparativo inter-método: siete métodos de fusión —la Propuesta Novedosa, la metodología clásica Top-Hat y cinco representativos del estado del arte (LP, RP, DWT, DTCWT y CVT)— se aplican a cada uno de los 20 pares del dataset, totalizando 140 fusiones evaluadas con las doce métricas sin referencia, base del análisis estadístico inter-método (las cuatro métricas complementarias del review —FMI, Q0, QW y QE— se reportan de forma descriptiva en la Tabla 6). Los dos hiperparámetros de la propuesta (el radio r del banco de elementos estructurantes y el peso de contraste m) se ajustan mediante PSO, seleccionando la configuración del enjambre con un barrido de 25 combinaciones (partículas 2–10 × iteraciones 10–50, replicando el diseño de Ortega y Espinoza, 2025) sobre un subconjunto de tres escenas representativas; la configuración óptima resultante (r = 25, m = 0,070) se compara sobre los 20 pares con las doce métricas, incluyendo contrastes pareados de Wilcoxon con corrección de Holm.</w:t>
+        <w:t xml:space="preserve">El diseño es comparativo inter-método: siete métodos de fusión —la Propuesta Novedosa, la metodología clásica Top-Hat y cinco representativos del estado del arte (LP, RP, DWT, DTCWT y CVT)— se aplican a cada uno de los 20 pares del dataset, totalizando 140 fusiones evaluadas con las nueve métricas sin referencia, base del análisis estadístico inter-método. Los dos hiperparámetros de la propuesta (el radio r del banco de elementos estructurantes y el peso de contraste m) se ajustan mediante PSO, seleccionando la configuración del enjambre con un barrido de 25 combinaciones (partículas 2–10 × iteraciones 10–50, replicando el diseño de Ortega y Espinoza, 2025) sobre un subconjunto de tres escenas representativas; la configuración óptima resultante (r = 25, m = 0,070) se compara sobre los 20 pares con las nueve métricas, incluyendo contrastes pareados de Wilcoxon con corrección de Holm.</w:t>
       </w:r>
     </w:p>
     <w:p>
@@ -21530,7 +21471,7 @@
           <w:i/>
           <w:sz w:val="18"/>
         </w:rPr>
-        <w:t>Tabla 5. Promedios de las seis métricas estándar de calidad de fusión por método (n = 20 pares).</w:t>
+        <w:t>Tabla 5. Promedios de frecuencia espacial (SF), similitud estructural (SSIM) y PSNR por método (n = 20 pares).</w:t>
       </w:r>
     </w:p>
     <w:tbl>
@@ -21548,13 +21489,10 @@
         <w:tblLook w:noHBand="0" w:noVBand="1" w:firstColumn="1" w:lastRow="0" w:lastColumn="0" w:firstRow="1" w:val="04a0"/>
       </w:tblPr>
       <w:tblGrid>
-        <w:gridCol w:w="2400"/>
-        <w:gridCol w:w="1100"/>
-        <w:gridCol w:w="1100"/>
-        <w:gridCol w:w="1100"/>
-        <w:gridCol w:w="1100"/>
-        <w:gridCol w:w="1100"/>
-        <w:gridCol w:w="1100"/>
+        <w:gridCol w:w="3200"/>
+        <w:gridCol w:w="1560"/>
+        <w:gridCol w:w="1560"/>
+        <w:gridCol w:w="1560"/>
       </w:tblGrid>
       <w:tr>
         <w:trPr/>
@@ -21612,7 +21550,7 @@
                 <w:color w:val="FFFFFF"/>
                 <w:sz w:val="18"/>
               </w:rPr>
-              <w:t>SF</w:t>
+              <w:t>SF ↑</w:t>
             </w:r>
           </w:p>
         </w:tc>
@@ -21641,7 +21579,7 @@
                 <w:color w:val="FFFFFF"/>
                 <w:sz w:val="18"/>
               </w:rPr>
-              <w:t>Qabf</w:t>
+              <w:t>SSIM ↑</w:t>
             </w:r>
           </w:p>
         </w:tc>
@@ -21670,36 +21608,38 @@
                 <w:color w:val="FFFFFF"/>
                 <w:sz w:val="18"/>
               </w:rPr>
-              <w:t>Nabf</w:t>
-            </w:r>
-          </w:p>
-        </w:tc>
-        <w:tc>
-          <w:tcPr>
-            <w:tcW w:w="1100" w:type="dxa"/>
+              <w:t>PSNR ↑</w:t>
+            </w:r>
+          </w:p>
+        </w:tc>
+      </w:tr>
+      <w:tr>
+        <w:trPr/>
+        <w:tc>
+          <w:tcPr>
+            <w:tcW w:w="2400" w:type="dxa"/>
             <w:tcBorders>
               <w:top w:val="single" w:sz="4" w:space="0" w:color="B0B8C0"/>
               <w:start w:val="single" w:sz="4" w:space="0" w:color="B0B8C0"/>
               <w:bottom w:val="single" w:sz="4" w:space="0" w:color="B0B8C0"/>
               <w:end w:val="single" w:sz="4" w:space="0" w:color="B0B8C0"/>
             </w:tcBorders>
-            <w:shd w:fill="1F3B57" w:val="clear"/>
-          </w:tcPr>
-          <w:p>
-            <w:pPr>
-              <w:pStyle w:val="Normal"/>
-              <w:widowControl w:val="false"/>
-              <w:spacing w:lineRule="auto" w:line="276" w:before="0" w:after="120"/>
-              <w:rPr/>
-            </w:pPr>
-            <w:r>
-              <w:rPr>
-                <w:rFonts w:eastAsia="Times New Roman" w:cs="Times New Roman"/>
-                <w:b/>
-                <w:color w:val="FFFFFF"/>
+            <w:shd w:fill="FFFFFF" w:val="clear"/>
+          </w:tcPr>
+          <w:p>
+            <w:pPr>
+              <w:pStyle w:val="Normal"/>
+              <w:widowControl w:val="false"/>
+              <w:spacing w:lineRule="auto" w:line="276" w:before="0" w:after="120"/>
+              <w:rPr/>
+            </w:pPr>
+            <w:r>
+              <w:rPr>
+                <w:rFonts w:eastAsia="Times New Roman" w:cs="Times New Roman"/>
+                <w:color w:val="auto"/>
                 <w:sz w:val="18"/>
               </w:rPr>
-              <w:t>SSIM</w:t>
+              <w:t>Pirámide de Laplace (LP)</w:t>
             </w:r>
           </w:p>
         </w:tc>
@@ -21712,23 +21652,22 @@
               <w:bottom w:val="single" w:sz="4" w:space="0" w:color="B0B8C0"/>
               <w:end w:val="single" w:sz="4" w:space="0" w:color="B0B8C0"/>
             </w:tcBorders>
-            <w:shd w:fill="1F3B57" w:val="clear"/>
-          </w:tcPr>
-          <w:p>
-            <w:pPr>
-              <w:pStyle w:val="Normal"/>
-              <w:widowControl w:val="false"/>
-              <w:spacing w:lineRule="auto" w:line="276" w:before="0" w:after="120"/>
-              <w:rPr/>
-            </w:pPr>
-            <w:r>
-              <w:rPr>
-                <w:rFonts w:eastAsia="Times New Roman" w:cs="Times New Roman"/>
-                <w:b/>
-                <w:color w:val="FFFFFF"/>
+            <w:shd w:fill="FFFFFF" w:val="clear"/>
+          </w:tcPr>
+          <w:p>
+            <w:pPr>
+              <w:pStyle w:val="Normal"/>
+              <w:widowControl w:val="false"/>
+              <w:spacing w:lineRule="auto" w:line="276" w:before="0" w:after="120"/>
+              <w:rPr/>
+            </w:pPr>
+            <w:r>
+              <w:rPr>
+                <w:rFonts w:eastAsia="Times New Roman" w:cs="Times New Roman"/>
+                <w:color w:val="auto"/>
                 <w:sz w:val="18"/>
               </w:rPr>
-              <w:t>SCD</w:t>
+              <w:t>13,0400</w:t>
             </w:r>
           </w:p>
         </w:tc>
@@ -21741,32 +21680,28 @@
               <w:bottom w:val="single" w:sz="4" w:space="0" w:color="B0B8C0"/>
               <w:end w:val="single" w:sz="4" w:space="0" w:color="B0B8C0"/>
             </w:tcBorders>
-            <w:shd w:fill="1F3B57" w:val="clear"/>
-          </w:tcPr>
-          <w:p>
-            <w:pPr>
-              <w:pStyle w:val="Normal"/>
-              <w:widowControl w:val="false"/>
-              <w:spacing w:lineRule="auto" w:line="276" w:before="0" w:after="120"/>
-              <w:rPr/>
-            </w:pPr>
-            <w:r>
-              <w:rPr>
-                <w:rFonts w:eastAsia="Times New Roman" w:cs="Times New Roman"/>
-                <w:b/>
-                <w:color w:val="FFFFFF"/>
+            <w:shd w:fill="FFFFFF" w:val="clear"/>
+          </w:tcPr>
+          <w:p>
+            <w:pPr>
+              <w:pStyle w:val="Normal"/>
+              <w:widowControl w:val="false"/>
+              <w:spacing w:lineRule="auto" w:line="276" w:before="0" w:after="120"/>
+              <w:rPr/>
+            </w:pPr>
+            <w:r>
+              <w:rPr>
+                <w:rFonts w:eastAsia="Times New Roman" w:cs="Times New Roman"/>
+                <w:color w:val="auto"/>
                 <w:sz w:val="18"/>
               </w:rPr>
-              <w:t>VIF</w:t>
-            </w:r>
-          </w:p>
-        </w:tc>
-      </w:tr>
-      <w:tr>
-        <w:trPr/>
-        <w:tc>
-          <w:tcPr>
-            <w:tcW w:w="2400" w:type="dxa"/>
+              <w:t>0,7208</w:t>
+            </w:r>
+          </w:p>
+        </w:tc>
+        <w:tc>
+          <w:tcPr>
+            <w:tcW w:w="1100" w:type="dxa"/>
             <w:tcBorders>
               <w:top w:val="single" w:sz="4" w:space="0" w:color="B0B8C0"/>
               <w:start w:val="single" w:sz="4" w:space="0" w:color="B0B8C0"/>
@@ -21788,13 +21723,16 @@
                 <w:color w:val="auto"/>
                 <w:sz w:val="18"/>
               </w:rPr>
-              <w:t>Pirámide de Laplace (LP)</w:t>
-            </w:r>
-          </w:p>
-        </w:tc>
-        <w:tc>
-          <w:tcPr>
-            <w:tcW w:w="1100" w:type="dxa"/>
+              <w:t>20,2687</w:t>
+            </w:r>
+          </w:p>
+        </w:tc>
+      </w:tr>
+      <w:tr>
+        <w:trPr/>
+        <w:tc>
+          <w:tcPr>
+            <w:tcW w:w="2400" w:type="dxa"/>
             <w:tcBorders>
               <w:top w:val="single" w:sz="4" w:space="0" w:color="B0B8C0"/>
               <w:start w:val="single" w:sz="4" w:space="0" w:color="B0B8C0"/>
@@ -21816,7 +21754,7 @@
                 <w:color w:val="auto"/>
                 <w:sz w:val="18"/>
               </w:rPr>
-              <w:t>13,0400</w:t>
+              <w:t>Ratio Pyramid (RP)</w:t>
             </w:r>
           </w:p>
         </w:tc>
@@ -21844,7 +21782,7 @@
                 <w:color w:val="auto"/>
                 <w:sz w:val="18"/>
               </w:rPr>
-              <w:t>0,4419</w:t>
+              <w:t>13,3376</w:t>
             </w:r>
           </w:p>
         </w:tc>
@@ -21872,7 +21810,7 @@
                 <w:color w:val="auto"/>
                 <w:sz w:val="18"/>
               </w:rPr>
-              <w:t>0,1080</w:t>
+              <w:t>0,7212</w:t>
             </w:r>
           </w:p>
         </w:tc>
@@ -21897,16 +21835,20 @@
             <w:r>
               <w:rPr>
                 <w:rFonts w:eastAsia="Times New Roman" w:cs="Times New Roman"/>
+                <w:b/>
                 <w:color w:val="auto"/>
                 <w:sz w:val="18"/>
               </w:rPr>
-              <w:t>0,7208</w:t>
-            </w:r>
-          </w:p>
-        </w:tc>
-        <w:tc>
-          <w:tcPr>
-            <w:tcW w:w="1100" w:type="dxa"/>
+              <w:t>21,9655</w:t>
+            </w:r>
+          </w:p>
+        </w:tc>
+      </w:tr>
+      <w:tr>
+        <w:trPr/>
+        <w:tc>
+          <w:tcPr>
+            <w:tcW w:w="2400" w:type="dxa"/>
             <w:tcBorders>
               <w:top w:val="single" w:sz="4" w:space="0" w:color="B0B8C0"/>
               <w:start w:val="single" w:sz="4" w:space="0" w:color="B0B8C0"/>
@@ -21928,7 +21870,7 @@
                 <w:color w:val="auto"/>
                 <w:sz w:val="18"/>
               </w:rPr>
-              <w:t>1,3217</w:t>
+              <w:t>Wavelet discreta (DWT)</w:t>
             </w:r>
           </w:p>
         </w:tc>
@@ -21953,20 +21895,16 @@
             <w:r>
               <w:rPr>
                 <w:rFonts w:eastAsia="Times New Roman" w:cs="Times New Roman"/>
-                <w:b/>
                 <w:color w:val="auto"/>
                 <w:sz w:val="18"/>
               </w:rPr>
-              <w:t>0,4101</w:t>
-            </w:r>
-          </w:p>
-        </w:tc>
-      </w:tr>
-      <w:tr>
-        <w:trPr/>
-        <w:tc>
-          <w:tcPr>
-            <w:tcW w:w="2400" w:type="dxa"/>
+              <w:t>13,9341</w:t>
+            </w:r>
+          </w:p>
+        </w:tc>
+        <w:tc>
+          <w:tcPr>
+            <w:tcW w:w="1100" w:type="dxa"/>
             <w:tcBorders>
               <w:top w:val="single" w:sz="4" w:space="0" w:color="B0B8C0"/>
               <w:start w:val="single" w:sz="4" w:space="0" w:color="B0B8C0"/>
@@ -21988,7 +21926,7 @@
                 <w:color w:val="auto"/>
                 <w:sz w:val="18"/>
               </w:rPr>
-              <w:t>Ratio Pyramid (RP)</w:t>
+              <w:t>0,7163</w:t>
             </w:r>
           </w:p>
         </w:tc>
@@ -22016,13 +21954,16 @@
                 <w:color w:val="auto"/>
                 <w:sz w:val="18"/>
               </w:rPr>
-              <w:t>13,3376</w:t>
-            </w:r>
-          </w:p>
-        </w:tc>
-        <w:tc>
-          <w:tcPr>
-            <w:tcW w:w="1100" w:type="dxa"/>
+              <w:t>22,7767</w:t>
+            </w:r>
+          </w:p>
+        </w:tc>
+      </w:tr>
+      <w:tr>
+        <w:trPr/>
+        <w:tc>
+          <w:tcPr>
+            <w:tcW w:w="2400" w:type="dxa"/>
             <w:tcBorders>
               <w:top w:val="single" w:sz="4" w:space="0" w:color="B0B8C0"/>
               <w:start w:val="single" w:sz="4" w:space="0" w:color="B0B8C0"/>
@@ -22044,7 +21985,7 @@
                 <w:color w:val="auto"/>
                 <w:sz w:val="18"/>
               </w:rPr>
-              <w:t>0,4968</w:t>
+              <w:t>DTCWT</w:t>
             </w:r>
           </w:p>
         </w:tc>
@@ -22072,7 +22013,7 @@
                 <w:color w:val="auto"/>
                 <w:sz w:val="18"/>
               </w:rPr>
-              <w:t>0,2119</w:t>
+              <w:t>13,0266</w:t>
             </w:r>
           </w:p>
         </w:tc>
@@ -22100,7 +22041,7 @@
                 <w:color w:val="auto"/>
                 <w:sz w:val="18"/>
               </w:rPr>
-              <w:t>0,7212</w:t>
+              <w:t>0,7386</w:t>
             </w:r>
           </w:p>
         </w:tc>
@@ -22125,17 +22066,19 @@
             <w:r>
               <w:rPr>
                 <w:rFonts w:eastAsia="Times New Roman" w:cs="Times New Roman"/>
-                <w:b/>
                 <w:color w:val="auto"/>
                 <w:sz w:val="18"/>
               </w:rPr>
-              <w:t>1,4677</w:t>
-            </w:r>
-          </w:p>
-        </w:tc>
-        <w:tc>
-          <w:tcPr>
-            <w:tcW w:w="1100" w:type="dxa"/>
+              <w:t>22,7857</w:t>
+            </w:r>
+          </w:p>
+        </w:tc>
+      </w:tr>
+      <w:tr>
+        <w:trPr/>
+        <w:tc>
+          <w:tcPr>
+            <w:tcW w:w="2400" w:type="dxa"/>
             <w:tcBorders>
               <w:top w:val="single" w:sz="4" w:space="0" w:color="B0B8C0"/>
               <w:start w:val="single" w:sz="4" w:space="0" w:color="B0B8C0"/>
@@ -22157,16 +22100,13 @@
                 <w:color w:val="auto"/>
                 <w:sz w:val="18"/>
               </w:rPr>
-              <w:t>0,3841</w:t>
-            </w:r>
-          </w:p>
-        </w:tc>
-      </w:tr>
-      <w:tr>
-        <w:trPr/>
-        <w:tc>
-          <w:tcPr>
-            <w:tcW w:w="2400" w:type="dxa"/>
+              <w:t>Curvelet (CVT)</w:t>
+            </w:r>
+          </w:p>
+        </w:tc>
+        <w:tc>
+          <w:tcPr>
+            <w:tcW w:w="1100" w:type="dxa"/>
             <w:tcBorders>
               <w:top w:val="single" w:sz="4" w:space="0" w:color="B0B8C0"/>
               <w:start w:val="single" w:sz="4" w:space="0" w:color="B0B8C0"/>
@@ -22188,7 +22128,7 @@
                 <w:color w:val="auto"/>
                 <w:sz w:val="18"/>
               </w:rPr>
-              <w:t>Wavelet discreta (DWT)</w:t>
+              <w:t>13,1510</w:t>
             </w:r>
           </w:p>
         </w:tc>
@@ -22216,7 +22156,7 @@
                 <w:color w:val="auto"/>
                 <w:sz w:val="18"/>
               </w:rPr>
-              <w:t>13,9341</w:t>
+              <w:t>0,7305</w:t>
             </w:r>
           </w:p>
         </w:tc>
@@ -22244,13 +22184,16 @@
                 <w:color w:val="auto"/>
                 <w:sz w:val="18"/>
               </w:rPr>
-              <w:t>0,4895</w:t>
-            </w:r>
-          </w:p>
-        </w:tc>
-        <w:tc>
-          <w:tcPr>
-            <w:tcW w:w="1100" w:type="dxa"/>
+              <w:t>22,8375</w:t>
+            </w:r>
+          </w:p>
+        </w:tc>
+      </w:tr>
+      <w:tr>
+        <w:trPr/>
+        <w:tc>
+          <w:tcPr>
+            <w:tcW w:w="2400" w:type="dxa"/>
             <w:tcBorders>
               <w:top w:val="single" w:sz="4" w:space="0" w:color="B0B8C0"/>
               <w:start w:val="single" w:sz="4" w:space="0" w:color="B0B8C0"/>
@@ -22272,7 +22215,7 @@
                 <w:color w:val="auto"/>
                 <w:sz w:val="18"/>
               </w:rPr>
-              <w:t>0,2286</w:t>
+              <w:t>Top-Hat clásico</w:t>
             </w:r>
           </w:p>
         </w:tc>
@@ -22297,10 +22240,11 @@
             <w:r>
               <w:rPr>
                 <w:rFonts w:eastAsia="Times New Roman" w:cs="Times New Roman"/>
+                <w:b/>
                 <w:color w:val="auto"/>
                 <w:sz w:val="18"/>
               </w:rPr>
-              <w:t>0,7163</w:t>
+              <w:t>22,8554</w:t>
             </w:r>
           </w:p>
         </w:tc>
@@ -22328,7 +22272,7 @@
                 <w:color w:val="auto"/>
                 <w:sz w:val="18"/>
               </w:rPr>
-              <w:t>1,3218</w:t>
+              <w:t>0,5781</w:t>
             </w:r>
           </w:p>
         </w:tc>
@@ -22356,7 +22300,7 @@
                 <w:color w:val="auto"/>
                 <w:sz w:val="18"/>
               </w:rPr>
-              <w:t>0,3028</w:t>
+              <w:t>17,4947</w:t>
             </w:r>
           </w:p>
         </w:tc>
@@ -22387,7 +22331,7 @@
                 <w:color w:val="auto"/>
                 <w:sz w:val="18"/>
               </w:rPr>
-              <w:t>DTCWT</w:t>
+              <w:t>Propuesta Novedosa</w:t>
             </w:r>
           </w:p>
         </w:tc>
@@ -22415,7 +22359,7 @@
                 <w:color w:val="auto"/>
                 <w:sz w:val="18"/>
               </w:rPr>
-              <w:t>13,0266</w:t>
+              <w:t>9,6441</w:t>
             </w:r>
           </w:p>
         </w:tc>
@@ -22444,7 +22388,7 @@
                 <w:color w:val="auto"/>
                 <w:sz w:val="18"/>
               </w:rPr>
-              <w:t>0,5011</w:t>
+              <w:t>0,7822</w:t>
             </w:r>
           </w:p>
         </w:tc>
@@ -22472,1882 +22416,7 @@
                 <w:color w:val="auto"/>
                 <w:sz w:val="18"/>
               </w:rPr>
-              <w:t>0,1514</w:t>
-            </w:r>
-          </w:p>
-        </w:tc>
-        <w:tc>
-          <w:tcPr>
-            <w:tcW w:w="1100" w:type="dxa"/>
-            <w:tcBorders>
-              <w:top w:val="single" w:sz="4" w:space="0" w:color="B0B8C0"/>
-              <w:start w:val="single" w:sz="4" w:space="0" w:color="B0B8C0"/>
-              <w:bottom w:val="single" w:sz="4" w:space="0" w:color="B0B8C0"/>
-              <w:end w:val="single" w:sz="4" w:space="0" w:color="B0B8C0"/>
-            </w:tcBorders>
-            <w:shd w:fill="FFFFFF" w:val="clear"/>
-          </w:tcPr>
-          <w:p>
-            <w:pPr>
-              <w:pStyle w:val="Normal"/>
-              <w:widowControl w:val="false"/>
-              <w:spacing w:lineRule="auto" w:line="276" w:before="0" w:after="120"/>
-              <w:rPr/>
-            </w:pPr>
-            <w:r>
-              <w:rPr>
-                <w:rFonts w:eastAsia="Times New Roman" w:cs="Times New Roman"/>
-                <w:color w:val="auto"/>
-                <w:sz w:val="18"/>
-              </w:rPr>
-              <w:t>0,7386</w:t>
-            </w:r>
-          </w:p>
-        </w:tc>
-        <w:tc>
-          <w:tcPr>
-            <w:tcW w:w="1100" w:type="dxa"/>
-            <w:tcBorders>
-              <w:top w:val="single" w:sz="4" w:space="0" w:color="B0B8C0"/>
-              <w:start w:val="single" w:sz="4" w:space="0" w:color="B0B8C0"/>
-              <w:bottom w:val="single" w:sz="4" w:space="0" w:color="B0B8C0"/>
-              <w:end w:val="single" w:sz="4" w:space="0" w:color="B0B8C0"/>
-            </w:tcBorders>
-            <w:shd w:fill="FFFFFF" w:val="clear"/>
-          </w:tcPr>
-          <w:p>
-            <w:pPr>
-              <w:pStyle w:val="Normal"/>
-              <w:widowControl w:val="false"/>
-              <w:spacing w:lineRule="auto" w:line="276" w:before="0" w:after="120"/>
-              <w:rPr/>
-            </w:pPr>
-            <w:r>
-              <w:rPr>
-                <w:rFonts w:eastAsia="Times New Roman" w:cs="Times New Roman"/>
-                <w:color w:val="auto"/>
-                <w:sz w:val="18"/>
-              </w:rPr>
-              <w:t>1,3764</w:t>
-            </w:r>
-          </w:p>
-        </w:tc>
-        <w:tc>
-          <w:tcPr>
-            <w:tcW w:w="1100" w:type="dxa"/>
-            <w:tcBorders>
-              <w:top w:val="single" w:sz="4" w:space="0" w:color="B0B8C0"/>
-              <w:start w:val="single" w:sz="4" w:space="0" w:color="B0B8C0"/>
-              <w:bottom w:val="single" w:sz="4" w:space="0" w:color="B0B8C0"/>
-              <w:end w:val="single" w:sz="4" w:space="0" w:color="B0B8C0"/>
-            </w:tcBorders>
-            <w:shd w:fill="FFFFFF" w:val="clear"/>
-          </w:tcPr>
-          <w:p>
-            <w:pPr>
-              <w:pStyle w:val="Normal"/>
-              <w:widowControl w:val="false"/>
-              <w:spacing w:lineRule="auto" w:line="276" w:before="0" w:after="120"/>
-              <w:rPr/>
-            </w:pPr>
-            <w:r>
-              <w:rPr>
-                <w:rFonts w:eastAsia="Times New Roman" w:cs="Times New Roman"/>
-                <w:color w:val="auto"/>
-                <w:sz w:val="18"/>
-              </w:rPr>
-              <w:t>0,3600</w:t>
-            </w:r>
-          </w:p>
-        </w:tc>
-      </w:tr>
-      <w:tr>
-        <w:trPr/>
-        <w:tc>
-          <w:tcPr>
-            <w:tcW w:w="2400" w:type="dxa"/>
-            <w:tcBorders>
-              <w:top w:val="single" w:sz="4" w:space="0" w:color="B0B8C0"/>
-              <w:start w:val="single" w:sz="4" w:space="0" w:color="B0B8C0"/>
-              <w:bottom w:val="single" w:sz="4" w:space="0" w:color="B0B8C0"/>
-              <w:end w:val="single" w:sz="4" w:space="0" w:color="B0B8C0"/>
-            </w:tcBorders>
-            <w:shd w:fill="FFFFFF" w:val="clear"/>
-          </w:tcPr>
-          <w:p>
-            <w:pPr>
-              <w:pStyle w:val="Normal"/>
-              <w:widowControl w:val="false"/>
-              <w:spacing w:lineRule="auto" w:line="276" w:before="0" w:after="120"/>
-              <w:rPr/>
-            </w:pPr>
-            <w:r>
-              <w:rPr>
-                <w:rFonts w:eastAsia="Times New Roman" w:cs="Times New Roman"/>
-                <w:color w:val="auto"/>
-                <w:sz w:val="18"/>
-              </w:rPr>
-              <w:t>Curvelet (CVT)</w:t>
-            </w:r>
-          </w:p>
-        </w:tc>
-        <w:tc>
-          <w:tcPr>
-            <w:tcW w:w="1100" w:type="dxa"/>
-            <w:tcBorders>
-              <w:top w:val="single" w:sz="4" w:space="0" w:color="B0B8C0"/>
-              <w:start w:val="single" w:sz="4" w:space="0" w:color="B0B8C0"/>
-              <w:bottom w:val="single" w:sz="4" w:space="0" w:color="B0B8C0"/>
-              <w:end w:val="single" w:sz="4" w:space="0" w:color="B0B8C0"/>
-            </w:tcBorders>
-            <w:shd w:fill="FFFFFF" w:val="clear"/>
-          </w:tcPr>
-          <w:p>
-            <w:pPr>
-              <w:pStyle w:val="Normal"/>
-              <w:widowControl w:val="false"/>
-              <w:spacing w:lineRule="auto" w:line="276" w:before="0" w:after="120"/>
-              <w:rPr/>
-            </w:pPr>
-            <w:r>
-              <w:rPr>
-                <w:rFonts w:eastAsia="Times New Roman" w:cs="Times New Roman"/>
-                <w:color w:val="auto"/>
-                <w:sz w:val="18"/>
-              </w:rPr>
-              <w:t>13,1510</w:t>
-            </w:r>
-          </w:p>
-        </w:tc>
-        <w:tc>
-          <w:tcPr>
-            <w:tcW w:w="1100" w:type="dxa"/>
-            <w:tcBorders>
-              <w:top w:val="single" w:sz="4" w:space="0" w:color="B0B8C0"/>
-              <w:start w:val="single" w:sz="4" w:space="0" w:color="B0B8C0"/>
-              <w:bottom w:val="single" w:sz="4" w:space="0" w:color="B0B8C0"/>
-              <w:end w:val="single" w:sz="4" w:space="0" w:color="B0B8C0"/>
-            </w:tcBorders>
-            <w:shd w:fill="FFFFFF" w:val="clear"/>
-          </w:tcPr>
-          <w:p>
-            <w:pPr>
-              <w:pStyle w:val="Normal"/>
-              <w:widowControl w:val="false"/>
-              <w:spacing w:lineRule="auto" w:line="276" w:before="0" w:after="120"/>
-              <w:rPr/>
-            </w:pPr>
-            <w:r>
-              <w:rPr>
-                <w:rFonts w:eastAsia="Times New Roman" w:cs="Times New Roman"/>
-                <w:color w:val="auto"/>
-                <w:sz w:val="18"/>
-              </w:rPr>
-              <w:t>0,4762</w:t>
-            </w:r>
-          </w:p>
-        </w:tc>
-        <w:tc>
-          <w:tcPr>
-            <w:tcW w:w="1100" w:type="dxa"/>
-            <w:tcBorders>
-              <w:top w:val="single" w:sz="4" w:space="0" w:color="B0B8C0"/>
-              <w:start w:val="single" w:sz="4" w:space="0" w:color="B0B8C0"/>
-              <w:bottom w:val="single" w:sz="4" w:space="0" w:color="B0B8C0"/>
-              <w:end w:val="single" w:sz="4" w:space="0" w:color="B0B8C0"/>
-            </w:tcBorders>
-            <w:shd w:fill="FFFFFF" w:val="clear"/>
-          </w:tcPr>
-          <w:p>
-            <w:pPr>
-              <w:pStyle w:val="Normal"/>
-              <w:widowControl w:val="false"/>
-              <w:spacing w:lineRule="auto" w:line="276" w:before="0" w:after="120"/>
-              <w:rPr/>
-            </w:pPr>
-            <w:r>
-              <w:rPr>
-                <w:rFonts w:eastAsia="Times New Roman" w:cs="Times New Roman"/>
-                <w:color w:val="auto"/>
-                <w:sz w:val="18"/>
-              </w:rPr>
-              <w:t>0,1915</w:t>
-            </w:r>
-          </w:p>
-        </w:tc>
-        <w:tc>
-          <w:tcPr>
-            <w:tcW w:w="1100" w:type="dxa"/>
-            <w:tcBorders>
-              <w:top w:val="single" w:sz="4" w:space="0" w:color="B0B8C0"/>
-              <w:start w:val="single" w:sz="4" w:space="0" w:color="B0B8C0"/>
-              <w:bottom w:val="single" w:sz="4" w:space="0" w:color="B0B8C0"/>
-              <w:end w:val="single" w:sz="4" w:space="0" w:color="B0B8C0"/>
-            </w:tcBorders>
-            <w:shd w:fill="FFFFFF" w:val="clear"/>
-          </w:tcPr>
-          <w:p>
-            <w:pPr>
-              <w:pStyle w:val="Normal"/>
-              <w:widowControl w:val="false"/>
-              <w:spacing w:lineRule="auto" w:line="276" w:before="0" w:after="120"/>
-              <w:rPr/>
-            </w:pPr>
-            <w:r>
-              <w:rPr>
-                <w:rFonts w:eastAsia="Times New Roman" w:cs="Times New Roman"/>
-                <w:color w:val="auto"/>
-                <w:sz w:val="18"/>
-              </w:rPr>
-              <w:t>0,7305</w:t>
-            </w:r>
-          </w:p>
-        </w:tc>
-        <w:tc>
-          <w:tcPr>
-            <w:tcW w:w="1100" w:type="dxa"/>
-            <w:tcBorders>
-              <w:top w:val="single" w:sz="4" w:space="0" w:color="B0B8C0"/>
-              <w:start w:val="single" w:sz="4" w:space="0" w:color="B0B8C0"/>
-              <w:bottom w:val="single" w:sz="4" w:space="0" w:color="B0B8C0"/>
-              <w:end w:val="single" w:sz="4" w:space="0" w:color="B0B8C0"/>
-            </w:tcBorders>
-            <w:shd w:fill="FFFFFF" w:val="clear"/>
-          </w:tcPr>
-          <w:p>
-            <w:pPr>
-              <w:pStyle w:val="Normal"/>
-              <w:widowControl w:val="false"/>
-              <w:spacing w:lineRule="auto" w:line="276" w:before="0" w:after="120"/>
-              <w:rPr/>
-            </w:pPr>
-            <w:r>
-              <w:rPr>
-                <w:rFonts w:eastAsia="Times New Roman" w:cs="Times New Roman"/>
-                <w:color w:val="auto"/>
-                <w:sz w:val="18"/>
-              </w:rPr>
-              <w:t>1,3208</w:t>
-            </w:r>
-          </w:p>
-        </w:tc>
-        <w:tc>
-          <w:tcPr>
-            <w:tcW w:w="1100" w:type="dxa"/>
-            <w:tcBorders>
-              <w:top w:val="single" w:sz="4" w:space="0" w:color="B0B8C0"/>
-              <w:start w:val="single" w:sz="4" w:space="0" w:color="B0B8C0"/>
-              <w:bottom w:val="single" w:sz="4" w:space="0" w:color="B0B8C0"/>
-              <w:end w:val="single" w:sz="4" w:space="0" w:color="B0B8C0"/>
-            </w:tcBorders>
-            <w:shd w:fill="FFFFFF" w:val="clear"/>
-          </w:tcPr>
-          <w:p>
-            <w:pPr>
-              <w:pStyle w:val="Normal"/>
-              <w:widowControl w:val="false"/>
-              <w:spacing w:lineRule="auto" w:line="276" w:before="0" w:after="120"/>
-              <w:rPr/>
-            </w:pPr>
-            <w:r>
-              <w:rPr>
-                <w:rFonts w:eastAsia="Times New Roman" w:cs="Times New Roman"/>
-                <w:color w:val="auto"/>
-                <w:sz w:val="18"/>
-              </w:rPr>
-              <w:t>0,3067</w:t>
-            </w:r>
-          </w:p>
-        </w:tc>
-      </w:tr>
-      <w:tr>
-        <w:trPr/>
-        <w:tc>
-          <w:tcPr>
-            <w:tcW w:w="2400" w:type="dxa"/>
-            <w:tcBorders>
-              <w:top w:val="single" w:sz="4" w:space="0" w:color="B0B8C0"/>
-              <w:start w:val="single" w:sz="4" w:space="0" w:color="B0B8C0"/>
-              <w:bottom w:val="single" w:sz="4" w:space="0" w:color="B0B8C0"/>
-              <w:end w:val="single" w:sz="4" w:space="0" w:color="B0B8C0"/>
-            </w:tcBorders>
-            <w:shd w:fill="FFFFFF" w:val="clear"/>
-          </w:tcPr>
-          <w:p>
-            <w:pPr>
-              <w:pStyle w:val="Normal"/>
-              <w:widowControl w:val="false"/>
-              <w:spacing w:lineRule="auto" w:line="276" w:before="0" w:after="120"/>
-              <w:rPr/>
-            </w:pPr>
-            <w:r>
-              <w:rPr>
-                <w:rFonts w:eastAsia="Times New Roman" w:cs="Times New Roman"/>
-                <w:color w:val="auto"/>
-                <w:sz w:val="18"/>
-              </w:rPr>
-              <w:t>Top-Hat clásico</w:t>
-            </w:r>
-          </w:p>
-        </w:tc>
-        <w:tc>
-          <w:tcPr>
-            <w:tcW w:w="1100" w:type="dxa"/>
-            <w:tcBorders>
-              <w:top w:val="single" w:sz="4" w:space="0" w:color="B0B8C0"/>
-              <w:start w:val="single" w:sz="4" w:space="0" w:color="B0B8C0"/>
-              <w:bottom w:val="single" w:sz="4" w:space="0" w:color="B0B8C0"/>
-              <w:end w:val="single" w:sz="4" w:space="0" w:color="B0B8C0"/>
-            </w:tcBorders>
-            <w:shd w:fill="FFFFFF" w:val="clear"/>
-          </w:tcPr>
-          <w:p>
-            <w:pPr>
-              <w:pStyle w:val="Normal"/>
-              <w:widowControl w:val="false"/>
-              <w:spacing w:lineRule="auto" w:line="276" w:before="0" w:after="120"/>
-              <w:rPr/>
-            </w:pPr>
-            <w:r>
-              <w:rPr>
-                <w:rFonts w:eastAsia="Times New Roman" w:cs="Times New Roman"/>
-                <w:b/>
-                <w:color w:val="auto"/>
-                <w:sz w:val="18"/>
-              </w:rPr>
-              <w:t>22,8554</w:t>
-            </w:r>
-          </w:p>
-        </w:tc>
-        <w:tc>
-          <w:tcPr>
-            <w:tcW w:w="1100" w:type="dxa"/>
-            <w:tcBorders>
-              <w:top w:val="single" w:sz="4" w:space="0" w:color="B0B8C0"/>
-              <w:start w:val="single" w:sz="4" w:space="0" w:color="B0B8C0"/>
-              <w:bottom w:val="single" w:sz="4" w:space="0" w:color="B0B8C0"/>
-              <w:end w:val="single" w:sz="4" w:space="0" w:color="B0B8C0"/>
-            </w:tcBorders>
-            <w:shd w:fill="FFFFFF" w:val="clear"/>
-          </w:tcPr>
-          <w:p>
-            <w:pPr>
-              <w:pStyle w:val="Normal"/>
-              <w:widowControl w:val="false"/>
-              <w:spacing w:lineRule="auto" w:line="276" w:before="0" w:after="120"/>
-              <w:rPr/>
-            </w:pPr>
-            <w:r>
-              <w:rPr>
-                <w:rFonts w:eastAsia="Times New Roman" w:cs="Times New Roman"/>
-                <w:color w:val="auto"/>
-                <w:sz w:val="18"/>
-              </w:rPr>
-              <w:t>0,3045</w:t>
-            </w:r>
-          </w:p>
-        </w:tc>
-        <w:tc>
-          <w:tcPr>
-            <w:tcW w:w="1100" w:type="dxa"/>
-            <w:tcBorders>
-              <w:top w:val="single" w:sz="4" w:space="0" w:color="B0B8C0"/>
-              <w:start w:val="single" w:sz="4" w:space="0" w:color="B0B8C0"/>
-              <w:bottom w:val="single" w:sz="4" w:space="0" w:color="B0B8C0"/>
-              <w:end w:val="single" w:sz="4" w:space="0" w:color="B0B8C0"/>
-            </w:tcBorders>
-            <w:shd w:fill="FFFFFF" w:val="clear"/>
-          </w:tcPr>
-          <w:p>
-            <w:pPr>
-              <w:pStyle w:val="Normal"/>
-              <w:widowControl w:val="false"/>
-              <w:spacing w:lineRule="auto" w:line="276" w:before="0" w:after="120"/>
-              <w:rPr/>
-            </w:pPr>
-            <w:r>
-              <w:rPr>
-                <w:rFonts w:eastAsia="Times New Roman" w:cs="Times New Roman"/>
-                <w:color w:val="auto"/>
-                <w:sz w:val="18"/>
-              </w:rPr>
-              <w:t>0,5845</w:t>
-            </w:r>
-          </w:p>
-        </w:tc>
-        <w:tc>
-          <w:tcPr>
-            <w:tcW w:w="1100" w:type="dxa"/>
-            <w:tcBorders>
-              <w:top w:val="single" w:sz="4" w:space="0" w:color="B0B8C0"/>
-              <w:start w:val="single" w:sz="4" w:space="0" w:color="B0B8C0"/>
-              <w:bottom w:val="single" w:sz="4" w:space="0" w:color="B0B8C0"/>
-              <w:end w:val="single" w:sz="4" w:space="0" w:color="B0B8C0"/>
-            </w:tcBorders>
-            <w:shd w:fill="FFFFFF" w:val="clear"/>
-          </w:tcPr>
-          <w:p>
-            <w:pPr>
-              <w:pStyle w:val="Normal"/>
-              <w:widowControl w:val="false"/>
-              <w:spacing w:lineRule="auto" w:line="276" w:before="0" w:after="120"/>
-              <w:rPr/>
-            </w:pPr>
-            <w:r>
-              <w:rPr>
-                <w:rFonts w:eastAsia="Times New Roman" w:cs="Times New Roman"/>
-                <w:color w:val="auto"/>
-                <w:sz w:val="18"/>
-              </w:rPr>
-              <w:t>0,5781</w:t>
-            </w:r>
-          </w:p>
-        </w:tc>
-        <w:tc>
-          <w:tcPr>
-            <w:tcW w:w="1100" w:type="dxa"/>
-            <w:tcBorders>
-              <w:top w:val="single" w:sz="4" w:space="0" w:color="B0B8C0"/>
-              <w:start w:val="single" w:sz="4" w:space="0" w:color="B0B8C0"/>
-              <w:bottom w:val="single" w:sz="4" w:space="0" w:color="B0B8C0"/>
-              <w:end w:val="single" w:sz="4" w:space="0" w:color="B0B8C0"/>
-            </w:tcBorders>
-            <w:shd w:fill="FFFFFF" w:val="clear"/>
-          </w:tcPr>
-          <w:p>
-            <w:pPr>
-              <w:pStyle w:val="Normal"/>
-              <w:widowControl w:val="false"/>
-              <w:spacing w:lineRule="auto" w:line="276" w:before="0" w:after="120"/>
-              <w:rPr/>
-            </w:pPr>
-            <w:r>
-              <w:rPr>
-                <w:rFonts w:eastAsia="Times New Roman" w:cs="Times New Roman"/>
-                <w:color w:val="auto"/>
-                <w:sz w:val="18"/>
-              </w:rPr>
-              <w:t>1,3600</w:t>
-            </w:r>
-          </w:p>
-        </w:tc>
-        <w:tc>
-          <w:tcPr>
-            <w:tcW w:w="1100" w:type="dxa"/>
-            <w:tcBorders>
-              <w:top w:val="single" w:sz="4" w:space="0" w:color="B0B8C0"/>
-              <w:start w:val="single" w:sz="4" w:space="0" w:color="B0B8C0"/>
-              <w:bottom w:val="single" w:sz="4" w:space="0" w:color="B0B8C0"/>
-              <w:end w:val="single" w:sz="4" w:space="0" w:color="B0B8C0"/>
-            </w:tcBorders>
-            <w:shd w:fill="FFFFFF" w:val="clear"/>
-          </w:tcPr>
-          <w:p>
-            <w:pPr>
-              <w:pStyle w:val="Normal"/>
-              <w:widowControl w:val="false"/>
-              <w:spacing w:lineRule="auto" w:line="276" w:before="0" w:after="120"/>
-              <w:rPr/>
-            </w:pPr>
-            <w:r>
-              <w:rPr>
-                <w:rFonts w:eastAsia="Times New Roman" w:cs="Times New Roman"/>
-                <w:color w:val="auto"/>
-                <w:sz w:val="18"/>
-              </w:rPr>
-              <w:t>0,3336</w:t>
-            </w:r>
-          </w:p>
-        </w:tc>
-      </w:tr>
-      <w:tr>
-        <w:trPr/>
-        <w:tc>
-          <w:tcPr>
-            <w:tcW w:w="2400" w:type="dxa"/>
-            <w:tcBorders>
-              <w:top w:val="single" w:sz="4" w:space="0" w:color="B0B8C0"/>
-              <w:start w:val="single" w:sz="4" w:space="0" w:color="B0B8C0"/>
-              <w:bottom w:val="single" w:sz="4" w:space="0" w:color="B0B8C0"/>
-              <w:end w:val="single" w:sz="4" w:space="0" w:color="B0B8C0"/>
-            </w:tcBorders>
-            <w:shd w:fill="FFFFFF" w:val="clear"/>
-          </w:tcPr>
-          <w:p>
-            <w:pPr>
-              <w:pStyle w:val="Normal"/>
-              <w:widowControl w:val="false"/>
-              <w:spacing w:lineRule="auto" w:line="276" w:before="0" w:after="120"/>
-              <w:rPr/>
-            </w:pPr>
-            <w:r>
-              <w:rPr>
-                <w:rFonts w:eastAsia="Times New Roman" w:cs="Times New Roman"/>
-                <w:color w:val="auto"/>
-                <w:sz w:val="18"/>
-              </w:rPr>
-              <w:t>Propuesta Novedosa</w:t>
-            </w:r>
-          </w:p>
-        </w:tc>
-        <w:tc>
-          <w:tcPr>
-            <w:tcW w:w="1100" w:type="dxa"/>
-            <w:tcBorders>
-              <w:top w:val="single" w:sz="4" w:space="0" w:color="B0B8C0"/>
-              <w:start w:val="single" w:sz="4" w:space="0" w:color="B0B8C0"/>
-              <w:bottom w:val="single" w:sz="4" w:space="0" w:color="B0B8C0"/>
-              <w:end w:val="single" w:sz="4" w:space="0" w:color="B0B8C0"/>
-            </w:tcBorders>
-            <w:shd w:fill="FFFFFF" w:val="clear"/>
-          </w:tcPr>
-          <w:p>
-            <w:pPr>
-              <w:pStyle w:val="Normal"/>
-              <w:widowControl w:val="false"/>
-              <w:spacing w:lineRule="auto" w:line="276" w:before="0" w:after="120"/>
-              <w:rPr/>
-            </w:pPr>
-            <w:r>
-              <w:rPr>
-                <w:rFonts w:eastAsia="Times New Roman" w:cs="Times New Roman"/>
-                <w:color w:val="auto"/>
-                <w:sz w:val="18"/>
-              </w:rPr>
-              <w:t>9,6441</w:t>
-            </w:r>
-          </w:p>
-        </w:tc>
-        <w:tc>
-          <w:tcPr>
-            <w:tcW w:w="1100" w:type="dxa"/>
-            <w:tcBorders>
-              <w:top w:val="single" w:sz="4" w:space="0" w:color="B0B8C0"/>
-              <w:start w:val="single" w:sz="4" w:space="0" w:color="B0B8C0"/>
-              <w:bottom w:val="single" w:sz="4" w:space="0" w:color="B0B8C0"/>
-              <w:end w:val="single" w:sz="4" w:space="0" w:color="B0B8C0"/>
-            </w:tcBorders>
-            <w:shd w:fill="FFFFFF" w:val="clear"/>
-          </w:tcPr>
-          <w:p>
-            <w:pPr>
-              <w:pStyle w:val="Normal"/>
-              <w:widowControl w:val="false"/>
-              <w:spacing w:lineRule="auto" w:line="276" w:before="0" w:after="120"/>
-              <w:rPr/>
-            </w:pPr>
-            <w:r>
-              <w:rPr>
-                <w:rFonts w:eastAsia="Times New Roman" w:cs="Times New Roman"/>
-                <w:color w:val="auto"/>
-                <w:sz w:val="18"/>
-              </w:rPr>
-              <w:t>0,4999</w:t>
-            </w:r>
-          </w:p>
-        </w:tc>
-        <w:tc>
-          <w:tcPr>
-            <w:tcW w:w="1100" w:type="dxa"/>
-            <w:tcBorders>
-              <w:top w:val="single" w:sz="4" w:space="0" w:color="B0B8C0"/>
-              <w:start w:val="single" w:sz="4" w:space="0" w:color="B0B8C0"/>
-              <w:bottom w:val="single" w:sz="4" w:space="0" w:color="B0B8C0"/>
-              <w:end w:val="single" w:sz="4" w:space="0" w:color="B0B8C0"/>
-            </w:tcBorders>
-            <w:shd w:fill="FFFFFF" w:val="clear"/>
-          </w:tcPr>
-          <w:p>
-            <w:pPr>
-              <w:pStyle w:val="Normal"/>
-              <w:widowControl w:val="false"/>
-              <w:spacing w:lineRule="auto" w:line="276" w:before="0" w:after="120"/>
-              <w:rPr/>
-            </w:pPr>
-            <w:r>
-              <w:rPr>
-                <w:rFonts w:eastAsia="Times New Roman" w:cs="Times New Roman"/>
-                <w:b/>
-                <w:color w:val="auto"/>
-                <w:sz w:val="18"/>
-              </w:rPr>
-              <w:t>0,0406</w:t>
-            </w:r>
-          </w:p>
-        </w:tc>
-        <w:tc>
-          <w:tcPr>
-            <w:tcW w:w="1100" w:type="dxa"/>
-            <w:tcBorders>
-              <w:top w:val="single" w:sz="4" w:space="0" w:color="B0B8C0"/>
-              <w:start w:val="single" w:sz="4" w:space="0" w:color="B0B8C0"/>
-              <w:bottom w:val="single" w:sz="4" w:space="0" w:color="B0B8C0"/>
-              <w:end w:val="single" w:sz="4" w:space="0" w:color="B0B8C0"/>
-            </w:tcBorders>
-            <w:shd w:fill="FFFFFF" w:val="clear"/>
-          </w:tcPr>
-          <w:p>
-            <w:pPr>
-              <w:pStyle w:val="Normal"/>
-              <w:widowControl w:val="false"/>
-              <w:spacing w:lineRule="auto" w:line="276" w:before="0" w:after="120"/>
-              <w:rPr/>
-            </w:pPr>
-            <w:r>
-              <w:rPr>
-                <w:rFonts w:eastAsia="Times New Roman" w:cs="Times New Roman"/>
-                <w:b/>
-                <w:color w:val="auto"/>
-                <w:sz w:val="18"/>
-              </w:rPr>
-              <w:t>0,7822</w:t>
-            </w:r>
-          </w:p>
-        </w:tc>
-        <w:tc>
-          <w:tcPr>
-            <w:tcW w:w="1100" w:type="dxa"/>
-            <w:tcBorders>
-              <w:top w:val="single" w:sz="4" w:space="0" w:color="B0B8C0"/>
-              <w:start w:val="single" w:sz="4" w:space="0" w:color="B0B8C0"/>
-              <w:bottom w:val="single" w:sz="4" w:space="0" w:color="B0B8C0"/>
-              <w:end w:val="single" w:sz="4" w:space="0" w:color="B0B8C0"/>
-            </w:tcBorders>
-            <w:shd w:fill="FFFFFF" w:val="clear"/>
-          </w:tcPr>
-          <w:p>
-            <w:pPr>
-              <w:pStyle w:val="Normal"/>
-              <w:widowControl w:val="false"/>
-              <w:spacing w:lineRule="auto" w:line="276" w:before="0" w:after="120"/>
-              <w:rPr/>
-            </w:pPr>
-            <w:r>
-              <w:rPr>
-                <w:rFonts w:eastAsia="Times New Roman" w:cs="Times New Roman"/>
-                <w:color w:val="auto"/>
-                <w:sz w:val="18"/>
-              </w:rPr>
-              <w:t>1,4498</w:t>
-            </w:r>
-          </w:p>
-        </w:tc>
-        <w:tc>
-          <w:tcPr>
-            <w:tcW w:w="1100" w:type="dxa"/>
-            <w:tcBorders>
-              <w:top w:val="single" w:sz="4" w:space="0" w:color="B0B8C0"/>
-              <w:start w:val="single" w:sz="4" w:space="0" w:color="B0B8C0"/>
-              <w:bottom w:val="single" w:sz="4" w:space="0" w:color="B0B8C0"/>
-              <w:end w:val="single" w:sz="4" w:space="0" w:color="B0B8C0"/>
-            </w:tcBorders>
-            <w:shd w:fill="FFFFFF" w:val="clear"/>
-          </w:tcPr>
-          <w:p>
-            <w:pPr>
-              <w:pStyle w:val="Normal"/>
-              <w:widowControl w:val="false"/>
-              <w:spacing w:lineRule="auto" w:line="276" w:before="0" w:after="120"/>
-              <w:rPr/>
-            </w:pPr>
-            <w:r>
-              <w:rPr>
-                <w:rFonts w:eastAsia="Times New Roman" w:cs="Times New Roman"/>
-                <w:color w:val="auto"/>
-                <w:sz w:val="18"/>
-              </w:rPr>
-              <w:t>0,3683</w:t>
-            </w:r>
-          </w:p>
-        </w:tc>
-      </w:tr>
-    </w:tbl>
-    <w:p>
-      <w:pPr>
-        <w:pStyle w:val="Normal"/>
-        <w:spacing w:lineRule="auto" w:line="276"/>
-        <w:jc w:val="both"/>
-        <w:rPr/>
-      </w:pPr>
-      <w:r>
-        <w:rPr>
-          <w:rFonts w:eastAsia="Times New Roman" w:cs="Times New Roman"/>
-          <w:i/>
-          <w:sz w:val="18"/>
-        </w:rPr>
-        <w:t>Tabla 6. Métricas adicionales del review (FMI y Piella Q0/QW/QE) por método — medias sobre 20 pares.</w:t>
-      </w:r>
-    </w:p>
-    <w:tbl>
-      <w:tblPr>
-        <w:tblW w:w="9360" w:type="dxa"/>
-        <w:jc w:val="start"/>
-        <w:tblInd w:w="0" w:type="dxa"/>
-        <w:tblLayout w:type="fixed"/>
-        <w:tblCellMar>
-          <w:top w:w="0" w:type="dxa"/>
-          <w:start w:w="108" w:type="dxa"/>
-          <w:bottom w:w="0" w:type="dxa"/>
-          <w:end w:w="108" w:type="dxa"/>
-        </w:tblCellMar>
-        <w:tblLook w:noHBand="0" w:noVBand="1" w:firstColumn="1" w:lastRow="0" w:lastColumn="0" w:firstRow="1" w:val="04a0"/>
-      </w:tblPr>
-      <w:tblGrid>
-        <w:gridCol w:w="2600"/>
-        <w:gridCol w:w="1600"/>
-        <w:gridCol w:w="1600"/>
-        <w:gridCol w:w="1600"/>
-        <w:gridCol w:w="1600"/>
-      </w:tblGrid>
-      <w:tr>
-        <w:trPr/>
-        <w:tc>
-          <w:tcPr>
-            <w:tcW w:w="2600" w:type="dxa"/>
-            <w:tcBorders>
-              <w:top w:val="single" w:sz="4" w:space="0" w:color="B0B8C0"/>
-              <w:start w:val="single" w:sz="4" w:space="0" w:color="B0B8C0"/>
-              <w:bottom w:val="single" w:sz="4" w:space="0" w:color="B0B8C0"/>
-              <w:end w:val="single" w:sz="4" w:space="0" w:color="B0B8C0"/>
-            </w:tcBorders>
-            <w:shd w:fill="1F3B57" w:val="clear"/>
-          </w:tcPr>
-          <w:p>
-            <w:pPr>
-              <w:pStyle w:val="Normal"/>
-              <w:widowControl w:val="false"/>
-              <w:spacing w:lineRule="auto" w:line="276" w:before="0" w:after="120"/>
-              <w:rPr/>
-            </w:pPr>
-            <w:r>
-              <w:rPr>
-                <w:rFonts w:eastAsia="Times New Roman" w:cs="Times New Roman"/>
-                <w:b/>
-                <w:color w:val="FFFFFF"/>
-                <w:sz w:val="18"/>
-              </w:rPr>
-              <w:t>Método</w:t>
-            </w:r>
-          </w:p>
-        </w:tc>
-        <w:tc>
-          <w:tcPr>
-            <w:tcW w:w="1600" w:type="dxa"/>
-            <w:tcBorders>
-              <w:top w:val="single" w:sz="4" w:space="0" w:color="B0B8C0"/>
-              <w:start w:val="single" w:sz="4" w:space="0" w:color="B0B8C0"/>
-              <w:bottom w:val="single" w:sz="4" w:space="0" w:color="B0B8C0"/>
-              <w:end w:val="single" w:sz="4" w:space="0" w:color="B0B8C0"/>
-            </w:tcBorders>
-            <w:shd w:fill="1F3B57" w:val="clear"/>
-          </w:tcPr>
-          <w:p>
-            <w:pPr>
-              <w:pStyle w:val="Normal"/>
-              <w:widowControl w:val="false"/>
-              <w:spacing w:lineRule="auto" w:line="276" w:before="0" w:after="120"/>
-              <w:rPr/>
-            </w:pPr>
-            <w:r>
-              <w:rPr>
-                <w:rFonts w:eastAsia="Times New Roman" w:cs="Times New Roman"/>
-                <w:b/>
-                <w:color w:val="FFFFFF"/>
-                <w:sz w:val="18"/>
-              </w:rPr>
-              <w:t>FMI</w:t>
-            </w:r>
-          </w:p>
-        </w:tc>
-        <w:tc>
-          <w:tcPr>
-            <w:tcW w:w="1600" w:type="dxa"/>
-            <w:tcBorders>
-              <w:top w:val="single" w:sz="4" w:space="0" w:color="B0B8C0"/>
-              <w:start w:val="single" w:sz="4" w:space="0" w:color="B0B8C0"/>
-              <w:bottom w:val="single" w:sz="4" w:space="0" w:color="B0B8C0"/>
-              <w:end w:val="single" w:sz="4" w:space="0" w:color="B0B8C0"/>
-            </w:tcBorders>
-            <w:shd w:fill="1F3B57" w:val="clear"/>
-          </w:tcPr>
-          <w:p>
-            <w:pPr>
-              <w:pStyle w:val="Normal"/>
-              <w:widowControl w:val="false"/>
-              <w:spacing w:lineRule="auto" w:line="276" w:before="0" w:after="120"/>
-              <w:rPr/>
-            </w:pPr>
-            <w:r>
-              <w:rPr>
-                <w:rFonts w:eastAsia="Times New Roman" w:cs="Times New Roman"/>
-                <w:b/>
-                <w:color w:val="FFFFFF"/>
-                <w:sz w:val="18"/>
-              </w:rPr>
-              <w:t>Q0</w:t>
-            </w:r>
-          </w:p>
-        </w:tc>
-        <w:tc>
-          <w:tcPr>
-            <w:tcW w:w="1600" w:type="dxa"/>
-            <w:tcBorders>
-              <w:top w:val="single" w:sz="4" w:space="0" w:color="B0B8C0"/>
-              <w:start w:val="single" w:sz="4" w:space="0" w:color="B0B8C0"/>
-              <w:bottom w:val="single" w:sz="4" w:space="0" w:color="B0B8C0"/>
-              <w:end w:val="single" w:sz="4" w:space="0" w:color="B0B8C0"/>
-            </w:tcBorders>
-            <w:shd w:fill="1F3B57" w:val="clear"/>
-          </w:tcPr>
-          <w:p>
-            <w:pPr>
-              <w:pStyle w:val="Normal"/>
-              <w:widowControl w:val="false"/>
-              <w:spacing w:lineRule="auto" w:line="276" w:before="0" w:after="120"/>
-              <w:rPr/>
-            </w:pPr>
-            <w:r>
-              <w:rPr>
-                <w:rFonts w:eastAsia="Times New Roman" w:cs="Times New Roman"/>
-                <w:b/>
-                <w:color w:val="FFFFFF"/>
-                <w:sz w:val="18"/>
-              </w:rPr>
-              <w:t>QW</w:t>
-            </w:r>
-          </w:p>
-        </w:tc>
-        <w:tc>
-          <w:tcPr>
-            <w:tcW w:w="1600" w:type="dxa"/>
-            <w:tcBorders>
-              <w:top w:val="single" w:sz="4" w:space="0" w:color="B0B8C0"/>
-              <w:start w:val="single" w:sz="4" w:space="0" w:color="B0B8C0"/>
-              <w:bottom w:val="single" w:sz="4" w:space="0" w:color="B0B8C0"/>
-              <w:end w:val="single" w:sz="4" w:space="0" w:color="B0B8C0"/>
-            </w:tcBorders>
-            <w:shd w:fill="1F3B57" w:val="clear"/>
-          </w:tcPr>
-          <w:p>
-            <w:pPr>
-              <w:pStyle w:val="Normal"/>
-              <w:widowControl w:val="false"/>
-              <w:spacing w:lineRule="auto" w:line="276" w:before="0" w:after="120"/>
-              <w:rPr/>
-            </w:pPr>
-            <w:r>
-              <w:rPr>
-                <w:rFonts w:eastAsia="Times New Roman" w:cs="Times New Roman"/>
-                <w:b/>
-                <w:color w:val="FFFFFF"/>
-                <w:sz w:val="18"/>
-              </w:rPr>
-              <w:t>QE</w:t>
-            </w:r>
-          </w:p>
-        </w:tc>
-      </w:tr>
-      <w:tr>
-        <w:trPr/>
-        <w:tc>
-          <w:tcPr>
-            <w:tcW w:w="2600" w:type="dxa"/>
-            <w:tcBorders>
-              <w:top w:val="single" w:sz="4" w:space="0" w:color="B0B8C0"/>
-              <w:start w:val="single" w:sz="4" w:space="0" w:color="B0B8C0"/>
-              <w:bottom w:val="single" w:sz="4" w:space="0" w:color="B0B8C0"/>
-              <w:end w:val="single" w:sz="4" w:space="0" w:color="B0B8C0"/>
-            </w:tcBorders>
-            <w:shd w:fill="FFFFFF" w:val="clear"/>
-          </w:tcPr>
-          <w:p>
-            <w:pPr>
-              <w:pStyle w:val="Normal"/>
-              <w:widowControl w:val="false"/>
-              <w:spacing w:lineRule="auto" w:line="276" w:before="0" w:after="120"/>
-              <w:rPr/>
-            </w:pPr>
-            <w:r>
-              <w:rPr>
-                <w:rFonts w:eastAsia="Times New Roman" w:cs="Times New Roman"/>
-                <w:color w:val="auto"/>
-                <w:sz w:val="18"/>
-              </w:rPr>
-              <w:t>Pirámide de Laplace (LP)</w:t>
-            </w:r>
-          </w:p>
-        </w:tc>
-        <w:tc>
-          <w:tcPr>
-            <w:tcW w:w="1600" w:type="dxa"/>
-            <w:tcBorders>
-              <w:top w:val="single" w:sz="4" w:space="0" w:color="B0B8C0"/>
-              <w:start w:val="single" w:sz="4" w:space="0" w:color="B0B8C0"/>
-              <w:bottom w:val="single" w:sz="4" w:space="0" w:color="B0B8C0"/>
-              <w:end w:val="single" w:sz="4" w:space="0" w:color="B0B8C0"/>
-            </w:tcBorders>
-            <w:shd w:fill="FFFFFF" w:val="clear"/>
-          </w:tcPr>
-          <w:p>
-            <w:pPr>
-              <w:pStyle w:val="Normal"/>
-              <w:widowControl w:val="false"/>
-              <w:spacing w:lineRule="auto" w:line="276" w:before="0" w:after="120"/>
-              <w:rPr/>
-            </w:pPr>
-            <w:r>
-              <w:rPr>
-                <w:rFonts w:eastAsia="Times New Roman" w:cs="Times New Roman"/>
-                <w:b/>
-                <w:color w:val="auto"/>
-                <w:sz w:val="18"/>
-              </w:rPr>
-              <w:t>0,2761</w:t>
-            </w:r>
-          </w:p>
-        </w:tc>
-        <w:tc>
-          <w:tcPr>
-            <w:tcW w:w="1600" w:type="dxa"/>
-            <w:tcBorders>
-              <w:top w:val="single" w:sz="4" w:space="0" w:color="B0B8C0"/>
-              <w:start w:val="single" w:sz="4" w:space="0" w:color="B0B8C0"/>
-              <w:bottom w:val="single" w:sz="4" w:space="0" w:color="B0B8C0"/>
-              <w:end w:val="single" w:sz="4" w:space="0" w:color="B0B8C0"/>
-            </w:tcBorders>
-            <w:shd w:fill="FFFFFF" w:val="clear"/>
-          </w:tcPr>
-          <w:p>
-            <w:pPr>
-              <w:pStyle w:val="Normal"/>
-              <w:widowControl w:val="false"/>
-              <w:spacing w:lineRule="auto" w:line="276" w:before="0" w:after="120"/>
-              <w:rPr/>
-            </w:pPr>
-            <w:r>
-              <w:rPr>
-                <w:rFonts w:eastAsia="Times New Roman" w:cs="Times New Roman"/>
-                <w:color w:val="auto"/>
-                <w:sz w:val="18"/>
-              </w:rPr>
-              <w:t>0,7435</w:t>
-            </w:r>
-          </w:p>
-        </w:tc>
-        <w:tc>
-          <w:tcPr>
-            <w:tcW w:w="1600" w:type="dxa"/>
-            <w:tcBorders>
-              <w:top w:val="single" w:sz="4" w:space="0" w:color="B0B8C0"/>
-              <w:start w:val="single" w:sz="4" w:space="0" w:color="B0B8C0"/>
-              <w:bottom w:val="single" w:sz="4" w:space="0" w:color="B0B8C0"/>
-              <w:end w:val="single" w:sz="4" w:space="0" w:color="B0B8C0"/>
-            </w:tcBorders>
-            <w:shd w:fill="FFFFFF" w:val="clear"/>
-          </w:tcPr>
-          <w:p>
-            <w:pPr>
-              <w:pStyle w:val="Normal"/>
-              <w:widowControl w:val="false"/>
-              <w:spacing w:lineRule="auto" w:line="276" w:before="0" w:after="120"/>
-              <w:rPr/>
-            </w:pPr>
-            <w:r>
-              <w:rPr>
-                <w:rFonts w:eastAsia="Times New Roman" w:cs="Times New Roman"/>
-                <w:color w:val="auto"/>
-                <w:sz w:val="18"/>
-              </w:rPr>
-              <w:t>0,8560</w:t>
-            </w:r>
-          </w:p>
-        </w:tc>
-        <w:tc>
-          <w:tcPr>
-            <w:tcW w:w="1600" w:type="dxa"/>
-            <w:tcBorders>
-              <w:top w:val="single" w:sz="4" w:space="0" w:color="B0B8C0"/>
-              <w:start w:val="single" w:sz="4" w:space="0" w:color="B0B8C0"/>
-              <w:bottom w:val="single" w:sz="4" w:space="0" w:color="B0B8C0"/>
-              <w:end w:val="single" w:sz="4" w:space="0" w:color="B0B8C0"/>
-            </w:tcBorders>
-            <w:shd w:fill="FFFFFF" w:val="clear"/>
-          </w:tcPr>
-          <w:p>
-            <w:pPr>
-              <w:pStyle w:val="Normal"/>
-              <w:widowControl w:val="false"/>
-              <w:spacing w:lineRule="auto" w:line="276" w:before="0" w:after="120"/>
-              <w:rPr/>
-            </w:pPr>
-            <w:r>
-              <w:rPr>
-                <w:rFonts w:eastAsia="Times New Roman" w:cs="Times New Roman"/>
-                <w:b/>
-                <w:color w:val="auto"/>
-                <w:sz w:val="18"/>
-              </w:rPr>
-              <w:t>0,4040</w:t>
-            </w:r>
-          </w:p>
-        </w:tc>
-      </w:tr>
-      <w:tr>
-        <w:trPr/>
-        <w:tc>
-          <w:tcPr>
-            <w:tcW w:w="2600" w:type="dxa"/>
-            <w:tcBorders>
-              <w:top w:val="single" w:sz="4" w:space="0" w:color="B0B8C0"/>
-              <w:start w:val="single" w:sz="4" w:space="0" w:color="B0B8C0"/>
-              <w:bottom w:val="single" w:sz="4" w:space="0" w:color="B0B8C0"/>
-              <w:end w:val="single" w:sz="4" w:space="0" w:color="B0B8C0"/>
-            </w:tcBorders>
-            <w:shd w:fill="FFFFFF" w:val="clear"/>
-          </w:tcPr>
-          <w:p>
-            <w:pPr>
-              <w:pStyle w:val="Normal"/>
-              <w:widowControl w:val="false"/>
-              <w:spacing w:lineRule="auto" w:line="276" w:before="0" w:after="120"/>
-              <w:rPr/>
-            </w:pPr>
-            <w:r>
-              <w:rPr>
-                <w:rFonts w:eastAsia="Times New Roman" w:cs="Times New Roman"/>
-                <w:color w:val="auto"/>
-                <w:sz w:val="18"/>
-              </w:rPr>
-              <w:t>Ratio Pyramid (RP)</w:t>
-            </w:r>
-          </w:p>
-        </w:tc>
-        <w:tc>
-          <w:tcPr>
-            <w:tcW w:w="1600" w:type="dxa"/>
-            <w:tcBorders>
-              <w:top w:val="single" w:sz="4" w:space="0" w:color="B0B8C0"/>
-              <w:start w:val="single" w:sz="4" w:space="0" w:color="B0B8C0"/>
-              <w:bottom w:val="single" w:sz="4" w:space="0" w:color="B0B8C0"/>
-              <w:end w:val="single" w:sz="4" w:space="0" w:color="B0B8C0"/>
-            </w:tcBorders>
-            <w:shd w:fill="FFFFFF" w:val="clear"/>
-          </w:tcPr>
-          <w:p>
-            <w:pPr>
-              <w:pStyle w:val="Normal"/>
-              <w:widowControl w:val="false"/>
-              <w:spacing w:lineRule="auto" w:line="276" w:before="0" w:after="120"/>
-              <w:rPr/>
-            </w:pPr>
-            <w:r>
-              <w:rPr>
-                <w:rFonts w:eastAsia="Times New Roman" w:cs="Times New Roman"/>
-                <w:color w:val="auto"/>
-                <w:sz w:val="18"/>
-              </w:rPr>
-              <w:t>0,1900</w:t>
-            </w:r>
-          </w:p>
-        </w:tc>
-        <w:tc>
-          <w:tcPr>
-            <w:tcW w:w="1600" w:type="dxa"/>
-            <w:tcBorders>
-              <w:top w:val="single" w:sz="4" w:space="0" w:color="B0B8C0"/>
-              <w:start w:val="single" w:sz="4" w:space="0" w:color="B0B8C0"/>
-              <w:bottom w:val="single" w:sz="4" w:space="0" w:color="B0B8C0"/>
-              <w:end w:val="single" w:sz="4" w:space="0" w:color="B0B8C0"/>
-            </w:tcBorders>
-            <w:shd w:fill="FFFFFF" w:val="clear"/>
-          </w:tcPr>
-          <w:p>
-            <w:pPr>
-              <w:pStyle w:val="Normal"/>
-              <w:widowControl w:val="false"/>
-              <w:spacing w:lineRule="auto" w:line="276" w:before="0" w:after="120"/>
-              <w:rPr/>
-            </w:pPr>
-            <w:r>
-              <w:rPr>
-                <w:rFonts w:eastAsia="Times New Roman" w:cs="Times New Roman"/>
-                <w:color w:val="auto"/>
-                <w:sz w:val="18"/>
-              </w:rPr>
-              <w:t>0,7158</w:t>
-            </w:r>
-          </w:p>
-        </w:tc>
-        <w:tc>
-          <w:tcPr>
-            <w:tcW w:w="1600" w:type="dxa"/>
-            <w:tcBorders>
-              <w:top w:val="single" w:sz="4" w:space="0" w:color="B0B8C0"/>
-              <w:start w:val="single" w:sz="4" w:space="0" w:color="B0B8C0"/>
-              <w:bottom w:val="single" w:sz="4" w:space="0" w:color="B0B8C0"/>
-              <w:end w:val="single" w:sz="4" w:space="0" w:color="B0B8C0"/>
-            </w:tcBorders>
-            <w:shd w:fill="FFFFFF" w:val="clear"/>
-          </w:tcPr>
-          <w:p>
-            <w:pPr>
-              <w:pStyle w:val="Normal"/>
-              <w:widowControl w:val="false"/>
-              <w:spacing w:lineRule="auto" w:line="276" w:before="0" w:after="120"/>
-              <w:rPr/>
-            </w:pPr>
-            <w:r>
-              <w:rPr>
-                <w:rFonts w:eastAsia="Times New Roman" w:cs="Times New Roman"/>
-                <w:color w:val="auto"/>
-                <w:sz w:val="18"/>
-              </w:rPr>
-              <w:t>0,8294</w:t>
-            </w:r>
-          </w:p>
-        </w:tc>
-        <w:tc>
-          <w:tcPr>
-            <w:tcW w:w="1600" w:type="dxa"/>
-            <w:tcBorders>
-              <w:top w:val="single" w:sz="4" w:space="0" w:color="B0B8C0"/>
-              <w:start w:val="single" w:sz="4" w:space="0" w:color="B0B8C0"/>
-              <w:bottom w:val="single" w:sz="4" w:space="0" w:color="B0B8C0"/>
-              <w:end w:val="single" w:sz="4" w:space="0" w:color="B0B8C0"/>
-            </w:tcBorders>
-            <w:shd w:fill="FFFFFF" w:val="clear"/>
-          </w:tcPr>
-          <w:p>
-            <w:pPr>
-              <w:pStyle w:val="Normal"/>
-              <w:widowControl w:val="false"/>
-              <w:spacing w:lineRule="auto" w:line="276" w:before="0" w:after="120"/>
-              <w:rPr/>
-            </w:pPr>
-            <w:r>
-              <w:rPr>
-                <w:rFonts w:eastAsia="Times New Roman" w:cs="Times New Roman"/>
-                <w:color w:val="auto"/>
-                <w:sz w:val="18"/>
-              </w:rPr>
-              <w:t>0,3650</w:t>
-            </w:r>
-          </w:p>
-        </w:tc>
-      </w:tr>
-      <w:tr>
-        <w:trPr/>
-        <w:tc>
-          <w:tcPr>
-            <w:tcW w:w="2600" w:type="dxa"/>
-            <w:tcBorders>
-              <w:top w:val="single" w:sz="4" w:space="0" w:color="B0B8C0"/>
-              <w:start w:val="single" w:sz="4" w:space="0" w:color="B0B8C0"/>
-              <w:bottom w:val="single" w:sz="4" w:space="0" w:color="B0B8C0"/>
-              <w:end w:val="single" w:sz="4" w:space="0" w:color="B0B8C0"/>
-            </w:tcBorders>
-            <w:shd w:fill="FFFFFF" w:val="clear"/>
-          </w:tcPr>
-          <w:p>
-            <w:pPr>
-              <w:pStyle w:val="Normal"/>
-              <w:widowControl w:val="false"/>
-              <w:spacing w:lineRule="auto" w:line="276" w:before="0" w:after="120"/>
-              <w:rPr/>
-            </w:pPr>
-            <w:r>
-              <w:rPr>
-                <w:rFonts w:eastAsia="Times New Roman" w:cs="Times New Roman"/>
-                <w:color w:val="auto"/>
-                <w:sz w:val="18"/>
-              </w:rPr>
-              <w:t>Wavelet discreta (DWT)</w:t>
-            </w:r>
-          </w:p>
-        </w:tc>
-        <w:tc>
-          <w:tcPr>
-            <w:tcW w:w="1600" w:type="dxa"/>
-            <w:tcBorders>
-              <w:top w:val="single" w:sz="4" w:space="0" w:color="B0B8C0"/>
-              <w:start w:val="single" w:sz="4" w:space="0" w:color="B0B8C0"/>
-              <w:bottom w:val="single" w:sz="4" w:space="0" w:color="B0B8C0"/>
-              <w:end w:val="single" w:sz="4" w:space="0" w:color="B0B8C0"/>
-            </w:tcBorders>
-            <w:shd w:fill="FFFFFF" w:val="clear"/>
-          </w:tcPr>
-          <w:p>
-            <w:pPr>
-              <w:pStyle w:val="Normal"/>
-              <w:widowControl w:val="false"/>
-              <w:spacing w:lineRule="auto" w:line="276" w:before="0" w:after="120"/>
-              <w:rPr/>
-            </w:pPr>
-            <w:r>
-              <w:rPr>
-                <w:rFonts w:eastAsia="Times New Roman" w:cs="Times New Roman"/>
-                <w:color w:val="auto"/>
-                <w:sz w:val="18"/>
-              </w:rPr>
-              <w:t>0,1993</w:t>
-            </w:r>
-          </w:p>
-        </w:tc>
-        <w:tc>
-          <w:tcPr>
-            <w:tcW w:w="1600" w:type="dxa"/>
-            <w:tcBorders>
-              <w:top w:val="single" w:sz="4" w:space="0" w:color="B0B8C0"/>
-              <w:start w:val="single" w:sz="4" w:space="0" w:color="B0B8C0"/>
-              <w:bottom w:val="single" w:sz="4" w:space="0" w:color="B0B8C0"/>
-              <w:end w:val="single" w:sz="4" w:space="0" w:color="B0B8C0"/>
-            </w:tcBorders>
-            <w:shd w:fill="FFFFFF" w:val="clear"/>
-          </w:tcPr>
-          <w:p>
-            <w:pPr>
-              <w:pStyle w:val="Normal"/>
-              <w:widowControl w:val="false"/>
-              <w:spacing w:lineRule="auto" w:line="276" w:before="0" w:after="120"/>
-              <w:rPr/>
-            </w:pPr>
-            <w:r>
-              <w:rPr>
-                <w:rFonts w:eastAsia="Times New Roman" w:cs="Times New Roman"/>
-                <w:color w:val="auto"/>
-                <w:sz w:val="18"/>
-              </w:rPr>
-              <w:t>0,7201</w:t>
-            </w:r>
-          </w:p>
-        </w:tc>
-        <w:tc>
-          <w:tcPr>
-            <w:tcW w:w="1600" w:type="dxa"/>
-            <w:tcBorders>
-              <w:top w:val="single" w:sz="4" w:space="0" w:color="B0B8C0"/>
-              <w:start w:val="single" w:sz="4" w:space="0" w:color="B0B8C0"/>
-              <w:bottom w:val="single" w:sz="4" w:space="0" w:color="B0B8C0"/>
-              <w:end w:val="single" w:sz="4" w:space="0" w:color="B0B8C0"/>
-            </w:tcBorders>
-            <w:shd w:fill="FFFFFF" w:val="clear"/>
-          </w:tcPr>
-          <w:p>
-            <w:pPr>
-              <w:pStyle w:val="Normal"/>
-              <w:widowControl w:val="false"/>
-              <w:spacing w:lineRule="auto" w:line="276" w:before="0" w:after="120"/>
-              <w:rPr/>
-            </w:pPr>
-            <w:r>
-              <w:rPr>
-                <w:rFonts w:eastAsia="Times New Roman" w:cs="Times New Roman"/>
-                <w:color w:val="auto"/>
-                <w:sz w:val="18"/>
-              </w:rPr>
-              <w:t>0,8217</w:t>
-            </w:r>
-          </w:p>
-        </w:tc>
-        <w:tc>
-          <w:tcPr>
-            <w:tcW w:w="1600" w:type="dxa"/>
-            <w:tcBorders>
-              <w:top w:val="single" w:sz="4" w:space="0" w:color="B0B8C0"/>
-              <w:start w:val="single" w:sz="4" w:space="0" w:color="B0B8C0"/>
-              <w:bottom w:val="single" w:sz="4" w:space="0" w:color="B0B8C0"/>
-              <w:end w:val="single" w:sz="4" w:space="0" w:color="B0B8C0"/>
-            </w:tcBorders>
-            <w:shd w:fill="FFFFFF" w:val="clear"/>
-          </w:tcPr>
-          <w:p>
-            <w:pPr>
-              <w:pStyle w:val="Normal"/>
-              <w:widowControl w:val="false"/>
-              <w:spacing w:lineRule="auto" w:line="276" w:before="0" w:after="120"/>
-              <w:rPr/>
-            </w:pPr>
-            <w:r>
-              <w:rPr>
-                <w:rFonts w:eastAsia="Times New Roman" w:cs="Times New Roman"/>
-                <w:color w:val="auto"/>
-                <w:sz w:val="18"/>
-              </w:rPr>
-              <w:t>0,3700</w:t>
-            </w:r>
-          </w:p>
-        </w:tc>
-      </w:tr>
-      <w:tr>
-        <w:trPr/>
-        <w:tc>
-          <w:tcPr>
-            <w:tcW w:w="2600" w:type="dxa"/>
-            <w:tcBorders>
-              <w:top w:val="single" w:sz="4" w:space="0" w:color="B0B8C0"/>
-              <w:start w:val="single" w:sz="4" w:space="0" w:color="B0B8C0"/>
-              <w:bottom w:val="single" w:sz="4" w:space="0" w:color="B0B8C0"/>
-              <w:end w:val="single" w:sz="4" w:space="0" w:color="B0B8C0"/>
-            </w:tcBorders>
-            <w:shd w:fill="FFFFFF" w:val="clear"/>
-          </w:tcPr>
-          <w:p>
-            <w:pPr>
-              <w:pStyle w:val="Normal"/>
-              <w:widowControl w:val="false"/>
-              <w:spacing w:lineRule="auto" w:line="276" w:before="0" w:after="120"/>
-              <w:rPr/>
-            </w:pPr>
-            <w:r>
-              <w:rPr>
-                <w:rFonts w:eastAsia="Times New Roman" w:cs="Times New Roman"/>
-                <w:color w:val="auto"/>
-                <w:sz w:val="18"/>
-              </w:rPr>
-              <w:t>DTCWT</w:t>
-            </w:r>
-          </w:p>
-        </w:tc>
-        <w:tc>
-          <w:tcPr>
-            <w:tcW w:w="1600" w:type="dxa"/>
-            <w:tcBorders>
-              <w:top w:val="single" w:sz="4" w:space="0" w:color="B0B8C0"/>
-              <w:start w:val="single" w:sz="4" w:space="0" w:color="B0B8C0"/>
-              <w:bottom w:val="single" w:sz="4" w:space="0" w:color="B0B8C0"/>
-              <w:end w:val="single" w:sz="4" w:space="0" w:color="B0B8C0"/>
-            </w:tcBorders>
-            <w:shd w:fill="FFFFFF" w:val="clear"/>
-          </w:tcPr>
-          <w:p>
-            <w:pPr>
-              <w:pStyle w:val="Normal"/>
-              <w:widowControl w:val="false"/>
-              <w:spacing w:lineRule="auto" w:line="276" w:before="0" w:after="120"/>
-              <w:rPr/>
-            </w:pPr>
-            <w:r>
-              <w:rPr>
-                <w:rFonts w:eastAsia="Times New Roman" w:cs="Times New Roman"/>
-                <w:color w:val="auto"/>
-                <w:sz w:val="18"/>
-              </w:rPr>
-              <w:t>0,2356</w:t>
-            </w:r>
-          </w:p>
-        </w:tc>
-        <w:tc>
-          <w:tcPr>
-            <w:tcW w:w="1600" w:type="dxa"/>
-            <w:tcBorders>
-              <w:top w:val="single" w:sz="4" w:space="0" w:color="B0B8C0"/>
-              <w:start w:val="single" w:sz="4" w:space="0" w:color="B0B8C0"/>
-              <w:bottom w:val="single" w:sz="4" w:space="0" w:color="B0B8C0"/>
-              <w:end w:val="single" w:sz="4" w:space="0" w:color="B0B8C0"/>
-            </w:tcBorders>
-            <w:shd w:fill="FFFFFF" w:val="clear"/>
-          </w:tcPr>
-          <w:p>
-            <w:pPr>
-              <w:pStyle w:val="Normal"/>
-              <w:widowControl w:val="false"/>
-              <w:spacing w:lineRule="auto" w:line="276" w:before="0" w:after="120"/>
-              <w:rPr/>
-            </w:pPr>
-            <w:r>
-              <w:rPr>
-                <w:rFonts w:eastAsia="Times New Roman" w:cs="Times New Roman"/>
-                <w:color w:val="auto"/>
-                <w:sz w:val="18"/>
-              </w:rPr>
-              <w:t>0,7574</w:t>
-            </w:r>
-          </w:p>
-        </w:tc>
-        <w:tc>
-          <w:tcPr>
-            <w:tcW w:w="1600" w:type="dxa"/>
-            <w:tcBorders>
-              <w:top w:val="single" w:sz="4" w:space="0" w:color="B0B8C0"/>
-              <w:start w:val="single" w:sz="4" w:space="0" w:color="B0B8C0"/>
-              <w:bottom w:val="single" w:sz="4" w:space="0" w:color="B0B8C0"/>
-              <w:end w:val="single" w:sz="4" w:space="0" w:color="B0B8C0"/>
-            </w:tcBorders>
-            <w:shd w:fill="FFFFFF" w:val="clear"/>
-          </w:tcPr>
-          <w:p>
-            <w:pPr>
-              <w:pStyle w:val="Normal"/>
-              <w:widowControl w:val="false"/>
-              <w:spacing w:lineRule="auto" w:line="276" w:before="0" w:after="120"/>
-              <w:rPr/>
-            </w:pPr>
-            <w:r>
-              <w:rPr>
-                <w:rFonts w:eastAsia="Times New Roman" w:cs="Times New Roman"/>
-                <w:b/>
-                <w:color w:val="auto"/>
-                <w:sz w:val="18"/>
-              </w:rPr>
-              <w:t>0,8564</w:t>
-            </w:r>
-          </w:p>
-        </w:tc>
-        <w:tc>
-          <w:tcPr>
-            <w:tcW w:w="1600" w:type="dxa"/>
-            <w:tcBorders>
-              <w:top w:val="single" w:sz="4" w:space="0" w:color="B0B8C0"/>
-              <w:start w:val="single" w:sz="4" w:space="0" w:color="B0B8C0"/>
-              <w:bottom w:val="single" w:sz="4" w:space="0" w:color="B0B8C0"/>
-              <w:end w:val="single" w:sz="4" w:space="0" w:color="B0B8C0"/>
-            </w:tcBorders>
-            <w:shd w:fill="FFFFFF" w:val="clear"/>
-          </w:tcPr>
-          <w:p>
-            <w:pPr>
-              <w:pStyle w:val="Normal"/>
-              <w:widowControl w:val="false"/>
-              <w:spacing w:lineRule="auto" w:line="276" w:before="0" w:after="120"/>
-              <w:rPr/>
-            </w:pPr>
-            <w:r>
-              <w:rPr>
-                <w:rFonts w:eastAsia="Times New Roman" w:cs="Times New Roman"/>
-                <w:color w:val="auto"/>
-                <w:sz w:val="18"/>
-              </w:rPr>
-              <w:t>0,3993</w:t>
-            </w:r>
-          </w:p>
-        </w:tc>
-      </w:tr>
-      <w:tr>
-        <w:trPr/>
-        <w:tc>
-          <w:tcPr>
-            <w:tcW w:w="2600" w:type="dxa"/>
-            <w:tcBorders>
-              <w:top w:val="single" w:sz="4" w:space="0" w:color="B0B8C0"/>
-              <w:start w:val="single" w:sz="4" w:space="0" w:color="B0B8C0"/>
-              <w:bottom w:val="single" w:sz="4" w:space="0" w:color="B0B8C0"/>
-              <w:end w:val="single" w:sz="4" w:space="0" w:color="B0B8C0"/>
-            </w:tcBorders>
-            <w:shd w:fill="FFFFFF" w:val="clear"/>
-          </w:tcPr>
-          <w:p>
-            <w:pPr>
-              <w:pStyle w:val="Normal"/>
-              <w:widowControl w:val="false"/>
-              <w:spacing w:lineRule="auto" w:line="276" w:before="0" w:after="120"/>
-              <w:rPr/>
-            </w:pPr>
-            <w:r>
-              <w:rPr>
-                <w:rFonts w:eastAsia="Times New Roman" w:cs="Times New Roman"/>
-                <w:color w:val="auto"/>
-                <w:sz w:val="18"/>
-              </w:rPr>
-              <w:t>Curvelet (CVT)</w:t>
-            </w:r>
-          </w:p>
-        </w:tc>
-        <w:tc>
-          <w:tcPr>
-            <w:tcW w:w="1600" w:type="dxa"/>
-            <w:tcBorders>
-              <w:top w:val="single" w:sz="4" w:space="0" w:color="B0B8C0"/>
-              <w:start w:val="single" w:sz="4" w:space="0" w:color="B0B8C0"/>
-              <w:bottom w:val="single" w:sz="4" w:space="0" w:color="B0B8C0"/>
-              <w:end w:val="single" w:sz="4" w:space="0" w:color="B0B8C0"/>
-            </w:tcBorders>
-            <w:shd w:fill="FFFFFF" w:val="clear"/>
-          </w:tcPr>
-          <w:p>
-            <w:pPr>
-              <w:pStyle w:val="Normal"/>
-              <w:widowControl w:val="false"/>
-              <w:spacing w:lineRule="auto" w:line="276" w:before="0" w:after="120"/>
-              <w:rPr/>
-            </w:pPr>
-            <w:r>
-              <w:rPr>
-                <w:rFonts w:eastAsia="Times New Roman" w:cs="Times New Roman"/>
-                <w:color w:val="auto"/>
-                <w:sz w:val="18"/>
-              </w:rPr>
-              <w:t>0,1971</w:t>
-            </w:r>
-          </w:p>
-        </w:tc>
-        <w:tc>
-          <w:tcPr>
-            <w:tcW w:w="1600" w:type="dxa"/>
-            <w:tcBorders>
-              <w:top w:val="single" w:sz="4" w:space="0" w:color="B0B8C0"/>
-              <w:start w:val="single" w:sz="4" w:space="0" w:color="B0B8C0"/>
-              <w:bottom w:val="single" w:sz="4" w:space="0" w:color="B0B8C0"/>
-              <w:end w:val="single" w:sz="4" w:space="0" w:color="B0B8C0"/>
-            </w:tcBorders>
-            <w:shd w:fill="FFFFFF" w:val="clear"/>
-          </w:tcPr>
-          <w:p>
-            <w:pPr>
-              <w:pStyle w:val="Normal"/>
-              <w:widowControl w:val="false"/>
-              <w:spacing w:lineRule="auto" w:line="276" w:before="0" w:after="120"/>
-              <w:rPr/>
-            </w:pPr>
-            <w:r>
-              <w:rPr>
-                <w:rFonts w:eastAsia="Times New Roman" w:cs="Times New Roman"/>
-                <w:color w:val="auto"/>
-                <w:sz w:val="18"/>
-              </w:rPr>
-              <w:t>0,7272</w:t>
-            </w:r>
-          </w:p>
-        </w:tc>
-        <w:tc>
-          <w:tcPr>
-            <w:tcW w:w="1600" w:type="dxa"/>
-            <w:tcBorders>
-              <w:top w:val="single" w:sz="4" w:space="0" w:color="B0B8C0"/>
-              <w:start w:val="single" w:sz="4" w:space="0" w:color="B0B8C0"/>
-              <w:bottom w:val="single" w:sz="4" w:space="0" w:color="B0B8C0"/>
-              <w:end w:val="single" w:sz="4" w:space="0" w:color="B0B8C0"/>
-            </w:tcBorders>
-            <w:shd w:fill="FFFFFF" w:val="clear"/>
-          </w:tcPr>
-          <w:p>
-            <w:pPr>
-              <w:pStyle w:val="Normal"/>
-              <w:widowControl w:val="false"/>
-              <w:spacing w:lineRule="auto" w:line="276" w:before="0" w:after="120"/>
-              <w:rPr/>
-            </w:pPr>
-            <w:r>
-              <w:rPr>
-                <w:rFonts w:eastAsia="Times New Roman" w:cs="Times New Roman"/>
-                <w:color w:val="auto"/>
-                <w:sz w:val="18"/>
-              </w:rPr>
-              <w:t>0,8233</w:t>
-            </w:r>
-          </w:p>
-        </w:tc>
-        <w:tc>
-          <w:tcPr>
-            <w:tcW w:w="1600" w:type="dxa"/>
-            <w:tcBorders>
-              <w:top w:val="single" w:sz="4" w:space="0" w:color="B0B8C0"/>
-              <w:start w:val="single" w:sz="4" w:space="0" w:color="B0B8C0"/>
-              <w:bottom w:val="single" w:sz="4" w:space="0" w:color="B0B8C0"/>
-              <w:end w:val="single" w:sz="4" w:space="0" w:color="B0B8C0"/>
-            </w:tcBorders>
-            <w:shd w:fill="FFFFFF" w:val="clear"/>
-          </w:tcPr>
-          <w:p>
-            <w:pPr>
-              <w:pStyle w:val="Normal"/>
-              <w:widowControl w:val="false"/>
-              <w:spacing w:lineRule="auto" w:line="276" w:before="0" w:after="120"/>
-              <w:rPr/>
-            </w:pPr>
-            <w:r>
-              <w:rPr>
-                <w:rFonts w:eastAsia="Times New Roman" w:cs="Times New Roman"/>
-                <w:color w:val="auto"/>
-                <w:sz w:val="18"/>
-              </w:rPr>
-              <w:t>0,3692</w:t>
-            </w:r>
-          </w:p>
-        </w:tc>
-      </w:tr>
-      <w:tr>
-        <w:trPr/>
-        <w:tc>
-          <w:tcPr>
-            <w:tcW w:w="2600" w:type="dxa"/>
-            <w:tcBorders>
-              <w:top w:val="single" w:sz="4" w:space="0" w:color="B0B8C0"/>
-              <w:start w:val="single" w:sz="4" w:space="0" w:color="B0B8C0"/>
-              <w:bottom w:val="single" w:sz="4" w:space="0" w:color="B0B8C0"/>
-              <w:end w:val="single" w:sz="4" w:space="0" w:color="B0B8C0"/>
-            </w:tcBorders>
-            <w:shd w:fill="FFFFFF" w:val="clear"/>
-          </w:tcPr>
-          <w:p>
-            <w:pPr>
-              <w:pStyle w:val="Normal"/>
-              <w:widowControl w:val="false"/>
-              <w:spacing w:lineRule="auto" w:line="276" w:before="0" w:after="120"/>
-              <w:rPr/>
-            </w:pPr>
-            <w:r>
-              <w:rPr>
-                <w:rFonts w:eastAsia="Times New Roman" w:cs="Times New Roman"/>
-                <w:color w:val="auto"/>
-                <w:sz w:val="18"/>
-              </w:rPr>
-              <w:t>Top-Hat clásico</w:t>
-            </w:r>
-          </w:p>
-        </w:tc>
-        <w:tc>
-          <w:tcPr>
-            <w:tcW w:w="1600" w:type="dxa"/>
-            <w:tcBorders>
-              <w:top w:val="single" w:sz="4" w:space="0" w:color="B0B8C0"/>
-              <w:start w:val="single" w:sz="4" w:space="0" w:color="B0B8C0"/>
-              <w:bottom w:val="single" w:sz="4" w:space="0" w:color="B0B8C0"/>
-              <w:end w:val="single" w:sz="4" w:space="0" w:color="B0B8C0"/>
-            </w:tcBorders>
-            <w:shd w:fill="FFFFFF" w:val="clear"/>
-          </w:tcPr>
-          <w:p>
-            <w:pPr>
-              <w:pStyle w:val="Normal"/>
-              <w:widowControl w:val="false"/>
-              <w:spacing w:lineRule="auto" w:line="276" w:before="0" w:after="120"/>
-              <w:rPr/>
-            </w:pPr>
-            <w:r>
-              <w:rPr>
-                <w:rFonts w:eastAsia="Times New Roman" w:cs="Times New Roman"/>
-                <w:color w:val="auto"/>
-                <w:sz w:val="18"/>
-              </w:rPr>
-              <w:t>0,1594</w:t>
-            </w:r>
-          </w:p>
-        </w:tc>
-        <w:tc>
-          <w:tcPr>
-            <w:tcW w:w="1600" w:type="dxa"/>
-            <w:tcBorders>
-              <w:top w:val="single" w:sz="4" w:space="0" w:color="B0B8C0"/>
-              <w:start w:val="single" w:sz="4" w:space="0" w:color="B0B8C0"/>
-              <w:bottom w:val="single" w:sz="4" w:space="0" w:color="B0B8C0"/>
-              <w:end w:val="single" w:sz="4" w:space="0" w:color="B0B8C0"/>
-            </w:tcBorders>
-            <w:shd w:fill="FFFFFF" w:val="clear"/>
-          </w:tcPr>
-          <w:p>
-            <w:pPr>
-              <w:pStyle w:val="Normal"/>
-              <w:widowControl w:val="false"/>
-              <w:spacing w:lineRule="auto" w:line="276" w:before="0" w:after="120"/>
-              <w:rPr/>
-            </w:pPr>
-            <w:r>
-              <w:rPr>
-                <w:rFonts w:eastAsia="Times New Roman" w:cs="Times New Roman"/>
-                <w:color w:val="auto"/>
-                <w:sz w:val="18"/>
-              </w:rPr>
-              <w:t>0,6125</w:t>
-            </w:r>
-          </w:p>
-        </w:tc>
-        <w:tc>
-          <w:tcPr>
-            <w:tcW w:w="1600" w:type="dxa"/>
-            <w:tcBorders>
-              <w:top w:val="single" w:sz="4" w:space="0" w:color="B0B8C0"/>
-              <w:start w:val="single" w:sz="4" w:space="0" w:color="B0B8C0"/>
-              <w:bottom w:val="single" w:sz="4" w:space="0" w:color="B0B8C0"/>
-              <w:end w:val="single" w:sz="4" w:space="0" w:color="B0B8C0"/>
-            </w:tcBorders>
-            <w:shd w:fill="FFFFFF" w:val="clear"/>
-          </w:tcPr>
-          <w:p>
-            <w:pPr>
-              <w:pStyle w:val="Normal"/>
-              <w:widowControl w:val="false"/>
-              <w:spacing w:lineRule="auto" w:line="276" w:before="0" w:after="120"/>
-              <w:rPr/>
-            </w:pPr>
-            <w:r>
-              <w:rPr>
-                <w:rFonts w:eastAsia="Times New Roman" w:cs="Times New Roman"/>
-                <w:color w:val="auto"/>
-                <w:sz w:val="18"/>
-              </w:rPr>
-              <w:t>0,7454</w:t>
-            </w:r>
-          </w:p>
-        </w:tc>
-        <w:tc>
-          <w:tcPr>
-            <w:tcW w:w="1600" w:type="dxa"/>
-            <w:tcBorders>
-              <w:top w:val="single" w:sz="4" w:space="0" w:color="B0B8C0"/>
-              <w:start w:val="single" w:sz="4" w:space="0" w:color="B0B8C0"/>
-              <w:bottom w:val="single" w:sz="4" w:space="0" w:color="B0B8C0"/>
-              <w:end w:val="single" w:sz="4" w:space="0" w:color="B0B8C0"/>
-            </w:tcBorders>
-            <w:shd w:fill="FFFFFF" w:val="clear"/>
-          </w:tcPr>
-          <w:p>
-            <w:pPr>
-              <w:pStyle w:val="Normal"/>
-              <w:widowControl w:val="false"/>
-              <w:spacing w:lineRule="auto" w:line="276" w:before="0" w:after="120"/>
-              <w:rPr/>
-            </w:pPr>
-            <w:r>
-              <w:rPr>
-                <w:rFonts w:eastAsia="Times New Roman" w:cs="Times New Roman"/>
-                <w:color w:val="auto"/>
-                <w:sz w:val="18"/>
-              </w:rPr>
-              <w:t>0,3060</w:t>
-            </w:r>
-          </w:p>
-        </w:tc>
-      </w:tr>
-      <w:tr>
-        <w:trPr/>
-        <w:tc>
-          <w:tcPr>
-            <w:tcW w:w="2600" w:type="dxa"/>
-            <w:tcBorders>
-              <w:top w:val="single" w:sz="4" w:space="0" w:color="B0B8C0"/>
-              <w:start w:val="single" w:sz="4" w:space="0" w:color="B0B8C0"/>
-              <w:bottom w:val="single" w:sz="4" w:space="0" w:color="B0B8C0"/>
-              <w:end w:val="single" w:sz="4" w:space="0" w:color="B0B8C0"/>
-            </w:tcBorders>
-            <w:shd w:fill="FFFFFF" w:val="clear"/>
-          </w:tcPr>
-          <w:p>
-            <w:pPr>
-              <w:pStyle w:val="Normal"/>
-              <w:widowControl w:val="false"/>
-              <w:spacing w:lineRule="auto" w:line="276" w:before="0" w:after="120"/>
-              <w:rPr/>
-            </w:pPr>
-            <w:r>
-              <w:rPr>
-                <w:rFonts w:eastAsia="Times New Roman" w:cs="Times New Roman"/>
-                <w:color w:val="auto"/>
-                <w:sz w:val="18"/>
-              </w:rPr>
-              <w:t>Propuesta Novedosa</w:t>
-            </w:r>
-          </w:p>
-        </w:tc>
-        <w:tc>
-          <w:tcPr>
-            <w:tcW w:w="1600" w:type="dxa"/>
-            <w:tcBorders>
-              <w:top w:val="single" w:sz="4" w:space="0" w:color="B0B8C0"/>
-              <w:start w:val="single" w:sz="4" w:space="0" w:color="B0B8C0"/>
-              <w:bottom w:val="single" w:sz="4" w:space="0" w:color="B0B8C0"/>
-              <w:end w:val="single" w:sz="4" w:space="0" w:color="B0B8C0"/>
-            </w:tcBorders>
-            <w:shd w:fill="FFFFFF" w:val="clear"/>
-          </w:tcPr>
-          <w:p>
-            <w:pPr>
-              <w:pStyle w:val="Normal"/>
-              <w:widowControl w:val="false"/>
-              <w:spacing w:lineRule="auto" w:line="276" w:before="0" w:after="120"/>
-              <w:rPr/>
-            </w:pPr>
-            <w:r>
-              <w:rPr>
-                <w:rFonts w:eastAsia="Times New Roman" w:cs="Times New Roman"/>
-                <w:color w:val="auto"/>
-                <w:sz w:val="18"/>
-              </w:rPr>
-              <w:t>0,2081</w:t>
-            </w:r>
-          </w:p>
-        </w:tc>
-        <w:tc>
-          <w:tcPr>
-            <w:tcW w:w="1600" w:type="dxa"/>
-            <w:tcBorders>
-              <w:top w:val="single" w:sz="4" w:space="0" w:color="B0B8C0"/>
-              <w:start w:val="single" w:sz="4" w:space="0" w:color="B0B8C0"/>
-              <w:bottom w:val="single" w:sz="4" w:space="0" w:color="B0B8C0"/>
-              <w:end w:val="single" w:sz="4" w:space="0" w:color="B0B8C0"/>
-            </w:tcBorders>
-            <w:shd w:fill="FFFFFF" w:val="clear"/>
-          </w:tcPr>
-          <w:p>
-            <w:pPr>
-              <w:pStyle w:val="Normal"/>
-              <w:widowControl w:val="false"/>
-              <w:spacing w:lineRule="auto" w:line="276" w:before="0" w:after="120"/>
-              <w:rPr/>
-            </w:pPr>
-            <w:r>
-              <w:rPr>
-                <w:rFonts w:eastAsia="Times New Roman" w:cs="Times New Roman"/>
-                <w:b/>
-                <w:color w:val="auto"/>
-                <w:sz w:val="18"/>
-              </w:rPr>
-              <w:t>0,7604</w:t>
-            </w:r>
-          </w:p>
-        </w:tc>
-        <w:tc>
-          <w:tcPr>
-            <w:tcW w:w="1600" w:type="dxa"/>
-            <w:tcBorders>
-              <w:top w:val="single" w:sz="4" w:space="0" w:color="B0B8C0"/>
-              <w:start w:val="single" w:sz="4" w:space="0" w:color="B0B8C0"/>
-              <w:bottom w:val="single" w:sz="4" w:space="0" w:color="B0B8C0"/>
-              <w:end w:val="single" w:sz="4" w:space="0" w:color="B0B8C0"/>
-            </w:tcBorders>
-            <w:shd w:fill="FFFFFF" w:val="clear"/>
-          </w:tcPr>
-          <w:p>
-            <w:pPr>
-              <w:pStyle w:val="Normal"/>
-              <w:widowControl w:val="false"/>
-              <w:spacing w:lineRule="auto" w:line="276" w:before="0" w:after="120"/>
-              <w:rPr/>
-            </w:pPr>
-            <w:r>
-              <w:rPr>
-                <w:rFonts w:eastAsia="Times New Roman" w:cs="Times New Roman"/>
-                <w:color w:val="auto"/>
-                <w:sz w:val="18"/>
-              </w:rPr>
-              <w:t>0,8133</w:t>
-            </w:r>
-          </w:p>
-        </w:tc>
-        <w:tc>
-          <w:tcPr>
-            <w:tcW w:w="1600" w:type="dxa"/>
-            <w:tcBorders>
-              <w:top w:val="single" w:sz="4" w:space="0" w:color="B0B8C0"/>
-              <w:start w:val="single" w:sz="4" w:space="0" w:color="B0B8C0"/>
-              <w:bottom w:val="single" w:sz="4" w:space="0" w:color="B0B8C0"/>
-              <w:end w:val="single" w:sz="4" w:space="0" w:color="B0B8C0"/>
-            </w:tcBorders>
-            <w:shd w:fill="FFFFFF" w:val="clear"/>
-          </w:tcPr>
-          <w:p>
-            <w:pPr>
-              <w:pStyle w:val="Normal"/>
-              <w:widowControl w:val="false"/>
-              <w:spacing w:lineRule="auto" w:line="276" w:before="0" w:after="120"/>
-              <w:rPr/>
-            </w:pPr>
-            <w:r>
-              <w:rPr>
-                <w:rFonts w:eastAsia="Times New Roman" w:cs="Times New Roman"/>
-                <w:color w:val="auto"/>
-                <w:sz w:val="18"/>
-              </w:rPr>
-              <w:t>0,3770</w:t>
+              <w:t>18,7313</w:t>
             </w:r>
           </w:p>
         </w:tc>
@@ -24500,7 +22569,7 @@
         <w:rPr>
           <w:rFonts w:eastAsia="Times New Roman" w:cs="Times New Roman"/>
         </w:rPr>
-        <w:t>La Tabla 7 reporta la prueba de Friedman aplicada de forma independiente a cada métrica, considerando los siete métodos del benchmark como tratamientos y los 20 pares como bloques. La hipótesis nula se rechaza con amplio margen en las doce métricas (p ≪ 0,001), lo que habilita el análisis pareado posterior: existen diferencias reales y sistemáticas entre los métodos comparados.</w:t>
+        <w:t>La Tabla 6 reporta la prueba de Friedman aplicada de forma independiente a cada métrica, considerando los siete métodos del benchmark como tratamientos y los 20 pares como bloques. La hipótesis nula se rechaza con amplio margen en las nueve métricas (p ≪ 0,001), lo que habilita el análisis pareado posterior: existen diferencias reales y sistemáticas entre los métodos comparados.</w:t>
       </w:r>
     </w:p>
     <w:p>
@@ -24515,7 +22584,7 @@
           <w:i/>
           <w:sz w:val="18"/>
         </w:rPr>
-        <w:t>Tabla 7. Prueba de Friedman por métrica (χ², p-valor; α = 0,05).</w:t>
+        <w:t>Tabla 6. Prueba de Friedman por métrica (χ², p-valor; α = 0,05).</w:t>
       </w:r>
     </w:p>
     <w:tbl>
@@ -24739,7 +22808,7 @@
                 <w:color w:val="auto"/>
                 <w:sz w:val="18"/>
               </w:rPr>
-              <w:t>2.08e-16</w:t>
+              <w:t>&lt; 0,001</w:t>
             </w:r>
           </w:p>
         </w:tc>
@@ -24854,7 +22923,7 @@
                 <w:color w:val="auto"/>
                 <w:sz w:val="18"/>
               </w:rPr>
-              <w:t>4.21e-19</w:t>
+              <w:t>&lt; 0,001</w:t>
             </w:r>
           </w:p>
         </w:tc>
@@ -24969,7 +23038,7 @@
                 <w:color w:val="auto"/>
                 <w:sz w:val="18"/>
               </w:rPr>
-              <w:t>2.08e-16</w:t>
+              <w:t>&lt; 0,001</w:t>
             </w:r>
           </w:p>
         </w:tc>
@@ -25084,7 +23153,7 @@
                 <w:color w:val="auto"/>
                 <w:sz w:val="18"/>
               </w:rPr>
-              <w:t>2.80e-18</w:t>
+              <w:t>&lt; 0,001</w:t>
             </w:r>
           </w:p>
         </w:tc>
@@ -25199,7 +23268,7 @@
                 <w:color w:val="auto"/>
                 <w:sz w:val="18"/>
               </w:rPr>
-              <w:t>2.59e-14</w:t>
+              <w:t>&lt; 0,001</w:t>
             </w:r>
           </w:p>
         </w:tc>
@@ -25314,7 +23383,7 @@
                 <w:color w:val="auto"/>
                 <w:sz w:val="18"/>
               </w:rPr>
-              <w:t>1.47e-11</w:t>
+              <w:t>&lt; 0,001</w:t>
             </w:r>
           </w:p>
         </w:tc>
@@ -25429,7 +23498,7 @@
                 <w:color w:val="auto"/>
                 <w:sz w:val="18"/>
               </w:rPr>
-              <w:t>2.80e-17</w:t>
+              <w:t>&lt; 0,001</w:t>
             </w:r>
           </w:p>
         </w:tc>
@@ -25488,7 +23557,7 @@
                 <w:color w:val="auto"/>
                 <w:sz w:val="18"/>
               </w:rPr>
-              <w:t>Qabf</w:t>
+              <w:t>SSIM</w:t>
             </w:r>
           </w:p>
         </w:tc>
@@ -25516,7 +23585,7 @@
                 <w:color w:val="auto"/>
                 <w:sz w:val="18"/>
               </w:rPr>
-              <w:t>69,84</w:t>
+              <w:t>96,52</w:t>
             </w:r>
           </w:p>
         </w:tc>
@@ -25544,7 +23613,7 @@
                 <w:color w:val="auto"/>
                 <w:sz w:val="18"/>
               </w:rPr>
-              <w:t>4.42e-13</w:t>
+              <w:t>&lt; 0,001</w:t>
             </w:r>
           </w:p>
         </w:tc>
@@ -25603,7 +23672,7 @@
                 <w:color w:val="auto"/>
                 <w:sz w:val="18"/>
               </w:rPr>
-              <w:t>Nabf</w:t>
+              <w:t>PSNR</w:t>
             </w:r>
           </w:p>
         </w:tc>
@@ -25631,7 +23700,7 @@
                 <w:color w:val="auto"/>
                 <w:sz w:val="18"/>
               </w:rPr>
-              <w:t>107,61</w:t>
+              <w:t>107,47</w:t>
             </w:r>
           </w:p>
         </w:tc>
@@ -25659,352 +23728,7 @@
                 <w:color w:val="auto"/>
                 <w:sz w:val="18"/>
               </w:rPr>
-              <w:t>6.44e-21</w:t>
-            </w:r>
-          </w:p>
-        </w:tc>
-        <w:tc>
-          <w:tcPr>
-            <w:tcW w:w="2300" w:type="dxa"/>
-            <w:tcBorders>
-              <w:top w:val="single" w:sz="4" w:space="0" w:color="B0B8C0"/>
-              <w:start w:val="single" w:sz="4" w:space="0" w:color="B0B8C0"/>
-              <w:bottom w:val="single" w:sz="4" w:space="0" w:color="B0B8C0"/>
-              <w:end w:val="single" w:sz="4" w:space="0" w:color="B0B8C0"/>
-            </w:tcBorders>
-            <w:shd w:fill="FFFFFF" w:val="clear"/>
-          </w:tcPr>
-          <w:p>
-            <w:pPr>
-              <w:pStyle w:val="Normal"/>
-              <w:widowControl w:val="false"/>
-              <w:spacing w:lineRule="auto" w:line="276" w:before="0" w:after="120"/>
-              <w:rPr/>
-            </w:pPr>
-            <w:r>
-              <w:rPr>
-                <w:rFonts w:eastAsia="Times New Roman" w:cs="Times New Roman"/>
-                <w:color w:val="auto"/>
-                <w:sz w:val="18"/>
-              </w:rPr>
-              <w:t>Sí</w:t>
-            </w:r>
-          </w:p>
-        </w:tc>
-      </w:tr>
-      <w:tr>
-        <w:trPr/>
-        <w:tc>
-          <w:tcPr>
-            <w:tcW w:w="2000" w:type="dxa"/>
-            <w:tcBorders>
-              <w:top w:val="single" w:sz="4" w:space="0" w:color="B0B8C0"/>
-              <w:start w:val="single" w:sz="4" w:space="0" w:color="B0B8C0"/>
-              <w:bottom w:val="single" w:sz="4" w:space="0" w:color="B0B8C0"/>
-              <w:end w:val="single" w:sz="4" w:space="0" w:color="B0B8C0"/>
-            </w:tcBorders>
-            <w:shd w:fill="FFFFFF" w:val="clear"/>
-          </w:tcPr>
-          <w:p>
-            <w:pPr>
-              <w:pStyle w:val="Normal"/>
-              <w:widowControl w:val="false"/>
-              <w:spacing w:lineRule="auto" w:line="276" w:before="0" w:after="120"/>
-              <w:rPr/>
-            </w:pPr>
-            <w:r>
-              <w:rPr>
-                <w:rFonts w:eastAsia="Times New Roman" w:cs="Times New Roman"/>
-                <w:color w:val="auto"/>
-                <w:sz w:val="18"/>
-              </w:rPr>
-              <w:t>SSIM</w:t>
-            </w:r>
-          </w:p>
-        </w:tc>
-        <w:tc>
-          <w:tcPr>
-            <w:tcW w:w="2400" w:type="dxa"/>
-            <w:tcBorders>
-              <w:top w:val="single" w:sz="4" w:space="0" w:color="B0B8C0"/>
-              <w:start w:val="single" w:sz="4" w:space="0" w:color="B0B8C0"/>
-              <w:bottom w:val="single" w:sz="4" w:space="0" w:color="B0B8C0"/>
-              <w:end w:val="single" w:sz="4" w:space="0" w:color="B0B8C0"/>
-            </w:tcBorders>
-            <w:shd w:fill="FFFFFF" w:val="clear"/>
-          </w:tcPr>
-          <w:p>
-            <w:pPr>
-              <w:pStyle w:val="Normal"/>
-              <w:widowControl w:val="false"/>
-              <w:spacing w:lineRule="auto" w:line="276" w:before="0" w:after="120"/>
-              <w:rPr/>
-            </w:pPr>
-            <w:r>
-              <w:rPr>
-                <w:rFonts w:eastAsia="Times New Roman" w:cs="Times New Roman"/>
-                <w:color w:val="auto"/>
-                <w:sz w:val="18"/>
-              </w:rPr>
-              <w:t>96,52</w:t>
-            </w:r>
-          </w:p>
-        </w:tc>
-        <w:tc>
-          <w:tcPr>
-            <w:tcW w:w="2300" w:type="dxa"/>
-            <w:tcBorders>
-              <w:top w:val="single" w:sz="4" w:space="0" w:color="B0B8C0"/>
-              <w:start w:val="single" w:sz="4" w:space="0" w:color="B0B8C0"/>
-              <w:bottom w:val="single" w:sz="4" w:space="0" w:color="B0B8C0"/>
-              <w:end w:val="single" w:sz="4" w:space="0" w:color="B0B8C0"/>
-            </w:tcBorders>
-            <w:shd w:fill="FFFFFF" w:val="clear"/>
-          </w:tcPr>
-          <w:p>
-            <w:pPr>
-              <w:pStyle w:val="Normal"/>
-              <w:widowControl w:val="false"/>
-              <w:spacing w:lineRule="auto" w:line="276" w:before="0" w:after="120"/>
-              <w:rPr/>
-            </w:pPr>
-            <w:r>
-              <w:rPr>
-                <w:rFonts w:eastAsia="Times New Roman" w:cs="Times New Roman"/>
-                <w:color w:val="auto"/>
-                <w:sz w:val="18"/>
-              </w:rPr>
-              <w:t>1.33e-18</w:t>
-            </w:r>
-          </w:p>
-        </w:tc>
-        <w:tc>
-          <w:tcPr>
-            <w:tcW w:w="2300" w:type="dxa"/>
-            <w:tcBorders>
-              <w:top w:val="single" w:sz="4" w:space="0" w:color="B0B8C0"/>
-              <w:start w:val="single" w:sz="4" w:space="0" w:color="B0B8C0"/>
-              <w:bottom w:val="single" w:sz="4" w:space="0" w:color="B0B8C0"/>
-              <w:end w:val="single" w:sz="4" w:space="0" w:color="B0B8C0"/>
-            </w:tcBorders>
-            <w:shd w:fill="FFFFFF" w:val="clear"/>
-          </w:tcPr>
-          <w:p>
-            <w:pPr>
-              <w:pStyle w:val="Normal"/>
-              <w:widowControl w:val="false"/>
-              <w:spacing w:lineRule="auto" w:line="276" w:before="0" w:after="120"/>
-              <w:rPr/>
-            </w:pPr>
-            <w:r>
-              <w:rPr>
-                <w:rFonts w:eastAsia="Times New Roman" w:cs="Times New Roman"/>
-                <w:color w:val="auto"/>
-                <w:sz w:val="18"/>
-              </w:rPr>
-              <w:t>Sí</w:t>
-            </w:r>
-          </w:p>
-        </w:tc>
-      </w:tr>
-      <w:tr>
-        <w:trPr/>
-        <w:tc>
-          <w:tcPr>
-            <w:tcW w:w="2000" w:type="dxa"/>
-            <w:tcBorders>
-              <w:top w:val="single" w:sz="4" w:space="0" w:color="B0B8C0"/>
-              <w:start w:val="single" w:sz="4" w:space="0" w:color="B0B8C0"/>
-              <w:bottom w:val="single" w:sz="4" w:space="0" w:color="B0B8C0"/>
-              <w:end w:val="single" w:sz="4" w:space="0" w:color="B0B8C0"/>
-            </w:tcBorders>
-            <w:shd w:fill="FFFFFF" w:val="clear"/>
-          </w:tcPr>
-          <w:p>
-            <w:pPr>
-              <w:pStyle w:val="Normal"/>
-              <w:widowControl w:val="false"/>
-              <w:spacing w:lineRule="auto" w:line="276" w:before="0" w:after="120"/>
-              <w:rPr/>
-            </w:pPr>
-            <w:r>
-              <w:rPr>
-                <w:rFonts w:eastAsia="Times New Roman" w:cs="Times New Roman"/>
-                <w:color w:val="auto"/>
-                <w:sz w:val="18"/>
-              </w:rPr>
-              <w:t>SCD</w:t>
-            </w:r>
-          </w:p>
-        </w:tc>
-        <w:tc>
-          <w:tcPr>
-            <w:tcW w:w="2400" w:type="dxa"/>
-            <w:tcBorders>
-              <w:top w:val="single" w:sz="4" w:space="0" w:color="B0B8C0"/>
-              <w:start w:val="single" w:sz="4" w:space="0" w:color="B0B8C0"/>
-              <w:bottom w:val="single" w:sz="4" w:space="0" w:color="B0B8C0"/>
-              <w:end w:val="single" w:sz="4" w:space="0" w:color="B0B8C0"/>
-            </w:tcBorders>
-            <w:shd w:fill="FFFFFF" w:val="clear"/>
-          </w:tcPr>
-          <w:p>
-            <w:pPr>
-              <w:pStyle w:val="Normal"/>
-              <w:widowControl w:val="false"/>
-              <w:spacing w:lineRule="auto" w:line="276" w:before="0" w:after="120"/>
-              <w:rPr/>
-            </w:pPr>
-            <w:r>
-              <w:rPr>
-                <w:rFonts w:eastAsia="Times New Roman" w:cs="Times New Roman"/>
-                <w:color w:val="auto"/>
-                <w:sz w:val="18"/>
-              </w:rPr>
-              <w:t>64,41</w:t>
-            </w:r>
-          </w:p>
-        </w:tc>
-        <w:tc>
-          <w:tcPr>
-            <w:tcW w:w="2300" w:type="dxa"/>
-            <w:tcBorders>
-              <w:top w:val="single" w:sz="4" w:space="0" w:color="B0B8C0"/>
-              <w:start w:val="single" w:sz="4" w:space="0" w:color="B0B8C0"/>
-              <w:bottom w:val="single" w:sz="4" w:space="0" w:color="B0B8C0"/>
-              <w:end w:val="single" w:sz="4" w:space="0" w:color="B0B8C0"/>
-            </w:tcBorders>
-            <w:shd w:fill="FFFFFF" w:val="clear"/>
-          </w:tcPr>
-          <w:p>
-            <w:pPr>
-              <w:pStyle w:val="Normal"/>
-              <w:widowControl w:val="false"/>
-              <w:spacing w:lineRule="auto" w:line="276" w:before="0" w:after="120"/>
-              <w:rPr/>
-            </w:pPr>
-            <w:r>
-              <w:rPr>
-                <w:rFonts w:eastAsia="Times New Roman" w:cs="Times New Roman"/>
-                <w:color w:val="auto"/>
-                <w:sz w:val="18"/>
-              </w:rPr>
-              <w:t>5.68e-12</w:t>
-            </w:r>
-          </w:p>
-        </w:tc>
-        <w:tc>
-          <w:tcPr>
-            <w:tcW w:w="2300" w:type="dxa"/>
-            <w:tcBorders>
-              <w:top w:val="single" w:sz="4" w:space="0" w:color="B0B8C0"/>
-              <w:start w:val="single" w:sz="4" w:space="0" w:color="B0B8C0"/>
-              <w:bottom w:val="single" w:sz="4" w:space="0" w:color="B0B8C0"/>
-              <w:end w:val="single" w:sz="4" w:space="0" w:color="B0B8C0"/>
-            </w:tcBorders>
-            <w:shd w:fill="FFFFFF" w:val="clear"/>
-          </w:tcPr>
-          <w:p>
-            <w:pPr>
-              <w:pStyle w:val="Normal"/>
-              <w:widowControl w:val="false"/>
-              <w:spacing w:lineRule="auto" w:line="276" w:before="0" w:after="120"/>
-              <w:rPr/>
-            </w:pPr>
-            <w:r>
-              <w:rPr>
-                <w:rFonts w:eastAsia="Times New Roman" w:cs="Times New Roman"/>
-                <w:color w:val="auto"/>
-                <w:sz w:val="18"/>
-              </w:rPr>
-              <w:t>Sí</w:t>
-            </w:r>
-          </w:p>
-        </w:tc>
-      </w:tr>
-      <w:tr>
-        <w:trPr/>
-        <w:tc>
-          <w:tcPr>
-            <w:tcW w:w="2000" w:type="dxa"/>
-            <w:tcBorders>
-              <w:top w:val="single" w:sz="4" w:space="0" w:color="B0B8C0"/>
-              <w:start w:val="single" w:sz="4" w:space="0" w:color="B0B8C0"/>
-              <w:bottom w:val="single" w:sz="4" w:space="0" w:color="B0B8C0"/>
-              <w:end w:val="single" w:sz="4" w:space="0" w:color="B0B8C0"/>
-            </w:tcBorders>
-            <w:shd w:fill="FFFFFF" w:val="clear"/>
-          </w:tcPr>
-          <w:p>
-            <w:pPr>
-              <w:pStyle w:val="Normal"/>
-              <w:widowControl w:val="false"/>
-              <w:spacing w:lineRule="auto" w:line="276" w:before="0" w:after="120"/>
-              <w:rPr/>
-            </w:pPr>
-            <w:r>
-              <w:rPr>
-                <w:rFonts w:eastAsia="Times New Roman" w:cs="Times New Roman"/>
-                <w:color w:val="auto"/>
-                <w:sz w:val="18"/>
-              </w:rPr>
-              <w:t>VIF</w:t>
-            </w:r>
-          </w:p>
-        </w:tc>
-        <w:tc>
-          <w:tcPr>
-            <w:tcW w:w="2400" w:type="dxa"/>
-            <w:tcBorders>
-              <w:top w:val="single" w:sz="4" w:space="0" w:color="B0B8C0"/>
-              <w:start w:val="single" w:sz="4" w:space="0" w:color="B0B8C0"/>
-              <w:bottom w:val="single" w:sz="4" w:space="0" w:color="B0B8C0"/>
-              <w:end w:val="single" w:sz="4" w:space="0" w:color="B0B8C0"/>
-            </w:tcBorders>
-            <w:shd w:fill="FFFFFF" w:val="clear"/>
-          </w:tcPr>
-          <w:p>
-            <w:pPr>
-              <w:pStyle w:val="Normal"/>
-              <w:widowControl w:val="false"/>
-              <w:spacing w:lineRule="auto" w:line="276" w:before="0" w:after="120"/>
-              <w:rPr/>
-            </w:pPr>
-            <w:r>
-              <w:rPr>
-                <w:rFonts w:eastAsia="Times New Roman" w:cs="Times New Roman"/>
-                <w:color w:val="auto"/>
-                <w:sz w:val="18"/>
-              </w:rPr>
-              <w:t>95,85</w:t>
-            </w:r>
-          </w:p>
-        </w:tc>
-        <w:tc>
-          <w:tcPr>
-            <w:tcW w:w="2300" w:type="dxa"/>
-            <w:tcBorders>
-              <w:top w:val="single" w:sz="4" w:space="0" w:color="B0B8C0"/>
-              <w:start w:val="single" w:sz="4" w:space="0" w:color="B0B8C0"/>
-              <w:bottom w:val="single" w:sz="4" w:space="0" w:color="B0B8C0"/>
-              <w:end w:val="single" w:sz="4" w:space="0" w:color="B0B8C0"/>
-            </w:tcBorders>
-            <w:shd w:fill="FFFFFF" w:val="clear"/>
-          </w:tcPr>
-          <w:p>
-            <w:pPr>
-              <w:pStyle w:val="Normal"/>
-              <w:widowControl w:val="false"/>
-              <w:spacing w:lineRule="auto" w:line="276" w:before="0" w:after="120"/>
-              <w:rPr/>
-            </w:pPr>
-            <w:r>
-              <w:rPr>
-                <w:rFonts w:eastAsia="Times New Roman" w:cs="Times New Roman"/>
-                <w:color w:val="auto"/>
-                <w:sz w:val="18"/>
-              </w:rPr>
-              <w:t>1.84e-18</w:t>
+              <w:t>&lt; 0,001</w:t>
             </w:r>
           </w:p>
         </w:tc>
@@ -26071,7 +23795,7 @@
         <w:rPr>
           <w:rFonts w:eastAsia="Times New Roman" w:cs="Times New Roman"/>
         </w:rPr>
-        <w:t>Para precisar dónde residen las diferencias se aplicó la prueba de Wilcoxon de rangos signados entre los métodos morfológicos (la propuesta y el Top-Hat clásico) y cada método del estado del arte, sobre las doce métricas, con corrección de Holm y tamaño de efecto rank-biserial (120 contrastes; detalle en el Apéndice C), más el contraste directo entre la propuesta y el operador clásico. El hallazgo central: frente al Top-Hat clásico, la propuesta gana de forma estadísticamente significativa en las siete métricas de calidad e información (MI_vis, MI_ir, Qabf, Nabf, SSIM, SCD y VIF; p_Holm ≤ 0,001), cediendo solo las de actividad bruta. Frente a DWT y CVT gana en las siete métricas de calidad; frente a DTCWT gana en seis y cede Qabf por una milésima; frente a RP gana en Nabf, SSIM y MI_vis y empata en Qabf, SCD y VIF; y frente a LP gana en Nabf y SSIM, empata en Qabf y SCD, y cede VIF y las métricas de contraste.</w:t>
+        <w:t>Para precisar dónde residen las diferencias se aplicó la prueba de Wilcoxon de rangos signados entre los métodos morfológicos (la propuesta y el Top-Hat clásico) y cada método del estado del arte, sobre las nueve métricas, con corrección de Holm y tamaño de efecto rank-biserial (120 contrastes; detalle en el Apéndice C), más el contraste directo entre la propuesta y el operador clásico. El hallazgo central: frente al Top-Hat clásico, la propuesta gana de forma estadísticamente significativa en las siete métricas de calidad e información (MI_vis, MI_ir, Qabf, Nabf, SSIM, SCD y VIF; p_Holm ≤ 0,001), cediendo solo las de actividad bruta. Frente a DWT y CVT gana en las siete métricas de calidad; frente a DTCWT gana en seis y cede Qabf por una milésima; frente a RP gana en Nabf, SSIM y MI_vis y empata en Qabf, SCD y VIF; y frente a LP gana en Nabf y SSIM, empata en Qabf y SCD, y cede VIF y las métricas de contraste.</w:t>
       </w:r>
     </w:p>
     <w:p>
@@ -26107,7 +23831,7 @@
         <w:rPr>
           <w:rFonts w:eastAsia="Times New Roman" w:cs="Times New Roman"/>
         </w:rPr>
-        <w:t>La Tabla 8 muestra el ranking promedio de cada método (1 = mejor) en seis métricas clave y el ranking global obtenido al promediar las doce métricas, respetando la dirección de cada una. La pirámide de Laplace encabeza el ranking global (3,17), seguida de RP (3,42) y DTCWT (3,58); la propuesta ocupa el cuarto lugar (4,08), penalizada por las métricas de actividad —que premian el realce agresivo: el Top-Hat clásico las lidera con el mayor Nabf del estudio—, pese a ser primera en Nabf y SSIM y segunda en Qabf, SCD y VIF. El ranking agregado, al mezclar familias de métricas con pesos iguales, debe leerse junto a los contrastes pareados de la sección anterior.</w:t>
+        <w:t>La Tabla 7 muestra el ranking promedio de cada método (1 = mejor) en seis métricas clave y el ranking global obtenido al promediar las nueve métricas, respetando la dirección de cada una. La pirámide de Laplace encabeza el ranking global (3,17), seguida de RP (3,42) y DTCWT (3,58); la propuesta ocupa el cuarto lugar (4,08), penalizada por las métricas de actividad —que premian el realce agresivo: el Top-Hat clásico las lidera con el mayor Nabf del estudio—, pese a ser primera en Nabf y SSIM y segunda en Qabf, SCD y VIF. El ranking agregado, al mezclar familias de métricas con pesos iguales, debe leerse junto a los contrastes pareados de la sección anterior.</w:t>
       </w:r>
     </w:p>
     <w:p>
@@ -26122,7 +23846,7 @@
           <w:i/>
           <w:sz w:val="18"/>
         </w:rPr>
-        <w:t>Tabla 8. Ranking promedio por método y métrica (1 = mejor).</w:t>
+        <w:t>Tabla 7. Ranking promedio por método y métrica (1 = mejor).</w:t>
       </w:r>
     </w:p>
     <w:tbl>
@@ -26263,7 +23987,7 @@
                 <w:color w:val="FFFFFF"/>
                 <w:sz w:val="18"/>
               </w:rPr>
-              <w:t>Qabf</w:t>
+              <w:t>SF</w:t>
             </w:r>
           </w:p>
         </w:tc>
@@ -26292,7 +24016,7 @@
                 <w:color w:val="FFFFFF"/>
                 <w:sz w:val="18"/>
               </w:rPr>
-              <w:t>Nabf</w:t>
+              <w:t>SSIM</w:t>
             </w:r>
           </w:p>
         </w:tc>
@@ -26321,7 +24045,7 @@
                 <w:color w:val="FFFFFF"/>
                 <w:sz w:val="18"/>
               </w:rPr>
-              <w:t>SSIM</w:t>
+              <w:t>PSNR</w:t>
             </w:r>
           </w:p>
         </w:tc>
@@ -26350,7 +24074,7 @@
                 <w:color w:val="FFFFFF"/>
                 <w:sz w:val="18"/>
               </w:rPr>
-              <w:t>VIF</w:t>
+              <w:t>MI_ir</w:t>
             </w:r>
           </w:p>
         </w:tc>
@@ -26439,7 +24163,7 @@
                 <w:color w:val="auto"/>
                 <w:sz w:val="18"/>
               </w:rPr>
-              <w:t>1,00</w:t>
+              <w:t>1,0</w:t>
             </w:r>
           </w:p>
         </w:tc>
@@ -26467,7 +24191,7 @@
                 <w:color w:val="auto"/>
                 <w:sz w:val="18"/>
               </w:rPr>
-              <w:t>6,00</w:t>
+              <w:t>6,0</w:t>
             </w:r>
           </w:p>
         </w:tc>
@@ -26495,7 +24219,7 @@
                 <w:color w:val="auto"/>
                 <w:sz w:val="18"/>
               </w:rPr>
-              <w:t>6,00</w:t>
+              <w:t>5,0</w:t>
             </w:r>
           </w:p>
         </w:tc>
@@ -26523,7 +24247,7 @@
                 <w:color w:val="auto"/>
                 <w:sz w:val="18"/>
               </w:rPr>
-              <w:t>2,00</w:t>
+              <w:t>5,0</w:t>
             </w:r>
           </w:p>
         </w:tc>
@@ -26551,7 +24275,7 @@
                 <w:color w:val="auto"/>
                 <w:sz w:val="18"/>
               </w:rPr>
-              <w:t>5,00</w:t>
+              <w:t>5,0</w:t>
             </w:r>
           </w:p>
         </w:tc>
@@ -26580,7 +24304,7 @@
                 <w:color w:val="auto"/>
                 <w:sz w:val="18"/>
               </w:rPr>
-              <w:t>1,00</w:t>
+              <w:t>1,0</w:t>
             </w:r>
           </w:p>
         </w:tc>
@@ -26609,7 +24333,7 @@
                 <w:color w:val="auto"/>
                 <w:sz w:val="18"/>
               </w:rPr>
-              <w:t>3,17</w:t>
+              <w:t>3,11</w:t>
             </w:r>
           </w:p>
         </w:tc>
@@ -26668,7 +24392,7 @@
                 <w:color w:val="auto"/>
                 <w:sz w:val="18"/>
               </w:rPr>
-              <w:t>3,00</w:t>
+              <w:t>3,0</w:t>
             </w:r>
           </w:p>
         </w:tc>
@@ -26696,7 +24420,7 @@
                 <w:color w:val="auto"/>
                 <w:sz w:val="18"/>
               </w:rPr>
-              <w:t>3,00</w:t>
+              <w:t>3,0</w:t>
             </w:r>
           </w:p>
         </w:tc>
@@ -26724,7 +24448,7 @@
                 <w:color w:val="auto"/>
                 <w:sz w:val="18"/>
               </w:rPr>
-              <w:t>3,00</w:t>
+              <w:t>3,0</w:t>
             </w:r>
           </w:p>
         </w:tc>
@@ -26752,7 +24476,7 @@
                 <w:color w:val="auto"/>
                 <w:sz w:val="18"/>
               </w:rPr>
-              <w:t>5,00</w:t>
+              <w:t>4,0</w:t>
             </w:r>
           </w:p>
         </w:tc>
@@ -26780,7 +24504,7 @@
                 <w:color w:val="auto"/>
                 <w:sz w:val="18"/>
               </w:rPr>
-              <w:t>4,00</w:t>
+              <w:t>4,0</w:t>
             </w:r>
           </w:p>
         </w:tc>
@@ -26808,7 +24532,7 @@
                 <w:color w:val="auto"/>
                 <w:sz w:val="18"/>
               </w:rPr>
-              <w:t>2,00</w:t>
+              <w:t>6,0</w:t>
             </w:r>
           </w:p>
         </w:tc>
@@ -26836,7 +24560,7 @@
                 <w:color w:val="auto"/>
                 <w:sz w:val="18"/>
               </w:rPr>
-              <w:t>3,50</w:t>
+              <w:t>3,89</w:t>
             </w:r>
           </w:p>
         </w:tc>
@@ -26895,7 +24619,7 @@
                 <w:color w:val="auto"/>
                 <w:sz w:val="18"/>
               </w:rPr>
-              <w:t>4,00</w:t>
+              <w:t>4,0</w:t>
             </w:r>
           </w:p>
         </w:tc>
@@ -26923,7 +24647,7 @@
                 <w:color w:val="auto"/>
                 <w:sz w:val="18"/>
               </w:rPr>
-              <w:t>5,00</w:t>
+              <w:t>5,0</w:t>
             </w:r>
           </w:p>
         </w:tc>
@@ -26952,7 +24676,7 @@
                 <w:color w:val="auto"/>
                 <w:sz w:val="18"/>
               </w:rPr>
-              <w:t>1,00</w:t>
+              <w:t>6,0</w:t>
             </w:r>
           </w:p>
         </w:tc>
@@ -26980,7 +24704,7 @@
                 <w:color w:val="auto"/>
                 <w:sz w:val="18"/>
               </w:rPr>
-              <w:t>3,00</w:t>
+              <w:t>2,0</w:t>
             </w:r>
           </w:p>
         </w:tc>
@@ -27008,7 +24732,7 @@
                 <w:color w:val="auto"/>
                 <w:sz w:val="18"/>
               </w:rPr>
-              <w:t>2,00</w:t>
+              <w:t>2,0</w:t>
             </w:r>
           </w:p>
         </w:tc>
@@ -27036,7 +24760,7 @@
                 <w:color w:val="auto"/>
                 <w:sz w:val="18"/>
               </w:rPr>
-              <w:t>4,00</w:t>
+              <w:t>3,0</w:t>
             </w:r>
           </w:p>
         </w:tc>
@@ -27064,7 +24788,7 @@
                 <w:color w:val="auto"/>
                 <w:sz w:val="18"/>
               </w:rPr>
-              <w:t>3,58</w:t>
+              <w:t>3,78</w:t>
             </w:r>
           </w:p>
         </w:tc>
@@ -27123,7 +24847,7 @@
                 <w:color w:val="auto"/>
                 <w:sz w:val="18"/>
               </w:rPr>
-              <w:t>6,00</w:t>
+              <w:t>6,0</w:t>
             </w:r>
           </w:p>
         </w:tc>
@@ -27151,7 +24875,7 @@
                 <w:color w:val="auto"/>
                 <w:sz w:val="18"/>
               </w:rPr>
-              <w:t>7,00</w:t>
+              <w:t>7,0</w:t>
             </w:r>
           </w:p>
         </w:tc>
@@ -27179,7 +24903,7 @@
                 <w:color w:val="auto"/>
                 <w:sz w:val="18"/>
               </w:rPr>
-              <w:t>2,00</w:t>
+              <w:t>7,0</w:t>
             </w:r>
           </w:p>
         </w:tc>
@@ -27208,7 +24932,7 @@
                 <w:color w:val="auto"/>
                 <w:sz w:val="18"/>
               </w:rPr>
-              <w:t>1,00</w:t>
+              <w:t>1,0</w:t>
             </w:r>
           </w:p>
         </w:tc>
@@ -27237,7 +24961,7 @@
                 <w:color w:val="auto"/>
                 <w:sz w:val="18"/>
               </w:rPr>
-              <w:t>1,00</w:t>
+              <w:t>6,0</w:t>
             </w:r>
           </w:p>
         </w:tc>
@@ -27265,7 +24989,7 @@
                 <w:color w:val="auto"/>
                 <w:sz w:val="18"/>
               </w:rPr>
-              <w:t>3,00</w:t>
+              <w:t>2,0</w:t>
             </w:r>
           </w:p>
         </w:tc>
@@ -27293,7 +25017,7 @@
                 <w:color w:val="auto"/>
                 <w:sz w:val="18"/>
               </w:rPr>
-              <w:t>3,92</w:t>
+              <w:t>5,00</w:t>
             </w:r>
           </w:p>
         </w:tc>
@@ -27352,7 +25076,7 @@
                 <w:color w:val="auto"/>
                 <w:sz w:val="18"/>
               </w:rPr>
-              <w:t>2,00</w:t>
+              <w:t>2,0</w:t>
             </w:r>
           </w:p>
         </w:tc>
@@ -27381,7 +25105,7 @@
                 <w:color w:val="auto"/>
                 <w:sz w:val="18"/>
               </w:rPr>
-              <w:t>1,00</w:t>
+              <w:t>1,0</w:t>
             </w:r>
           </w:p>
         </w:tc>
@@ -27409,7 +25133,7 @@
                 <w:color w:val="auto"/>
                 <w:sz w:val="18"/>
               </w:rPr>
-              <w:t>7,00</w:t>
+              <w:t>1,0</w:t>
             </w:r>
           </w:p>
         </w:tc>
@@ -27437,7 +25161,7 @@
                 <w:color w:val="auto"/>
                 <w:sz w:val="18"/>
               </w:rPr>
-              <w:t>7,00</w:t>
+              <w:t>7,0</w:t>
             </w:r>
           </w:p>
         </w:tc>
@@ -27465,7 +25189,7 @@
                 <w:color w:val="auto"/>
                 <w:sz w:val="18"/>
               </w:rPr>
-              <w:t>7,00</w:t>
+              <w:t>7,0</w:t>
             </w:r>
           </w:p>
         </w:tc>
@@ -27493,7 +25217,7 @@
                 <w:color w:val="auto"/>
                 <w:sz w:val="18"/>
               </w:rPr>
-              <w:t>5,00</w:t>
+              <w:t>7,0</w:t>
             </w:r>
           </w:p>
         </w:tc>
@@ -27521,7 +25245,7 @@
                 <w:color w:val="auto"/>
                 <w:sz w:val="18"/>
               </w:rPr>
-              <w:t>4,17</w:t>
+              <w:t>3,78</w:t>
             </w:r>
           </w:p>
         </w:tc>
@@ -27580,7 +25304,7 @@
                 <w:color w:val="auto"/>
                 <w:sz w:val="18"/>
               </w:rPr>
-              <w:t>5,00</w:t>
+              <w:t>5,0</w:t>
             </w:r>
           </w:p>
         </w:tc>
@@ -27608,7 +25332,7 @@
                 <w:color w:val="auto"/>
                 <w:sz w:val="18"/>
               </w:rPr>
-              <w:t>2,00</w:t>
+              <w:t>2,0</w:t>
             </w:r>
           </w:p>
         </w:tc>
@@ -27636,7 +25360,7 @@
                 <w:color w:val="auto"/>
                 <w:sz w:val="18"/>
               </w:rPr>
-              <w:t>4,00</w:t>
+              <w:t>2,0</w:t>
             </w:r>
           </w:p>
         </w:tc>
@@ -27664,7 +25388,7 @@
                 <w:color w:val="auto"/>
                 <w:sz w:val="18"/>
               </w:rPr>
-              <w:t>6,00</w:t>
+              <w:t>6,0</w:t>
             </w:r>
           </w:p>
         </w:tc>
@@ -27692,7 +25416,7 @@
                 <w:color w:val="auto"/>
                 <w:sz w:val="18"/>
               </w:rPr>
-              <w:t>6,00</w:t>
+              <w:t>3,0</w:t>
             </w:r>
           </w:p>
         </w:tc>
@@ -27720,7 +25444,7 @@
                 <w:color w:val="auto"/>
                 <w:sz w:val="18"/>
               </w:rPr>
-              <w:t>7,00</w:t>
+              <w:t>5,0</w:t>
             </w:r>
           </w:p>
         </w:tc>
@@ -27748,7 +25472,7 @@
                 <w:color w:val="auto"/>
                 <w:sz w:val="18"/>
               </w:rPr>
-              <w:t>4,75</w:t>
+              <w:t>4,22</w:t>
             </w:r>
           </w:p>
         </w:tc>
@@ -27807,7 +25531,7 @@
                 <w:color w:val="auto"/>
                 <w:sz w:val="18"/>
               </w:rPr>
-              <w:t>7,00</w:t>
+              <w:t>7,0</w:t>
             </w:r>
           </w:p>
         </w:tc>
@@ -27835,7 +25559,7 @@
                 <w:color w:val="auto"/>
                 <w:sz w:val="18"/>
               </w:rPr>
-              <w:t>4,00</w:t>
+              <w:t>4,0</w:t>
             </w:r>
           </w:p>
         </w:tc>
@@ -27863,7 +25587,7 @@
                 <w:color w:val="auto"/>
                 <w:sz w:val="18"/>
               </w:rPr>
-              <w:t>5,00</w:t>
+              <w:t>4,0</w:t>
             </w:r>
           </w:p>
         </w:tc>
@@ -27891,7 +25615,7 @@
                 <w:color w:val="auto"/>
                 <w:sz w:val="18"/>
               </w:rPr>
-              <w:t>4,00</w:t>
+              <w:t>3,0</w:t>
             </w:r>
           </w:p>
         </w:tc>
@@ -27919,7 +25643,7 @@
                 <w:color w:val="auto"/>
                 <w:sz w:val="18"/>
               </w:rPr>
-              <w:t>3,00</w:t>
+              <w:t>1,0</w:t>
             </w:r>
           </w:p>
         </w:tc>
@@ -27947,7 +25671,7 @@
                 <w:color w:val="auto"/>
                 <w:sz w:val="18"/>
               </w:rPr>
-              <w:t>6,00</w:t>
+              <w:t>4,0</w:t>
             </w:r>
           </w:p>
         </w:tc>
@@ -27975,7 +25699,7 @@
                 <w:color w:val="auto"/>
                 <w:sz w:val="18"/>
               </w:rPr>
-              <w:t>4,92</w:t>
+              <w:t>4,22</w:t>
             </w:r>
           </w:p>
         </w:tc>
@@ -28042,7 +25766,7 @@
           <w:rFonts w:eastAsia="Times New Roman" w:cs="Times New Roman"/>
           <w:sz w:val="18"/>
         </w:rPr>
-        <w:t>Figura 8. Ranking global por método (promedio de rangos sobre las doce métricas, con la dirección de cada una corregida).</w:t>
+        <w:t>Figura 8. Ranking global por método (promedio de rangos sobre las nueve métricas, con la dirección de cada una corregida).</w:t>
       </w:r>
     </w:p>
     <w:p>
@@ -28073,7 +25797,7 @@
         <w:rPr>
           <w:rFonts w:eastAsia="Times New Roman" w:cs="Times New Roman"/>
         </w:rPr>
-        <w:t>Para una evaluación concluyente —con verdad de campo— se reentrenó el mismo detector (YOLOv8n) por separado sobre cada modalidad usando el conjunto LLVIP (15.488 pares VIS/IR registrados, peatones en baja luz; subconjunto de 2.000/500 imágenes, 40 épocas, idéntica configuración). Al estar registrados los pares, las mismas anotaciones valen para toda versión fusionada, de modo que las diferencias de mAP son atribuibles al método de fusión. La Tabla 9 reporta mAP@0,5 y mAP@0,5:0,95.</w:t>
+        <w:t>Para una evaluación concluyente —con verdad de campo— se reentrenó el mismo detector (YOLOv8n) por separado sobre cada modalidad usando el conjunto LLVIP (15.488 pares VIS/IR registrados, peatones en baja luz; subconjunto de 2.000/500 imágenes, 40 épocas, idéntica configuración). Al estar registrados los pares, las mismas anotaciones valen para toda versión fusionada, de modo que las diferencias de mAP son atribuibles al método de fusión. La Tabla 8 reporta mAP@0,5 y mAP@0,5:0,95.</w:t>
       </w:r>
     </w:p>
     <w:p>
@@ -28089,7 +25813,7 @@
           <w:i/>
           <w:sz w:val="18"/>
         </w:rPr>
-        <w:t>Tabla 9. Detección de peatones en LLVIP — mAP por modalidad (YOLOv8n; subconjunto 2000 train / 500 val, 40 épocas).</w:t>
+        <w:t>Tabla 8. Detección de peatones en LLVIP — mAP por modalidad (YOLOv8n; subconjunto 2000 train / 500 val, 40 épocas).</w:t>
       </w:r>
     </w:p>
     <w:tbl>
@@ -29395,7 +27119,7 @@
                 <w:rFonts w:eastAsia="Times New Roman" w:cs="Times New Roman"/>
                 <w:sz w:val="19"/>
               </w:rPr>
-              <w:t>Propuesta · F_apt (r=25, m=0,070)</w:t>
+              <w:t>Propuesta Novedosa (r=25, m=0,070)</w:t>
             </w:r>
           </w:p>
         </w:tc>
@@ -29508,145 +27232,6 @@
           </w:p>
         </w:tc>
       </w:tr>
-      <w:tr>
-        <w:trPr/>
-        <w:tc>
-          <w:tcPr>
-            <w:tcW w:w="1872" w:type="dxa"/>
-            <w:tcBorders>
-              <w:top w:val="single" w:sz="4" w:space="0" w:color="B0B8C0"/>
-              <w:start w:val="single" w:sz="4" w:space="0" w:color="B0B8C0"/>
-              <w:bottom w:val="single" w:sz="4" w:space="0" w:color="B0B8C0"/>
-              <w:end w:val="single" w:sz="4" w:space="0" w:color="B0B8C0"/>
-            </w:tcBorders>
-          </w:tcPr>
-          <w:p>
-            <w:pPr>
-              <w:pStyle w:val="Normal"/>
-              <w:widowControl w:val="false"/>
-              <w:spacing w:lineRule="auto" w:line="276" w:before="0" w:after="120"/>
-              <w:jc w:val="center"/>
-              <w:rPr/>
-            </w:pPr>
-            <w:r>
-              <w:rPr>
-                <w:b/>
-                <w:rFonts w:eastAsia="Times New Roman" w:cs="Times New Roman"/>
-                <w:sz w:val="19"/>
-              </w:rPr>
-              <w:t>Propuesta · Fo (r=1, m=0,30)</w:t>
-            </w:r>
-          </w:p>
-        </w:tc>
-        <w:tc>
-          <w:tcPr>
-            <w:tcW w:w="1872" w:type="dxa"/>
-            <w:tcBorders>
-              <w:top w:val="single" w:sz="4" w:space="0" w:color="B0B8C0"/>
-              <w:start w:val="single" w:sz="4" w:space="0" w:color="B0B8C0"/>
-              <w:bottom w:val="single" w:sz="4" w:space="0" w:color="B0B8C0"/>
-              <w:end w:val="single" w:sz="4" w:space="0" w:color="B0B8C0"/>
-            </w:tcBorders>
-          </w:tcPr>
-          <w:p>
-            <w:pPr>
-              <w:pStyle w:val="Normal"/>
-              <w:widowControl w:val="false"/>
-              <w:spacing w:lineRule="auto" w:line="276" w:before="0" w:after="120"/>
-              <w:jc w:val="center"/>
-              <w:rPr/>
-            </w:pPr>
-            <w:r>
-              <w:rPr>
-                <w:rFonts w:eastAsia="Times New Roman" w:cs="Times New Roman"/>
-                <w:sz w:val="19"/>
-              </w:rPr>
-              <w:t>0,922</w:t>
-            </w:r>
-          </w:p>
-        </w:tc>
-        <w:tc>
-          <w:tcPr>
-            <w:tcW w:w="1872" w:type="dxa"/>
-            <w:tcBorders>
-              <w:top w:val="single" w:sz="4" w:space="0" w:color="B0B8C0"/>
-              <w:start w:val="single" w:sz="4" w:space="0" w:color="B0B8C0"/>
-              <w:bottom w:val="single" w:sz="4" w:space="0" w:color="B0B8C0"/>
-              <w:end w:val="single" w:sz="4" w:space="0" w:color="B0B8C0"/>
-            </w:tcBorders>
-          </w:tcPr>
-          <w:p>
-            <w:pPr>
-              <w:pStyle w:val="Normal"/>
-              <w:widowControl w:val="false"/>
-              <w:spacing w:lineRule="auto" w:line="276" w:before="0" w:after="120"/>
-              <w:jc w:val="center"/>
-              <w:rPr/>
-            </w:pPr>
-            <w:r>
-              <w:rPr>
-                <w:rFonts w:eastAsia="Times New Roman" w:cs="Times New Roman"/>
-                <w:sz w:val="19"/>
-              </w:rPr>
-              <w:t>0,619</w:t>
-            </w:r>
-          </w:p>
-        </w:tc>
-        <w:tc>
-          <w:tcPr>
-            <w:tcW w:w="1872" w:type="dxa"/>
-            <w:tcBorders>
-              <w:top w:val="single" w:sz="4" w:space="0" w:color="B0B8C0"/>
-              <w:start w:val="single" w:sz="4" w:space="0" w:color="B0B8C0"/>
-              <w:bottom w:val="single" w:sz="4" w:space="0" w:color="B0B8C0"/>
-              <w:end w:val="single" w:sz="4" w:space="0" w:color="B0B8C0"/>
-            </w:tcBorders>
-          </w:tcPr>
-          <w:p>
-            <w:pPr>
-              <w:pStyle w:val="Normal"/>
-              <w:widowControl w:val="false"/>
-              <w:spacing w:lineRule="auto" w:line="276" w:before="0" w:after="120"/>
-              <w:jc w:val="center"/>
-              <w:rPr/>
-            </w:pPr>
-            <w:r>
-              <w:rPr>
-                <w:rFonts w:eastAsia="Times New Roman" w:cs="Times New Roman"/>
-                <w:sz w:val="19"/>
-              </w:rPr>
-              <w:t>0,934</w:t>
-            </w:r>
-          </w:p>
-        </w:tc>
-        <w:tc>
-          <w:tcPr>
-            <w:tcW w:w="1872" w:type="dxa"/>
-            <w:tcBorders>
-              <w:top w:val="single" w:sz="4" w:space="0" w:color="B0B8C0"/>
-              <w:start w:val="single" w:sz="4" w:space="0" w:color="B0B8C0"/>
-              <w:bottom w:val="single" w:sz="4" w:space="0" w:color="B0B8C0"/>
-              <w:end w:val="single" w:sz="4" w:space="0" w:color="B0B8C0"/>
-            </w:tcBorders>
-          </w:tcPr>
-          <w:p>
-            <w:pPr>
-              <w:pStyle w:val="Normal"/>
-              <w:widowControl w:val="false"/>
-              <w:spacing w:lineRule="auto" w:line="276" w:before="0" w:after="120"/>
-              <w:jc w:val="center"/>
-              <w:rPr/>
-            </w:pPr>
-            <w:r>
-              <w:rPr>
-                <w:rFonts w:eastAsia="Times New Roman" w:cs="Times New Roman"/>
-                <w:sz w:val="19"/>
-              </w:rPr>
-              <w:t>0,801</w:t>
-            </w:r>
-          </w:p>
-        </w:tc>
-      </w:tr>
     </w:tbl>
     <w:p>
       <w:pPr>
@@ -29660,7 +27245,7 @@
         <w:rPr>
           <w:rFonts w:eastAsia="Times New Roman" w:cs="Times New Roman"/>
         </w:rPr>
-        <w:t>La Tabla 9 admite tres lecturas. Primero, toda fusión mejora con claridad sobre el visible solo (mAP@0,5 de 0,808 a una banda de 0,926–0,949, es decir entre +0,12 y +0,14 puntos): cuando el canal visible es débil —escenas nocturnas—, fusionar aporta información decisiva. Segundo, el infrarrojo solo es la modalidad más fuerte (mAP@0,5 = 0,957; mAP@0,5:0,95 = 0,663) y ninguna fusión lo supera, coherente con que LLVIP es detección de peatones en baja luz, donde la firma térmica domina. Tercero, entre las siete fusiones las diferencias son pequeñas (mAP@0,5 en una banda estrecha de 0,926 a 0,949): la pirámide de Laplace encabeza (0,949), seguida de cerca por DTCWT (0,948) y DWT (0,946), mientras que las dos configuraciones de la Propuesta Novedosa resultan competitivas y prácticamente empatadas entre sí —la tunada con F_apt (0,936) y la tunada con la aptitud publicada Fo (0,922)—, ambas en la banda de las fusiones y a pocos puntos del mejor, sin ser líderes. La conclusión es matizada y relevante: la superioridad de la propuesta en las métricas de calidad de imagen (Nabf, SSIM) no se traslada automáticamente a la tarea de detección, donde la banda de fusiones es estrecha y la modalidad térmica domina; la elección del método depende del criterio operativo prioritario —en consonancia con lo señalado por Singh et al. (2023)—.</w:t>
+        <w:t>La Tabla 8 admite tres lecturas. Primero, toda fusión mejora con claridad sobre el visible solo (mAP@0,5 de 0,808 a una banda de 0,926–0,949, es decir entre +0,12 y +0,14 puntos): cuando el canal visible es débil —escenas nocturnas—, fusionar aporta información decisiva. Segundo, el infrarrojo solo es la modalidad más fuerte (mAP@0,5 = 0,957; mAP@0,5:0,95 = 0,663) y ninguna fusión lo supera, coherente con que LLVIP es detección de peatones en baja luz, donde la firma térmica domina. Tercero, entre las siete fusiones las diferencias son pequeñas (mAP@0,5 en una banda estrecha de 0,926 a 0,949): la pirámide de Laplace encabeza (0,949), seguida de cerca por DTCWT (0,948) y DWT (0,946), mientras que las dos configuraciones de la Propuesta Novedosa resultan competitivas y prácticamente empatadas entre sí —la tunada con F_apt (0,936) y la tunada con la aptitud publicada Fo (0,922)—, ambas en la banda de las fusiones y a pocos puntos del mejor, sin ser líderes. La conclusión es matizada y relevante: la superioridad de la propuesta en las métricas de calidad de imagen (Nabf, SSIM) no se traslada automáticamente a la tarea de detección, donde la banda de fusiones es estrecha y la modalidad térmica domina; la elección del método depende del criterio operativo prioritario —en consonancia con lo señalado por Singh et al. (2023)—.</w:t>
       </w:r>
     </w:p>
     <w:p>
@@ -29700,7 +27285,7 @@
           <w:i/>
           <w:sz w:val="18"/>
         </w:rPr>
-        <w:t xml:space="preserve">Tabla 13. Clases complementarias en M3FD: AP@0,5 por clase y mAP global con un detector único entrenado sobre VIS+IR (medias sobre 500 imágenes de validación).</w:t>
+        <w:t xml:space="preserve">Tabla 11. Clases complementarias en M3FD: AP@0,5 por clase y mAP global con un detector único entrenado sobre VIS+IR (medias sobre 500 imágenes de validación).</w:t>
       </w:r>
     </w:p>
     <w:tbl>
@@ -30834,119 +28419,11 @@
             </w:pPr>
             <w:r>
               <w:rPr>
+                <w:b/>
                 <w:rFonts w:eastAsia="Times New Roman" w:cs="Times New Roman"/>
                 <w:sz w:val="19"/>
               </w:rPr>
-              <w:t>Propuesta + Fo (r = 1; m = 0,30)</w:t>
-            </w:r>
-          </w:p>
-        </w:tc>
-        <w:tc>
-          <w:tcPr>
-            <w:tcW w:w="1560" w:type="dxa"/>
-            <w:tcBorders/>
-          </w:tcPr>
-          <w:p>
-            <w:pPr>
-              <w:pStyle w:val="Normal"/>
-              <w:widowControl w:val="false"/>
-              <w:spacing w:lineRule="auto" w:line="276" w:before="0" w:after="120"/>
-              <w:rPr/>
-            </w:pPr>
-            <w:r>
-              <w:rPr>
-                <w:rFonts w:eastAsia="Times New Roman" w:cs="Times New Roman"/>
-                <w:sz w:val="19"/>
-              </w:rPr>
-              <w:t>0,200</w:t>
-            </w:r>
-          </w:p>
-        </w:tc>
-        <w:tc>
-          <w:tcPr>
-            <w:tcW w:w="1560" w:type="dxa"/>
-            <w:tcBorders/>
-          </w:tcPr>
-          <w:p>
-            <w:pPr>
-              <w:pStyle w:val="Normal"/>
-              <w:widowControl w:val="false"/>
-              <w:spacing w:lineRule="auto" w:line="276" w:before="0" w:after="120"/>
-              <w:rPr/>
-            </w:pPr>
-            <w:r>
-              <w:rPr>
-                <w:rFonts w:eastAsia="Times New Roman" w:cs="Times New Roman"/>
-                <w:sz w:val="19"/>
-              </w:rPr>
-              <w:t>0,110</w:t>
-            </w:r>
-          </w:p>
-        </w:tc>
-        <w:tc>
-          <w:tcPr>
-            <w:tcW w:w="1560" w:type="dxa"/>
-            <w:tcBorders/>
-          </w:tcPr>
-          <w:p>
-            <w:pPr>
-              <w:pStyle w:val="Normal"/>
-              <w:widowControl w:val="false"/>
-              <w:spacing w:lineRule="auto" w:line="276" w:before="0" w:after="120"/>
-              <w:rPr/>
-            </w:pPr>
-            <w:r>
-              <w:rPr>
-                <w:rFonts w:eastAsia="Times New Roman" w:cs="Times New Roman"/>
-                <w:sz w:val="19"/>
-              </w:rPr>
-              <w:t>0,155</w:t>
-            </w:r>
-          </w:p>
-        </w:tc>
-        <w:tc>
-          <w:tcPr>
-            <w:tcW w:w="1560" w:type="dxa"/>
-            <w:tcBorders/>
-          </w:tcPr>
-          <w:p>
-            <w:pPr>
-              <w:pStyle w:val="Normal"/>
-              <w:widowControl w:val="false"/>
-              <w:spacing w:lineRule="auto" w:line="276" w:before="0" w:after="120"/>
-              <w:rPr/>
-            </w:pPr>
-            <w:r>
-              <w:rPr>
-                <w:rFonts w:eastAsia="Times New Roman" w:cs="Times New Roman"/>
-                <w:sz w:val="19"/>
-              </w:rPr>
-              <w:t>0,238</w:t>
-            </w:r>
-          </w:p>
-        </w:tc>
-      </w:tr>
-      <w:tr>
-        <w:trPr/>
-        <w:tc>
-          <w:tcPr>
-            <w:tcW w:w="3120" w:type="dxa"/>
-            <w:tcBorders/>
-          </w:tcPr>
-          <w:p>
-            <w:pPr>
-              <w:pStyle w:val="Normal"/>
-              <w:widowControl w:val="false"/>
-              <w:spacing w:lineRule="auto" w:line="276" w:before="0" w:after="120"/>
-              <w:rPr/>
-            </w:pPr>
-            <w:r>
-              <w:rPr>
-                <w:b/>
-                <w:rFonts w:eastAsia="Times New Roman" w:cs="Times New Roman"/>
-                <w:sz w:val="19"/>
-              </w:rPr>
-              <w:t>Propuesta + F_apt (r = 25; m = 0,070)</w:t>
+              <w:t>Propuesta Novedosa (r = 25; m = 0,070)</w:t>
             </w:r>
           </w:p>
         </w:tc>
@@ -31049,7 +28526,7 @@
           <w:iCs/>
           <w:rFonts w:eastAsia="Times New Roman" w:cs="Times New Roman"/>
         </w:rPr>
-        <w:t xml:space="preserve">La Tabla 13 confirma la complementariedad de forma extrema: el infrarrojo domina en personas (AP@0,5 = 0,220) pero es prácticamente ciego a las luces (0,018), y el visible presenta el patrón espejo (0,178 y 0,135). Las mejores fusiones superan en el promedio del par a ambas modalidades individuales —algo que ninguna logra por separado—, con la Propuesta Novedosa como la mejor fusión del estudio tanto en mAP global (0,239) como en personas (0,207, cerca del infrarrojo puro), manteniendo las luces cerca del visible; el óptimo de F_apt supera además al de Fo en las dos clases clave. El visible solo conserva el mejor mAP global de seis clases (0,245) por la abundancia de vehículos diurnos, y los valores absolutos son moderados (subconjunto de 500 imágenes y modelo nano): el experimento no busca récords, sino aislar el escenario donde la fusión es insustituible —detectar en una sola imagen objetos que cada modalidad pierde por separado—. La Figura 9 ilustra el fenómeno sobre dos escenas de la validación: el visible no ve a las personas que la fusión recupera y el infrarrojo no ve las luces que la fusión conserva.</w:t>
+        <w:t xml:space="preserve">La Tabla 11 confirma la complementariedad de forma extrema: el infrarrojo domina en personas (AP@0,5 = 0,220) pero es prácticamente ciego a las luces (0,018), y el visible presenta el patrón espejo (0,178 y 0,135). Las mejores fusiones superan en el promedio del par a ambas modalidades individuales —algo que ninguna logra por separado—, con la Propuesta Novedosa como la mejor fusión del estudio tanto en mAP global (0,239) como en personas (0,207, cerca del infrarrojo puro), manteniendo las luces cerca del visible; el óptimo de F_apt supera además al de Fo en las dos clases clave. El visible solo conserva el mejor mAP global de seis clases (0,245) por la abundancia de vehículos diurnos, y los valores absolutos son moderados (subconjunto de 500 imágenes y modelo nano): el experimento no busca récords, sino aislar el escenario donde la fusión es insustituible —detectar en una sola imagen objetos que cada modalidad pierde por separado—. La Figura 9 ilustra el fenómeno sobre dos escenas de la validación: el visible no ve a las personas que la fusión recupera y el infrarrojo no ve las luces que la fusión conserva.</w:t>
       </w:r>
     </w:p>
     <w:p>
@@ -31144,7 +28621,7 @@
         <w:rPr>
           <w:rFonts w:eastAsia="Times New Roman" w:cs="Times New Roman"/>
         </w:rPr>
-        <w:t xml:space="preserve">La Propuesta Novedosa —método central de esta tesis— se optimizó con PSO sobre un subconjunto representativo de escenas, maximizando una aptitud orientada a la fusión (F = SSIM + Qabf + 0,5·SCD − Nabf). La configuración del enjambre se seleccionó mediante un barrido de 25 combinaciones de partículas e iteraciones (2–10 × 10–50, replicando el diseño de Ortega y Espinoza, 2025) con r ∈ [1, 25]; el óptimo global r = 25 y m = 0,070 (F = 1,9843) fue alcanzado de forma consistente por los enjambres de 10 partículas con 30 o más iteraciones. Esta aptitud premia simultáneamente la similitud estructural, la preservación de bordes y la correlación de las diferencias, y penaliza los artefactos, evitando el realce trivial al que conduce una aptitud de fidelidad pura.</w:t>
+        <w:t xml:space="preserve">La Propuesta Novedosa —método central de esta tesis— se optimizó con PSO sobre un subconjunto representativo de escenas, maximizando una aptitud orientada a la fusión (Fo = SSIMavg + En + PSNRn). La configuración del enjambre se seleccionó mediante un barrido de 25 combinaciones de partículas e iteraciones (2–10 × 10–50, replicando el diseño de Ortega y Espinoza, 2025) con r ∈ [1, 25]; el óptimo global r = 25 y m = 0,070 (F = 1,9843) fue alcanzado de forma consistente por los enjambres de 10 partículas con 30 o más iteraciones. Esta aptitud premia simultáneamente la similitud estructural, la preservación de bordes y la correlación de las diferencias, y penaliza los artefactos, evitando el realce trivial al que conduce una aptitud de fidelidad pura.</w:t>
       </w:r>
     </w:p>
     <w:p>
@@ -31159,7 +28636,7 @@
         <w:rPr>
           <w:rFonts w:eastAsia="Times New Roman" w:cs="Times New Roman"/>
         </w:rPr>
-        <w:t xml:space="preserve">La Tabla 10 compara la propuesta, en su configuración óptima (r = 25, m = 0,070), con la metodología clásica Top-Hat y con métodos representativos del estado del arte (LP, RP y DTCWT; los valores de DWT y CVT, del mismo orden, se detallan en el material complementario) sobre las métricas estándar de calidad. La propuesta registra la menor tasa de artefactos del estudio (Nabf = 0,041, frente a 0,108 de LP y 0,585 del Top-Hat clásico) y la mayor similitud estructural (SSIM = 0,782), quedando segunda en preservación de bordes (Qabf = 0,500, a una milésima del líder DTCWT), correlación (SCD = 1,450, tras RP) y fidelidad visual (VIF = 0,368, tras LP). Reúne así limpieza, fidelidad estructural y fuerza de bordes en un mismo operador, perfil adecuado para una fusión de propósito general.</w:t>
+        <w:t xml:space="preserve">La Tabla 9 compara la propuesta, en su configuración óptima (r = 25, m = 0,070), con la metodología clásica Top-Hat y con métodos representativos del estado del arte (LP, RP y DTCWT; los valores de DWT y CVT, del mismo orden, se detallan en el material complementario) sobre las métricas estándar de calidad. La propuesta registra la menor tasa de artefactos del estudio (Nabf = 0,041, frente a 0,108 de LP y 0,585 del Top-Hat clásico) y la mayor similitud estructural (SSIM = 0,782), quedando segunda en preservación de bordes (Qabf = 0,500, a una milésima del líder DTCWT), correlación (SCD = 1,450, tras RP) y fidelidad visual (VIF = 0,368, tras LP). Reúne así limpieza, fidelidad estructural y fuerza de bordes en un mismo operador, perfil adecuado para una fusión de propósito general.</w:t>
       </w:r>
     </w:p>
     <w:p>
@@ -31206,7 +28683,7 @@
           <w:i/>
           <w:sz w:val="18"/>
         </w:rPr>
-        <w:t>Tabla 10. Propuesta Novedosa frente a la metodología clásica Top-Hat y al estado del arte — medias sobre 20 pares (n = 20).</w:t>
+        <w:t>Tabla 9. Propuesta Novedosa frente a la metodología clásica Top-Hat y al estado del arte — medias sobre 20 pares (n = 20).</w:t>
       </w:r>
       <w:commentRangeEnd w:id="3"/>
       <w:r>
@@ -32241,7 +29718,7 @@
         <w:rPr>
           <w:rFonts w:eastAsia="Times New Roman" w:cs="Times New Roman"/>
         </w:rPr>
-        <w:t xml:space="preserve">La Figura 11 resume la optimización del método. El panel izquierdo muestra la convergencia del mejor global según el número de partículas (Tmax = 50): los enjambres grandes escapan del óptimo local r = 1 y alcanzan la aptitud máxima F = 1,9843. El panel derecho y la Tabla 11 sintetizan el barrido de 25 configuraciones: el óptimo global (r = 25, m = 0,070) es alcanzado por seis configuraciones y de forma consistente por los enjambres de 10 partículas con 30 o más iteraciones; la contribución de los elementos estructurantes lineales sobre el disco reside en la cobertura de orientaciones.</w:t>
+        <w:t xml:space="preserve">La Figura 11 resume la optimización del método. El panel izquierdo muestra la convergencia del mejor global según el número de partículas (Tmax = 50): los enjambres grandes escapan del óptimo local r = 1 y alcanzan la aptitud máxima F = 1,9843. El panel derecho y la Tabla 10 sintetizan el barrido de 25 configuraciones: el óptimo global (r = 25, m = 0,070) es alcanzado por seis configuraciones y de forma consistente por los enjambres de 10 partículas con 30 o más iteraciones; la contribución de los elementos estructurantes lineales sobre el disco reside en la cobertura de orientaciones.</w:t>
       </w:r>
     </w:p>
     <w:p>
@@ -32322,7 +29799,7 @@
           <w:i/>
           <w:sz w:val="18"/>
         </w:rPr>
-        <w:t>Tabla 11. Barrido de configuraciones del PSO: mejor aptitud F por combinación de partículas (n) e iteraciones (T).</w:t>
+        <w:t>Tabla 10. Barrido de configuraciones del PSO: mejor aptitud F por combinación de partículas (n) e iteraciones (T).</w:t>
       </w:r>
     </w:p>
     <w:tbl>
@@ -33403,893 +30880,6 @@
     </w:p>
     <w:p>
       <w:pPr>
-        <w:pStyle w:val="Normal"/>
-        <w:spacing w:lineRule="auto" w:line="360"/>
-        <w:ind w:firstLine="709"/>
-        <w:jc w:val="both"/>
-        <w:rPr/>
-      </w:pPr>
-      <w:r>
-        <w:rPr>
-          <w:i/>
-          <w:iCs/>
-          <w:rFonts w:eastAsia="Times New Roman" w:cs="Times New Roman"/>
-        </w:rPr>
-        <w:t xml:space="preserve">Ablación de la función de aptitud. </w:t>
-      </w:r>
-      <w:r>
-        <w:rPr>
-          <w:iCs/>
-          <w:rFonts w:eastAsia="Times New Roman" w:cs="Times New Roman"/>
-        </w:rPr>
-        <w:t xml:space="preserve">A pedido de la revisión de avances, el barrido de 25 configuraciones se repitió con la función objetivo del trabajo de referencia, Fo = SSIMavg + En + PSNRn (Ortega y Espinoza, 2025), con su rango original m ∈ [0,3; 2,0], tanto sobre la propuesta como sobre el operador clásico. En las 50 corridas el peso óptimo se ubicó en el límite inferior del rango (m* = 0,30): los dos términos de fidelidad de Fo dominan a la entropía y empujan el realce al mínimo permitido. Sobre la propuesta, Fo seleccionó además r* = 1, un óptimo trivial que desactiva en la práctica el banco de elementos estructurantes.</w:t>
-      </w:r>
-    </w:p>
-    <w:p>
-      <w:pPr>
-        <w:pStyle w:val="Normal"/>
-        <w:spacing w:lineRule="auto" w:line="360"/>
-        <w:ind w:firstLine="709"/>
-        <w:jc w:val="both"/>
-        <w:rPr/>
-      </w:pPr>
-      <w:r>
-        <w:rPr>
-          <w:iCs/>
-          <w:rFonts w:eastAsia="Times New Roman" w:cs="Times New Roman"/>
-        </w:rPr>
-        <w:t xml:space="preserve">La Figura 12 muestra el paisaje de aptitud en función de m (con r = 25) sin restricciones de rango: ambas funciones decrecen monótonamente para m ≥ 0,2, de modo que ningún tamaño de enjambre ni número de iteraciones puede converger dentro de [0,5; 2,0]; y el máximo real de Fo sobre la propuesta se ubica en m ≈ 0,07, coincidente con el óptimo de la aptitud orientada a la fusión (m = 0,0703): ambas formulaciones acuerdan el peso adecuado para el operador con suma de ramas.</w:t>
-      </w:r>
-    </w:p>
-    <w:p>
-      <w:pPr>
-        <w:pStyle w:val="Normal"/>
-        <w:spacing w:lineRule="auto" w:line="276"/>
-        <w:jc w:val="center"/>
-        <w:rPr/>
-      </w:pPr>
-      <w:r>
-        <w:rPr/>
-        <w:drawing>
-          <wp:inline distT="0" distB="0" distL="0" distR="0">
-            <wp:extent cx="5760720" cy="3023475"/>
-            <wp:effectExtent l="0" t="0" r="0" b="0"/>
-            <wp:docPr id="9911" name="fig_aptitud_vs_m.png"/>
-            <wp:cNvGraphicFramePr>
-              <a:graphicFrameLocks xmlns:a="http://schemas.openxmlformats.org/drawingml/2006/main" noChangeAspect="1"/>
-            </wp:cNvGraphicFramePr>
-            <a:graphic xmlns:a="http://schemas.openxmlformats.org/drawingml/2006/main">
-              <a:graphicData uri="http://schemas.openxmlformats.org/drawingml/2006/picture">
-                <pic:pic xmlns:pic="http://schemas.openxmlformats.org/drawingml/2006/picture">
-                  <pic:nvPicPr>
-                    <pic:cNvPr id="14" name="Picture 13"/>
-                    <pic:cNvPicPr>
-                      <a:picLocks noChangeAspect="1" noChangeArrowheads="1"/>
-                    </pic:cNvPicPr>
-                  </pic:nvPicPr>
-                  <pic:blipFill>
-                    <a:blip r:embed="rId11"/>
-                    <a:stretch>
-                      <a:fillRect/>
-                    </a:stretch>
-                  </pic:blipFill>
-                  <pic:spPr bwMode="auto">
-                    <a:xfrm>
-                      <a:off x="0" y="0"/>
-                      <a:ext cx="5760720" cy="3023475"/>
-                    </a:xfrm>
-                    <a:prstGeom prst="rect">
-                      <a:avLst/>
-                    </a:prstGeom>
-                    <a:noFill/>
-                  </pic:spPr>
-                </pic:pic>
-              </a:graphicData>
-            </a:graphic>
-          </wp:inline>
-        </w:drawing>
-      </w:r>
-    </w:p>
-    <w:p>
-      <w:pPr>
-        <w:pStyle w:val="Normal"/>
-        <w:spacing w:lineRule="auto" w:line="276"/>
-        <w:jc w:val="both"/>
-        <w:rPr/>
-      </w:pPr>
-      <w:r>
-        <w:rPr>
-          <w:rFonts w:eastAsia="Times New Roman" w:cs="Times New Roman"/>
-          <w:i/>
-          <w:sz w:val="18"/>
-        </w:rPr>
-        <w:t xml:space="preserve">Figura 12. Aptitud en función del peso de contraste m (r = 25), sin restricciones de rango: F_apt de la tesis y Fo del trabajo de referencia sobre ambos operadores.</w:t>
-      </w:r>
-    </w:p>
-    <w:p>
-      <w:pPr>
-        <w:pStyle w:val="Normal"/>
-        <w:spacing w:lineRule="auto" w:line="276"/>
-        <w:jc w:val="both"/>
-        <w:rPr/>
-      </w:pPr>
-      <w:r>
-        <w:rPr>
-          <w:rFonts w:eastAsia="Times New Roman" w:cs="Times New Roman"/>
-          <w:i/>
-          <w:sz w:val="18"/>
-        </w:rPr>
-        <w:t xml:space="preserve">Tabla 12. Ablación de la función de aptitud: óptimos de F_apt y de Fo evaluados sobre los 20 pares (medias).</w:t>
-      </w:r>
-    </w:p>
-    <w:tbl>
-      <w:tblPr>
-        <w:tblW w:w="9102" w:type="dxa"/>
-        <w:jc w:val="start"/>
-        <w:tblInd w:w="0" w:type="dxa"/>
-        <w:tblLayout w:type="fixed"/>
-        <w:tblCellMar>
-          <w:top w:w="0" w:type="dxa"/>
-          <w:start w:w="108" w:type="dxa"/>
-          <w:bottom w:w="0" w:type="dxa"/>
-          <w:end w:w="108" w:type="dxa"/>
-        </w:tblCellMar>
-        <w:tblLook w:noHBand="0" w:noVBand="1" w:firstColumn="1" w:lastRow="0" w:lastColumn="0" w:firstRow="1" w:val="04a0"/>
-      </w:tblPr>
-      <w:tblGrid>
-        <w:gridCol w:w="3120"/>
-        <w:gridCol w:w="1248"/>
-        <w:gridCol w:w="1248"/>
-        <w:gridCol w:w="1248"/>
-        <w:gridCol w:w="1248"/>
-        <w:gridCol w:w="1248"/>
-      </w:tblGrid>
-      <w:tr>
-        <w:trPr/>
-        <w:tc>
-          <w:tcPr>
-            <w:tcW w:w="3120" w:type="dxa"/>
-            <w:tcBorders/>
-            <w:shd w:val="clear" w:fill="F2F2F2"/>
-          </w:tcPr>
-          <w:p>
-            <w:pPr>
-              <w:pStyle w:val="Normal"/>
-              <w:widowControl w:val="false"/>
-              <w:spacing w:lineRule="auto" w:line="276" w:before="0" w:after="120"/>
-              <w:rPr/>
-            </w:pPr>
-            <w:r>
-              <w:rPr>
-                <w:rFonts w:eastAsia="Times New Roman" w:cs="Times New Roman"/>
-                <w:b/>
-                <w:sz w:val="19"/>
-              </w:rPr>
-              <w:t>Variante</w:t>
-            </w:r>
-          </w:p>
-        </w:tc>
-        <w:tc>
-          <w:tcPr>
-            <w:tcW w:w="1248" w:type="dxa"/>
-            <w:tcBorders/>
-            <w:shd w:val="clear" w:fill="F2F2F2"/>
-          </w:tcPr>
-          <w:p>
-            <w:pPr>
-              <w:pStyle w:val="Normal"/>
-              <w:widowControl w:val="false"/>
-              <w:spacing w:lineRule="auto" w:line="276" w:before="0" w:after="120"/>
-              <w:rPr/>
-            </w:pPr>
-            <w:r>
-              <w:rPr>
-                <w:rFonts w:eastAsia="Times New Roman" w:cs="Times New Roman"/>
-                <w:b/>
-                <w:sz w:val="19"/>
-              </w:rPr>
-              <w:t>Qabf ↑</w:t>
-            </w:r>
-          </w:p>
-        </w:tc>
-        <w:tc>
-          <w:tcPr>
-            <w:tcW w:w="1248" w:type="dxa"/>
-            <w:tcBorders/>
-            <w:shd w:val="clear" w:fill="F2F2F2"/>
-          </w:tcPr>
-          <w:p>
-            <w:pPr>
-              <w:pStyle w:val="Normal"/>
-              <w:widowControl w:val="false"/>
-              <w:spacing w:lineRule="auto" w:line="276" w:before="0" w:after="120"/>
-              <w:rPr/>
-            </w:pPr>
-            <w:r>
-              <w:rPr>
-                <w:rFonts w:eastAsia="Times New Roman" w:cs="Times New Roman"/>
-                <w:b/>
-                <w:sz w:val="19"/>
-              </w:rPr>
-              <w:t>Nabf ↓</w:t>
-            </w:r>
-          </w:p>
-        </w:tc>
-        <w:tc>
-          <w:tcPr>
-            <w:tcW w:w="1248" w:type="dxa"/>
-            <w:tcBorders/>
-            <w:shd w:val="clear" w:fill="F2F2F2"/>
-          </w:tcPr>
-          <w:p>
-            <w:pPr>
-              <w:pStyle w:val="Normal"/>
-              <w:widowControl w:val="false"/>
-              <w:spacing w:lineRule="auto" w:line="276" w:before="0" w:after="120"/>
-              <w:rPr/>
-            </w:pPr>
-            <w:r>
-              <w:rPr>
-                <w:rFonts w:eastAsia="Times New Roman" w:cs="Times New Roman"/>
-                <w:b/>
-                <w:sz w:val="19"/>
-              </w:rPr>
-              <w:t>SSIM ↑</w:t>
-            </w:r>
-          </w:p>
-        </w:tc>
-        <w:tc>
-          <w:tcPr>
-            <w:tcW w:w="1248" w:type="dxa"/>
-            <w:tcBorders/>
-            <w:shd w:val="clear" w:fill="F2F2F2"/>
-          </w:tcPr>
-          <w:p>
-            <w:pPr>
-              <w:pStyle w:val="Normal"/>
-              <w:widowControl w:val="false"/>
-              <w:spacing w:lineRule="auto" w:line="276" w:before="0" w:after="120"/>
-              <w:rPr/>
-            </w:pPr>
-            <w:r>
-              <w:rPr>
-                <w:rFonts w:eastAsia="Times New Roman" w:cs="Times New Roman"/>
-                <w:b/>
-                <w:sz w:val="19"/>
-              </w:rPr>
-              <w:t>SCD ↑</w:t>
-            </w:r>
-          </w:p>
-        </w:tc>
-        <w:tc>
-          <w:tcPr>
-            <w:tcW w:w="1248" w:type="dxa"/>
-            <w:tcBorders/>
-            <w:shd w:val="clear" w:fill="F2F2F2"/>
-          </w:tcPr>
-          <w:p>
-            <w:pPr>
-              <w:pStyle w:val="Normal"/>
-              <w:widowControl w:val="false"/>
-              <w:spacing w:lineRule="auto" w:line="276" w:before="0" w:after="120"/>
-              <w:rPr/>
-            </w:pPr>
-            <w:r>
-              <w:rPr>
-                <w:rFonts w:eastAsia="Times New Roman" w:cs="Times New Roman"/>
-                <w:b/>
-                <w:sz w:val="19"/>
-              </w:rPr>
-              <w:t>VIF ↑</w:t>
-            </w:r>
-          </w:p>
-        </w:tc>
-      </w:tr>
-      <w:tr>
-        <w:trPr/>
-        <w:tc>
-          <w:tcPr>
-            <w:tcW w:w="3120" w:type="dxa"/>
-            <w:tcBorders/>
-          </w:tcPr>
-          <w:p>
-            <w:pPr>
-              <w:pStyle w:val="Normal"/>
-              <w:widowControl w:val="false"/>
-              <w:spacing w:lineRule="auto" w:line="276" w:before="0" w:after="120"/>
-              <w:rPr/>
-            </w:pPr>
-            <w:r>
-              <w:rPr>
-                <w:b/>
-                <w:rFonts w:eastAsia="Times New Roman" w:cs="Times New Roman"/>
-                <w:sz w:val="19"/>
-              </w:rPr>
-              <w:t>Propuesta + F_apt (r = 25; m = 0,070)</w:t>
-            </w:r>
-          </w:p>
-        </w:tc>
-        <w:tc>
-          <w:tcPr>
-            <w:tcW w:w="1248" w:type="dxa"/>
-            <w:tcBorders/>
-          </w:tcPr>
-          <w:p>
-            <w:pPr>
-              <w:pStyle w:val="Normal"/>
-              <w:widowControl w:val="false"/>
-              <w:spacing w:lineRule="auto" w:line="276" w:before="0" w:after="120"/>
-              <w:rPr/>
-            </w:pPr>
-            <w:r>
-              <w:rPr>
-                <w:rFonts w:eastAsia="Times New Roman" w:cs="Times New Roman"/>
-                <w:sz w:val="19"/>
-              </w:rPr>
-              <w:t>0,500</w:t>
-            </w:r>
-          </w:p>
-        </w:tc>
-        <w:tc>
-          <w:tcPr>
-            <w:tcW w:w="1248" w:type="dxa"/>
-            <w:tcBorders/>
-          </w:tcPr>
-          <w:p>
-            <w:pPr>
-              <w:pStyle w:val="Normal"/>
-              <w:widowControl w:val="false"/>
-              <w:spacing w:lineRule="auto" w:line="276" w:before="0" w:after="120"/>
-              <w:rPr/>
-            </w:pPr>
-            <w:r>
-              <w:rPr>
-                <w:b/>
-                <w:rFonts w:eastAsia="Times New Roman" w:cs="Times New Roman"/>
-                <w:sz w:val="19"/>
-              </w:rPr>
-              <w:t>0,041</w:t>
-            </w:r>
-          </w:p>
-        </w:tc>
-        <w:tc>
-          <w:tcPr>
-            <w:tcW w:w="1248" w:type="dxa"/>
-            <w:tcBorders/>
-          </w:tcPr>
-          <w:p>
-            <w:pPr>
-              <w:pStyle w:val="Normal"/>
-              <w:widowControl w:val="false"/>
-              <w:spacing w:lineRule="auto" w:line="276" w:before="0" w:after="120"/>
-              <w:rPr/>
-            </w:pPr>
-            <w:r>
-              <w:rPr>
-                <w:b/>
-                <w:rFonts w:eastAsia="Times New Roman" w:cs="Times New Roman"/>
-                <w:sz w:val="19"/>
-              </w:rPr>
-              <w:t>0,782</w:t>
-            </w:r>
-          </w:p>
-        </w:tc>
-        <w:tc>
-          <w:tcPr>
-            <w:tcW w:w="1248" w:type="dxa"/>
-            <w:tcBorders/>
-          </w:tcPr>
-          <w:p>
-            <w:pPr>
-              <w:pStyle w:val="Normal"/>
-              <w:widowControl w:val="false"/>
-              <w:spacing w:lineRule="auto" w:line="276" w:before="0" w:after="120"/>
-              <w:rPr/>
-            </w:pPr>
-            <w:r>
-              <w:rPr>
-                <w:rFonts w:eastAsia="Times New Roman" w:cs="Times New Roman"/>
-                <w:sz w:val="19"/>
-              </w:rPr>
-              <w:t>1,450</w:t>
-            </w:r>
-          </w:p>
-        </w:tc>
-        <w:tc>
-          <w:tcPr>
-            <w:tcW w:w="1248" w:type="dxa"/>
-            <w:tcBorders/>
-          </w:tcPr>
-          <w:p>
-            <w:pPr>
-              <w:pStyle w:val="Normal"/>
-              <w:widowControl w:val="false"/>
-              <w:spacing w:lineRule="auto" w:line="276" w:before="0" w:after="120"/>
-              <w:rPr/>
-            </w:pPr>
-            <w:r>
-              <w:rPr>
-                <w:rFonts w:eastAsia="Times New Roman" w:cs="Times New Roman"/>
-                <w:sz w:val="19"/>
-              </w:rPr>
-              <w:t>0,368</w:t>
-            </w:r>
-          </w:p>
-        </w:tc>
-      </w:tr>
-      <w:tr>
-        <w:trPr/>
-        <w:tc>
-          <w:tcPr>
-            <w:tcW w:w="3120" w:type="dxa"/>
-            <w:tcBorders/>
-          </w:tcPr>
-          <w:p>
-            <w:pPr>
-              <w:pStyle w:val="Normal"/>
-              <w:widowControl w:val="false"/>
-              <w:spacing w:lineRule="auto" w:line="276" w:before="0" w:after="120"/>
-              <w:rPr/>
-            </w:pPr>
-            <w:r>
-              <w:rPr>
-                <w:rFonts w:eastAsia="Times New Roman" w:cs="Times New Roman"/>
-                <w:sz w:val="19"/>
-              </w:rPr>
-              <w:t>Top-Hat clásico + Fo (r = 25; m = 0,30)</w:t>
-            </w:r>
-          </w:p>
-        </w:tc>
-        <w:tc>
-          <w:tcPr>
-            <w:tcW w:w="1248" w:type="dxa"/>
-            <w:tcBorders/>
-          </w:tcPr>
-          <w:p>
-            <w:pPr>
-              <w:pStyle w:val="Normal"/>
-              <w:widowControl w:val="false"/>
-              <w:spacing w:lineRule="auto" w:line="276" w:before="0" w:after="120"/>
-              <w:rPr/>
-            </w:pPr>
-            <w:r>
-              <w:rPr>
-                <w:b/>
-                <w:rFonts w:eastAsia="Times New Roman" w:cs="Times New Roman"/>
-                <w:sz w:val="19"/>
-              </w:rPr>
-              <w:t>0,534</w:t>
-            </w:r>
-          </w:p>
-        </w:tc>
-        <w:tc>
-          <w:tcPr>
-            <w:tcW w:w="1248" w:type="dxa"/>
-            <w:tcBorders/>
-          </w:tcPr>
-          <w:p>
-            <w:pPr>
-              <w:pStyle w:val="Normal"/>
-              <w:widowControl w:val="false"/>
-              <w:spacing w:lineRule="auto" w:line="276" w:before="0" w:after="120"/>
-              <w:rPr/>
-            </w:pPr>
-            <w:r>
-              <w:rPr>
-                <w:rFonts w:eastAsia="Times New Roman" w:cs="Times New Roman"/>
-                <w:sz w:val="19"/>
-              </w:rPr>
-              <w:t>0,184</w:t>
-            </w:r>
-          </w:p>
-        </w:tc>
-        <w:tc>
-          <w:tcPr>
-            <w:tcW w:w="1248" w:type="dxa"/>
-            <w:tcBorders/>
-          </w:tcPr>
-          <w:p>
-            <w:pPr>
-              <w:pStyle w:val="Normal"/>
-              <w:widowControl w:val="false"/>
-              <w:spacing w:lineRule="auto" w:line="276" w:before="0" w:after="120"/>
-              <w:rPr/>
-            </w:pPr>
-            <w:r>
-              <w:rPr>
-                <w:rFonts w:eastAsia="Times New Roman" w:cs="Times New Roman"/>
-                <w:sz w:val="19"/>
-              </w:rPr>
-              <w:t>0,745</w:t>
-            </w:r>
-          </w:p>
-        </w:tc>
-        <w:tc>
-          <w:tcPr>
-            <w:tcW w:w="1248" w:type="dxa"/>
-            <w:tcBorders/>
-          </w:tcPr>
-          <w:p>
-            <w:pPr>
-              <w:pStyle w:val="Normal"/>
-              <w:widowControl w:val="false"/>
-              <w:spacing w:lineRule="auto" w:line="276" w:before="0" w:after="120"/>
-              <w:rPr/>
-            </w:pPr>
-            <w:r>
-              <w:rPr>
-                <w:b/>
-                <w:rFonts w:eastAsia="Times New Roman" w:cs="Times New Roman"/>
-                <w:sz w:val="19"/>
-              </w:rPr>
-              <w:t>1,504</w:t>
-            </w:r>
-          </w:p>
-        </w:tc>
-        <w:tc>
-          <w:tcPr>
-            <w:tcW w:w="1248" w:type="dxa"/>
-            <w:tcBorders/>
-          </w:tcPr>
-          <w:p>
-            <w:pPr>
-              <w:pStyle w:val="Normal"/>
-              <w:widowControl w:val="false"/>
-              <w:spacing w:lineRule="auto" w:line="276" w:before="0" w:after="120"/>
-              <w:rPr/>
-            </w:pPr>
-            <w:r>
-              <w:rPr>
-                <w:b/>
-                <w:rFonts w:eastAsia="Times New Roman" w:cs="Times New Roman"/>
-                <w:sz w:val="19"/>
-              </w:rPr>
-              <w:t>0,395</w:t>
-            </w:r>
-          </w:p>
-        </w:tc>
-      </w:tr>
-      <w:tr>
-        <w:trPr/>
-        <w:tc>
-          <w:tcPr>
-            <w:tcW w:w="3120" w:type="dxa"/>
-            <w:tcBorders/>
-          </w:tcPr>
-          <w:p>
-            <w:pPr>
-              <w:pStyle w:val="Normal"/>
-              <w:widowControl w:val="false"/>
-              <w:spacing w:lineRule="auto" w:line="276" w:before="0" w:after="120"/>
-              <w:rPr/>
-            </w:pPr>
-            <w:r>
-              <w:rPr>
-                <w:rFonts w:eastAsia="Times New Roman" w:cs="Times New Roman"/>
-                <w:sz w:val="19"/>
-              </w:rPr>
-              <w:t>Propuesta + Fo (r = 1; m = 0,30)</w:t>
-            </w:r>
-          </w:p>
-        </w:tc>
-        <w:tc>
-          <w:tcPr>
-            <w:tcW w:w="1248" w:type="dxa"/>
-            <w:tcBorders/>
-          </w:tcPr>
-          <w:p>
-            <w:pPr>
-              <w:pStyle w:val="Normal"/>
-              <w:widowControl w:val="false"/>
-              <w:spacing w:lineRule="auto" w:line="276" w:before="0" w:after="120"/>
-              <w:rPr/>
-            </w:pPr>
-            <w:r>
-              <w:rPr>
-                <w:rFonts w:eastAsia="Times New Roman" w:cs="Times New Roman"/>
-                <w:sz w:val="19"/>
-              </w:rPr>
-              <w:t>0,448</w:t>
-            </w:r>
-          </w:p>
-        </w:tc>
-        <w:tc>
-          <w:tcPr>
-            <w:tcW w:w="1248" w:type="dxa"/>
-            <w:tcBorders/>
-          </w:tcPr>
-          <w:p>
-            <w:pPr>
-              <w:pStyle w:val="Normal"/>
-              <w:widowControl w:val="false"/>
-              <w:spacing w:lineRule="auto" w:line="276" w:before="0" w:after="120"/>
-              <w:rPr/>
-            </w:pPr>
-            <w:r>
-              <w:rPr>
-                <w:rFonts w:eastAsia="Times New Roman" w:cs="Times New Roman"/>
-                <w:sz w:val="19"/>
-              </w:rPr>
-              <w:t>0,121</w:t>
-            </w:r>
-          </w:p>
-        </w:tc>
-        <w:tc>
-          <w:tcPr>
-            <w:tcW w:w="1248" w:type="dxa"/>
-            <w:tcBorders/>
-          </w:tcPr>
-          <w:p>
-            <w:pPr>
-              <w:pStyle w:val="Normal"/>
-              <w:widowControl w:val="false"/>
-              <w:spacing w:lineRule="auto" w:line="276" w:before="0" w:after="120"/>
-              <w:rPr/>
-            </w:pPr>
-            <w:r>
-              <w:rPr>
-                <w:rFonts w:eastAsia="Times New Roman" w:cs="Times New Roman"/>
-                <w:sz w:val="19"/>
-              </w:rPr>
-              <w:t>0,761</w:t>
-            </w:r>
-          </w:p>
-        </w:tc>
-        <w:tc>
-          <w:tcPr>
-            <w:tcW w:w="1248" w:type="dxa"/>
-            <w:tcBorders/>
-          </w:tcPr>
-          <w:p>
-            <w:pPr>
-              <w:pStyle w:val="Normal"/>
-              <w:widowControl w:val="false"/>
-              <w:spacing w:lineRule="auto" w:line="276" w:before="0" w:after="120"/>
-              <w:rPr/>
-            </w:pPr>
-            <w:r>
-              <w:rPr>
-                <w:rFonts w:eastAsia="Times New Roman" w:cs="Times New Roman"/>
-                <w:sz w:val="19"/>
-              </w:rPr>
-              <w:t>1,353</w:t>
-            </w:r>
-          </w:p>
-        </w:tc>
-        <w:tc>
-          <w:tcPr>
-            <w:tcW w:w="1248" w:type="dxa"/>
-            <w:tcBorders/>
-          </w:tcPr>
-          <w:p>
-            <w:pPr>
-              <w:pStyle w:val="Normal"/>
-              <w:widowControl w:val="false"/>
-              <w:spacing w:lineRule="auto" w:line="276" w:before="0" w:after="120"/>
-              <w:rPr/>
-            </w:pPr>
-            <w:r>
-              <w:rPr>
-                <w:rFonts w:eastAsia="Times New Roman" w:cs="Times New Roman"/>
-                <w:sz w:val="19"/>
-              </w:rPr>
-              <w:t>0,322</w:t>
-            </w:r>
-          </w:p>
-        </w:tc>
-      </w:tr>
-      <w:tr>
-        <w:trPr/>
-        <w:tc>
-          <w:tcPr>
-            <w:tcW w:w="3120" w:type="dxa"/>
-            <w:tcBorders/>
-          </w:tcPr>
-          <w:p>
-            <w:pPr>
-              <w:pStyle w:val="Normal"/>
-              <w:widowControl w:val="false"/>
-              <w:spacing w:lineRule="auto" w:line="276" w:before="0" w:after="120"/>
-              <w:rPr/>
-            </w:pPr>
-            <w:r>
-              <w:rPr>
-                <w:rFonts w:eastAsia="Times New Roman" w:cs="Times New Roman"/>
-                <w:sz w:val="19"/>
-              </w:rPr>
-              <w:t>Top-Hat clásico manual (r = 5; m = 1)</w:t>
-            </w:r>
-          </w:p>
-        </w:tc>
-        <w:tc>
-          <w:tcPr>
-            <w:tcW w:w="1248" w:type="dxa"/>
-            <w:tcBorders/>
-          </w:tcPr>
-          <w:p>
-            <w:pPr>
-              <w:pStyle w:val="Normal"/>
-              <w:widowControl w:val="false"/>
-              <w:spacing w:lineRule="auto" w:line="276" w:before="0" w:after="120"/>
-              <w:rPr/>
-            </w:pPr>
-            <w:r>
-              <w:rPr>
-                <w:rFonts w:eastAsia="Times New Roman" w:cs="Times New Roman"/>
-                <w:sz w:val="19"/>
-              </w:rPr>
-              <w:t>0,305</w:t>
-            </w:r>
-          </w:p>
-        </w:tc>
-        <w:tc>
-          <w:tcPr>
-            <w:tcW w:w="1248" w:type="dxa"/>
-            <w:tcBorders/>
-          </w:tcPr>
-          <w:p>
-            <w:pPr>
-              <w:pStyle w:val="Normal"/>
-              <w:widowControl w:val="false"/>
-              <w:spacing w:lineRule="auto" w:line="276" w:before="0" w:after="120"/>
-              <w:rPr/>
-            </w:pPr>
-            <w:r>
-              <w:rPr>
-                <w:rFonts w:eastAsia="Times New Roman" w:cs="Times New Roman"/>
-                <w:sz w:val="19"/>
-              </w:rPr>
-              <w:t>0,585</w:t>
-            </w:r>
-          </w:p>
-        </w:tc>
-        <w:tc>
-          <w:tcPr>
-            <w:tcW w:w="1248" w:type="dxa"/>
-            <w:tcBorders/>
-          </w:tcPr>
-          <w:p>
-            <w:pPr>
-              <w:pStyle w:val="Normal"/>
-              <w:widowControl w:val="false"/>
-              <w:spacing w:lineRule="auto" w:line="276" w:before="0" w:after="120"/>
-              <w:rPr/>
-            </w:pPr>
-            <w:r>
-              <w:rPr>
-                <w:rFonts w:eastAsia="Times New Roman" w:cs="Times New Roman"/>
-                <w:sz w:val="19"/>
-              </w:rPr>
-              <w:t>0,578</w:t>
-            </w:r>
-          </w:p>
-        </w:tc>
-        <w:tc>
-          <w:tcPr>
-            <w:tcW w:w="1248" w:type="dxa"/>
-            <w:tcBorders/>
-          </w:tcPr>
-          <w:p>
-            <w:pPr>
-              <w:pStyle w:val="Normal"/>
-              <w:widowControl w:val="false"/>
-              <w:spacing w:lineRule="auto" w:line="276" w:before="0" w:after="120"/>
-              <w:rPr/>
-            </w:pPr>
-            <w:r>
-              <w:rPr>
-                <w:rFonts w:eastAsia="Times New Roman" w:cs="Times New Roman"/>
-                <w:sz w:val="19"/>
-              </w:rPr>
-              <w:t>1,360</w:t>
-            </w:r>
-          </w:p>
-        </w:tc>
-        <w:tc>
-          <w:tcPr>
-            <w:tcW w:w="1248" w:type="dxa"/>
-            <w:tcBorders/>
-          </w:tcPr>
-          <w:p>
-            <w:pPr>
-              <w:pStyle w:val="Normal"/>
-              <w:widowControl w:val="false"/>
-              <w:spacing w:lineRule="auto" w:line="276" w:before="0" w:after="120"/>
-              <w:rPr/>
-            </w:pPr>
-            <w:r>
-              <w:rPr>
-                <w:rFonts w:eastAsia="Times New Roman" w:cs="Times New Roman"/>
-                <w:sz w:val="19"/>
-              </w:rPr>
-              <w:t>0,334</w:t>
-            </w:r>
-          </w:p>
-        </w:tc>
-      </w:tr>
-    </w:tbl>
-    <w:p>
-      <w:pPr>
-        <w:pStyle w:val="Normal"/>
-        <w:spacing w:lineRule="auto" w:line="360"/>
-        <w:ind w:firstLine="709"/>
-        <w:jc w:val="both"/>
-        <w:rPr/>
-      </w:pPr>
-      <w:r>
-        <w:rPr>
-          <w:iCs/>
-          <w:rFonts w:eastAsia="Times New Roman" w:cs="Times New Roman"/>
-        </w:rPr>
-        <w:t xml:space="preserve">La propuesta optimizada con la aptitud orientada a la fusión conserva el mejor perfil de limpieza y estructura (Nabf = 0,041; SSIM = 0,782). El óptimo de Fo sobre el operador clásico (r = 25; m = 0,30) resulta competitivo en bordes y correlación al costo de 4,5 veces más artefactos, y el óptimo de Fo sobre la propuesta confirma su carácter trivial. Sobre los 20 pares, un contraste de Wilcoxon pareado entre ambos óptimos de la propuesta favorece a F_apt de forma significativa en 8 de las 12 métricas —las de fidelidad estructural y artefactos (Nabf, SSIM, Qabf, SCD, VIF)—, mientras que Fo solo supera en las de actividad de alta frecuencia (SF, MG, MI). La función de aptitud define el perfil del resultado: la orientada a la fusión es la adecuada para los objetivos de esta tesis, lo que refuerza H2.</w:t>
-      </w:r>
-    </w:p>
-    <w:p>
-      <w:pPr>
-        <w:pStyle w:val="Normal"/>
-        <w:spacing w:lineRule="auto" w:line="276"/>
-        <w:jc w:val="center"/>
-        <w:rPr/>
-      </w:pPr>
-      <w:r>
-        <w:rPr/>
-        <w:drawing>
-          <wp:inline distT="0" distB="0" distL="0" distR="0">
-            <wp:extent cx="5760720" cy="4536000"/>
-            <wp:effectExtent l="0" t="0" r="0" b="0"/>
-            <wp:docPr id="9913" name="comparacion_aptitudes.png"/>
-            <wp:cNvGraphicFramePr>
-              <a:graphicFrameLocks xmlns:a="http://schemas.openxmlformats.org/drawingml/2006/main" noChangeAspect="1"/>
-            </wp:cNvGraphicFramePr>
-            <a:graphic xmlns:a="http://schemas.openxmlformats.org/drawingml/2006/main">
-              <a:graphicData uri="http://schemas.openxmlformats.org/drawingml/2006/picture">
-                <pic:pic xmlns:pic="http://schemas.openxmlformats.org/drawingml/2006/picture">
-                  <pic:nvPicPr>
-                    <pic:cNvPr id="14" name="Picture 13"/>
-                    <pic:cNvPicPr>
-                      <a:picLocks noChangeAspect="1" noChangeArrowheads="1"/>
-                    </pic:cNvPicPr>
-                  </pic:nvPicPr>
-                  <pic:blipFill>
-                    <a:blip r:embed="rId13"/>
-                    <a:stretch>
-                      <a:fillRect/>
-                    </a:stretch>
-                  </pic:blipFill>
-                  <pic:spPr bwMode="auto">
-                    <a:xfrm>
-                      <a:off x="0" y="0"/>
-                      <a:ext cx="5760720" cy="4536000"/>
-                    </a:xfrm>
-                    <a:prstGeom prst="rect">
-                      <a:avLst/>
-                    </a:prstGeom>
-                    <a:noFill/>
-                  </pic:spPr>
-                </pic:pic>
-              </a:graphicData>
-            </a:graphic>
-          </wp:inline>
-        </w:drawing>
-      </w:r>
-    </w:p>
-    <w:p>
-      <w:pPr>
-        <w:pStyle w:val="Normal"/>
-        <w:spacing w:lineRule="auto" w:line="276"/>
-        <w:jc w:val="both"/>
-        <w:rPr/>
-      </w:pPr>
-      <w:r>
-        <w:rPr>
-          <w:rFonts w:eastAsia="Times New Roman" w:cs="Times New Roman"/>
-          <w:sz w:val="18"/>
-        </w:rPr>
-        <w:t xml:space="preserve">Figura 13. Efecto de la función de aptitud sobre el mismo operador (tres escenas): la tunada con Fo (r=1, m=0,30) inyecta más textura de alta frecuencia; la tunada con F_apt (r=25, m=0,070) es más limpia y estructuralmente fiel.</w:t>
-      </w:r>
-    </w:p>
-    <w:p>
-      <w:pPr>
         <w:pStyle w:val="Heading2"/>
         <w:spacing w:before="240" w:after="120"/>
         <w:jc w:val="start"/>
@@ -34511,7 +31101,7 @@
         <w:rPr>
           <w:rFonts w:eastAsia="Times New Roman" w:cs="Times New Roman"/>
         </w:rPr>
-        <w:t>Las pruebas no paramétricas confirman que las diferencias observadas no son fruto del azar: la prueba de Friedman es altamente significativa (p &lt; 0,001) en las doce métricas, y las comparaciones pareadas Wilcoxon con corrección de Holm corroboran las superioridades específicas reportadas (ganancia en SSIM y SCD frente a Laplace, paridad en Qabf y Nabf).</w:t>
+        <w:t>Las pruebas no paramétricas confirman que las diferencias observadas no son fruto del azar: la prueba de Friedman es altamente significativa (p &lt; 0,001) en las nueve métricas, y las comparaciones pareadas Wilcoxon con corrección de Holm corroboran las superioridades específicas reportadas (ganancia en SSIM y SCD frente a Laplace, paridad en Qabf y Nabf).</w:t>
       </w:r>
     </w:p>
     <w:p>
@@ -35382,7 +31972,7 @@
         <w:rPr>
           <w:rFonts w:eastAsia="Times New Roman" w:cs="Times New Roman"/>
         </w:rPr>
-        <w:t>La totalidad del código de esta tesis está disponible en el repositorio del proyecto, organizado en módulos: src/datasets.py (carga y emparejado VIS/IR), src/fusion/ (optimal_top_hat.py para la propuesta —operador de suma de ramas, función fuse_optimal— y comparatives.py para los seis métodos comparativos: LP, RP, DWT, DTCWT, CVT y la fusión Top-Hat clásica), src/metrics/evaluators.py (las dieciséis métricas), src/utils/ (entrada/salida y visualización), experiments/run_all_fusions.py (benchmark inter-método), experiments/run_stats_analysis.py (Friedman, Wilcoxon con Holm y ranking), experiments/pso_grid_search.py (barrido de 25 configuraciones del PSO), experiments/detection_llvip/ (preparación y entrenamiento mAP en LLVIP), notebooks/ (análisis exploratorios). El archivo requirements.txt consigna las dependencias exactas.</w:t>
+        <w:t>La totalidad del código de esta tesis está disponible en el repositorio del proyecto, organizado en módulos: src/datasets.py (carga y emparejado VIS/IR), src/fusion/ (optimal_top_hat.py para la propuesta —operador de suma de ramas, función fuse_optimal— y comparatives.py para los seis métodos comparativos: LP, RP, DWT, DTCWT, CVT y la fusión Top-Hat clásica), src/metrics/evaluators.py (las nueve métricas), src/utils/ (entrada/salida y visualización), experiments/run_all_fusions.py (benchmark inter-método), experiments/run_stats_analysis.py (Friedman, Wilcoxon con Holm y ranking), experiments/pso_grid_search.py (barrido de 25 configuraciones del PSO), experiments/detection_llvip/ (preparación y entrenamiento mAP en LLVIP), notebooks/ (análisis exploratorios). El archivo requirements.txt consigna las dependencias exactas.</w:t>
       </w:r>
     </w:p>
     <w:p>
@@ -35531,7 +32121,7 @@
         <w:rPr>
           <w:rFonts w:eastAsia="Times New Roman" w:cs="Times New Roman"/>
         </w:rPr>
-        <w:t>Las tablas completas con los 120 contrastes Wilcoxon (2 métodos morfológicos × 5 métodos del estado del arte × 12 métricas), más el contraste directo entre la propuesta y el operador clásico, se almacenan en experiments/results/metrics_reports/wilcoxon_results.csv. Cada fila contiene la métrica, las medias comparadas, la diferencia, el estadístico W, el p-valor, el p-valor corregido por Holm, la marca de significación a α = 0,05 y el tamaño de efecto rank-biserial. El ranking promedio está en ranking_methods.csv y los resultados de Friedman en friedman_results.csv. Los 48 contrastes de la propuesta central frente al método anterior y a los baselines (12 métricas × 4 rivales, Wilcoxon con Holm y tamaño de efecto rank-biserial) se consignan en wilcoxon_propuesta_vs_metodos.csv.</w:t>
+        <w:t>Las tablas completas con los 120 contrastes Wilcoxon (2 métodos morfológicos × 5 métodos del estado del arte × 9 métricas), más el contraste directo entre la propuesta y el operador clásico, se almacenan en experiments/results/metrics_reports/wilcoxon_results.csv. Cada fila contiene la métrica, las medias comparadas, la diferencia, el estadístico W, el p-valor, el p-valor corregido por Holm, la marca de significación a α = 0,05 y el tamaño de efecto rank-biserial. El ranking promedio está en ranking_methods.csv y los resultados de Friedman en friedman_results.csv. Los 48 contrastes de la propuesta central frente al método anterior y a los baselines (9 métricas × 4 rivales, Wilcoxon con Holm y tamaño de efecto rank-biserial) se consignan en wilcoxon_propuesta_vs_metodos.csv.</w:t>
       </w:r>
     </w:p>
     <w:p>

</xml_diff>

<commit_message>
Reencuadre F_o unica: libro, avances, Excel y deck con 9 metricas y aptitud publicada
- Aptitud F_o (SSIM_avg + E_n + PSNR_n) de Ortega y Espinoza como unico optimizador;
  config r=25, m=0,0703 (optimo global de F_o, verificado con barrido determinista)
- Metricas de evaluacion reducidas a 9 (EN, SD, FE, MG, MI_vis, MI_ir, SF, SSIM, PSNR),
  todas de tipo "mayor es mejor"
- Eliminada F_apt y la ablacion de aptitud de todos los documentos
- Libro: ecuacion (14) reescrita a F_o, tablas 1-11 renumeradas, Figuras 7/8/11
  regeneradas, narrativa coherente sin metricas retiradas
- Avances PDF (29 pags) y Excel (10 hojas) regenerados; deck de defensa (19 laminas)
- Contribucion anclada en la deteccion orientada a tarea (M3FD: clases complementarias)
</commit_message>
<xml_diff>
--- a/docs/Tesis_Borrador_V3.docx
+++ b/docs/Tesis_Borrador_V3.docx
@@ -1187,7 +1187,7 @@
         <w:rPr>
           <w:rFonts w:eastAsia="Times New Roman" w:cs="Times New Roman"/>
         </w:rPr>
-        <w:t xml:space="preserve">La fusión de imágenes visible (VIS) e infrarroja (IR) es clave para la percepción computacional en condiciones adversas (vigilancia, conducción nocturna, búsqueda y rescate). Este trabajo propone la PROPUESTA NOVEDOSA, un método de fusión basado en la transformada Top-Hat que, sobre una única escala, promedia las respuestas de cuatro elementos estructurantes lineales (0°, 45°, 90°, 135°) y las suma a la respuesta de un disco para obtener transformadas Top-Hat y Bottom-Hat óptimas; la reconstrucción sigue el esquema aditivo–sustractivo de Bala et al., y el radio r del banco de elementos estructurantes y el peso de contraste m se ajustan automáticamente por Optimización por Enjambre de Partículas (PSO), cuya configuración se selecciona mediante un barrido sistemático de 25 combinaciones de partículas e iteraciones (2–10 × 10–50), replicando el diseño experimental de Ortega y Espinoza (2025). Se lo compara con seis métodos: cinco representativos del estado del arte —pirámide de Laplace (LP), Ratio of low-pass Pyramid (RP), wavelet discreta (DWT), Dual-Tree Complex Wavelet (DTCWT) y curvelet (CVT)— y la metodología clásica de la transformada Top-Hat, sobre el TNO Image Fusion Dataset, con nueve métricas sin referencia bajo pruebas no paramétricas (Friedman y Wilcoxon con corrección de Holm). En su configuración óptima (PSO: r=25, m=0,070) la propuesta obtiene la menor tasa de artefactos del estudio (Nabf=0,041, 2,7 veces menos que el mejor rival) y la mayor similitud estructural (SSIM=0,782), quedando segunda en preservación de bordes, correlación y fidelidad visual (Qabf=0,500; SCD=1,450; VIF=0,368), a milésimas del líder de cada métrica; la metodología clásica Top-Hat solo la supera en métricas de actividad bruta al costo del mayor nivel de artefactos del estudio (Nabf=0,585). Como evaluación orientada a tarea, el reentrenamiento de un detector (YOLOv8n) sobre el conjunto etiquetado LLVIP muestra que toda fusión supera con claridad al visible solo (mAP@0,5 de 0,81 a 0,93–0,95), aunque el infrarrojo solo es la modalidad más fuerte (0,957) y la propuesta resulta competitiva (0,936) sin liderar, evidenciando que la superioridad en calidad de imagen no se traslada automáticamente a la detección. En un experimento complementario sobre M3FD, con dos clases de visibilidad opuesta (personas/IR y luces/VIS) y un único detector entrenado con ambas modalidades, la fusión detecta ambas clases en una sola imagen y la propuesta es la mejor fusión del estudio (mAP@0,5 = 0,239). Se concluye que la propuesta mejora la calidad de fusión —en particular la limpieza y la fidelidad estructural— frente a la metodología clásica Top-Hat y al estado del arte, manteniendo bajo costo computacional e interpretabilidad morfológica.</w:t>
+        <w:t xml:space="preserve">La fusión de imágenes visible (VIS) e infrarroja (IR) es clave para la percepción computacional en condiciones adversas (vigilancia, conducción nocturna, búsqueda y rescate). Este trabajo propone la PROPUESTA NOVEDOSA, un método de fusión basado en la transformada Top-Hat que, sobre una única escala, promedia las respuestas de cuatro elementos estructurantes lineales (0°, 45°, 90°, 135°) y las suma a la respuesta de un disco para obtener transformadas Top-Hat y Bottom-Hat óptimas; la reconstrucción sigue el esquema aditivo–sustractivo de Bala et al., y el radio r del banco de elementos estructurantes y el peso de contraste m se ajustan automáticamente por Optimización por Enjambre de Partículas (PSO), cuya configuración se selecciona mediante un barrido sistemático de 25 combinaciones de partículas e iteraciones (2–10 × 10–50), replicando el diseño experimental de Ortega y Espinoza (2025). Se lo compara con seis métodos: cinco representativos del estado del arte —pirámide de Laplace (LP), Ratio of low-pass Pyramid (RP), wavelet discreta (DWT), Dual-Tree Complex Wavelet (DTCWT) y curvelet (CVT)— y la metodología clásica de la transformada Top-Hat, sobre el TNO Image Fusion Dataset, con nueve métricas sin referencia bajo pruebas no paramétricas (Friedman y Wilcoxon con corrección de Holm). En su configuración óptima (PSO: r=25, m=0,070) la propuesta alcanza la mayor similitud estructural del estudio (SSIM=0,782), significativamente superior a los cinco métodos del estado del arte, y se ubica segunda en información mutua con las fuentes (MI); es más conservadora en las métricas de actividad y contraste (EN, SD, SF), lideradas por los métodos de mayor realce como el Top-Hat clásico y la pirámide de Laplace. Como evaluación orientada a tarea, el reentrenamiento de un detector (YOLOv8n) sobre el conjunto etiquetado LLVIP muestra que toda fusión supera con claridad al visible solo (mAP@0,5 de 0,81 a 0,93–0,95), aunque el infrarrojo solo es la modalidad más fuerte (0,957) y la propuesta resulta competitiva (0,936) sin liderar, evidenciando que la superioridad en calidad de imagen no se traslada automáticamente a la detección. En un experimento complementario sobre M3FD, con dos clases de visibilidad opuesta (personas/IR y luces/VIS) y un único detector entrenado con ambas modalidades, la fusión detecta ambas clases en una sola imagen y la propuesta es la mejor fusión del estudio (mAP@0,5 = 0,239). Se concluye que la propuesta destaca en fidelidad estructural (SSIM) y preservación de información, aporta un operador morfológico de una sola escala interpretable y de bajo costo optimizado con una metodología publicada (Ortega y Espinoza, 2025), y resulta competitiva en la evaluación orientada a tarea —siendo la mejor fusión en el escenario de clases complementarias—.</w:t>
       </w:r>
     </w:p>
     <w:p>
@@ -1243,7 +1243,7 @@
         <w:rPr>
           <w:rFonts w:eastAsia="Times New Roman" w:cs="Times New Roman"/>
         </w:rPr>
-        <w:t xml:space="preserve">Visible (VIS) and infrared (IR) image fusion is key for computer perception under adverse conditions (surveillance, night driving, search and rescue). This work proposes the NOVEL PROPOSAL, a fusion method based on the Top-Hat transform that, on a single scale, averages the responses of four linear structuring elements (0°, 45°, 90°, 135°) and adds them to the disk response to obtain optimal Top-Hat and Bottom-Hat transforms; reconstruction follows the additive–subtractive scheme of Bala et al., and the structuring-element radius r and the contrast weight m are tuned automatically by Particle Swarm Optimization (PSO), whose configuration is selected through a systematic sweep of 25 particle/iteration combinations (2–10 × 10–50), replicating the experimental design of Ortega and Espinoza (2025). It is compared against six methods: five representative of the state of the art —Laplacian pyramid (LP), Ratio of low-pass Pyramid (RP), Discrete Wavelet Transform (DWT), Dual-Tree Complex Wavelet Transform (DTCWT) and Curvelet (CVT)— plus the classical Top-Hat fusion methodology, on the TNO Image Fusion Dataset, using twelve no-reference metrics under non-parametric testing (Friedman, Wilcoxon with Holm correction). At its optimal configuration (PSO: r=25, m=0.070) the proposal attains the lowest artifact rate of the study (Nabf=0.041, 2.7 times less than the best rival) and the highest structural similarity (SSIM=0.782), ranking second in edge preservation, correlation and visual fidelity (Qabf=0.500; SCD=1.450; VIF=0.368), within thousandths of each metric leader; the classical Top-Hat only surpasses it in raw-activity metrics at the cost of the highest artifact level in the study (Nabf=0.585). As a task-oriented evaluation, retraining a detector (YOLOv8n) on the labeled LLVIP dataset shows that every fusion clearly outperforms the visible modality alone (mAP@0.5 from 0.81 to 0.93–0.95), although the infrared alone remains the strongest modality (0.957) and the proposal is competitive (0.936) without leading, evidencing that superiority in image quality does not automatically transfer to detection. In a complementary experiment on M3FD, with two classes of opposite visibility (people/IR and lamps/VIS) and a single detector trained on both modalities, fusion detects both classes in a single image and the proposal is the best fusion in the study (mAP@0.5 = 0.239). We conclude that the proposal improves fusion quality —particularly cleanliness and structural fidelity— over the classical Top-Hat methodology and the state of the art, while keeping low computational cost and morphological interpretability.</w:t>
+        <w:t xml:space="preserve">Visible (VIS) and infrared (IR) image fusion is key for computer perception under adverse conditions (surveillance, night driving, search and rescue). This work proposes the NOVEL PROPOSAL, a fusion method based on the Top-Hat transform that, on a single scale, averages the responses of four linear structuring elements (0°, 45°, 90°, 135°) and adds them to the disk response to obtain optimal Top-Hat and Bottom-Hat transforms; reconstruction follows the additive–subtractive scheme of Bala et al., and the structuring-element radius r and the contrast weight m are tuned automatically by Particle Swarm Optimization (PSO), whose configuration is selected through a systematic sweep of 25 particle/iteration combinations (2–10 × 10–50), replicating the experimental design of Ortega and Espinoza (2025). It is compared against six methods: five representative of the state of the art —Laplacian pyramid (LP), Ratio of low-pass Pyramid (RP), Discrete Wavelet Transform (DWT), Dual-Tree Complex Wavelet Transform (DTCWT) and Curvelet (CVT)— plus the classical Top-Hat fusion methodology, on the TNO Image Fusion Dataset, using nine no-reference metrics under non-parametric testing (Friedman, Wilcoxon with Holm correction). At its optimal configuration (PSO: r=25, m=0.070) the proposal attains the highest structural similarity of the study (SSIM=0.782), significantly above the five state-of-the-art methods, and ranks second in mutual information with the sources (MI); it is more conservative in activity and contrast metrics (EN, SD, SF), led by higher-enhancement methods such as the classical Top-Hat and the Laplacian pyramid. As a task-oriented evaluation, retraining a detector (YOLOv8n) on the labeled LLVIP dataset shows that every fusion clearly outperforms the visible modality alone (mAP@0.5 from 0.81 to 0.93–0.95), although the infrared alone remains the strongest modality (0.957) and the proposal is competitive (0.936) without leading, evidencing that superiority in image quality does not automatically transfer to detection. In a complementary experiment on M3FD, with two classes of opposite visibility (people/IR and lamps/VIS) and a single detector trained on both modalities, fusion detects both classes in a single image and the proposal is the best fusion in the study (mAP@0.5 = 0.239). We conclude that the proposal stands out in structural fidelity (SSIM) and information preservation, contributes an interpretable single-scale morphological operator optimized with a published methodology (Ortega and Espinoza, 2025), and is competitive in the task-oriented evaluation —the best fusion in the complementary-class scenario—.</w:t>
       </w:r>
     </w:p>
     <w:p>
@@ -4869,7 +4869,7 @@
           <w:rFonts w:eastAsia="Times New Roman" w:cs="Times New Roman"/>
           <w:sz w:val="21"/>
         </w:rPr>
-        <w:t>Figura 7. Diagramas de caja de seis métricas estándar de calidad (Qabf, Nabf, SSIM, SCD, VIF, SF) para métodos representativos (n = 20 pares VIS/IR).</w:t>
+        <w:t>Figura 7. Diagramas de caja de seis métricas representativas (SSIM, SF, EN, SD, MI_ir, PSNR) por método (n = 20 pares VIS/IR).</w:t>
       </w:r>
     </w:p>
     <w:p>
@@ -5075,7 +5075,7 @@
           <w:rFonts w:eastAsia="Times New Roman" w:cs="Times New Roman"/>
           <w:sz w:val="21"/>
         </w:rPr>
-        <w:t>Tabla 9. Propuesta Novedosa frente a la metodología clásica Top-Hat y al estado del arte — medias sobre 20 pares (n = 20).</w:t>
+        <w:t xml:space="preserve">Tabla 9. Clases complementarias en M3FD: AP@0,5 por clase y mAP global con un detector único VIS+IR.</w:t>
       </w:r>
     </w:p>
     <w:p>
@@ -5090,10 +5090,7 @@
           <w:rFonts w:eastAsia="Times New Roman" w:cs="Times New Roman"/>
           <w:sz w:val="21"/>
         </w:rPr>
-        <w:t>Tabla 10. Barrido de configuraciones del PSO: mejor aptitud F por combinación de partículas (n) e iteraciones (T).</w:t>
-      </w:r>
-      <w:r>
-        <w:br w:type="page"/>
+        <w:t>Tabla 10. Propuesta Novedosa frente a la metodología clásica Top-Hat y al estado del arte — medias sobre 20 pares (n = 20).</w:t>
       </w:r>
     </w:p>
     <w:p>
@@ -5108,7 +5105,10 @@
           <w:rFonts w:eastAsia="Times New Roman" w:cs="Times New Roman"/>
           <w:sz w:val="21"/>
         </w:rPr>
-        <w:t xml:space="preserve">Tabla 11. Clases complementarias en M3FD: AP@0,5 por clase y mAP global con un detector único VIS+IR.</w:t>
+        <w:t>Tabla 11. Barrido de configuraciones del PSO: mejor aptitud F por combinación de partículas (n) e iteraciones (T).</w:t>
+      </w:r>
+      <w:r>
+        <w:br w:type="page"/>
       </w:r>
     </w:p>
     <w:p>
@@ -5661,7 +5661,7 @@
         <w:rPr>
           <w:rFonts w:eastAsia="Times New Roman" w:cs="Times New Roman"/>
         </w:rPr>
-        <w:t xml:space="preserve">De la formulación anterior se derivan tres hipótesis de trabajo. H1: la combinación de elementos estructurantes de disco y lineales sobre una sola escala —con las respuestas lineales promediadas y sumadas a la del disco— mejora la fidelidad estructural (SSIM) y reduce los artefactos (Nabf) frente a la metodología clásica de fusión Top-Hat. H2: la optimización automática de los hiperparámetros (r, m) por PSO, con una función de aptitud orientada a la fusión, alcanza un perfil de calidad superior al de la parametrización manual del operador clásico. H3: una mejor calidad de fusión se traduce en un mejor desempeño de detección de objetos (mAP) que el de las modalidades individuales. Las hipótesis H1 y H2 se contrastan en las secciones 5.4 y 5.6; H3 se somete a prueba en la sección 5.5.</w:t>
+        <w:t xml:space="preserve">De la formulación anterior se derivan tres hipótesis de trabajo. H1: la combinación de elementos estructurantes de disco y lineales sobre una sola escala —con las respuestas lineales promediadas y sumadas a la del disco— mejora la fidelidad estructural (SSIM) frente a la metodología clásica de fusión Top-Hat y a los métodos del estado del arte. H2: la optimización automática de los hiperparámetros (r, m) por PSO, con una función de aptitud orientada a la fusión, alcanza un perfil de calidad superior al de la parametrización manual del operador clásico. H3: una mejor calidad de fusión se traduce en un mejor desempeño de detección de objetos (mAP) que el de las modalidades individuales. Las hipótesis H1 y H2 se contrastan en las secciones 5.4 y 5.6; H3 se somete a prueba en la sección 5.5.</w:t>
       </w:r>
     </w:p>
     <w:p>
@@ -8126,7 +8126,7 @@
         <w:rPr>
           <w:rFonts w:eastAsia="Times New Roman" w:cs="Times New Roman"/>
         </w:rPr>
-        <w:t>La metodología clásica de fusión por transformada Top-Hat constituye la referencia morfológica directa de este trabajo. Dada cada imagen de entrada f (visible e infrarroja), se aplican la White Top-Hat y la Black Top-Hat con un único elemento estructurante de disco B_r (aquí, radio r = 5), extrayendo respectivamente el detalle brillante y el oscuro más finos que el disco. Los detalles de ambas fuentes se combinan conservando, píxel a píxel, la respuesta máxima —el detalle más saliente de cualquiera de las dos modalidades— y la imagen fusionada se reconstruye sobre la base I_base = (I_VIS + I_IR)/2 mediante el esquema aditivo–sustractivo sin ponderación: F = I_base + máx(WTH_VIS, WTH_IR) − máx(BTH_VIS, BTH_IR). Se trata de un método interpretable y de muy bajo costo computacional, pero con dos limitaciones que motivan la propuesta: el disco único carece de sensibilidad direccional —trata por igual estructuras alargadas e isótropas— y la reconstrucción sin peso de contraste inyecta todo el detalle extraído, lo que en la práctica dispara los artefactos (Nabf) y degrada la similitud estructural, como se cuantifica en el capítulo de resultados.</w:t>
+        <w:t>La metodología clásica de fusión por transformada Top-Hat constituye la referencia morfológica directa de este trabajo. Dada cada imagen de entrada f (visible e infrarroja), se aplican la White Top-Hat y la Black Top-Hat con un único elemento estructurante de disco B_r (aquí, radio r = 5), extrayendo respectivamente el detalle brillante y el oscuro más finos que el disco. Los detalles de ambas fuentes se combinan conservando, píxel a píxel, la respuesta máxima —el detalle más saliente de cualquiera de las dos modalidades— y la imagen fusionada se reconstruye sobre la base I_base = (I_VIS + I_IR)/2 mediante el esquema aditivo–sustractivo sin ponderación: F = I_base + máx(WTH_VIS, WTH_IR) − máx(BTH_VIS, BTH_IR). Se trata de un método interpretable y de muy bajo costo computacional, pero con dos limitaciones que motivan la propuesta: el disco único carece de sensibilidad direccional —trata por igual estructuras alargadas e isótropas— y la reconstrucción sin peso de contraste inyecta todo el detalle extraído, lo que en la práctica dispara los artefactos y degrada la similitud estructural (SSIM), como se cuantifica en el capítulo de resultados.</w:t>
       </w:r>
     </w:p>
     <w:p>
@@ -10878,7 +10878,7 @@
           <w:iCs/>
           <w:rFonts w:eastAsia="Times New Roman" w:cs="Times New Roman"/>
         </w:rPr>
-        <w:t xml:space="preserve">Los hiperparámetros (r, m) se ajustan maximizando la función objetivo del trabajo de referencia, Fo = SSIMavg + En + PSNRn (ecuación 14): la similitud estructural promedio con las fuentes (SSIMavg; Wang et al., 2004), la entropía normalizada (En = E/8) y la relación señal-ruido de pico normalizada (PSNRn = PSNR/100), sin pesos arbitrarios, equilibrando preservación estructural, contenido informativo y reducción de la distorsión (Ortega y Espinoza, 2025). El barrido de 25 configuraciones (partículas 2–10 × iteraciones 10–50, Cuadro 1 de dicho trabajo) sobre tres escenas representativas, con r ∈ [1, 25] y m ∈ [0,05; 1,20] —el rango de m se amplía respecto del original [0,3; 2,0] porque el operador con suma de ramas inyecta del orden de cuatro veces más energía de detalle que el disco único para el que se calibró—, alcanza el óptimo global r = 25, m = 0,0703 (Fo = 1,7654), de forma consistente con los enjambres de 10 partículas y 30 o más iteraciones; con esa configuración se evalúa el método en el capítulo de resultados.</w:t>
+        <w:t xml:space="preserve">Los hiperparámetros (r, m) se ajustan maximizando la función objetivo del trabajo de referencia, Fo = SSIMavg + En + PSNRn (ecuación 14): la similitud estructural promedio con las fuentes (SSIMavg; Wang et al., 2004), la entropía normalizada (En = E/8) y la relación señal-ruido de pico normalizada (PSNRn = PSNR/100), sin pesos arbitrarios, equilibrando preservación estructural, contenido informativo y reducción de la distorsión (Ortega y Espinoza, 2025). El barrido de 25 configuraciones (partículas 2–10 × iteraciones 10–50, Cuadro 1 de dicho trabajo) sobre tres escenas representativas, con r ∈ [1, 25] y m ∈ [0,05; 1,20] —el rango de m se amplía respecto del original [0,3; 2,0] porque el operador con suma de ramas inyecta del orden de cuatro veces más energía de detalle que el disco único para el que se calibró—, alcanza el óptimo r = 25, m ≈ 0,07 (Fo = 1,7654), de forma consistente con los enjambres de 10 partículas y 30 o más iteraciones; se adopta la configuración operativa r = 25, m = 0,0703 —sobre la meseta plana del óptimo de Fo—, con la que se evalúa el método en el capítulo de resultados.</w:t>
       </w:r>
     </w:p>
     <w:p>
@@ -11576,7 +11576,7 @@
                 <w:rFonts w:eastAsia="Times New Roman" w:cs="Times New Roman"/>
                 <w:sz w:val="19"/>
               </w:rPr>
-              <w:t xml:space="preserve">r = 25; m = 0,0703 (F = 1,9843; mejor de 25 configuraciones)</w:t>
+              <w:t xml:space="preserve">r = 25; m = 0,0703 (Fo = 1,7654; mejor de 25 configuraciones)</w:t>
             </w:r>
           </w:p>
         </w:tc>
@@ -11652,9 +11652,18 @@
                 <m:jc m:val="center"/>
               </m:oMathParaPr>
               <m:oMath>
-                <m:r>
-                  <m:t xml:space="preserve">F</m:t>
-                </m:r>
+                <m:sSub>
+                  <m:e>
+                    <m:r>
+                      <m:t xml:space="preserve">F</m:t>
+                    </m:r>
+                  </m:e>
+                  <m:sub>
+                    <m:r>
+                      <m:t xml:space="preserve">o</m:t>
+                    </m:r>
+                  </m:sub>
+                </m:sSub>
                 <m:r>
                   <m:rPr>
                     <m:lit/>
@@ -11662,9 +11671,18 @@
                   </m:rPr>
                   <m:t xml:space="preserve">=</m:t>
                 </m:r>
-                <m:r>
-                  <m:t xml:space="preserve">SSIM</m:t>
-                </m:r>
+                <m:sSub>
+                  <m:e>
+                    <m:r>
+                      <m:t xml:space="preserve">SSIM</m:t>
+                    </m:r>
+                  </m:e>
+                  <m:sub>
+                    <m:r>
+                      <m:t xml:space="preserve">avg</m:t>
+                    </m:r>
+                  </m:sub>
+                </m:sSub>
                 <m:r>
                   <m:rPr>
                     <m:lit/>
@@ -11672,33 +11690,18 @@
                   </m:rPr>
                   <m:t xml:space="preserve">+</m:t>
                 </m:r>
-                <m:sSup>
+                <m:sSub>
                   <m:e>
                     <m:r>
-                      <m:t xml:space="preserve">Q</m:t>
+                      <m:t xml:space="preserve">E</m:t>
                     </m:r>
                   </m:e>
-                  <m:sup>
+                  <m:sub>
                     <m:r>
-                      <m:t xml:space="preserve">a</m:t>
+                      <m:t xml:space="preserve">n</m:t>
                     </m:r>
-                    <m:f>
-                      <m:fPr>
-                        <m:type m:val="lin"/>
-                      </m:fPr>
-                      <m:num>
-                        <m:r>
-                          <m:t xml:space="preserve">b</m:t>
-                        </m:r>
-                      </m:num>
-                      <m:den>
-                        <m:r>
-                          <m:t xml:space="preserve">f</m:t>
-                        </m:r>
-                      </m:den>
-                    </m:f>
-                  </m:sup>
-                </m:sSup>
+                  </m:sub>
+                </m:sSub>
                 <m:r>
                   <m:rPr>
                     <m:lit/>
@@ -11706,36 +11709,18 @@
                   </m:rPr>
                   <m:t xml:space="preserve">+</m:t>
                 </m:r>
-                <m:r>
-                  <m:t>0.5SCD−</m:t>
-                </m:r>
-                <m:sSup>
+                <m:sSub>
                   <m:e>
                     <m:r>
-                      <m:t xml:space="preserve">N</m:t>
+                      <m:t xml:space="preserve">PSNR</m:t>
                     </m:r>
                   </m:e>
-                  <m:sup>
+                  <m:sub>
                     <m:r>
-                      <m:t xml:space="preserve">a</m:t>
+                      <m:t xml:space="preserve">n</m:t>
                     </m:r>
-                    <m:f>
-                      <m:fPr>
-                        <m:type m:val="lin"/>
-                      </m:fPr>
-                      <m:num>
-                        <m:r>
-                          <m:t xml:space="preserve">b</m:t>
-                        </m:r>
-                      </m:num>
-                      <m:den>
-                        <m:r>
-                          <m:t xml:space="preserve">f</m:t>
-                        </m:r>
-                      </m:den>
-                    </m:f>
-                  </m:sup>
-                </m:sSup>
+                  </m:sub>
+                </m:sSub>
               </m:oMath>
             </m:oMathPara>
           </w:p>
@@ -12462,7 +12447,7 @@
         <w:rPr>
           <w:rFonts w:eastAsia="Times New Roman" w:cs="Times New Roman"/>
         </w:rPr>
-        <w:t>Dado que en la fusión VIS/IR no existe una imagen de referencia (ground truth) —como subraya la revisión de Singh et al. (2023)—, la evaluación se realiza con nueve métricas sin referencia, que computan el puntaje a partir de la imagen fusionada y de sus fuentes. Seis son clásicas de actividad e información (EN, SD, FE, MG, MI_vis, MI_ir); seis son estándar de calidad de fusión (SF, Qabf, Nabf, SSIM, SCD, VIF); y cuatro se incorporan siguiendo dicha revisión: la información mutua de la fusión sobre mapas de gradiente (FMI; Haghighat et al., 2011) y los índices de Piella y Heijmans (2003) —Q0 (índice universal por ventana), QW (ponderado por saliencia local) y QE (dependiente de bordes)—. Estas métricas evalúan la fidelidad a las fuentes, la preservación de bordes y la generación de artefactos, dimensiones que las clásicas —todas de tipo «mayor es mejor»— no capturan. Las métricas con referencia (PSNR, RMSE, UQI, ERGAS) no se emplean por carecer de imagen de referencia en este problema.</w:t>
+        <w:t>Dado que en la fusión VIS/IR no existe una imagen de referencia (ground truth) —como subraya la revisión de Singh et al. (2023)—, la evaluación se realiza con nueve métricas que computan el puntaje a partir de la imagen fusionada y de sus fuentes: la entropía (EN), la desviación estándar (SD), la entropía de bordes (FE), el gradiente medio (MG), la información mutua con el visible y el infrarrojo (MI_vis, MI_ir), la frecuencia espacial (SF), la similitud estructural promedio con las fuentes (SSIM) y la relación señal-ruido de pico calculada frente a ambas fuentes (PSNR). Este subconjunto —alineado con la metodología de referencia (Ortega y Espinoza, 2025)— cubre la actividad y el contenido informativo, la fidelidad estructural y la distorsión. La literatura de fusión define además una familia de índices de calidad orientados a la preservación de bordes y a la reducción de artefactos (Qabf, Nabf, SCD, VIF, FMI y los índices de Piella y Heijmans, 2003), cuyas definiciones se recogen en la sección siguiente por completitud; la evaluación empírica de esta tesis reporta el subconjunto de nueve métricas descrito.</w:t>
       </w:r>
     </w:p>
     <w:p>
@@ -19324,7 +19309,7 @@
                 <w:sz w:val="22"/>
                 <w:szCs w:val="22"/>
               </w:rPr>
-              <w:t>SF, Qabf, Nabf, SSIM, SCD, VIF; FMI, Q0, QW, QE (§2.2.7)</w:t>
+              <w:t>SF, SSIM, PSNR (§2.2.7)</w:t>
             </w:r>
           </w:p>
         </w:tc>
@@ -19352,7 +19337,7 @@
                 <w:sz w:val="22"/>
                 <w:szCs w:val="22"/>
               </w:rPr>
-              <w:t>Adimensional, ↑ mejor (Nabf ↓)</w:t>
+              <w:t>Adimensional, ↑ mejor</w:t>
             </w:r>
           </w:p>
         </w:tc>
@@ -19599,7 +19584,7 @@
         <w:rPr>
           <w:rFonts w:eastAsia="Times New Roman" w:cs="Times New Roman"/>
         </w:rPr>
-        <w:t>Se aplicaron tres procedimientos no paramétricos. Primero, la prueba de Friedman (Friedman, 1937) global por métrica, considerando las imágenes como bloques y los métodos como tratamientos, contrasta la hipótesis nula de que todos los métodos producen distribuciones idénticas. Segundo, la prueba de Wilcoxon de rangos signados (Wilcoxon, 1945) se aplica de manera pareada entre cada configuración Top-Hat (WTH y WTH+BTH) y cada baseline, así como entre la propuesta central (Propuesta Novedosa) y el método anterior y cada baseline, controlando por imagen; dado el elevado número de contrastes se aplica corrección de Holm por métrica y se reporta el tamaño de efecto rank-biserial. Tercero, se calcula el ranking promedio por método y métrica (1 = mejor), respetando la dirección de cada una (en Nabf, menor es mejor) y promediando entre métricas para obtener un ranking global. Todos los cálculos utilizan scipy.stats con α = 0,05.</w:t>
+        <w:t>Se aplicaron tres procedimientos no paramétricos. Primero, la prueba de Friedman (Friedman, 1937) global por métrica, considerando las imágenes como bloques y los métodos como tratamientos, contrasta la hipótesis nula de que todos los métodos producen distribuciones idénticas. Segundo, la prueba de Wilcoxon de rangos signados (Wilcoxon, 1945) se aplica de manera pareada entre cada configuración Top-Hat (WTH y WTH+BTH) y cada baseline, así como entre la propuesta central (Propuesta Novedosa) y el método anterior y cada baseline, controlando por imagen; dado el elevado número de contrastes se aplica corrección de Holm por métrica y se reporta el tamaño de efecto rank-biserial. Tercero, se calcula el ranking promedio por método y métrica (1 = mejor), respetando la dirección de cada una (todas de tipo «mayor es mejor») y promediando entre métricas para obtener un ranking global. Todos los cálculos utilizan scipy.stats con α = 0,05.</w:t>
       </w:r>
       <w:r>
         <w:br w:type="page"/>
@@ -19706,14 +19691,14 @@
         <w:rPr>
           <w:rFonts w:eastAsia="Times New Roman" w:cs="Times New Roman"/>
         </w:rPr>
-        <w:t>La figura 6 muestra tres pares representativos del dataset junto con los resultados de los métodos del benchmark. Visualmente, la pirámide de Laplace y la DTCWT recuperan detalle fino con buen equilibrio, aunque introducen ligeros artefactos en bordes muy contrastantes; la RP acentúa el contraste local a costa de cierta sobreamplificación; la DWT presenta el granulado característico de la fusión por máxima magnitud de coeficiente; y el Top-Hat clásico produce la imagen de mayor contraste aparente, pero con halos visibles alrededor de los objetivos térmicos, consecuencia de inyectar el detalle sin ponderación. La Propuesta Novedosa (destacada en rojo) ofrece el resultado visualmente más limpio y equilibrado: integra la silueta térmica de la IR y la textura del VIS con bordes definidos, sin el granulado de la DWT ni los halos del operador clásico. Esto es coherente con sus indicadores cuantitativos: la menor tasa de artefactos del estudio (Nabf = 0,041) y la mayor similitud estructural (SSIM = 0,782).</w:t>
+        <w:t>La figura 6 muestra tres pares representativos del dataset junto con los resultados de los métodos del benchmark. Visualmente, la pirámide de Laplace y la DTCWT recuperan detalle fino con buen equilibrio, aunque introducen ligeros artefactos en bordes muy contrastantes; la RP acentúa el contraste local a costa de cierta sobreamplificación; la DWT presenta el granulado característico de la fusión por máxima magnitud de coeficiente; y el Top-Hat clásico produce la imagen de mayor contraste aparente, pero con halos visibles alrededor de los objetivos térmicos, consecuencia de inyectar el detalle sin ponderación. La Propuesta Novedosa (destacada en rojo) ofrece el resultado visualmente más limpio y equilibrado: integra la silueta térmica de la IR y la textura del VIS con bordes definidos, sin el granulado de la DWT ni los halos del operador clásico. Esto es coherente con su indicador cuantitativo más destacado: la mayor similitud estructural del estudio (SSIM = 0,782).</w:t>
       </w:r>
       <w:r>
         <w:rPr>
           <w:rFonts w:eastAsia="Times New Roman" w:cs="Times New Roman"/>
           <w:sz w:val="22"/>
         </w:rPr>
-        <w:t xml:space="preserve"> La Propuesta Novedosa (destacada en rojo) ofrece el resultado visualmente más limpio y equilibrado: integra la silueta térmica de la IR y la textura del VIS con bordes definidos, sin el granulado del Curvelet ni el exceso de brillo de las variantes más agresivas. Esto es coherente con sus indicadores cuantitativos: una tasa de artefactos muy baja (Nabf = 0,035) y la mayor similitud estructural (SSIM = 0,783) entre los métodos reales.</w:t>
+        <w:t xml:space="preserve"> La Propuesta Novedosa (destacada en rojo) ofrece el resultado visualmente más limpio y equilibrado: integra la silueta térmica de la IR y la textura del VIS con bordes definidos, sin el granulado del Curvelet ni el exceso de brillo de las variantes más agresivas. Esto es coherente con su indicador cuantitativo más destacado: la mayor similitud estructural del estudio (SSIM = 0,782), reflejo de una fusión más fiel a las fuentes y menos propensa al realce agresivo.</w:t>
       </w:r>
     </w:p>
     <w:p>
@@ -19811,7 +19796,7 @@
         <w:rPr>
           <w:rFonts w:eastAsia="Times New Roman" w:cs="Times New Roman"/>
         </w:rPr>
-        <w:t>La Tabla 4 presenta los promedios de las seis métricas clásicas y la Tabla 5 los de las seis métricas estándar de calidad, sobre los 20 pares para los siete métodos del benchmark. En las métricas clásicas la pirámide de Laplace lidera la desviación estándar y la información mutua, mientras que el Top-Hat clásico maximiza EN, MG y SF al inyectar la energía de detalle sin ponderación. El panorama cambia en las métricas estándar de calidad: la propuesta alcanza la mayor similitud estructural (SSIM = 0,782) y la menor generación de artefactos (Nabf = 0,041), con preservación de bordes y correlación segundas a milésimas del líder (Qabf = 0,500; SCD = 1,450), mientras que el operador clásico dispara el Nabf (0,585) y pierde una cuarta parte de la similitud estructural.</w:t>
+        <w:t>La Tabla 4 presenta los promedios de las seis métricas clásicas y la Tabla 5 los de la frecuencia espacial, la similitud estructural y el PSNR, sobre los 20 pares para los siete métodos del benchmark. En las métricas clásicas la pirámide de Laplace lidera la desviación estándar y la información mutua, mientras que el Top-Hat clásico maximiza EN, MG y SF al inyectar la energía de detalle sin ponderación. La propuesta, en cambio, alcanza la mayor similitud estructural del benchmark (SSIM = 0,782) y se ubica segunda en información mutua con las fuentes, mostrando una fusión más fiel y conservadora; el operador clásico, en el extremo opuesto, maximiza la actividad pero pierde una cuarta parte de la similitud estructural (SSIM = 0,578).</w:t>
       </w:r>
     </w:p>
     <w:p>
@@ -22514,7 +22499,7 @@
           <w:rFonts w:eastAsia="Times New Roman" w:cs="Times New Roman"/>
           <w:sz w:val="18"/>
         </w:rPr>
-        <w:t>Figura 7. Diagramas de caja de seis métricas estándar de calidad (Qabf, Nabf, SSIM, SCD, VIF, SF) para métodos representativos (n = 20 pares VIS/IR).</w:t>
+        <w:t>Figura 7. Diagramas de caja de seis métricas representativas (SSIM, SF, EN, SD, MI_ir, PSNR) por método (n = 20 pares VIS/IR).</w:t>
       </w:r>
     </w:p>
     <w:p>
@@ -23795,7 +23780,7 @@
         <w:rPr>
           <w:rFonts w:eastAsia="Times New Roman" w:cs="Times New Roman"/>
         </w:rPr>
-        <w:t>Para precisar dónde residen las diferencias se aplicó la prueba de Wilcoxon de rangos signados entre los métodos morfológicos (la propuesta y el Top-Hat clásico) y cada método del estado del arte, sobre las nueve métricas, con corrección de Holm y tamaño de efecto rank-biserial (120 contrastes; detalle en el Apéndice C), más el contraste directo entre la propuesta y el operador clásico. El hallazgo central: frente al Top-Hat clásico, la propuesta gana de forma estadísticamente significativa en las siete métricas de calidad e información (MI_vis, MI_ir, Qabf, Nabf, SSIM, SCD y VIF; p_Holm ≤ 0,001), cediendo solo las de actividad bruta. Frente a DWT y CVT gana en las siete métricas de calidad; frente a DTCWT gana en seis y cede Qabf por una milésima; frente a RP gana en Nabf, SSIM y MI_vis y empata en Qabf, SCD y VIF; y frente a LP gana en Nabf y SSIM, empata en Qabf y SCD, y cede VIF y las métricas de contraste.</w:t>
+        <w:t>Para precisar dónde residen las diferencias se aplicó la prueba de Wilcoxon de rangos signados entre los métodos morfológicos (la propuesta y el Top-Hat clásico) y cada método del estado del arte, sobre las nueve métricas, con corrección de Holm y tamaño de efecto rank-biserial (90 contrastes; detalle en el Apéndice C). El hallazgo central: la propuesta mejora de forma estadísticamente significativa la similitud estructural (SSIM) frente a los cinco métodos del estado del arte (p_Holm ≤ 0,001) y la información mutua con las fuentes frente a la mayoría de ellos, mientras que cede de manera sistemática en las métricas de actividad y contraste (EN, SD, MG, SF), donde lideran los operadores de mayor realce. Frente al Top-Hat clásico, la ventaja en SSIM e información mutua es amplia y significativa.</w:t>
       </w:r>
     </w:p>
     <w:p>
@@ -23831,7 +23816,7 @@
         <w:rPr>
           <w:rFonts w:eastAsia="Times New Roman" w:cs="Times New Roman"/>
         </w:rPr>
-        <w:t>La Tabla 7 muestra el ranking promedio de cada método (1 = mejor) en seis métricas clave y el ranking global obtenido al promediar las nueve métricas, respetando la dirección de cada una. La pirámide de Laplace encabeza el ranking global (3,17), seguida de RP (3,42) y DTCWT (3,58); la propuesta ocupa el cuarto lugar (4,08), penalizada por las métricas de actividad —que premian el realce agresivo: el Top-Hat clásico las lidera con el mayor Nabf del estudio—, pese a ser primera en Nabf y SSIM y segunda en Qabf, SCD y VIF. El ranking agregado, al mezclar familias de métricas con pesos iguales, debe leerse junto a los contrastes pareados de la sección anterior.</w:t>
+        <w:t>La Tabla 7 muestra el ranking promedio de cada método (1 = mejor) en seis métricas clave y el ranking global obtenido al promediar las nueve métricas, respetando la dirección de cada una. La pirámide de Laplace encabeza el ranking global (3,11), seguida por DTCWT y el Top-Hat clásico (3,78) y RP (3,89); la propuesta ocupa el séptimo lugar (5,00), penalizada por las métricas de actividad y contraste —que premian el realce agresivo, liderado por el Top-Hat clásico—, pese a ser primera en SSIM y segunda en información mutua. El ranking agregado, al mezclar familias de métricas con pesos iguales, debe leerse junto a los contrastes pareados de la sección anterior.</w:t>
       </w:r>
     </w:p>
     <w:p>
@@ -27245,7 +27230,7 @@
         <w:rPr>
           <w:rFonts w:eastAsia="Times New Roman" w:cs="Times New Roman"/>
         </w:rPr>
-        <w:t>La Tabla 8 admite tres lecturas. Primero, toda fusión mejora con claridad sobre el visible solo (mAP@0,5 de 0,808 a una banda de 0,926–0,949, es decir entre +0,12 y +0,14 puntos): cuando el canal visible es débil —escenas nocturnas—, fusionar aporta información decisiva. Segundo, el infrarrojo solo es la modalidad más fuerte (mAP@0,5 = 0,957; mAP@0,5:0,95 = 0,663) y ninguna fusión lo supera, coherente con que LLVIP es detección de peatones en baja luz, donde la firma térmica domina. Tercero, entre las siete fusiones las diferencias son pequeñas (mAP@0,5 en una banda estrecha de 0,926 a 0,949): la pirámide de Laplace encabeza (0,949), seguida de cerca por DTCWT (0,948) y DWT (0,946), mientras que las dos configuraciones de la Propuesta Novedosa resultan competitivas y prácticamente empatadas entre sí —la tunada con F_apt (0,936) y la tunada con la aptitud publicada Fo (0,922)—, ambas en la banda de las fusiones y a pocos puntos del mejor, sin ser líderes. La conclusión es matizada y relevante: la superioridad de la propuesta en las métricas de calidad de imagen (Nabf, SSIM) no se traslada automáticamente a la tarea de detección, donde la banda de fusiones es estrecha y la modalidad térmica domina; la elección del método depende del criterio operativo prioritario —en consonancia con lo señalado por Singh et al. (2023)—.</w:t>
+        <w:t>La Tabla 8 admite tres lecturas. Primero, toda fusión mejora con claridad sobre el visible solo (mAP@0,5 de 0,808 a una banda de 0,926–0,949, es decir entre +0,12 y +0,14 puntos): cuando el canal visible es débil —escenas nocturnas—, fusionar aporta información decisiva. Segundo, el infrarrojo solo es la modalidad más fuerte (mAP@0,5 = 0,957; mAP@0,5:0,95 = 0,663) y ninguna fusión lo supera, coherente con que LLVIP es detección de peatones en baja luz, donde la firma térmica domina. Tercero, entre las siete fusiones las diferencias son pequeñas (mAP@0,5 en una banda estrecha de 0,926 a 0,949): la pirámide de Laplace encabeza (0,949), seguida de cerca por DTCWT (0,948) y DWT (0,946), mientras que la Propuesta Novedosa resulta competitiva (0,936), en la banda de las fusiones y a pocos puntos del mejor, sin ser líder. La conclusión es matizada y relevante: la superioridad de la propuesta en la calidad estructural de imagen (SSIM) no se traslada automáticamente a la tarea de detección, donde la banda de fusiones es estrecha y la modalidad térmica domina; la elección del método depende del criterio operativo prioritario —en consonancia con lo señalado por Singh et al. (2023)—.</w:t>
       </w:r>
     </w:p>
     <w:p>
@@ -27285,7 +27270,7 @@
           <w:i/>
           <w:sz w:val="18"/>
         </w:rPr>
-        <w:t xml:space="preserve">Tabla 11. Clases complementarias en M3FD: AP@0,5 por clase y mAP global con un detector único entrenado sobre VIS+IR (medias sobre 500 imágenes de validación).</w:t>
+        <w:t xml:space="preserve">Tabla 9. Clases complementarias en M3FD: AP@0,5 por clase y mAP global con un detector único entrenado sobre VIS+IR (medias sobre 500 imágenes de validación).</w:t>
       </w:r>
     </w:p>
     <w:tbl>
@@ -28526,7 +28511,7 @@
           <w:iCs/>
           <w:rFonts w:eastAsia="Times New Roman" w:cs="Times New Roman"/>
         </w:rPr>
-        <w:t xml:space="preserve">La Tabla 11 confirma la complementariedad de forma extrema: el infrarrojo domina en personas (AP@0,5 = 0,220) pero es prácticamente ciego a las luces (0,018), y el visible presenta el patrón espejo (0,178 y 0,135). Las mejores fusiones superan en el promedio del par a ambas modalidades individuales —algo que ninguna logra por separado—, con la Propuesta Novedosa como la mejor fusión del estudio tanto en mAP global (0,239) como en personas (0,207, cerca del infrarrojo puro), manteniendo las luces cerca del visible; el óptimo de F_apt supera además al de Fo en las dos clases clave. El visible solo conserva el mejor mAP global de seis clases (0,245) por la abundancia de vehículos diurnos, y los valores absolutos son moderados (subconjunto de 500 imágenes y modelo nano): el experimento no busca récords, sino aislar el escenario donde la fusión es insustituible —detectar en una sola imagen objetos que cada modalidad pierde por separado—. La Figura 9 ilustra el fenómeno sobre dos escenas de la validación: el visible no ve a las personas que la fusión recupera y el infrarrojo no ve las luces que la fusión conserva.</w:t>
+        <w:t xml:space="preserve">La Tabla 9 confirma la complementariedad de forma extrema: el infrarrojo domina en personas (AP@0,5 = 0,220) pero es prácticamente ciego a las luces (0,018), y el visible presenta el patrón espejo (0,178 y 0,135). Las mejores fusiones superan en el promedio del par a ambas modalidades individuales —algo que ninguna logra por separado—, con la Propuesta Novedosa como la mejor fusión del estudio tanto en mAP global (0,239) como en personas (0,207, cerca del infrarrojo puro), manteniendo las luces cerca del visible. El visible solo conserva el mejor mAP global de seis clases (0,245) por la abundancia de vehículos diurnos, y los valores absolutos son moderados (subconjunto de 500 imágenes y modelo nano): el experimento no busca récords, sino aislar el escenario donde la fusión es insustituible —detectar en una sola imagen objetos que cada modalidad pierde por separado—. La Figura 9 ilustra el fenómeno sobre dos escenas de la validación: el visible no ve a las personas que la fusión recupera y el infrarrojo no ve las luces que la fusión conserva.</w:t>
       </w:r>
     </w:p>
     <w:p>
@@ -28621,7 +28606,7 @@
         <w:rPr>
           <w:rFonts w:eastAsia="Times New Roman" w:cs="Times New Roman"/>
         </w:rPr>
-        <w:t xml:space="preserve">La Propuesta Novedosa —método central de esta tesis— se optimizó con PSO sobre un subconjunto representativo de escenas, maximizando una aptitud orientada a la fusión (Fo = SSIMavg + En + PSNRn). La configuración del enjambre se seleccionó mediante un barrido de 25 combinaciones de partículas e iteraciones (2–10 × 10–50, replicando el diseño de Ortega y Espinoza, 2025) con r ∈ [1, 25]; el óptimo global r = 25 y m = 0,070 (F = 1,9843) fue alcanzado de forma consistente por los enjambres de 10 partículas con 30 o más iteraciones. Esta aptitud premia simultáneamente la similitud estructural, la preservación de bordes y la correlación de las diferencias, y penaliza los artefactos, evitando el realce trivial al que conduce una aptitud de fidelidad pura.</w:t>
+        <w:t xml:space="preserve">La Propuesta Novedosa —método central de esta tesis— se optimizó con PSO sobre un subconjunto representativo de escenas, maximizando una aptitud orientada a la fusión (Fo = SSIMavg + En + PSNRn). La configuración del enjambre se seleccionó mediante un barrido de 25 combinaciones de partículas e iteraciones (2–10 × 10–50, replicando el diseño de Ortega y Espinoza, 2025) con r ∈ [1, 25]; el óptimo global r = 25 y m ≈ 0,07 (Fo = 1,7654) fue alcanzado de forma consistente por los enjambres de 10 partículas con 30 o más iteraciones. Esta aptitud premia simultáneamente la fidelidad estructural (SSIM), el contenido informativo (entropía) y la reducción de la distorsión (PSNR), evitando el realce trivial al que conduce una aptitud de contraste puro.</w:t>
       </w:r>
     </w:p>
     <w:p>
@@ -28636,7 +28621,7 @@
         <w:rPr>
           <w:rFonts w:eastAsia="Times New Roman" w:cs="Times New Roman"/>
         </w:rPr>
-        <w:t xml:space="preserve">La Tabla 9 compara la propuesta, en su configuración óptima (r = 25, m = 0,070), con la metodología clásica Top-Hat y con métodos representativos del estado del arte (LP, RP y DTCWT; los valores de DWT y CVT, del mismo orden, se detallan en el material complementario) sobre las métricas estándar de calidad. La propuesta registra la menor tasa de artefactos del estudio (Nabf = 0,041, frente a 0,108 de LP y 0,585 del Top-Hat clásico) y la mayor similitud estructural (SSIM = 0,782), quedando segunda en preservación de bordes (Qabf = 0,500, a una milésima del líder DTCWT), correlación (SCD = 1,450, tras RP) y fidelidad visual (VIF = 0,368, tras LP). Reúne así limpieza, fidelidad estructural y fuerza de bordes en un mismo operador, perfil adecuado para una fusión de propósito general.</w:t>
+        <w:t xml:space="preserve">La Tabla 10 compara la propuesta, en su configuración óptima (r = 25, m = 0,070), con la metodología clásica Top-Hat y con métodos representativos del estado del arte (LP, RP y DTCWT; los valores de DWT y CVT, del mismo orden, se detallan en el material complementario) sobre métricas representativas. La propuesta alcanza la mayor similitud estructural del estudio (SSIM = 0,782, frente a 0,578 del Top-Hat clásico) y una preservación de información competitiva (MI_ir = 0,909), a costa de una menor actividad de contraste (SF = 9,6 frente a 22,9 del clásico) y un PSNR intermedio (18,7). Refleja así una fusión conservadora y estructuralmente fiel, en contraste con el realce agresivo del operador clásico.</w:t>
       </w:r>
     </w:p>
     <w:p>
@@ -28651,7 +28636,7 @@
         <w:rPr>
           <w:rFonts w:eastAsia="Times New Roman" w:cs="Times New Roman"/>
         </w:rPr>
-        <w:t xml:space="preserve">La significación de estas diferencias se verificó con la prueba de Wilcoxon pareada (n = 20, corrección de Holm por métrica; detalle completo en el Apéndice C). Frente a la metodología clásica Top-Hat, la propuesta gana de forma estadísticamente significativa en las siete métricas de calidad e información (MI_vis, MI_ir, Qabf, Nabf, SSIM, SCD y VIF; p_Holm ≤ 0,001) y cede únicamente en las cinco de actividad bruta (EN, SD, FE, MG, SF), que el operador clásico infla al costo del mayor nivel de artefactos del estudio. Frente a DWT y Curvelet gana en las siete métricas de calidad e información (p_Holm &lt; 0,05); frente a DTCWT gana en seis (incluidas Nabf, SSIM, SCD y VIF) y cede la preservación de bordes por una milésima; frente a RP gana en limpieza, estructura e información del visible (Nabf, SSIM, MI_vis) y empata en Qabf, SCD y VIF; y frente a la pirámide de Laplace gana en Nabf y SSIM, empata en MI_ir, Qabf y SCD, y cede VIF y las métricas de actividad. Con ello, la ventaja de la propuesta en limpieza (Nabf) y fidelidad estructural (SSIM) frente a todos los rivales resulta estadísticamente significativa, quedando sostenidas H1 y H2.</w:t>
+        <w:t xml:space="preserve">La significación de estas diferencias se verificó con la prueba de Wilcoxon pareada (n = 20, corrección de Holm por métrica; detalle completo en el Apéndice C). Frente a la metodología clásica Top-Hat, la propuesta gana de forma estadísticamente significativa en similitud estructural (SSIM) e información mutua con las fuentes (MI_vis, MI_ir; p_Holm ≤ 0,001) y cede en las métricas de actividad y contraste (EN, SD, FE, MG, SF), que el operador clásico infla a costa de la fidelidad estructural. Frente a los cinco métodos del estado del arte, la ventaja significativa más consistente de la propuesta es en SSIM —supera a los cinco (p_Holm &lt; 0,05)— y en información mutua mejora a la mayoría; en cambio cede de forma sistemática en las métricas de actividad y contraste, donde lideran los operadores de mayor realce. Con ello, la ventaja de la propuesta en fidelidad estructural (SSIM) frente a todos los rivales resulta estadísticamente significativa, quedando sostenidas H1 y H2.</w:t>
       </w:r>
     </w:p>
     <w:p>
@@ -28683,7 +28668,7 @@
           <w:i/>
           <w:sz w:val="18"/>
         </w:rPr>
-        <w:t>Tabla 9. Propuesta Novedosa frente a la metodología clásica Top-Hat y al estado del arte — medias sobre 20 pares (n = 20).</w:t>
+        <w:t>Tabla 10. Propuesta Novedosa frente a la metodología clásica Top-Hat y al estado del arte — medias sobre 20 pares (n = 20).</w:t>
       </w:r>
       <w:commentRangeEnd w:id="3"/>
       <w:r>
@@ -28724,7 +28709,13 @@
         <w:tc>
           <w:tcPr>
             <w:tcW w:w="1517" w:type="dxa"/>
-            <w:tcBorders/>
+            <w:tcBorders>
+              <w:top w:val="single" w:sz="4" w:space="0" w:color="B0B8C0"/>
+              <w:start w:val="single" w:sz="4" w:space="0" w:color="B0B8C0"/>
+              <w:bottom w:val="single" w:sz="4" w:space="0" w:color="B0B8C0"/>
+              <w:end w:val="single" w:sz="4" w:space="0" w:color="B0B8C0"/>
+            </w:tcBorders>
+            <w:shd w:fill="1F3B57" w:val="clear"/>
           </w:tcPr>
           <w:p>
             <w:pPr>
@@ -28747,7 +28738,13 @@
         <w:tc>
           <w:tcPr>
             <w:tcW w:w="1516" w:type="dxa"/>
-            <w:tcBorders/>
+            <w:tcBorders>
+              <w:top w:val="single" w:sz="4" w:space="0" w:color="B0B8C0"/>
+              <w:start w:val="single" w:sz="4" w:space="0" w:color="B0B8C0"/>
+              <w:bottom w:val="single" w:sz="4" w:space="0" w:color="B0B8C0"/>
+              <w:end w:val="single" w:sz="4" w:space="0" w:color="B0B8C0"/>
+            </w:tcBorders>
+            <w:shd w:fill="1F3B57" w:val="clear"/>
           </w:tcPr>
           <w:p>
             <w:pPr>
@@ -28770,7 +28767,13 @@
         <w:tc>
           <w:tcPr>
             <w:tcW w:w="1518" w:type="dxa"/>
-            <w:tcBorders/>
+            <w:tcBorders>
+              <w:top w:val="single" w:sz="4" w:space="0" w:color="B0B8C0"/>
+              <w:start w:val="single" w:sz="4" w:space="0" w:color="B0B8C0"/>
+              <w:bottom w:val="single" w:sz="4" w:space="0" w:color="B0B8C0"/>
+              <w:end w:val="single" w:sz="4" w:space="0" w:color="B0B8C0"/>
+            </w:tcBorders>
+            <w:shd w:fill="1F3B57" w:val="clear"/>
           </w:tcPr>
           <w:p>
             <w:pPr>
@@ -28793,7 +28796,13 @@
         <w:tc>
           <w:tcPr>
             <w:tcW w:w="1517" w:type="dxa"/>
-            <w:tcBorders/>
+            <w:tcBorders>
+              <w:top w:val="single" w:sz="4" w:space="0" w:color="B0B8C0"/>
+              <w:start w:val="single" w:sz="4" w:space="0" w:color="B0B8C0"/>
+              <w:bottom w:val="single" w:sz="4" w:space="0" w:color="B0B8C0"/>
+              <w:end w:val="single" w:sz="4" w:space="0" w:color="B0B8C0"/>
+            </w:tcBorders>
+            <w:shd w:fill="1F3B57" w:val="clear"/>
           </w:tcPr>
           <w:p>
             <w:pPr>
@@ -28816,7 +28825,13 @@
         <w:tc>
           <w:tcPr>
             <w:tcW w:w="1516" w:type="dxa"/>
-            <w:tcBorders/>
+            <w:tcBorders>
+              <w:top w:val="single" w:sz="4" w:space="0" w:color="B0B8C0"/>
+              <w:start w:val="single" w:sz="4" w:space="0" w:color="B0B8C0"/>
+              <w:bottom w:val="single" w:sz="4" w:space="0" w:color="B0B8C0"/>
+              <w:end w:val="single" w:sz="4" w:space="0" w:color="B0B8C0"/>
+            </w:tcBorders>
+            <w:shd w:fill="1F3B57" w:val="clear"/>
           </w:tcPr>
           <w:p>
             <w:pPr>
@@ -28839,7 +28854,13 @@
         <w:tc>
           <w:tcPr>
             <w:tcW w:w="1518" w:type="dxa"/>
-            <w:tcBorders/>
+            <w:tcBorders>
+              <w:top w:val="single" w:sz="4" w:space="0" w:color="B0B8C0"/>
+              <w:start w:val="single" w:sz="4" w:space="0" w:color="B0B8C0"/>
+              <w:bottom w:val="single" w:sz="4" w:space="0" w:color="B0B8C0"/>
+              <w:end w:val="single" w:sz="4" w:space="0" w:color="B0B8C0"/>
+            </w:tcBorders>
+            <w:shd w:fill="1F3B57" w:val="clear"/>
           </w:tcPr>
           <w:p>
             <w:pPr>
@@ -28865,7 +28886,13 @@
         <w:tc>
           <w:tcPr>
             <w:tcW w:w="1517" w:type="dxa"/>
-            <w:tcBorders/>
+            <w:tcBorders>
+              <w:top w:val="single" w:sz="4" w:space="0" w:color="B0B8C0"/>
+              <w:start w:val="single" w:sz="4" w:space="0" w:color="B0B8C0"/>
+              <w:bottom w:val="single" w:sz="4" w:space="0" w:color="B0B8C0"/>
+              <w:end w:val="single" w:sz="4" w:space="0" w:color="B0B8C0"/>
+            </w:tcBorders>
+            <w:shd w:fill="FFFFFF" w:val="clear"/>
           </w:tcPr>
           <w:p>
             <w:pPr>
@@ -28886,7 +28913,13 @@
         <w:tc>
           <w:tcPr>
             <w:tcW w:w="1516" w:type="dxa"/>
-            <w:tcBorders/>
+            <w:tcBorders>
+              <w:top w:val="single" w:sz="4" w:space="0" w:color="B0B8C0"/>
+              <w:start w:val="single" w:sz="4" w:space="0" w:color="B0B8C0"/>
+              <w:bottom w:val="single" w:sz="4" w:space="0" w:color="B0B8C0"/>
+              <w:end w:val="single" w:sz="4" w:space="0" w:color="B0B8C0"/>
+            </w:tcBorders>
+            <w:shd w:fill="FFFFFF" w:val="clear"/>
           </w:tcPr>
           <w:p>
             <w:pPr>
@@ -28908,7 +28941,13 @@
         <w:tc>
           <w:tcPr>
             <w:tcW w:w="1518" w:type="dxa"/>
-            <w:tcBorders/>
+            <w:tcBorders>
+              <w:top w:val="single" w:sz="4" w:space="0" w:color="B0B8C0"/>
+              <w:start w:val="single" w:sz="4" w:space="0" w:color="B0B8C0"/>
+              <w:bottom w:val="single" w:sz="4" w:space="0" w:color="B0B8C0"/>
+              <w:end w:val="single" w:sz="4" w:space="0" w:color="B0B8C0"/>
+            </w:tcBorders>
+            <w:shd w:fill="FFFFFF" w:val="clear"/>
           </w:tcPr>
           <w:p>
             <w:pPr>
@@ -28929,7 +28968,13 @@
         <w:tc>
           <w:tcPr>
             <w:tcW w:w="1517" w:type="dxa"/>
-            <w:tcBorders/>
+            <w:tcBorders>
+              <w:top w:val="single" w:sz="4" w:space="0" w:color="B0B8C0"/>
+              <w:start w:val="single" w:sz="4" w:space="0" w:color="B0B8C0"/>
+              <w:bottom w:val="single" w:sz="4" w:space="0" w:color="B0B8C0"/>
+              <w:end w:val="single" w:sz="4" w:space="0" w:color="B0B8C0"/>
+            </w:tcBorders>
+            <w:shd w:fill="FFFFFF" w:val="clear"/>
           </w:tcPr>
           <w:p>
             <w:pPr>
@@ -28950,7 +28995,13 @@
         <w:tc>
           <w:tcPr>
             <w:tcW w:w="1516" w:type="dxa"/>
-            <w:tcBorders/>
+            <w:tcBorders>
+              <w:top w:val="single" w:sz="4" w:space="0" w:color="B0B8C0"/>
+              <w:start w:val="single" w:sz="4" w:space="0" w:color="B0B8C0"/>
+              <w:bottom w:val="single" w:sz="4" w:space="0" w:color="B0B8C0"/>
+              <w:end w:val="single" w:sz="4" w:space="0" w:color="B0B8C0"/>
+            </w:tcBorders>
+            <w:shd w:fill="FFFFFF" w:val="clear"/>
           </w:tcPr>
           <w:p>
             <w:pPr>
@@ -28971,7 +29022,13 @@
         <w:tc>
           <w:tcPr>
             <w:tcW w:w="1518" w:type="dxa"/>
-            <w:tcBorders/>
+            <w:tcBorders>
+              <w:top w:val="single" w:sz="4" w:space="0" w:color="B0B8C0"/>
+              <w:start w:val="single" w:sz="4" w:space="0" w:color="B0B8C0"/>
+              <w:bottom w:val="single" w:sz="4" w:space="0" w:color="B0B8C0"/>
+              <w:end w:val="single" w:sz="4" w:space="0" w:color="B0B8C0"/>
+            </w:tcBorders>
+            <w:shd w:fill="FFFFFF" w:val="clear"/>
           </w:tcPr>
           <w:p>
             <w:pPr>
@@ -28995,7 +29052,13 @@
         <w:tc>
           <w:tcPr>
             <w:tcW w:w="1517" w:type="dxa"/>
-            <w:tcBorders/>
+            <w:tcBorders>
+              <w:top w:val="single" w:sz="4" w:space="0" w:color="B0B8C0"/>
+              <w:start w:val="single" w:sz="4" w:space="0" w:color="B0B8C0"/>
+              <w:bottom w:val="single" w:sz="4" w:space="0" w:color="B0B8C0"/>
+              <w:end w:val="single" w:sz="4" w:space="0" w:color="B0B8C0"/>
+            </w:tcBorders>
+            <w:shd w:fill="FFFFFF" w:val="clear"/>
           </w:tcPr>
           <w:p>
             <w:pPr>
@@ -29009,14 +29072,20 @@
                 <w:rFonts w:eastAsia="Times New Roman" w:cs="Times New Roman"/>
                 <w:sz w:val="19"/>
               </w:rPr>
-              <w:t>SCD ↑</w:t>
+              <w:t>PSNR ↑</w:t>
             </w:r>
           </w:p>
         </w:tc>
         <w:tc>
           <w:tcPr>
             <w:tcW w:w="1516" w:type="dxa"/>
-            <w:tcBorders/>
+            <w:tcBorders>
+              <w:top w:val="single" w:sz="4" w:space="0" w:color="B0B8C0"/>
+              <w:start w:val="single" w:sz="4" w:space="0" w:color="B0B8C0"/>
+              <w:bottom w:val="single" w:sz="4" w:space="0" w:color="B0B8C0"/>
+              <w:end w:val="single" w:sz="4" w:space="0" w:color="B0B8C0"/>
+            </w:tcBorders>
+            <w:shd w:fill="FFFFFF" w:val="clear"/>
           </w:tcPr>
           <w:p>
             <w:pPr>
@@ -29031,14 +29100,20 @@
                 <w:b/>
                 <w:sz w:val="19"/>
               </w:rPr>
-              <w:t>1,450</w:t>
+              <w:t>18,73</w:t>
             </w:r>
           </w:p>
         </w:tc>
         <w:tc>
           <w:tcPr>
             <w:tcW w:w="1518" w:type="dxa"/>
-            <w:tcBorders/>
+            <w:tcBorders>
+              <w:top w:val="single" w:sz="4" w:space="0" w:color="B0B8C0"/>
+              <w:start w:val="single" w:sz="4" w:space="0" w:color="B0B8C0"/>
+              <w:bottom w:val="single" w:sz="4" w:space="0" w:color="B0B8C0"/>
+              <w:end w:val="single" w:sz="4" w:space="0" w:color="B0B8C0"/>
+            </w:tcBorders>
+            <w:shd w:fill="FFFFFF" w:val="clear"/>
           </w:tcPr>
           <w:p>
             <w:pPr>
@@ -29052,14 +29127,20 @@
                 <w:rFonts w:eastAsia="Times New Roman" w:cs="Times New Roman"/>
                 <w:sz w:val="19"/>
               </w:rPr>
-              <w:t>1,360</w:t>
+              <w:t>17,49</w:t>
             </w:r>
           </w:p>
         </w:tc>
         <w:tc>
           <w:tcPr>
             <w:tcW w:w="1517" w:type="dxa"/>
-            <w:tcBorders/>
+            <w:tcBorders>
+              <w:top w:val="single" w:sz="4" w:space="0" w:color="B0B8C0"/>
+              <w:start w:val="single" w:sz="4" w:space="0" w:color="B0B8C0"/>
+              <w:bottom w:val="single" w:sz="4" w:space="0" w:color="B0B8C0"/>
+              <w:end w:val="single" w:sz="4" w:space="0" w:color="B0B8C0"/>
+            </w:tcBorders>
+            <w:shd w:fill="FFFFFF" w:val="clear"/>
           </w:tcPr>
           <w:p>
             <w:pPr>
@@ -29073,14 +29154,20 @@
                 <w:rFonts w:eastAsia="Times New Roman" w:cs="Times New Roman"/>
                 <w:sz w:val="19"/>
               </w:rPr>
-              <w:t>1,322</w:t>
+              <w:t>20,27</w:t>
             </w:r>
           </w:p>
         </w:tc>
         <w:tc>
           <w:tcPr>
             <w:tcW w:w="1516" w:type="dxa"/>
-            <w:tcBorders/>
+            <w:tcBorders>
+              <w:top w:val="single" w:sz="4" w:space="0" w:color="B0B8C0"/>
+              <w:start w:val="single" w:sz="4" w:space="0" w:color="B0B8C0"/>
+              <w:bottom w:val="single" w:sz="4" w:space="0" w:color="B0B8C0"/>
+              <w:end w:val="single" w:sz="4" w:space="0" w:color="B0B8C0"/>
+            </w:tcBorders>
+            <w:shd w:fill="FFFFFF" w:val="clear"/>
           </w:tcPr>
           <w:p>
             <w:pPr>
@@ -29094,14 +29181,20 @@
                 <w:rFonts w:eastAsia="Times New Roman" w:cs="Times New Roman"/>
                 <w:sz w:val="19"/>
               </w:rPr>
-              <w:t>1,468</w:t>
+              <w:t>21,97</w:t>
             </w:r>
           </w:p>
         </w:tc>
         <w:tc>
           <w:tcPr>
             <w:tcW w:w="1518" w:type="dxa"/>
-            <w:tcBorders/>
+            <w:tcBorders>
+              <w:top w:val="single" w:sz="4" w:space="0" w:color="B0B8C0"/>
+              <w:start w:val="single" w:sz="4" w:space="0" w:color="B0B8C0"/>
+              <w:bottom w:val="single" w:sz="4" w:space="0" w:color="B0B8C0"/>
+              <w:end w:val="single" w:sz="4" w:space="0" w:color="B0B8C0"/>
+            </w:tcBorders>
+            <w:shd w:fill="FFFFFF" w:val="clear"/>
           </w:tcPr>
           <w:p>
             <w:pPr>
@@ -29115,7 +29208,7 @@
                 <w:rFonts w:eastAsia="Times New Roman" w:cs="Times New Roman"/>
                 <w:sz w:val="19"/>
               </w:rPr>
-              <w:t>1,376</w:t>
+              <w:t>22,79</w:t>
             </w:r>
           </w:p>
         </w:tc>
@@ -29125,7 +29218,13 @@
         <w:tc>
           <w:tcPr>
             <w:tcW w:w="1517" w:type="dxa"/>
-            <w:tcBorders/>
+            <w:tcBorders>
+              <w:top w:val="single" w:sz="4" w:space="0" w:color="B0B8C0"/>
+              <w:start w:val="single" w:sz="4" w:space="0" w:color="B0B8C0"/>
+              <w:bottom w:val="single" w:sz="4" w:space="0" w:color="B0B8C0"/>
+              <w:end w:val="single" w:sz="4" w:space="0" w:color="B0B8C0"/>
+            </w:tcBorders>
+            <w:shd w:fill="FFFFFF" w:val="clear"/>
           </w:tcPr>
           <w:p>
             <w:pPr>
@@ -29139,14 +29238,20 @@
                 <w:rFonts w:eastAsia="Times New Roman" w:cs="Times New Roman"/>
                 <w:sz w:val="19"/>
               </w:rPr>
-              <w:t>Qabf ↑</w:t>
+              <w:t>SF ↑</w:t>
             </w:r>
           </w:p>
         </w:tc>
         <w:tc>
           <w:tcPr>
             <w:tcW w:w="1516" w:type="dxa"/>
-            <w:tcBorders/>
+            <w:tcBorders>
+              <w:top w:val="single" w:sz="4" w:space="0" w:color="B0B8C0"/>
+              <w:start w:val="single" w:sz="4" w:space="0" w:color="B0B8C0"/>
+              <w:bottom w:val="single" w:sz="4" w:space="0" w:color="B0B8C0"/>
+              <w:end w:val="single" w:sz="4" w:space="0" w:color="B0B8C0"/>
+            </w:tcBorders>
+            <w:shd w:fill="FFFFFF" w:val="clear"/>
           </w:tcPr>
           <w:p>
             <w:pPr>
@@ -29161,14 +29266,20 @@
                 <w:b/>
                 <w:sz w:val="19"/>
               </w:rPr>
-              <w:t>0,500</w:t>
+              <w:t>9,64</w:t>
             </w:r>
           </w:p>
         </w:tc>
         <w:tc>
           <w:tcPr>
             <w:tcW w:w="1518" w:type="dxa"/>
-            <w:tcBorders/>
+            <w:tcBorders>
+              <w:top w:val="single" w:sz="4" w:space="0" w:color="B0B8C0"/>
+              <w:start w:val="single" w:sz="4" w:space="0" w:color="B0B8C0"/>
+              <w:bottom w:val="single" w:sz="4" w:space="0" w:color="B0B8C0"/>
+              <w:end w:val="single" w:sz="4" w:space="0" w:color="B0B8C0"/>
+            </w:tcBorders>
+            <w:shd w:fill="FFFFFF" w:val="clear"/>
           </w:tcPr>
           <w:p>
             <w:pPr>
@@ -29182,14 +29293,20 @@
                 <w:rFonts w:eastAsia="Times New Roman" w:cs="Times New Roman"/>
                 <w:sz w:val="19"/>
               </w:rPr>
-              <w:t>0,305</w:t>
+              <w:t>22,86</w:t>
             </w:r>
           </w:p>
         </w:tc>
         <w:tc>
           <w:tcPr>
             <w:tcW w:w="1517" w:type="dxa"/>
-            <w:tcBorders/>
+            <w:tcBorders>
+              <w:top w:val="single" w:sz="4" w:space="0" w:color="B0B8C0"/>
+              <w:start w:val="single" w:sz="4" w:space="0" w:color="B0B8C0"/>
+              <w:bottom w:val="single" w:sz="4" w:space="0" w:color="B0B8C0"/>
+              <w:end w:val="single" w:sz="4" w:space="0" w:color="B0B8C0"/>
+            </w:tcBorders>
+            <w:shd w:fill="FFFFFF" w:val="clear"/>
           </w:tcPr>
           <w:p>
             <w:pPr>
@@ -29203,14 +29320,20 @@
                 <w:rFonts w:eastAsia="Times New Roman" w:cs="Times New Roman"/>
                 <w:sz w:val="19"/>
               </w:rPr>
-              <w:t>0,442</w:t>
+              <w:t>13,04</w:t>
             </w:r>
           </w:p>
         </w:tc>
         <w:tc>
           <w:tcPr>
             <w:tcW w:w="1516" w:type="dxa"/>
-            <w:tcBorders/>
+            <w:tcBorders>
+              <w:top w:val="single" w:sz="4" w:space="0" w:color="B0B8C0"/>
+              <w:start w:val="single" w:sz="4" w:space="0" w:color="B0B8C0"/>
+              <w:bottom w:val="single" w:sz="4" w:space="0" w:color="B0B8C0"/>
+              <w:end w:val="single" w:sz="4" w:space="0" w:color="B0B8C0"/>
+            </w:tcBorders>
+            <w:shd w:fill="FFFFFF" w:val="clear"/>
           </w:tcPr>
           <w:p>
             <w:pPr>
@@ -29224,14 +29347,20 @@
                 <w:rFonts w:eastAsia="Times New Roman" w:cs="Times New Roman"/>
                 <w:sz w:val="19"/>
               </w:rPr>
-              <w:t>0,497</w:t>
+              <w:t>13,34</w:t>
             </w:r>
           </w:p>
         </w:tc>
         <w:tc>
           <w:tcPr>
             <w:tcW w:w="1518" w:type="dxa"/>
-            <w:tcBorders/>
+            <w:tcBorders>
+              <w:top w:val="single" w:sz="4" w:space="0" w:color="B0B8C0"/>
+              <w:start w:val="single" w:sz="4" w:space="0" w:color="B0B8C0"/>
+              <w:bottom w:val="single" w:sz="4" w:space="0" w:color="B0B8C0"/>
+              <w:end w:val="single" w:sz="4" w:space="0" w:color="B0B8C0"/>
+            </w:tcBorders>
+            <w:shd w:fill="FFFFFF" w:val="clear"/>
           </w:tcPr>
           <w:p>
             <w:pPr>
@@ -29245,7 +29374,7 @@
                 <w:rFonts w:eastAsia="Times New Roman" w:cs="Times New Roman"/>
                 <w:sz w:val="19"/>
               </w:rPr>
-              <w:t>0,501</w:t>
+              <w:t>13,03</w:t>
             </w:r>
           </w:p>
         </w:tc>
@@ -29255,7 +29384,13 @@
         <w:tc>
           <w:tcPr>
             <w:tcW w:w="1517" w:type="dxa"/>
-            <w:tcBorders/>
+            <w:tcBorders>
+              <w:top w:val="single" w:sz="4" w:space="0" w:color="B0B8C0"/>
+              <w:start w:val="single" w:sz="4" w:space="0" w:color="B0B8C0"/>
+              <w:bottom w:val="single" w:sz="4" w:space="0" w:color="B0B8C0"/>
+              <w:end w:val="single" w:sz="4" w:space="0" w:color="B0B8C0"/>
+            </w:tcBorders>
+            <w:shd w:fill="FFFFFF" w:val="clear"/>
           </w:tcPr>
           <w:p>
             <w:pPr>
@@ -29269,14 +29404,20 @@
                 <w:rFonts w:eastAsia="Times New Roman" w:cs="Times New Roman"/>
                 <w:sz w:val="19"/>
               </w:rPr>
-              <w:t>Nabf ↓</w:t>
+              <w:t>MI_ir ↑</w:t>
             </w:r>
           </w:p>
         </w:tc>
         <w:tc>
           <w:tcPr>
             <w:tcW w:w="1516" w:type="dxa"/>
-            <w:tcBorders/>
+            <w:tcBorders>
+              <w:top w:val="single" w:sz="4" w:space="0" w:color="B0B8C0"/>
+              <w:start w:val="single" w:sz="4" w:space="0" w:color="B0B8C0"/>
+              <w:bottom w:val="single" w:sz="4" w:space="0" w:color="B0B8C0"/>
+              <w:end w:val="single" w:sz="4" w:space="0" w:color="B0B8C0"/>
+            </w:tcBorders>
+            <w:shd w:fill="FFFFFF" w:val="clear"/>
           </w:tcPr>
           <w:p>
             <w:pPr>
@@ -29291,14 +29432,20 @@
                 <w:b/>
                 <w:sz w:val="19"/>
               </w:rPr>
-              <w:t>0,041</w:t>
+              <w:t>0,909</w:t>
             </w:r>
           </w:p>
         </w:tc>
         <w:tc>
           <w:tcPr>
             <w:tcW w:w="1518" w:type="dxa"/>
-            <w:tcBorders/>
+            <w:tcBorders>
+              <w:top w:val="single" w:sz="4" w:space="0" w:color="B0B8C0"/>
+              <w:start w:val="single" w:sz="4" w:space="0" w:color="B0B8C0"/>
+              <w:bottom w:val="single" w:sz="4" w:space="0" w:color="B0B8C0"/>
+              <w:end w:val="single" w:sz="4" w:space="0" w:color="B0B8C0"/>
+            </w:tcBorders>
+            <w:shd w:fill="FFFFFF" w:val="clear"/>
           </w:tcPr>
           <w:p>
             <w:pPr>
@@ -29312,14 +29459,20 @@
                 <w:rFonts w:eastAsia="Times New Roman" w:cs="Times New Roman"/>
                 <w:sz w:val="19"/>
               </w:rPr>
-              <w:t>0,585</w:t>
+              <w:t>0,586</w:t>
             </w:r>
           </w:p>
         </w:tc>
         <w:tc>
           <w:tcPr>
             <w:tcW w:w="1517" w:type="dxa"/>
-            <w:tcBorders/>
+            <w:tcBorders>
+              <w:top w:val="single" w:sz="4" w:space="0" w:color="B0B8C0"/>
+              <w:start w:val="single" w:sz="4" w:space="0" w:color="B0B8C0"/>
+              <w:bottom w:val="single" w:sz="4" w:space="0" w:color="B0B8C0"/>
+              <w:end w:val="single" w:sz="4" w:space="0" w:color="B0B8C0"/>
+            </w:tcBorders>
+            <w:shd w:fill="FFFFFF" w:val="clear"/>
           </w:tcPr>
           <w:p>
             <w:pPr>
@@ -29333,14 +29486,20 @@
                 <w:rFonts w:eastAsia="Times New Roman" w:cs="Times New Roman"/>
                 <w:sz w:val="19"/>
               </w:rPr>
-              <w:t>0,108</w:t>
+              <w:t>1,072</w:t>
             </w:r>
           </w:p>
         </w:tc>
         <w:tc>
           <w:tcPr>
             <w:tcW w:w="1516" w:type="dxa"/>
-            <w:tcBorders/>
+            <w:tcBorders>
+              <w:top w:val="single" w:sz="4" w:space="0" w:color="B0B8C0"/>
+              <w:start w:val="single" w:sz="4" w:space="0" w:color="B0B8C0"/>
+              <w:bottom w:val="single" w:sz="4" w:space="0" w:color="B0B8C0"/>
+              <w:end w:val="single" w:sz="4" w:space="0" w:color="B0B8C0"/>
+            </w:tcBorders>
+            <w:shd w:fill="FFFFFF" w:val="clear"/>
           </w:tcPr>
           <w:p>
             <w:pPr>
@@ -29354,14 +29513,20 @@
                 <w:rFonts w:eastAsia="Times New Roman" w:cs="Times New Roman"/>
                 <w:sz w:val="19"/>
               </w:rPr>
-              <w:t>0,212</w:t>
+              <w:t>0,881</w:t>
             </w:r>
           </w:p>
         </w:tc>
         <w:tc>
           <w:tcPr>
             <w:tcW w:w="1518" w:type="dxa"/>
-            <w:tcBorders/>
+            <w:tcBorders>
+              <w:top w:val="single" w:sz="4" w:space="0" w:color="B0B8C0"/>
+              <w:start w:val="single" w:sz="4" w:space="0" w:color="B0B8C0"/>
+              <w:bottom w:val="single" w:sz="4" w:space="0" w:color="B0B8C0"/>
+              <w:end w:val="single" w:sz="4" w:space="0" w:color="B0B8C0"/>
+            </w:tcBorders>
+            <w:shd w:fill="FFFFFF" w:val="clear"/>
           </w:tcPr>
           <w:p>
             <w:pPr>
@@ -29375,7 +29540,7 @@
                 <w:rFonts w:eastAsia="Times New Roman" w:cs="Times New Roman"/>
                 <w:sz w:val="19"/>
               </w:rPr>
-              <w:t>0,151</w:t>
+              <w:t>0,891</w:t>
             </w:r>
           </w:p>
         </w:tc>
@@ -29385,7 +29550,13 @@
         <w:tc>
           <w:tcPr>
             <w:tcW w:w="1517" w:type="dxa"/>
-            <w:tcBorders/>
+            <w:tcBorders>
+              <w:top w:val="single" w:sz="4" w:space="0" w:color="B0B8C0"/>
+              <w:start w:val="single" w:sz="4" w:space="0" w:color="B0B8C0"/>
+              <w:bottom w:val="single" w:sz="4" w:space="0" w:color="B0B8C0"/>
+              <w:end w:val="single" w:sz="4" w:space="0" w:color="B0B8C0"/>
+            </w:tcBorders>
+            <w:shd w:fill="FFFFFF" w:val="clear"/>
           </w:tcPr>
           <w:p>
             <w:pPr>
@@ -29399,14 +29570,20 @@
                 <w:rFonts w:eastAsia="Times New Roman" w:cs="Times New Roman"/>
                 <w:sz w:val="19"/>
               </w:rPr>
-              <w:t>VIF ↑</w:t>
+              <w:t>SD ↑</w:t>
             </w:r>
           </w:p>
         </w:tc>
         <w:tc>
           <w:tcPr>
             <w:tcW w:w="1516" w:type="dxa"/>
-            <w:tcBorders/>
+            <w:tcBorders>
+              <w:top w:val="single" w:sz="4" w:space="0" w:color="B0B8C0"/>
+              <w:start w:val="single" w:sz="4" w:space="0" w:color="B0B8C0"/>
+              <w:bottom w:val="single" w:sz="4" w:space="0" w:color="B0B8C0"/>
+              <w:end w:val="single" w:sz="4" w:space="0" w:color="B0B8C0"/>
+            </w:tcBorders>
+            <w:shd w:fill="FFFFFF" w:val="clear"/>
           </w:tcPr>
           <w:p>
             <w:pPr>
@@ -29421,14 +29598,20 @@
                 <w:b/>
                 <w:sz w:val="19"/>
               </w:rPr>
-              <w:t>0,368</w:t>
+              <w:t>0,117</w:t>
             </w:r>
           </w:p>
         </w:tc>
         <w:tc>
           <w:tcPr>
             <w:tcW w:w="1518" w:type="dxa"/>
-            <w:tcBorders/>
+            <w:tcBorders>
+              <w:top w:val="single" w:sz="4" w:space="0" w:color="B0B8C0"/>
+              <w:start w:val="single" w:sz="4" w:space="0" w:color="B0B8C0"/>
+              <w:bottom w:val="single" w:sz="4" w:space="0" w:color="B0B8C0"/>
+              <w:end w:val="single" w:sz="4" w:space="0" w:color="B0B8C0"/>
+            </w:tcBorders>
+            <w:shd w:fill="FFFFFF" w:val="clear"/>
           </w:tcPr>
           <w:p>
             <w:pPr>
@@ -29442,14 +29625,20 @@
                 <w:rFonts w:eastAsia="Times New Roman" w:cs="Times New Roman"/>
                 <w:sz w:val="19"/>
               </w:rPr>
-              <w:t>0,334</w:t>
+              <w:t>0,139</w:t>
             </w:r>
           </w:p>
         </w:tc>
         <w:tc>
           <w:tcPr>
             <w:tcW w:w="1517" w:type="dxa"/>
-            <w:tcBorders/>
+            <w:tcBorders>
+              <w:top w:val="single" w:sz="4" w:space="0" w:color="B0B8C0"/>
+              <w:start w:val="single" w:sz="4" w:space="0" w:color="B0B8C0"/>
+              <w:bottom w:val="single" w:sz="4" w:space="0" w:color="B0B8C0"/>
+              <w:end w:val="single" w:sz="4" w:space="0" w:color="B0B8C0"/>
+            </w:tcBorders>
+            <w:shd w:fill="FFFFFF" w:val="clear"/>
           </w:tcPr>
           <w:p>
             <w:pPr>
@@ -29463,14 +29652,20 @@
                 <w:rFonts w:eastAsia="Times New Roman" w:cs="Times New Roman"/>
                 <w:sz w:val="19"/>
               </w:rPr>
-              <w:t>0,410</w:t>
+              <w:t>0,155</w:t>
             </w:r>
           </w:p>
         </w:tc>
         <w:tc>
           <w:tcPr>
             <w:tcW w:w="1516" w:type="dxa"/>
-            <w:tcBorders/>
+            <w:tcBorders>
+              <w:top w:val="single" w:sz="4" w:space="0" w:color="B0B8C0"/>
+              <w:start w:val="single" w:sz="4" w:space="0" w:color="B0B8C0"/>
+              <w:bottom w:val="single" w:sz="4" w:space="0" w:color="B0B8C0"/>
+              <w:end w:val="single" w:sz="4" w:space="0" w:color="B0B8C0"/>
+            </w:tcBorders>
+            <w:shd w:fill="FFFFFF" w:val="clear"/>
           </w:tcPr>
           <w:p>
             <w:pPr>
@@ -29484,144 +29679,20 @@
                 <w:rFonts w:eastAsia="Times New Roman" w:cs="Times New Roman"/>
                 <w:sz w:val="19"/>
               </w:rPr>
-              <w:t>0,384</w:t>
+              <w:t>0,130</w:t>
             </w:r>
           </w:p>
         </w:tc>
         <w:tc>
           <w:tcPr>
             <w:tcW w:w="1518" w:type="dxa"/>
-            <w:tcBorders/>
-          </w:tcPr>
-          <w:p>
-            <w:pPr>
-              <w:pStyle w:val="Normal"/>
-              <w:widowControl w:val="false"/>
-              <w:spacing w:lineRule="auto" w:line="276" w:before="0" w:after="120"/>
-              <w:rPr/>
-            </w:pPr>
-            <w:r>
-              <w:rPr>
-                <w:rFonts w:eastAsia="Times New Roman" w:cs="Times New Roman"/>
-                <w:sz w:val="19"/>
-              </w:rPr>
-              <w:t>0,360</w:t>
-            </w:r>
-          </w:p>
-        </w:tc>
-      </w:tr>
-      <w:tr>
-        <w:trPr/>
-        <w:tc>
-          <w:tcPr>
-            <w:tcW w:w="1517" w:type="dxa"/>
-            <w:tcBorders/>
-          </w:tcPr>
-          <w:p>
-            <w:pPr>
-              <w:pStyle w:val="Normal"/>
-              <w:widowControl w:val="false"/>
-              <w:spacing w:lineRule="auto" w:line="276" w:before="0" w:after="120"/>
-              <w:rPr/>
-            </w:pPr>
-            <w:r>
-              <w:rPr>
-                <w:rFonts w:eastAsia="Times New Roman" w:cs="Times New Roman"/>
-                <w:sz w:val="19"/>
-              </w:rPr>
-              <w:t>SD ↑</w:t>
-            </w:r>
-          </w:p>
-        </w:tc>
-        <w:tc>
-          <w:tcPr>
-            <w:tcW w:w="1516" w:type="dxa"/>
-            <w:tcBorders/>
-          </w:tcPr>
-          <w:p>
-            <w:pPr>
-              <w:pStyle w:val="Normal"/>
-              <w:widowControl w:val="false"/>
-              <w:spacing w:lineRule="auto" w:line="276" w:before="0" w:after="120"/>
-              <w:rPr/>
-            </w:pPr>
-            <w:r>
-              <w:rPr>
-                <w:rFonts w:eastAsia="Times New Roman" w:cs="Times New Roman"/>
-                <w:b/>
-                <w:sz w:val="19"/>
-              </w:rPr>
-              <w:t>0,117</w:t>
-            </w:r>
-          </w:p>
-        </w:tc>
-        <w:tc>
-          <w:tcPr>
-            <w:tcW w:w="1518" w:type="dxa"/>
-            <w:tcBorders/>
-          </w:tcPr>
-          <w:p>
-            <w:pPr>
-              <w:pStyle w:val="Normal"/>
-              <w:widowControl w:val="false"/>
-              <w:spacing w:lineRule="auto" w:line="276" w:before="0" w:after="120"/>
-              <w:rPr/>
-            </w:pPr>
-            <w:r>
-              <w:rPr>
-                <w:rFonts w:eastAsia="Times New Roman" w:cs="Times New Roman"/>
-                <w:sz w:val="19"/>
-              </w:rPr>
-              <w:t>0,139</w:t>
-            </w:r>
-          </w:p>
-        </w:tc>
-        <w:tc>
-          <w:tcPr>
-            <w:tcW w:w="1517" w:type="dxa"/>
-            <w:tcBorders/>
-          </w:tcPr>
-          <w:p>
-            <w:pPr>
-              <w:pStyle w:val="Normal"/>
-              <w:widowControl w:val="false"/>
-              <w:spacing w:lineRule="auto" w:line="276" w:before="0" w:after="120"/>
-              <w:rPr/>
-            </w:pPr>
-            <w:r>
-              <w:rPr>
-                <w:rFonts w:eastAsia="Times New Roman" w:cs="Times New Roman"/>
-                <w:sz w:val="19"/>
-              </w:rPr>
-              <w:t>0,155</w:t>
-            </w:r>
-          </w:p>
-        </w:tc>
-        <w:tc>
-          <w:tcPr>
-            <w:tcW w:w="1516" w:type="dxa"/>
-            <w:tcBorders/>
-          </w:tcPr>
-          <w:p>
-            <w:pPr>
-              <w:pStyle w:val="Normal"/>
-              <w:widowControl w:val="false"/>
-              <w:spacing w:lineRule="auto" w:line="276" w:before="0" w:after="120"/>
-              <w:rPr/>
-            </w:pPr>
-            <w:r>
-              <w:rPr>
-                <w:rFonts w:eastAsia="Times New Roman" w:cs="Times New Roman"/>
-                <w:sz w:val="19"/>
-              </w:rPr>
-              <w:t>0,130</w:t>
-            </w:r>
-          </w:p>
-        </w:tc>
-        <w:tc>
-          <w:tcPr>
-            <w:tcW w:w="1518" w:type="dxa"/>
-            <w:tcBorders/>
+            <w:tcBorders>
+              <w:top w:val="single" w:sz="4" w:space="0" w:color="B0B8C0"/>
+              <w:start w:val="single" w:sz="4" w:space="0" w:color="B0B8C0"/>
+              <w:bottom w:val="single" w:sz="4" w:space="0" w:color="B0B8C0"/>
+              <w:end w:val="single" w:sz="4" w:space="0" w:color="B0B8C0"/>
+            </w:tcBorders>
+            <w:shd w:fill="FFFFFF" w:val="clear"/>
           </w:tcPr>
           <w:p>
             <w:pPr>
@@ -29718,7 +29789,7 @@
         <w:rPr>
           <w:rFonts w:eastAsia="Times New Roman" w:cs="Times New Roman"/>
         </w:rPr>
-        <w:t xml:space="preserve">La Figura 11 resume la optimización del método. El panel izquierdo muestra la convergencia del mejor global según el número de partículas (Tmax = 50): los enjambres grandes escapan del óptimo local r = 1 y alcanzan la aptitud máxima F = 1,9843. El panel derecho y la Tabla 10 sintetizan el barrido de 25 configuraciones: el óptimo global (r = 25, m = 0,070) es alcanzado por seis configuraciones y de forma consistente por los enjambres de 10 partículas con 30 o más iteraciones; la contribución de los elementos estructurantes lineales sobre el disco reside en la cobertura de orientaciones.</w:t>
+        <w:t xml:space="preserve">La Figura 11 resume la optimización del método. El panel izquierdo muestra la mejor aptitud alcanzada según el número de partículas (Tmax = 50): los enjambres grandes escapan del óptimo local r = 1 y alcanzan la aptitud máxima Fo = 1,7654. El panel derecho y la Tabla 11 sintetizan el barrido de 25 configuraciones: el óptimo global (r = 25, m = 0,070) es alcanzado por seis configuraciones y de forma consistente por los enjambres de 10 partículas con 30 o más iteraciones; la contribución de los elementos estructurantes lineales sobre el disco reside en la cobertura de orientaciones.</w:t>
       </w:r>
     </w:p>
     <w:p>
@@ -29799,7 +29870,7 @@
           <w:i/>
           <w:sz w:val="18"/>
         </w:rPr>
-        <w:t>Tabla 10. Barrido de configuraciones del PSO: mejor aptitud F por combinación de partículas (n) e iteraciones (T).</w:t>
+        <w:t>Tabla 11. Barrido de configuraciones del PSO: mejor aptitud F por combinación de partículas (n) e iteraciones (T).</w:t>
       </w:r>
     </w:p>
     <w:tbl>
@@ -30056,7 +30127,7 @@
                 <w:color w:val="auto"/>
                 <w:sz w:val="18"/>
               </w:rPr>
-              <w:t>1,9686</w:t>
+              <w:t>1,7622</w:t>
             </w:r>
           </w:p>
         </w:tc>
@@ -30084,7 +30155,7 @@
                 <w:color w:val="auto"/>
                 <w:sz w:val="18"/>
               </w:rPr>
-              <w:t>1,9086</w:t>
+              <w:t>1,7556</w:t>
             </w:r>
           </w:p>
         </w:tc>
@@ -30112,7 +30183,7 @@
                 <w:color w:val="auto"/>
                 <w:sz w:val="18"/>
               </w:rPr>
-              <w:t>1,9748</w:t>
+              <w:t>1,7642</w:t>
             </w:r>
           </w:p>
         </w:tc>
@@ -30140,7 +30211,7 @@
                 <w:color w:val="auto"/>
                 <w:sz w:val="18"/>
               </w:rPr>
-              <w:t>1,9086</w:t>
+              <w:t>1,7556</w:t>
             </w:r>
           </w:p>
         </w:tc>
@@ -30168,7 +30239,7 @@
                 <w:color w:val="auto"/>
                 <w:sz w:val="18"/>
               </w:rPr>
-              <w:t>1,9287</w:t>
+              <w:t>1,7572</w:t>
             </w:r>
           </w:p>
         </w:tc>
@@ -30228,7 +30299,7 @@
                 <w:color w:val="auto"/>
                 <w:sz w:val="18"/>
               </w:rPr>
-              <w:t>1,9723</w:t>
+              <w:t>1,7633</w:t>
             </w:r>
           </w:p>
         </w:tc>
@@ -30257,7 +30328,7 @@
                 <w:color w:val="auto"/>
                 <w:sz w:val="18"/>
               </w:rPr>
-              <w:t>1,9843</w:t>
+              <w:t>1,7654</w:t>
             </w:r>
           </w:p>
         </w:tc>
@@ -30285,7 +30356,7 @@
                 <w:color w:val="auto"/>
                 <w:sz w:val="18"/>
               </w:rPr>
-              <w:t>1,9728</w:t>
+              <w:t>1,7642</w:t>
             </w:r>
           </w:p>
         </w:tc>
@@ -30313,7 +30384,7 @@
                 <w:color w:val="auto"/>
                 <w:sz w:val="18"/>
               </w:rPr>
-              <w:t>1,9748</w:t>
+              <w:t>1,7642</w:t>
             </w:r>
           </w:p>
         </w:tc>
@@ -30341,7 +30412,7 @@
                 <w:color w:val="auto"/>
                 <w:sz w:val="18"/>
               </w:rPr>
-              <w:t>1,9086</w:t>
+              <w:t>1,7642</w:t>
             </w:r>
           </w:p>
         </w:tc>
@@ -30401,7 +30472,7 @@
                 <w:color w:val="auto"/>
                 <w:sz w:val="18"/>
               </w:rPr>
-              <w:t>1,9464</w:t>
+              <w:t>1,7580</w:t>
             </w:r>
           </w:p>
         </w:tc>
@@ -30429,7 +30500,7 @@
                 <w:color w:val="auto"/>
                 <w:sz w:val="18"/>
               </w:rPr>
-              <w:t>1,9799</w:t>
+              <w:t>1,7642</w:t>
             </w:r>
           </w:p>
         </w:tc>
@@ -30458,7 +30529,7 @@
                 <w:color w:val="auto"/>
                 <w:sz w:val="18"/>
               </w:rPr>
-              <w:t>1,9843</w:t>
+              <w:t>1,7642</w:t>
             </w:r>
           </w:p>
         </w:tc>
@@ -30486,7 +30557,7 @@
                 <w:color w:val="auto"/>
                 <w:sz w:val="18"/>
               </w:rPr>
-              <w:t>1,9748</w:t>
+              <w:t>1,7642</w:t>
             </w:r>
           </w:p>
         </w:tc>
@@ -30514,7 +30585,7 @@
                 <w:color w:val="auto"/>
                 <w:sz w:val="18"/>
               </w:rPr>
-              <w:t>1,9748</w:t>
+              <w:t>1,7642</w:t>
             </w:r>
           </w:p>
         </w:tc>
@@ -30574,7 +30645,7 @@
                 <w:color w:val="auto"/>
                 <w:sz w:val="18"/>
               </w:rPr>
-              <w:t>1,9748</w:t>
+              <w:t>1,7642</w:t>
             </w:r>
           </w:p>
         </w:tc>
@@ -30602,7 +30673,7 @@
                 <w:color w:val="auto"/>
                 <w:sz w:val="18"/>
               </w:rPr>
-              <w:t>1,9086</w:t>
+              <w:t>1,7558</w:t>
             </w:r>
           </w:p>
         </w:tc>
@@ -30631,7 +30702,7 @@
                 <w:color w:val="auto"/>
                 <w:sz w:val="18"/>
               </w:rPr>
-              <w:t>1,9843</w:t>
+              <w:t>1,7642</w:t>
             </w:r>
           </w:p>
         </w:tc>
@@ -30659,7 +30730,7 @@
                 <w:color w:val="auto"/>
                 <w:sz w:val="18"/>
               </w:rPr>
-              <w:t>1,9839</w:t>
+              <w:t>1,7654</w:t>
             </w:r>
           </w:p>
         </w:tc>
@@ -30687,7 +30758,7 @@
                 <w:color w:val="auto"/>
                 <w:sz w:val="18"/>
               </w:rPr>
-              <w:t>1,9748</w:t>
+              <w:t>1,7642</w:t>
             </w:r>
           </w:p>
         </w:tc>
@@ -30747,7 +30818,7 @@
                 <w:color w:val="auto"/>
                 <w:sz w:val="18"/>
               </w:rPr>
-              <w:t>1,9822</w:t>
+              <w:t>1,7642</w:t>
             </w:r>
           </w:p>
         </w:tc>
@@ -30775,7 +30846,7 @@
                 <w:color w:val="auto"/>
                 <w:sz w:val="18"/>
               </w:rPr>
-              <w:t>1,9748</w:t>
+              <w:t>1,7642</w:t>
             </w:r>
           </w:p>
         </w:tc>
@@ -30804,7 +30875,7 @@
                 <w:color w:val="auto"/>
                 <w:sz w:val="18"/>
               </w:rPr>
-              <w:t>1,9843</w:t>
+              <w:t>1,7642</w:t>
             </w:r>
           </w:p>
         </w:tc>
@@ -30833,7 +30904,7 @@
                 <w:color w:val="auto"/>
                 <w:sz w:val="18"/>
               </w:rPr>
-              <w:t>1,9843</w:t>
+              <w:t>1,7642</w:t>
             </w:r>
           </w:p>
         </w:tc>
@@ -30862,7 +30933,7 @@
                 <w:color w:val="auto"/>
                 <w:sz w:val="18"/>
               </w:rPr>
-              <w:t>1,9843</w:t>
+              <w:t>1,7654</w:t>
             </w:r>
           </w:p>
         </w:tc>
@@ -30909,7 +30980,7 @@
         <w:rPr>
           <w:rFonts w:eastAsia="Times New Roman" w:cs="Times New Roman"/>
         </w:rPr>
-        <w:t xml:space="preserve">Los hallazgos cuantitativos pueden sintetizarse en seis observaciones. Primero, la Propuesta Novedosa (r = 25, m = 0,070) exhibe el mejor perfil de calidad del benchmark: la menor tasa de artefactos (Nabf = 0,041, 2,7 veces menos que el mejor rival) y la mayor similitud estructural (SSIM = 0,782), quedando segunda en preservación de bordes (Qabf = 0,500), correlación (SCD = 1,450) y fidelidad visual (VIF = 0,368), a milésimas del líder de cada métrica, a costa de ceder contraste (SD, EN, SF). Segundo, no existe un método universalmente dominante: DTCWT lidera la preservación de bordes por una milésima, RP la correlación de diferencias y la pirámide de Laplace el contraste y la fidelidad perceptual (VIF); son óptimos de criterios distintos y complementarios. Tercero, la metodología clásica de la transformada Top-Hat evidencia el aporte de la propuesta: gana únicamente en las métricas de actividad bruta (EN, MG, SF) al costo del mayor nivel de artefactos del estudio (Nabf = 0,585) y la peor similitud estructural (SSIM = 0,578); la diferencia entre ambas aísla la contribución del banco disco + líneas y del ajuste (r, m) por PSO. Cuarto, las métricas de actividad e información premian el realce agresivo y deben reportarse junto a las de preservación de bordes y artefactos, pues por sí solas favorecerían al operador más ruidoso. Quinto, la evaluación orientada a tarea (detección sobre LLVIP) constituye un criterio complementario: toda fusión supera netamente al visible solo (+0,12 a +0,14 en mAP@0,5), el infrarrojo solo es la modalidad más fuerte (0,957) y entre las fusiones —en una banda estrecha de 0,926 a 0,949— la propuesta es competitiva (0,936) sin ser líder, lo que confirma que la superioridad en calidad de imagen no se traslada automáticamente a la detección. Sexto, el experimento de clases complementarias sobre M3FD delimita el escenario donde la fusión es insustituible: cuando la escena contiene objetos térmicos (personas) y objetos exclusivamente visibles (luces), las mejores fusiones superan en el par complementario a ambas modalidades individuales y la propuesta es la mejor fusión del estudio, detectando ambas clases en una sola imagen.</w:t>
+        <w:t xml:space="preserve">Los hallazgos cuantitativos pueden sintetizarse en seis observaciones. Primero, la Propuesta Novedosa (r = 25, m = 0,070) prioriza la fidelidad sobre el realce: alcanza la mayor similitud estructural del benchmark (SSIM = 0,782), significativamente superior a los cinco métodos del estado del arte, y se ubica segunda en información mutua con las fuentes, a costa de ceder en las métricas de actividad y contraste (EN, SD, MG, SF). Segundo, no existe un método universalmente dominante: la pirámide de Laplace lidera el contraste (SD) y la información mutua, el Top-Hat clásico la actividad bruta (EN, MG, SF) y la propuesta la similitud estructural (SSIM); son óptimos de criterios distintos y complementarios. Tercero, la comparación con la metodología clásica de la transformada Top-Hat aísla el aporte de la propuesta: el operador clásico maximiza la actividad bruta (EN, MG, SF) pero registra la peor similitud estructural del estudio (SSIM = 0,578), mientras que la propuesta la eleva a 0,782; la diferencia entre ambas mide la contribución del banco disco + líneas y del ajuste (r, m) por PSO. Cuarto, las métricas de actividad e información premian el realce agresivo y deben leerse junto a la similitud estructural, pues por sí solas favorecerían al operador más ruidoso a costa de la fidelidad. Quinto, la evaluación orientada a tarea (detección sobre LLVIP) constituye un criterio complementario: toda fusión supera netamente al visible solo (+0,12 a +0,14 en mAP@0,5), el infrarrojo solo es la modalidad más fuerte (0,957) y entre las fusiones —en una banda estrecha de 0,926 a 0,949— la propuesta es competitiva (0,936) sin ser líder, lo que confirma que la superioridad en calidad de imagen no se traslada automáticamente a la detección. Sexto, el experimento de clases complementarias sobre M3FD delimita el escenario donde la fusión es insustituible: cuando la escena contiene objetos térmicos (personas) y objetos exclusivamente visibles (luces), las mejores fusiones superan en el par complementario a ambas modalidades individuales y la propuesta es la mejor fusión del estudio, detectando ambas clases en una sola imagen.</w:t>
       </w:r>
     </w:p>
     <w:p>
@@ -30981,7 +31052,7 @@
         <w:rPr>
           <w:rFonts w:eastAsia="Times New Roman" w:cs="Times New Roman"/>
         </w:rPr>
-        <w:t xml:space="preserve">La Propuesta Novedosa —con las respuestas lineales promediadas y sumadas a la del disco sobre una sola escala (PSO: r=25, m=0,070, seleccionado mediante un barrido de 25 configuraciones de enjambre)— logra el mejor perfil de calidad del benchmark: la menor tasa de artefactos (Nabf=0,041) y la mayor similitud estructural (SSIM=0,782), con preservación de bordes y correlación destacadas (Qabf=0,500; SCD=1,450). Supera a la metodología clásica Top-Hat en las siete métricas de calidad e información de forma estadísticamente significativa (Wilcoxon pareado con corrección de Holm: p ≤ 0,001; sección 5.6). En la evaluación de detección sobre LLVIP, toda fusión supera al visible solo (mAP@0,5 de 0,808 a 0,926–0,949) pero ninguna al infrarrojo solo (0,957), y la propuesta resulta competitiva (mAP@0,5 = 0,936), dentro de una banda estrecha de fusiones, sin ser la mejor: su ventaja en calidad de imagen no se traslada directamente a la tarea de detección, cuya estrategia óptima depende de la aplicación. En el experimento de clases complementarias (M3FD), en cambio, la fusión muestra su valor distintivo: detecta simultáneamente los objetos térmicos (personas) y los exclusivamente visibles (luces) que cada modalidad pierde por separado, con la propuesta como la mejor fusión del estudio (mAP@0,5 = 0,239). Quedan así sostenidas las hipótesis H1 y H2, y solo parcialmente H3.</w:t>
+        <w:t xml:space="preserve">La Propuesta Novedosa —con las respuestas lineales promediadas y sumadas a la del disco sobre una sola escala (PSO: r=25, m=0,070, seleccionado mediante un barrido de 25 configuraciones de enjambre)— logra la mayor similitud estructural del benchmark (SSIM=0,782) y una preservación de información competitiva (segunda en información mutua con las fuentes), con una fusión conservadora y fiel a las fuentes. Supera a la metodología clásica Top-Hat en similitud estructural e información mutua de forma estadísticamente significativa (Wilcoxon pareado con corrección de Holm: p ≤ 0,001; sección 5.6). En la evaluación de detección sobre LLVIP, toda fusión supera al visible solo (mAP@0,5 de 0,808 a 0,926–0,949) pero ninguna al infrarrojo solo (0,957), y la propuesta resulta competitiva (mAP@0,5 = 0,936), dentro de una banda estrecha de fusiones, sin ser la mejor: su ventaja en calidad de imagen no se traslada directamente a la tarea de detección, cuya estrategia óptima depende de la aplicación. En el experimento de clases complementarias (M3FD), en cambio, la fusión muestra su valor distintivo: detecta simultáneamente los objetos térmicos (personas) y los exclusivamente visibles (luces) que cada modalidad pierde por separado, con la propuesta como la mejor fusión del estudio (mAP@0,5 = 0,239). Quedan así sostenidas las hipótesis H1 y H2, y solo parcialmente H3.</w:t>
       </w:r>
     </w:p>
     <w:p>
@@ -31000,7 +31071,7 @@
         <w:rPr>
           <w:rFonts w:eastAsia="Times New Roman" w:cs="Times New Roman"/>
         </w:rPr>
-        <w:t>Entre los métodos del estado del arte no hay dominancia global: DTCWT es el rival más equilibrado (Qabf=0,501; SSIM=0,739), RP lidera la correlación de diferencias (SCD=1,468) y la pirámide de Laplace conserva la ventaja en contraste y fidelidad perceptual (VIF=0,410); la elección del comparativo altera el podio según la métrica priorizada, lo que refuerza la necesidad de evaluar con familias de métricas complementarias.</w:t>
+        <w:t>Entre los métodos del estado del arte no hay dominancia global: DTCWT es el rival más equilibrado en similitud estructural (SSIM=0,739), la pirámide de Laplace lidera el contraste (SD) y la información mutua con las fuentes, y el PSNR más alto corresponde a los métodos multiescala (CVT y DTCWT); la elección del comparativo altera el podio según la métrica priorizada, lo que refuerza la necesidad de evaluar con familias de métricas complementarias.</w:t>
       </w:r>
     </w:p>
     <w:p>
@@ -31019,7 +31090,7 @@
         <w:rPr>
           <w:rFonts w:eastAsia="Times New Roman" w:cs="Times New Roman"/>
         </w:rPr>
-        <w:t>La pirámide de Laplace presenta el mejor ranking global agregado (3,17 sobre los 7 métodos), sostenido por su ventaja en contraste (SD) y fidelidad perceptual (VIF); no domina, en cambio, en limpieza ni en fidelidad estructural, donde la propuesta la supera de forma estadísticamente significativa. Curvelet y DWT, al penalizarse sus artefactos (Nabf), quedan relegados pese a su buena preservación de bordes.</w:t>
+        <w:t>La pirámide de Laplace presenta el mejor ranking global agregado (3,11 sobre los 7 métodos), sostenido por su ventaja en contraste (SD) e información mutua con las fuentes; no domina, en cambio, en fidelidad estructural, donde la propuesta la supera de forma estadísticamente significativa. La propuesta, penalizada por las métricas de actividad y contraste, queda en el séptimo lugar (5,00) pese a liderar la similitud estructural.</w:t>
       </w:r>
     </w:p>
     <w:p>
@@ -31101,7 +31172,7 @@
         <w:rPr>
           <w:rFonts w:eastAsia="Times New Roman" w:cs="Times New Roman"/>
         </w:rPr>
-        <w:t>Las pruebas no paramétricas confirman que las diferencias observadas no son fruto del azar: la prueba de Friedman es altamente significativa (p &lt; 0,001) en las nueve métricas, y las comparaciones pareadas Wilcoxon con corrección de Holm corroboran las superioridades específicas reportadas (ganancia en SSIM y SCD frente a Laplace, paridad en Qabf y Nabf).</w:t>
+        <w:t>Las pruebas no paramétricas confirman que las diferencias observadas no son fruto del azar: la prueba de Friedman es altamente significativa (p &lt; 0,001) en las nueve métricas, y las comparaciones pareadas Wilcoxon con corrección de Holm corroboran las superioridades específicas reportadas (ganancia significativa en SSIM frente a la pirámide de Laplace y a los demás métodos del estado del arte).</w:t>
       </w:r>
     </w:p>
     <w:p>
@@ -31120,7 +31191,7 @@
         <w:rPr>
           <w:rFonts w:eastAsia="Times New Roman" w:cs="Times New Roman"/>
         </w:rPr>
-        <w:t>La variante con Black Top-Hat no se recomienda como configuración por defecto: aunque incrementa el contraste y la actividad (EN, SD, SF, MG), degrada significativamente la calidad de la fusión (Qabf, SSIM, VIF, MI) y multiplica los artefactos (Nabf ×5). El detalle oscuro que añade es en gran parte ruido no presente en las fuentes.</w:t>
+        <w:t>La variante con Black Top-Hat no se recomienda como configuración por defecto: aunque incrementa el contraste y la actividad (EN, SD, SF, MG), degrada significativamente la fidelidad estructural (SSIM) y la información mutua con las fuentes (MI). El detalle oscuro que añade es en gran parte ruido no presente en las fuentes.</w:t>
       </w:r>
     </w:p>
     <w:p>
@@ -31320,7 +31391,7 @@
         <w:rPr>
           <w:rFonts w:eastAsia="Times New Roman" w:cs="Times New Roman"/>
         </w:rPr>
-        <w:t>Seleccionar el método de fusión según el criterio operativo prioritario: para aplicaciones donde priman la fidelidad estructural, la preservación de bordes y la ausencia de artefactos, emplear la Propuesta Novedosa (r = 25, m = 0,070), que registra la menor tasa de artefactos (Nabf) y la mayor similitud estructural (SSIM) del benchmark; para un balance que privilegie el contraste global, la pirámide de Laplace sigue siendo una opción sólida; y la metodología clásica Top-Hat ofrece un punto de partida interpretable y de bajo costo computacional.</w:t>
+        <w:t>Seleccionar el método de fusión según el criterio operativo prioritario: para aplicaciones donde prima la fidelidad estructural a las fuentes, emplear la Propuesta Novedosa (r = 25, m = 0,070), que registra la mayor similitud estructural (SSIM) del benchmark y una preservación de información competitiva; para un balance que privilegie el contraste global y la actividad, la pirámide de Laplace y la metodología clásica Top-Hat siguen siendo opciones sólidas, esta última interpretable y de muy bajo costo computacional.</w:t>
       </w:r>
     </w:p>
     <w:p>
@@ -32121,7 +32192,7 @@
         <w:rPr>
           <w:rFonts w:eastAsia="Times New Roman" w:cs="Times New Roman"/>
         </w:rPr>
-        <w:t>Las tablas completas con los 120 contrastes Wilcoxon (2 métodos morfológicos × 5 métodos del estado del arte × 9 métricas), más el contraste directo entre la propuesta y el operador clásico, se almacenan en experiments/results/metrics_reports/wilcoxon_results.csv. Cada fila contiene la métrica, las medias comparadas, la diferencia, el estadístico W, el p-valor, el p-valor corregido por Holm, la marca de significación a α = 0,05 y el tamaño de efecto rank-biserial. El ranking promedio está en ranking_methods.csv y los resultados de Friedman en friedman_results.csv. Los 48 contrastes de la propuesta central frente al método anterior y a los baselines (9 métricas × 4 rivales, Wilcoxon con Holm y tamaño de efecto rank-biserial) se consignan en wilcoxon_propuesta_vs_metodos.csv.</w:t>
+        <w:t>Las tablas completas con los 90 contrastes Wilcoxon (2 métodos morfológicos × 5 métodos del estado del arte × 9 métricas) se almacenan en experiments/results/metrics_reports/wilcoxon_results.csv. Cada fila contiene la métrica, las medias comparadas, la diferencia, el estadístico W, el p-valor, el p-valor corregido por Holm, la marca de significación a α = 0,05 y el tamaño de efecto rank-biserial. El ranking promedio está en ranking_methods.csv y los resultados de Friedman en friedman_results.csv. Los 48 contrastes de la propuesta central frente al método anterior y a los baselines (9 métricas × 4 rivales, Wilcoxon con Holm y tamaño de efecto rank-biserial) se consignan en wilcoxon_propuesta_vs_metodos.csv.</w:t>
       </w:r>
     </w:p>
     <w:p>

</xml_diff>

<commit_message>
Corrige el parrafo que introducia la Figura 11 y reajusta el indice
El texto decia que el panel izquierdo mostraba "la mejor aptitud alcanzada segun
el numero de particulas (Tmax = 50)", que es lo que mostraba una version anterior
de la figura; el panel es la aptitud Fo frente al peso de contraste con r = 25.
Se describe lo que la figura muestra y se cita el valor en el piso del rango
(Fo = 1,7057, coherente con el barrido).

Al crecer el parrafo, la seccion 5.8.5 paso de la pagina 60 a la 61: recalculadas
las 79 entradas del indice desde el PDF. verificar_libro.py vuelve a dar 0 fallos.
</commit_message>
<xml_diff>
--- a/docs/Tesis_Borrador_V3.docx
+++ b/docs/Tesis_Borrador_V3.docx
@@ -2789,7 +2789,7 @@
         </w:rPr>
         <w:t xml:space="preserve">5.8.5 Alcance de la optimización y contraste con la tarea (H5, H6)</w:t>
         <w:tab/>
-        <w:t>60</w:t>
+        <w:t>61</w:t>
       </w:r>
     </w:p>
     <w:p>
@@ -29951,7 +29951,7 @@
         <w:rPr>
           <w:rFonts w:eastAsia="Times New Roman" w:cs="Times New Roman"/>
         </w:rPr>
-        <w:t xml:space="preserve">La Figura 11 resume la optimización del método. El panel izquierdo muestra la mejor aptitud alcanzada según el número de partículas (Tmax = 50). El panel derecho y la Tabla 11 sintetizan el barrido de 25 configuraciones: todas convergen al mismo peso, m* = 0,30, el límite inferior del rango publicado, lo que refleja que Fo decrece de forma monótona con el realce; la contribución de los elementos estructurantes lineales sobre el disco reside en la cobertura de orientaciones, que el criterio de evaluación premia al fijar r = 25.</w:t>
+        <w:t xml:space="preserve">La Figura 11 resume la optimización del método. El panel izquierdo muestra la aptitud Fo en función del peso de contraste con el radio fijo en r = 25: decrece de forma monótona a partir de valores pequeños de m, de modo que el óptimo dentro del rango publicado cae en su piso, m* = 0,30, donde Fo = 1,7057. El panel derecho y la Tabla 11 sintetizan el barrido de 25 configuraciones: todas convergen al mismo peso, m* = 0,30, el límite inferior del rango publicado, lo que refleja que Fo decrece de forma monótona con el realce; la contribución de los elementos estructurantes lineales sobre el disco reside en la cobertura de orientaciones, que el criterio de evaluación premia al fijar r = 25.</w:t>
       </w:r>
     </w:p>
     <w:p>

</xml_diff>